<commit_message>
docs: revise ITSSI 2026 XAI paper content and checklist
</commit_message>
<xml_diff>
--- a/papers/itssi_xai_2026/itssi_xai_2026.docx
+++ b/papers/itssi_xai_2026/itssi_xai_2026.docx
@@ -96,7 +96,7 @@
           <w:i w:val="0"/>
           <w:sz w:val="20"/>
         </w:rPr>
-        <w:t>To show that concept attractors formed from a small number of examples yield recognition with a fully traceable decision, and to document the conditions under which the result is valid.</w:t>
+        <w:t>To show that concept attractors formed from a small number of examples yield recognition with a traceable decision, and to document the conditions under which the result is valid.</w:t>
       </w:r>
       <w:r>
         <w:rPr>
@@ -123,7 +123,7 @@
           <w:i w:val="0"/>
           <w:sz w:val="20"/>
         </w:rPr>
-        <w:t>To represent contour images as bipartite graphs; to form an alphabet of concepts by structural reduction with interval generalization of parameters; to build classification on graph edit distance with diagnostic feature weighting; to evaluate the system on the complete-contour subset of MNIST with the filter disclosed; to demonstrate explainability by tracing a decision and to measure inference cost.</w:t>
+        <w:t>To represent contour images as bipartite graphs; to form an alphabet of concepts by structural reduction with interval generalization of parameters; to build classification on graph edit distance with diagnostic feature weighting; to evaluate the system on the complete-contour subset of MNIST with the filter disclosed; to demonstrate explainability by tracing a decision.</w:t>
       </w:r>
       <w:r>
         <w:rPr>
@@ -177,7 +177,7 @@
           <w:i w:val="0"/>
           <w:sz w:val="20"/>
         </w:rPr>
-        <w:t>13 concept attractors formed from 76 unique samples (3–9 per concept) classify 8,685 complete-contour MNIST images with 91.13 % accuracy, 91.92 % precision, 91.13 % recall and 91.34 % F1 score. The completeness filter excludes 12.9 % of the test set and is class-skewed; this is disclosed with its rationale. A trace shows how a decision decomposes into an attractor, node substitutions and per-feature costs. The classification stage has a median of 167 ms and a maximum of 1.4 s.</w:t>
+        <w:t>Thirteen concept attractors were formed from 76 manually selected sources expanded to 805 images. Of 8,707 admitted images, 8,685 produced decisions: accuracy is 91.13 % over processed images and 90.90 % over all admitted images when 22 pipeline failures are included; support-weighted precision, recall, and F1 are 91.92 %, 91.13 %, and 91.34 %. An archived replay gives one numerical chain from edit operations to the final score.</w:t>
       </w:r>
       <w:r>
         <w:rPr>
@@ -204,7 +204,7 @@
           <w:i w:val="0"/>
           <w:sz w:val="20"/>
         </w:rPr>
-        <w:t>Recognition without backpropagation from a small number of examples is feasible, and the graph structure of the representation makes every decision verifiable. The headline metric is conditional on the completeness filter; transferring it to the full dataset requires associative recognition of broken contours.</w:t>
+        <w:t>Recognition without backpropagation from 76 sources is feasible, and each decision decomposes into edit operations and per-feature costs. The result is valid within the manually filtered MNIST subset; no comparison with other models was made.</w:t>
       </w:r>
     </w:p>
     <w:p>
@@ -291,7 +291,7 @@
           <w:i w:val="0"/>
           <w:sz w:val="20"/>
         </w:rPr>
-        <w:t>Найпоширеніший спосіб її подолання — апостеріорні (post-hoc) пояснення. Метод LIME [1] будує локальну лінійну апроксимацію поведінки навченої моделі в околі окремого прикладу. Метод SHAP [2] розподіляє внески ознак за схемою кооперативних ігор. Обидва методи працюють ззовні щодо моделі й трактують її як чорну скриньку, тому пояснення лишається наближенням зовнішньої щодо моделі функції, а не описом самого обчислення.</w:t>
+        <w:t>Найпоширеніший спосіб її подолання — апостеріорні (post-hoc) пояснення. Метод LIME [1] будує локальну лінійну апроксимацію поведінки навченої моделі в околі окремого прикладу. SHAP [2] розподіляє внески ознак за схемою кооперативних ігор; його родина містить як модельно-незалежний Kernel SHAP, так і модельно-специфічні Linear SHAP та Deep SHAP. LIME і Kernel SHAP працюють з моделлю як із чорною скринькою та пояснюють внески ознак, а не відтворюють внутрішню послідовність операцій класифікатора.</w:t>
       </w:r>
     </w:p>
     <w:p>
@@ -339,7 +339,7 @@
           <w:i w:val="0"/>
           <w:sz w:val="20"/>
         </w:rPr>
-        <w:t>Статус отриманого результату варто окреслити відверто. Система перебуває на дослідницькій стадії й не є готовим продуктом. Вона не претендує на рівень точності нейромережевих класифікаторів на еталонних наборах і не порівнюється з ними за цим показником. Орієнтиром є рівень розпізнавання людини. Наукове питання формулюється інакше, ніж у порівняльних дослідженнях точності: чи можливе розпізнавання без зворотного поширення помилки, з малої кількості навчальних прикладів і з повністю простежуваним шляхом ухвалення рішення. Практична цінність такої постановки з'являється там, де навчальних даних мало, а рішення має бути придатним до перевірки вручну.</w:t>
+        <w:t>Статус отриманого результату варто окреслити відверто. Система перебуває на дослідницькій стадії й не є готовим продуктом. Вона не претендує на рівень точності нейромережевих класифікаторів на еталонних наборах і не порівнюється з ними за цим показником. Рівень розпізнавання людини є заявленим орієнтиром проєкту, але експерименту за участю людей не проводили й досягнення цього рівня не стверджуємо. Наукове питання формулюється інакше, ніж у порівняльних дослідженнях точності: чи можливе розпізнавання без зворотного поширення помилки, з малої кількості навчальних прикладів і з простежуваним за збереженими даними шляхом ухвалення рішення. Практична цінність такої постановки з'являється там, де навчальних даних мало, а рішення має бути придатним до перевірки вручну.</w:t>
       </w:r>
     </w:p>
     <w:p>
@@ -355,7 +355,7 @@
           <w:i w:val="0"/>
           <w:sz w:val="20"/>
         </w:rPr>
-        <w:t>У статті викладено подання зображень атрибутованими двочастковими графами, процедуру формування концептів-атракторів структурною редукцією, класифікацію за подібністю графів і результати оцінювання на MNIST з повністю розкритим фільтром повноти контуру. На підмножині повних контурів отримано точність 91,13 % за 13 концептів, сформованих із 76 унікальних навчальних зразків. Окремо наведено повне трасування одного рішення разом з механізмом домінантної помилки та виміряну обчислювальну вартість виведення.</w:t>
+        <w:t>У статті викладено подання зображень атрибутованими двочастковими графами, процедуру формування концептів-атракторів структурною редукцією, класифікацію за подібністю графів і результати оцінювання на MNIST з ручним фільтром повноти контуру. На 8 685 оброблених зображеннях отримано точність 91,13 %, а на всіх 8 707 допущених — 90,90 %. Алфавіт із 13 концептів сформовано з 76 вручну відібраних джерел, розширених до 805 зображень. Окремо наведено архівне відтворення одного рішення.</w:t>
       </w:r>
     </w:p>
     <w:p>
@@ -498,7 +498,7 @@
           <w:i w:val="0"/>
           <w:sz w:val="20"/>
         </w:rPr>
-        <w:t>García-Cuesta et al. [11] перевіряють на міцність прототипні мережі — архітектури, які заведено вважати пояснюваними за побудовою. Емпірично показано, що подання прототипів можна змінити навмисно або ненавмисно так, що зовнішня правдоподібність пояснення збережеться, а зв'язок із засвоєними ознаками зникне. Робота переносить на пояснювані за побудовою моделі ту саму претензію, яку Slack et al. [3] висунули до апостеріорних методів, і тим окреслює умову, за якої пояснюваність за побудовою справді щось гарантує. Такою умовою є подання, елементи якого мають самостійну геометричну інтерпретацію поза навченим простором вкладень.</w:t>
+        <w:t>García-Cuesta et al. [11] показують, що подання прототипів у прототипних мережах можна змінити навмисно або ненавмисно без втрати зовнішньої правдоподібності пояснення. Цей результат мотивує перевіряти, чи має елемент пояснення зміст поза навченим простором вкладень.</w:t>
       </w:r>
     </w:p>
     <w:p>
@@ -594,99 +594,7 @@
           <w:i w:val="0"/>
           <w:sz w:val="20"/>
         </w:rPr>
-        <w:t xml:space="preserve">Ще два напрями розвитку GED пришвидшують саме обчислення: Tang et al. [21] зводять задачу до відстані Fused Gromov-Wasserstein і будують алгоритм FGWAlign складності </w:t>
-      </w:r>
-      <m:oMath>
-        <m:r>
-          <w:rPr>
-            <w:sz w:val="20"/>
-            <w:szCs w:val="20"/>
-          </w:rPr>
-          <m:t>O</m:t>
-        </m:r>
-        <m:r>
-          <m:rPr>
-            <m:sty m:val="p"/>
-          </m:rPr>
-          <w:rPr>
-            <w:sz w:val="20"/>
-            <w:szCs w:val="20"/>
-          </w:rPr>
-          <m:t>(</m:t>
-        </m:r>
-        <m:r>
-          <m:rPr>
-            <m:sty m:val="p"/>
-          </m:rPr>
-          <w:rPr>
-            <w:sz w:val="20"/>
-            <w:szCs w:val="20"/>
-          </w:rPr>
-          <m:t>|</m:t>
-        </m:r>
-        <m:r>
-          <w:rPr>
-            <w:sz w:val="20"/>
-            <w:szCs w:val="20"/>
-          </w:rPr>
-          <m:t>V</m:t>
-        </m:r>
-        <m:r>
-          <m:rPr>
-            <m:sty m:val="p"/>
-          </m:rPr>
-          <w:rPr>
-            <w:sz w:val="20"/>
-            <w:szCs w:val="20"/>
-          </w:rPr>
-          <m:t>|</m:t>
-        </m:r>
-        <m:r>
-          <m:rPr>
-            <m:sty m:val="p"/>
-          </m:rPr>
-          <w:rPr>
-            <w:sz w:val="20"/>
-            <w:szCs w:val="20"/>
-          </w:rPr>
-          <m:t>|</m:t>
-        </m:r>
-        <m:r>
-          <w:rPr>
-            <w:sz w:val="20"/>
-            <w:szCs w:val="20"/>
-          </w:rPr>
-          <m:t>E</m:t>
-        </m:r>
-        <m:r>
-          <m:rPr>
-            <m:sty m:val="p"/>
-          </m:rPr>
-          <w:rPr>
-            <w:sz w:val="20"/>
-            <w:szCs w:val="20"/>
-          </w:rPr>
-          <m:t>|</m:t>
-        </m:r>
-        <m:r>
-          <m:rPr>
-            <m:sty m:val="p"/>
-          </m:rPr>
-          <w:rPr>
-            <w:sz w:val="20"/>
-            <w:szCs w:val="20"/>
-          </w:rPr>
-          <m:t>)</m:t>
-        </m:r>
-      </m:oMath>
-      <w:r>
-        <w:rPr>
-          <w:rFonts w:ascii="Times New Roman" w:hAnsi="Times New Roman"/>
-          <w:b w:val="0"/>
-          <w:i w:val="0"/>
-          <w:sz w:val="20"/>
-        </w:rPr>
-        <w:t>, який на чотирьох наборах даних зменшує похибку понад 80 % і прискорює обчислення в 15–60 разів, а Moscatelli et al. [22] переформульовують квадратичну задачу про призначення як передбачення ребер на графі екземпляра й наскрізно отримують м'яку матрицю відповідності графовою мережею з виразністю рівня 3-WL. В обох роботах предметом дослідження є швидкість і точність обчислення, а вартість елементарної операції не має наперед заданого змісту, тому окремий доданок не пояснює, якою характеристикою відрізняються зіставлені вузли.</w:t>
+        <w:t>Ще два напрями розвитку GED пришвидшують саме обчислення: Tang et al. [21] зводять задачу до відстані Fused Gromov-Wasserstein і будують алгоритм FGWAlign складності O(|V||E|), який на чотирьох наборах даних зменшує похибку понад 80 % і прискорює обчислення в 15–60 разів. FGWAlign явно задає операції редагування та вартості перемаркування вузлів, але використовує загальні мітки й ребра, а не геометричні ознаки цієї роботи. Moscatelli et al. [22] переформульовують квадратичну задачу про призначення як передбачення ребер на графі екземпляра й наскрізно отримують м'яку матрицю відповідності графовою мережею з виразністю рівня 3-WL. Відмінність нашої схеми полягає не в наявності семантики операцій як такої, а в розкладі вартості заміщення за наперед визначеними геометричними ознаками вузлів.</w:t>
       </w:r>
     </w:p>
     <w:p>
@@ -798,7 +706,7 @@
           <w:i w:val="0"/>
           <w:sz w:val="20"/>
         </w:rPr>
-        <w:t>Ця стаття продовжує попередні роботи дослідницької групи. Формалізм енергетичної моделі та прототип на шести класах, який дав 82,44 % точності за 5–6 зразків на клас і один прохід формування, викладено в [32]. Векторизацію бінарних контурів як основу подання описано в [33], а теоретичну рамку архітектури інформації — в [34]. Графову модель навчання з малої кількості прикладів без зворотного поширення помилки подано в [35].</w:t>
+        <w:t>Ця стаття продовжує попередні роботи дослідницької групи. Формалізм енергетичної моделі та прототип на шести класах, який дав 82,44 % точності за 5–6 зразків на клас і один прохід формування, викладено в [32]. Векторизацію бінарних контурів як основу подання описано в [33], а теоретичну рамку архітектури інформації — в [34]. Графову модель навчання з малої кількості прикладів без зворотного поширення помилки подано в [35]. Формування концептів як динаміку структурних атракторів, конвеєр побудови графа та класифікатор на основі GED викладено в [36].</w:t>
       </w:r>
     </w:p>
     <w:p>
@@ -814,7 +722,7 @@
           <w:i w:val="0"/>
           <w:sz w:val="20"/>
         </w:rPr>
-        <w:t>Розглянуті роботи різняться тим, де в них перебуває пояснення щодо обчислення. Огляди та методи оцінювання апостеріорних пояснень [6, 7] працюють ззовні щодо навченої моделі, тому їхні висновки стосуються надійності сурогату, а не самого рішення. Моделі, пояснювані за побудовою [9, 10, 11], переносять пояснення всередину архітектури, проте зберігають навчене відображення від входу до проміжних понять, і саме воно лишається непрозорим, а подання прототипів піддається підміні без втрати зовнішньої правдоподібності. Роботи, які будують подання зображення графом [15, 16, 23, 24], використовують структуру як джерело ознак для подальшого навченого модуля, тому вузли та ребра не мають значення, яке можна прочитати окремо від ваг. Дослідження відстані редагування графів [20, 21, 22] підтверджують цінність розкладу на елементарні операції та водночас засвідчують зсув до навчання вартостей, після якого окремий доданок перестає вказувати на конкретну характеристику. Навчання за малою кількістю прикладів [28] і навчання без зворотного поширення помилки [31] знімають окремо взяті обмеження — потребу у великій вибірці та потребу в глобальному градієнті, — але подання в обох випадках лишається розподіленим за вагами.</w:t>
+        <w:t>Розглянуті роботи різняться тим, де в них перебуває пояснення щодо обчислення. Огляди та методи оцінювання апостеріорних пояснень [6, 7] працюють ззовні щодо навченої моделі, тому їхні висновки стосуються надійності сурогату, а не самого рішення. Моделі, пояснювані за побудовою [9, 10, 11], переносять пояснення всередину архітектури, але зберігають навчене відображення від входу до проміжних понять. Роботи, які будують подання зображення графом [15, 16, 23, 24], використовують структуру як джерело ознак для подальшого навченого модуля, тому вузли та ребра не мають значення, яке можна прочитати окремо від ваг. Дослідження відстані редагування графів [20, 21, 22] підтверджують цінність шляху редагування; FGWAlign при цьому має визначену семантику операцій. Навчання за малою кількістю прикладів [28] і навчання без зворотного поширення помилки [31] знімають окремо взяті обмеження — потребу у великій вибірці та потребу в глобальному градієнті, — але подання в обох випадках лишається розподіленим за вагами.</w:t>
       </w:r>
     </w:p>
     <w:p>
@@ -830,7 +738,7 @@
           <w:i w:val="0"/>
           <w:sz w:val="20"/>
         </w:rPr>
-        <w:t>Звідси випливає проблема, яку розв'язує ця стаття. Незакритою лишається сукупність чотирьох умов: структура подання є одночасно носієм рішення й носієм пояснення; вартості зіставлення прив'язані до наперед визначених геометричних характеристик, а не засвоєні з даних; результат отримано за десятками навчальних зразків без зворотного поширення помилки; умови оцінювання — фільтр даних, вартість виведення та політика відбору навчальних зразків — розкриті явно й перевірні за артефактами виконання. Жодна з розглянутих робіт не забезпечує цих умов одночасно.</w:t>
+        <w:t>Звідси випливає проблема, яку розв'язує ця стаття. Незакритою лишається сукупність чотирьох умов: структура подання є одночасно носієм рішення й носієм пояснення; вартості зіставлення прив'язані до наперед визначених геометричних характеристик, а не засвоєні з даних; результат отримано за десятками навчальних зразків без зворотного поширення помилки; умови оцінювання — фільтр даних і політика відбору навчальних зразків — описані в межах збережених артефактів. Серед розглянутих робіт жодна не поєднує ці умови.</w:t>
       </w:r>
     </w:p>
     <w:p>
@@ -957,7 +865,7 @@
           <w:i w:val="0"/>
           <w:sz w:val="20"/>
         </w:rPr>
-        <w:t>5) продемонструвати пояснюваність повним трасуванням одного рішення — від зіставлення вузлів і вартостей за окремими ознаками до механізму домінантної помилки — і виміряти обчислювальну вартість виведення за артефактами виконання, а не за оцінками складності алгоритму.</w:t>
+        <w:t>5) продемонструвати пояснюваність числовим трасуванням одного рішення — від операцій редагування й вартостей за окремими ознаками до підсумкової оцінки.</w:t>
       </w:r>
     </w:p>
     <w:p>
@@ -987,7 +895,7 @@
           <w:i w:val="0"/>
           <w:sz w:val="20"/>
         </w:rPr>
-        <w:t>2.1 Графове подання зображення</w:t>
+        <w:t>2.1 Графове подання і формування концептів</w:t>
       </w:r>
     </w:p>
     <w:p>
@@ -1003,7 +911,7 @@
           <w:i w:val="0"/>
           <w:sz w:val="20"/>
         </w:rPr>
-        <w:t>Зображення цифри подано атрибутованим двочастковим графом. Вузли двох типів чергуються: вузол-точка (Point) описує характерну точку контуру, вузол-вектор (Vector) описує прямолінійний відрізок між двома сусідніми точками. Зв'язки двонаправлені, тому будь-який обхід графа має вигляд Point → Vector → Point. Двочастковість зберігається на всіх етапах обробки: жодна точка не з'єднана з іншою точкою безпосередньо. Після побудови графа зображення описане лише вузлами, їхніми типами та атрибутами; значення пікселів далі не використовуються.</w:t>
+        <w:t>Подання зображення, конвеєр побудови графа та оператор формування концептів-атракторів викладено в [36]. Тут наведено лише те, що потрібно для читання результатів, і значення параметрів оцінюваного прогону; там, де цей опис розходиться з [36], для наведених результатів чинним є цей.</w:t>
       </w:r>
     </w:p>
     <w:p>
@@ -1019,7 +927,7 @@
           <w:i w:val="0"/>
           <w:sz w:val="20"/>
         </w:rPr>
-        <w:t>Відрізок контуру подано окремим вузлом, а не ребром графа. Завдяки цьому відрізок має власні атрибути — довжину, напрямок і орієнтацію — і бере участь у порівнянні нарівні з точками.</w:t>
+        <w:t>Зображення цифри подано атрибутованим двочастковим графом. Вузол-точка (Point) описує характерну точку контуру: кінець відкритого контуру (EndPoint), різку зміну напрямку (CornerPoint), перетин ліній (IntersectionPoint) або початок обходу (StartPoint). Вузол-вектор (Vector) описує прямолінійний відрізок між двома сусідніми точками і має власні атрибути довжини та напрямку, тому бере участь у порівнянні нарівні з точками.</w:t>
       </w:r>
     </w:p>
     <w:p>
@@ -1035,293 +943,7 @@
           <w:i w:val="0"/>
           <w:sz w:val="20"/>
         </w:rPr>
-        <w:t>Точки поділено на чотири типи. EndPoint позначає кінець відкритого контуру. CornerPoint позначає різку зміну напрямку і зберігає значення кута. IntersectionPoint позначає перетин ліній. StartPoint задає початок обходу графа. Один вузол може мати кілька міток одночасно.</w:t>
-      </w:r>
-    </w:p>
-    <w:p>
-      <w:pPr>
-        <w:spacing w:lineRule="exact" w:line="280" w:before="0" w:after="0"/>
-        <w:ind w:firstLine="567"/>
-        <w:jc w:val="both"/>
-      </w:pPr>
-      <w:r>
-        <w:rPr>
-          <w:rFonts w:ascii="Times New Roman" w:hAnsi="Times New Roman"/>
-          <w:b w:val="0"/>
-          <w:i w:val="0"/>
-          <w:sz w:val="20"/>
-        </w:rPr>
-        <w:t>Вузол-точка зберігає координати x та y і їхні нормалізовані значення. Вузол-вектор зберігає координати обох кінців, довжину, квадрант (I–IV), горизонтальний напрямок (LEFT, RIGHT або NONE) і вертикальний напрямок (TOP, BOTTOM або NONE). Квадрант і два напрямки описують орієнтацію відрізка без прив'язки до абсолютних координат.</w:t>
-      </w:r>
-    </w:p>
-    <w:p>
-      <w:pPr>
-        <w:spacing w:lineRule="exact" w:line="280" w:before="0" w:after="0"/>
-        <w:ind w:firstLine="567"/>
-        <w:jc w:val="both"/>
-      </w:pPr>
-      <w:r>
-        <w:rPr>
-          <w:rFonts w:ascii="Times New Roman" w:hAnsi="Times New Roman"/>
-          <w:b w:val="0"/>
-          <w:i w:val="0"/>
-          <w:sz w:val="20"/>
-        </w:rPr>
-        <w:t>Координати нормалізовано до центрованого діапазону від −1 до 1 за формулою (1):</w:t>
-      </w:r>
-    </w:p>
-    <w:p>
-      <w:pPr>
-        <w:tabs>
-          <w:tab w:pos="9638" w:val="right"/>
-        </w:tabs>
-        <w:spacing w:lineRule="auto" w:line="240" w:before="80" w:after="80"/>
-        <w:jc w:val="center"/>
-      </w:pPr>
-      <m:oMathPara>
-        <m:oMath>
-          <m:sSub>
-            <m:e>
-              <m:r>
-                <w:rPr>
-                  <w:sz w:val="20"/>
-                  <w:szCs w:val="20"/>
-                </w:rPr>
-                <m:t>x</m:t>
-              </m:r>
-            </m:e>
-            <m:sub>
-              <m:r>
-                <w:rPr>
-                  <w:sz w:val="20"/>
-                  <w:szCs w:val="20"/>
-                </w:rPr>
-                <m:t>n</m:t>
-              </m:r>
-              <m:r>
-                <w:rPr>
-                  <w:sz w:val="20"/>
-                  <w:szCs w:val="20"/>
-                </w:rPr>
-                <m:t>o</m:t>
-              </m:r>
-              <m:r>
-                <w:rPr>
-                  <w:sz w:val="20"/>
-                  <w:szCs w:val="20"/>
-                </w:rPr>
-                <m:t>r</m:t>
-              </m:r>
-              <m:r>
-                <w:rPr>
-                  <w:sz w:val="20"/>
-                  <w:szCs w:val="20"/>
-                </w:rPr>
-                <m:t>m</m:t>
-              </m:r>
-            </m:sub>
-          </m:sSub>
-          <m:r>
-            <m:rPr>
-              <m:sty m:val="p"/>
-            </m:rPr>
-            <w:rPr>
-              <w:sz w:val="20"/>
-              <w:szCs w:val="20"/>
-            </w:rPr>
-            <m:t>=</m:t>
-          </m:r>
-          <m:f>
-            <m:fPr>
-              <m:type m:val="bar"/>
-            </m:fPr>
-            <m:num>
-              <m:r>
-                <w:rPr>
-                  <w:sz w:val="20"/>
-                  <w:szCs w:val="20"/>
-                </w:rPr>
-                <m:t>x</m:t>
-              </m:r>
-              <m:r>
-                <m:rPr>
-                  <m:sty m:val="p"/>
-                </m:rPr>
-                <w:rPr>
-                  <w:sz w:val="20"/>
-                  <w:szCs w:val="20"/>
-                </w:rPr>
-                <m:t>−</m:t>
-              </m:r>
-              <m:sSub>
-                <m:e>
-                  <m:r>
-                    <w:rPr>
-                      <w:sz w:val="20"/>
-                      <w:szCs w:val="20"/>
-                    </w:rPr>
-                    <m:t>c</m:t>
-                  </m:r>
-                </m:e>
-                <m:sub>
-                  <m:r>
-                    <w:rPr>
-                      <w:sz w:val="20"/>
-                      <w:szCs w:val="20"/>
-                    </w:rPr>
-                    <m:t>x</m:t>
-                  </m:r>
-                </m:sub>
-              </m:sSub>
-            </m:num>
-            <m:den>
-              <m:sSub>
-                <m:e>
-                  <m:r>
-                    <w:rPr>
-                      <w:sz w:val="20"/>
-                      <w:szCs w:val="20"/>
-                    </w:rPr>
-                    <m:t>c</m:t>
-                  </m:r>
-                </m:e>
-                <m:sub>
-                  <m:r>
-                    <w:rPr>
-                      <w:sz w:val="20"/>
-                      <w:szCs w:val="20"/>
-                    </w:rPr>
-                    <m:t>x</m:t>
-                  </m:r>
-                </m:sub>
-              </m:sSub>
-            </m:den>
-          </m:f>
-        </m:oMath>
-      </m:oMathPara>
-      <w:r>
-        <w:rPr>
-          <w:rFonts w:ascii="Times New Roman" w:hAnsi="Times New Roman"/>
-          <w:b w:val="0"/>
-          <w:i w:val="0"/>
-          <w:sz w:val="20"/>
-        </w:rPr>
-        <w:tab/>
-        <w:t>(1)</w:t>
-      </w:r>
-    </w:p>
-    <w:p>
-      <w:pPr>
-        <w:spacing w:lineRule="exact" w:line="280" w:before="0" w:after="0"/>
-        <w:ind w:firstLine="567"/>
-        <w:jc w:val="both"/>
-      </w:pPr>
-      <w:r>
-        <w:rPr>
-          <w:rFonts w:ascii="Times New Roman" w:hAnsi="Times New Roman"/>
-          <w:b w:val="0"/>
-          <w:i w:val="0"/>
-          <w:sz w:val="20"/>
-        </w:rPr>
-        <w:t xml:space="preserve">де </w:t>
-      </w:r>
-      <m:oMath>
-        <m:sSub>
-          <m:e>
-            <m:r>
-              <w:rPr>
-                <w:sz w:val="20"/>
-                <w:szCs w:val="20"/>
-              </w:rPr>
-              <m:t>c</m:t>
-            </m:r>
-          </m:e>
-          <m:sub>
-            <m:r>
-              <w:rPr>
-                <w:sz w:val="20"/>
-                <w:szCs w:val="20"/>
-              </w:rPr>
-              <m:t>x</m:t>
-            </m:r>
-          </m:sub>
-        </m:sSub>
-      </m:oMath>
-      <w:r>
-        <w:rPr>
-          <w:rFonts w:ascii="Times New Roman" w:hAnsi="Times New Roman"/>
-          <w:b w:val="0"/>
-          <w:i w:val="0"/>
-          <w:sz w:val="20"/>
-        </w:rPr>
-        <w:t xml:space="preserve"> — координата центра зображення за віссю абсцис; для осі ординат перетворення аналогічне. Нормалізація робить подання інваріантним до масштабу та зсуву.</w:t>
-      </w:r>
-    </w:p>
-    <w:p>
-      <w:pPr>
-        <w:spacing w:lineRule="exact" w:line="280" w:before="160" w:after="80"/>
-        <w:jc w:val="both"/>
-      </w:pPr>
-      <w:r>
-        <w:rPr>
-          <w:rFonts w:ascii="Times New Roman" w:hAnsi="Times New Roman"/>
-          <w:b/>
-          <w:i w:val="0"/>
-          <w:sz w:val="20"/>
-        </w:rPr>
-        <w:t>2.2 Конвеєр побудови графа</w:t>
-      </w:r>
-    </w:p>
-    <w:p>
-      <w:pPr>
-        <w:spacing w:lineRule="exact" w:line="280" w:before="0" w:after="0"/>
-        <w:ind w:firstLine="567"/>
-        <w:jc w:val="both"/>
-      </w:pPr>
-      <w:r>
-        <w:rPr>
-          <w:rFonts w:ascii="Times New Roman" w:hAnsi="Times New Roman"/>
-          <w:b w:val="0"/>
-          <w:i w:val="0"/>
-          <w:sz w:val="20"/>
-        </w:rPr>
-        <w:t xml:space="preserve">Вхідні зображення — напівтонові, розміром 100×100 пікселів. Граф будують у шість етапів (рис. 1). Зображення бінаризують з фіксованим порогом </w:t>
-      </w:r>
-      <m:oMath>
-        <m:r>
-          <w:rPr>
-            <w:sz w:val="20"/>
-            <w:szCs w:val="20"/>
-          </w:rPr>
-          <m:t>θ</m:t>
-        </m:r>
-      </m:oMath>
-      <w:r>
-        <w:rPr>
-          <w:rFonts w:ascii="Times New Roman" w:hAnsi="Times New Roman"/>
-          <w:b w:val="0"/>
-          <w:i w:val="0"/>
-          <w:sz w:val="20"/>
-        </w:rPr>
-        <w:t xml:space="preserve"> = 110. Бінарну маску стоншують до товщини один піксель [36]. Скелет апроксимують зростаючим нейронним газом (Growing Neural Gas, GNG) [37]: мережа вузлів газу відтворює топологію ліній скелета. Мережу спрощують алгоритмом Рамера—Дугласа—Пекера з </w:t>
-      </w:r>
-      <m:oMath>
-        <m:r>
-          <w:rPr>
-            <w:sz w:val="20"/>
-            <w:szCs w:val="20"/>
-          </w:rPr>
-          <m:t>ε</m:t>
-        </m:r>
-      </m:oMath>
-      <w:r>
-        <w:rPr>
-          <w:rFonts w:ascii="Times New Roman" w:hAnsi="Times New Roman"/>
-          <w:b w:val="0"/>
-          <w:i w:val="0"/>
-          <w:sz w:val="20"/>
-        </w:rPr>
-        <w:t xml:space="preserve"> = 4,55 [38], який вилучає вузли, що лежать майже на прямій. На спрощеній мережі будують двочастковий граф з точок і векторів. На останньому етапі обчислюють атрибути вузлів і нормалізують координати.</w:t>
+        <w:t>Граф будують із напівтонового зображення 100×100 пікселів послідовністю, наведеною на рис. 1. Після бінаризації з маски вилучають компоненти до 9 пікселів і виконують морфологічне замикання ядром 3×3, маску стоншують до одного пікселя [37], а кінцеві гілки, коротші за максимум із 8 % довжини скелета і 5 пікселів, обрізають. Скелет апроксимують зростаючим нейронним газом (Growing Neural Gas, GNG) [38], мережу спрощують алгоритмом Рамера—Дугласа—Пекера з допуском 4,55 [39], після чого короткі перемички між розгалуженнями зливають. Початковий поріг бінаризації дорівнює 110; якщо побудова завершується помилкою або дає незв'язний граф, її повторюють із порогом, зменшеним на 5, до мінімуму 20. Очищення, обрізання гілок і злиття перемичок можуть змінити топологію. Координати вузлів відлічують від центра обмежувального прямокутника точок графа, ділять на його півдіагональ і округлюють до одного знака. Той самий конвеєр застосовують до навчальних і тестових зображень.</w:t>
       </w:r>
     </w:p>
     <w:p>
@@ -1392,17 +1014,30 @@
           <w:i w:val="0"/>
           <w:sz w:val="20"/>
         </w:rPr>
-        <w:t xml:space="preserve">Кожен наступний етап зменшує обсяг даних: растрове зображення, скелет завтовшки в один піксель, мережа вузлів, граф з точок і векторів. Обидва параметри конвеєра — поріг бінаризації та </w:t>
+        <w:t>Концепт-атрактор класу формують одним проходом через колекцію навчальних графів. Початковим станом концепту є граф першого зразка; кожен наступний зразок уточнює концепт структурною редукцією: вилучають кінцеві точки без відповідника разом зі шляхом до найближчого розгалуження, зливають або перемарковують точки перетину, вилучають надлишкові кутові точки, і в концепті лишається спільна для зразків частина структури. Числові атрибути відповідних вузлів зливають в інтервали з межами min і max та значенням center — середнім значень, поданих на поточний крок злиття. Автоматичної перевірки зміни концепту й умови зупинки цикл формування не має.</w:t>
       </w:r>
-      <m:oMath>
-        <m:r>
-          <w:rPr>
-            <w:sz w:val="20"/>
-            <w:szCs w:val="20"/>
-          </w:rPr>
-          <m:t>ε</m:t>
-        </m:r>
-      </m:oMath>
+    </w:p>
+    <w:p>
+      <w:pPr>
+        <w:spacing w:lineRule="exact" w:line="280" w:before="160" w:after="80"/>
+        <w:jc w:val="both"/>
+      </w:pPr>
+      <w:r>
+        <w:rPr>
+          <w:rFonts w:ascii="Times New Roman" w:hAnsi="Times New Roman"/>
+          <w:b/>
+          <w:i w:val="0"/>
+          <w:sz w:val="20"/>
+        </w:rPr>
+        <w:t>2.2 Навчальні дані та політика відбору зразків</w:t>
+      </w:r>
+    </w:p>
+    <w:p>
+      <w:pPr>
+        <w:spacing w:lineRule="exact" w:line="280" w:before="0" w:after="0"/>
+        <w:ind w:firstLine="567"/>
+        <w:jc w:val="both"/>
+      </w:pPr>
       <w:r>
         <w:rPr>
           <w:rFonts w:ascii="Times New Roman" w:hAnsi="Times New Roman"/>
@@ -1410,7 +1045,55 @@
           <w:i w:val="0"/>
           <w:sz w:val="20"/>
         </w:rPr>
-        <w:t xml:space="preserve"> спрощення — фіксовані й однакові для всіх зображень. Той самий конвеєр застосовують і до навчальних зображень під час формування концептів, і до тестових під час класифікації.</w:t>
+        <w:t>Алфавіт складається з 13 концептів для 10 класів цифр. Класи 1, 2 і 4 мають по два структурні підконцепти — 1_1 і 1_3, 2_1 і 2_2, 4_1 і 4_2, — бо ці цифри пишуть у двох топологічно різних стилях, які не зводяться один до одного редукцією. Решта класів мають по одному концепту. Розміри концептів і кількість навчальних зразків наведено в підрозділі 3.1.</w:t>
+      </w:r>
+    </w:p>
+    <w:p>
+      <w:pPr>
+        <w:spacing w:lineRule="exact" w:line="280" w:before="0" w:after="0"/>
+        <w:ind w:firstLine="567"/>
+        <w:jc w:val="both"/>
+      </w:pPr>
+      <w:r>
+        <w:rPr>
+          <w:rFonts w:ascii="Times New Roman" w:hAnsi="Times New Roman"/>
+          <w:b w:val="0"/>
+          <w:i w:val="0"/>
+          <w:sz w:val="20"/>
+        </w:rPr>
+        <w:t>Автор вручну подав від 3 до 9 вихідних джерел на концепт, застосовуючи критерій незмінності концепту під час укладання колекції. 76 джерел доповнено аугментованими варіантами з обертанням і малим зсувом; точний історичний рецепт не збережено. Разом колекція містить 805 зображень. Оригінали й аугментації спільно проходять структурну редукцію; окремого етапу, де лише аугментації задають інтервали, немає.</w:t>
+      </w:r>
+    </w:p>
+    <w:p>
+      <w:pPr>
+        <w:spacing w:lineRule="exact" w:line="280" w:before="0" w:after="0"/>
+        <w:ind w:firstLine="567"/>
+        <w:jc w:val="both"/>
+      </w:pPr>
+      <w:r>
+        <w:rPr>
+          <w:rFonts w:ascii="Times New Roman" w:hAnsi="Times New Roman"/>
+          <w:b w:val="0"/>
+          <w:i w:val="0"/>
+          <w:sz w:val="20"/>
+        </w:rPr>
+        <w:t>Джерела відібрано вручну, а не випадково. Критерій відбору — найменш спотворені написання без розривів контуру. В основі такого відбору лежить припущення, що правильно розпізнаний представник класу вже містить усі структурні й топологічні ознаки цього класу. Тоді формування концепту потребує не репрезентативної вибірки розподілу, а невеликої кількості структурно повних написань.</w:t>
+      </w:r>
+    </w:p>
+    <w:p>
+      <w:pPr>
+        <w:spacing w:lineRule="exact" w:line="280" w:before="0" w:after="0"/>
+        <w:ind w:firstLine="567"/>
+        <w:jc w:val="both"/>
+      </w:pPr>
+      <w:r>
+        <w:rPr>
+          <w:rFonts w:ascii="Times New Roman" w:hAnsi="Times New Roman"/>
+          <w:b w:val="0"/>
+          <w:i w:val="0"/>
+          <w:sz w:val="20"/>
+        </w:rPr>
+        <w:t>Межі цього припущення відомі лише частково. Чутливість підсумкової точності до конкретного вибору зразків у цій роботі не вимірювали. Кількість 76 відновлено групуванням назв файлів. 76 джерел узято з навчального розбиття MNIST (60 000 зображень), а оцінювання використовує тестове розбиття (10 000 зображень), тому ці два набори не перетинаються.</w:t>
       </w:r>
     </w:p>
     <w:p>
@@ -1425,7 +1108,7 @@
           <w:i w:val="0"/>
           <w:sz w:val="20"/>
         </w:rPr>
-        <w:t>2.3 Формування концептів-атракторів</w:t>
+        <w:t>2.3 Класифікація</w:t>
       </w:r>
     </w:p>
     <w:p>
@@ -1441,7 +1124,71 @@
           <w:i w:val="0"/>
           <w:sz w:val="20"/>
         </w:rPr>
-        <w:t xml:space="preserve">Концепт-атрактор класу формують ітеративно, додаючи навчальні зразки по одному. Початковим значенням концепту є граф першого зразка, тобто </w:t>
+        <w:t>Класифікація зіставляє граф вхідного зображення з кожним концептом алфавіту в чотири кроки: фільтр складності; окрема для кожного концепту попередня обробка входу з вибором StartPoint, переобчисленням напрямків і редукцією критичних точок; структурна перевірка; GED для пар, що лишилися. Складність графа — сума кількості його вузлів і ребер; концепти з більшою складністю, ніж початковий вхідний граф, відкидаються до попередньої обробки.</w:t>
+      </w:r>
+    </w:p>
+    <w:p>
+      <w:pPr>
+        <w:spacing w:lineRule="exact" w:line="280" w:before="0" w:after="0"/>
+        <w:ind w:firstLine="567"/>
+        <w:jc w:val="both"/>
+      </w:pPr>
+      <w:r>
+        <w:rPr>
+          <w:rFonts w:ascii="Times New Roman" w:hAnsi="Times New Roman"/>
+          <w:b w:val="0"/>
+          <w:i w:val="0"/>
+          <w:sz w:val="20"/>
+        </w:rPr>
+        <w:t>Міру відмінності двох графів дає GED — мінімальна сумарна вартість послідовності операцій, яка перетворює один граф на інший. Операціями редагування є вставлення, вилучення та заміщення вузлів і ребер. Точне обчислення GED є NP-складною задачею, тому практичні системи спираються на наближені алгоритми [18]. У цій роботі відстань обчислює anytime-розв'язувач, який шукає оптимальні шляхи редагування з налаштованим бюджетом 5 с на одне порівняння "зображення — концепт" і повертає найкращий знайдений результат. У реалізації прогону час перевіряють лише після чергового результату генератора, тому це номінальний бюджет, а не гарантована верхня межа.</w:t>
+      </w:r>
+    </w:p>
+    <w:p>
+      <w:pPr>
+        <w:spacing w:lineRule="exact" w:line="280" w:before="0" w:after="0"/>
+        <w:ind w:firstLine="567"/>
+        <w:jc w:val="both"/>
+      </w:pPr>
+      <w:r>
+        <w:rPr>
+          <w:rFonts w:ascii="Times New Roman" w:hAnsi="Times New Roman"/>
+          <w:b w:val="0"/>
+          <w:i w:val="0"/>
+          <w:sz w:val="20"/>
+        </w:rPr>
+        <w:t>Вартості заміщення задано монотонною шкалою: NO_COST = 0, MINOR = 0,25, GENERAL = 0,5, SEVERE = 0,8, NO_MATCH = 1,0 та IMPOSSIBLE = 6,0. Несумісне заміщення й вставлення вузла коштують 6,0, вилучення вузла — 0,25, вилучення ребра — 0,25, вставлення ребра — 0; атрибути ребер не порівнюються. Отже, це спрямована схема вартостей для перетворення графа зображення на граф концепту, а не симетрична метрика.</w:t>
+      </w:r>
+    </w:p>
+    <w:p>
+      <w:pPr>
+        <w:spacing w:lineRule="exact" w:line="280" w:before="0" w:after="0"/>
+        <w:ind w:firstLine="567"/>
+        <w:jc w:val="both"/>
+      </w:pPr>
+      <w:r>
+        <w:rPr>
+          <w:rFonts w:ascii="Times New Roman" w:hAnsi="Times New Roman"/>
+          <w:b w:val="0"/>
+          <w:i w:val="0"/>
+          <w:sz w:val="20"/>
+        </w:rPr>
+        <w:t>Порівняння вузлів спирається на 13 ознак: нормалізовані координати, відстань до центроїда, горизонтальний і вертикальний напрямки, кут з віссю абсцис, мінімальний кут у вузлі розгалуження, індикатор кінцевої точки, індикатор кутової точки, відношення довжини до максимальної, середню довжину сусідніх векторів, кількість сусідніх кінцевих точок і кількість сусідніх розгалужень.</w:t>
+      </w:r>
+    </w:p>
+    <w:p>
+      <w:pPr>
+        <w:spacing w:lineRule="exact" w:line="280" w:before="0" w:after="0"/>
+        <w:ind w:firstLine="567"/>
+        <w:jc w:val="both"/>
+      </w:pPr>
+      <w:r>
+        <w:rPr>
+          <w:rFonts w:ascii="Times New Roman" w:hAnsi="Times New Roman"/>
+          <w:b w:val="0"/>
+          <w:i w:val="0"/>
+          <w:sz w:val="20"/>
+        </w:rPr>
+        <w:t xml:space="preserve">Ознаки зважено діагностично: ненормована вага інтервальної ознаки обернена до ширини її інтервалу у вузлі концепту, збільшеної на сталу </w:t>
       </w:r>
       <m:oMath>
         <m:sSub>
@@ -1451,7 +1198,7 @@
                 <w:sz w:val="20"/>
                 <w:szCs w:val="20"/>
               </w:rPr>
-              <m:t>C</m:t>
+              <m:t>ε</m:t>
             </m:r>
           </m:e>
           <m:sub>
@@ -1460,37 +1207,7 @@
                 <w:sz w:val="20"/>
                 <w:szCs w:val="20"/>
               </w:rPr>
-              <m:t>0</m:t>
-            </m:r>
-          </m:sub>
-        </m:sSub>
-        <m:r>
-          <m:rPr>
-            <m:sty m:val="p"/>
-          </m:rPr>
-          <w:rPr>
-            <w:sz w:val="20"/>
-            <w:szCs w:val="20"/>
-          </w:rPr>
-          <m:t>=</m:t>
-        </m:r>
-        <m:sSub>
-          <m:e>
-            <m:r>
-              <w:rPr>
-                <w:sz w:val="20"/>
-                <w:szCs w:val="20"/>
-              </w:rPr>
-              <m:t>G</m:t>
-            </m:r>
-          </m:e>
-          <m:sub>
-            <m:r>
-              <w:rPr>
-                <w:sz w:val="20"/>
-                <w:szCs w:val="20"/>
-              </w:rPr>
-              <m:t>1</m:t>
+              <m:t>w</m:t>
             </m:r>
           </m:sub>
         </m:sSub>
@@ -1502,932 +1219,7 @@
           <w:i w:val="0"/>
           <w:sz w:val="20"/>
         </w:rPr>
-        <w:t>. Кожен наступний зразок уточнює концепт операцією редукції (custom reduction operation, CRO) за формулою (2):</w:t>
-      </w:r>
-    </w:p>
-    <w:p>
-      <w:pPr>
-        <w:tabs>
-          <w:tab w:pos="9638" w:val="right"/>
-        </w:tabs>
-        <w:spacing w:lineRule="auto" w:line="240" w:before="80" w:after="80"/>
-        <w:jc w:val="center"/>
-      </w:pPr>
-      <m:oMathPara>
-        <m:oMath>
-          <m:sSub>
-            <m:e>
-              <m:r>
-                <w:rPr>
-                  <w:sz w:val="20"/>
-                  <w:szCs w:val="20"/>
-                </w:rPr>
-                <m:t>C</m:t>
-              </m:r>
-            </m:e>
-            <m:sub>
-              <m:r>
-                <w:rPr>
-                  <w:sz w:val="20"/>
-                  <w:szCs w:val="20"/>
-                </w:rPr>
-                <m:t>i</m:t>
-              </m:r>
-              <m:r>
-                <m:rPr>
-                  <m:sty m:val="p"/>
-                </m:rPr>
-                <w:rPr>
-                  <w:sz w:val="20"/>
-                  <w:szCs w:val="20"/>
-                </w:rPr>
-                <m:t>+</m:t>
-              </m:r>
-              <m:r>
-                <w:rPr>
-                  <w:sz w:val="20"/>
-                  <w:szCs w:val="20"/>
-                </w:rPr>
-                <m:t>1</m:t>
-              </m:r>
-            </m:sub>
-          </m:sSub>
-          <m:r>
-            <m:rPr>
-              <m:sty m:val="p"/>
-            </m:rPr>
-            <w:rPr>
-              <w:sz w:val="20"/>
-              <w:szCs w:val="20"/>
-            </w:rPr>
-            <m:t>=</m:t>
-          </m:r>
-          <m:r>
-            <m:rPr>
-              <m:sty m:val="p"/>
-            </m:rPr>
-            <w:rPr>
-              <w:sz w:val="20"/>
-              <w:szCs w:val="20"/>
-            </w:rPr>
-            <m:t>C</m:t>
-          </m:r>
-          <m:r>
-            <m:rPr>
-              <m:sty m:val="p"/>
-            </m:rPr>
-            <w:rPr>
-              <w:sz w:val="20"/>
-              <w:szCs w:val="20"/>
-            </w:rPr>
-            <m:t>R</m:t>
-          </m:r>
-          <m:r>
-            <m:rPr>
-              <m:sty m:val="p"/>
-            </m:rPr>
-            <w:rPr>
-              <w:sz w:val="20"/>
-              <w:szCs w:val="20"/>
-            </w:rPr>
-            <m:t>O</m:t>
-          </m:r>
-          <m:r>
-            <m:rPr>
-              <m:sty m:val="p"/>
-            </m:rPr>
-            <w:rPr>
-              <w:sz w:val="20"/>
-              <w:szCs w:val="20"/>
-            </w:rPr>
-            <m:t>(</m:t>
-          </m:r>
-          <m:sSub>
-            <m:e>
-              <m:r>
-                <w:rPr>
-                  <w:sz w:val="20"/>
-                  <w:szCs w:val="20"/>
-                </w:rPr>
-                <m:t>C</m:t>
-              </m:r>
-            </m:e>
-            <m:sub>
-              <m:r>
-                <w:rPr>
-                  <w:sz w:val="20"/>
-                  <w:szCs w:val="20"/>
-                </w:rPr>
-                <m:t>i</m:t>
-              </m:r>
-            </m:sub>
-          </m:sSub>
-          <m:r>
-            <m:rPr>
-              <m:sty m:val="p"/>
-            </m:rPr>
-            <w:rPr>
-              <w:sz w:val="20"/>
-              <w:szCs w:val="20"/>
-            </w:rPr>
-            <m:t>,</m:t>
-          </m:r>
-          <m:r>
-            <w:rPr>
-              <w:sz w:val="20"/>
-              <w:szCs w:val="20"/>
-            </w:rPr>
-            <m:t> </m:t>
-          </m:r>
-          <m:sSub>
-            <m:e>
-              <m:r>
-                <w:rPr>
-                  <w:sz w:val="20"/>
-                  <w:szCs w:val="20"/>
-                </w:rPr>
-                <m:t>G</m:t>
-              </m:r>
-            </m:e>
-            <m:sub>
-              <m:r>
-                <w:rPr>
-                  <w:sz w:val="20"/>
-                  <w:szCs w:val="20"/>
-                </w:rPr>
-                <m:t>i</m:t>
-              </m:r>
-              <m:r>
-                <m:rPr>
-                  <m:sty m:val="p"/>
-                </m:rPr>
-                <w:rPr>
-                  <w:sz w:val="20"/>
-                  <w:szCs w:val="20"/>
-                </w:rPr>
-                <m:t>+</m:t>
-              </m:r>
-              <m:r>
-                <w:rPr>
-                  <w:sz w:val="20"/>
-                  <w:szCs w:val="20"/>
-                </w:rPr>
-                <m:t>1</m:t>
-              </m:r>
-            </m:sub>
-          </m:sSub>
-          <m:r>
-            <m:rPr>
-              <m:sty m:val="p"/>
-            </m:rPr>
-            <w:rPr>
-              <w:sz w:val="20"/>
-              <w:szCs w:val="20"/>
-            </w:rPr>
-            <m:t>)</m:t>
-          </m:r>
-          <m:r>
-            <m:rPr>
-              <m:sty m:val="p"/>
-            </m:rPr>
-            <w:rPr>
-              <w:sz w:val="20"/>
-              <w:szCs w:val="20"/>
-            </w:rPr>
-            <m:t>,</m:t>
-          </m:r>
-          <m:r>
-            <w:rPr>
-              <w:sz w:val="20"/>
-              <w:szCs w:val="20"/>
-            </w:rPr>
-            <m:t> </m:t>
-          </m:r>
-          <m:r>
-            <w:rPr>
-              <w:sz w:val="20"/>
-              <w:szCs w:val="20"/>
-            </w:rPr>
-            <m:t>i</m:t>
-          </m:r>
-          <m:r>
-            <m:rPr>
-              <m:sty m:val="p"/>
-            </m:rPr>
-            <w:rPr>
-              <w:sz w:val="20"/>
-              <w:szCs w:val="20"/>
-            </w:rPr>
-            <m:t>=</m:t>
-          </m:r>
-          <m:r>
-            <w:rPr>
-              <w:sz w:val="20"/>
-              <w:szCs w:val="20"/>
-            </w:rPr>
-            <m:t>1</m:t>
-          </m:r>
-          <m:r>
-            <m:rPr>
-              <m:sty m:val="p"/>
-            </m:rPr>
-            <w:rPr>
-              <w:sz w:val="20"/>
-              <w:szCs w:val="20"/>
-            </w:rPr>
-            <m:t>,</m:t>
-          </m:r>
-          <m:r>
-            <m:rPr>
-              <m:sty m:val="p"/>
-            </m:rPr>
-            <w:rPr>
-              <w:sz w:val="20"/>
-              <w:szCs w:val="20"/>
-            </w:rPr>
-            <m:t>…</m:t>
-          </m:r>
-          <m:r>
-            <m:rPr>
-              <m:sty m:val="p"/>
-            </m:rPr>
-            <w:rPr>
-              <w:sz w:val="20"/>
-              <w:szCs w:val="20"/>
-            </w:rPr>
-            <m:t>,</m:t>
-          </m:r>
-          <m:r>
-            <w:rPr>
-              <w:sz w:val="20"/>
-              <w:szCs w:val="20"/>
-            </w:rPr>
-            <m:t>n</m:t>
-          </m:r>
-          <m:r>
-            <m:rPr>
-              <m:sty m:val="p"/>
-            </m:rPr>
-            <w:rPr>
-              <w:sz w:val="20"/>
-              <w:szCs w:val="20"/>
-            </w:rPr>
-            <m:t>−</m:t>
-          </m:r>
-          <m:r>
-            <w:rPr>
-              <w:sz w:val="20"/>
-              <w:szCs w:val="20"/>
-            </w:rPr>
-            <m:t>1</m:t>
-          </m:r>
-        </m:oMath>
-      </m:oMathPara>
-      <w:r>
-        <w:rPr>
-          <w:rFonts w:ascii="Times New Roman" w:hAnsi="Times New Roman"/>
-          <w:b w:val="0"/>
-          <w:i w:val="0"/>
-          <w:sz w:val="20"/>
-        </w:rPr>
-        <w:tab/>
-        <w:t>(2)</w:t>
-      </w:r>
-    </w:p>
-    <w:p>
-      <w:pPr>
-        <w:spacing w:lineRule="exact" w:line="280" w:before="0" w:after="0"/>
-        <w:ind w:firstLine="567"/>
-        <w:jc w:val="both"/>
-      </w:pPr>
-      <w:r>
-        <w:rPr>
-          <w:rFonts w:ascii="Times New Roman" w:hAnsi="Times New Roman"/>
-          <w:b w:val="0"/>
-          <w:i w:val="0"/>
-          <w:sz w:val="20"/>
-        </w:rPr>
-        <w:t xml:space="preserve">де </w:t>
-      </w:r>
-      <m:oMath>
-        <m:sSub>
-          <m:e>
-            <m:r>
-              <w:rPr>
-                <w:sz w:val="20"/>
-                <w:szCs w:val="20"/>
-              </w:rPr>
-              <m:t>C</m:t>
-            </m:r>
-          </m:e>
-          <m:sub>
-            <m:r>
-              <w:rPr>
-                <w:sz w:val="20"/>
-                <w:szCs w:val="20"/>
-              </w:rPr>
-              <m:t>i</m:t>
-            </m:r>
-          </m:sub>
-        </m:sSub>
-      </m:oMath>
-      <w:r>
-        <w:rPr>
-          <w:rFonts w:ascii="Times New Roman" w:hAnsi="Times New Roman"/>
-          <w:b w:val="0"/>
-          <w:i w:val="0"/>
-          <w:sz w:val="20"/>
-        </w:rPr>
-        <w:t xml:space="preserve"> — поточний стан концепту, </w:t>
-      </w:r>
-      <m:oMath>
-        <m:sSub>
-          <m:e>
-            <m:r>
-              <w:rPr>
-                <w:sz w:val="20"/>
-                <w:szCs w:val="20"/>
-              </w:rPr>
-              <m:t>G</m:t>
-            </m:r>
-          </m:e>
-          <m:sub>
-            <m:r>
-              <w:rPr>
-                <w:sz w:val="20"/>
-                <w:szCs w:val="20"/>
-              </w:rPr>
-              <m:t>i</m:t>
-            </m:r>
-            <m:r>
-              <m:rPr>
-                <m:sty m:val="p"/>
-              </m:rPr>
-              <w:rPr>
-                <w:sz w:val="20"/>
-                <w:szCs w:val="20"/>
-              </w:rPr>
-              <m:t>+</m:t>
-            </m:r>
-            <m:r>
-              <w:rPr>
-                <w:sz w:val="20"/>
-                <w:szCs w:val="20"/>
-              </w:rPr>
-              <m:t>1</m:t>
-            </m:r>
-          </m:sub>
-        </m:sSub>
-      </m:oMath>
-      <w:r>
-        <w:rPr>
-          <w:rFonts w:ascii="Times New Roman" w:hAnsi="Times New Roman"/>
-          <w:b w:val="0"/>
-          <w:i w:val="0"/>
-          <w:sz w:val="20"/>
-        </w:rPr>
-        <w:t xml:space="preserve"> — граф наступного зразка, n — кількість зразків.</w:t>
-      </w:r>
-    </w:p>
-    <w:p>
-      <w:pPr>
-        <w:spacing w:lineRule="exact" w:line="280" w:before="0" w:after="0"/>
-        <w:ind w:firstLine="567"/>
-        <w:jc w:val="both"/>
-      </w:pPr>
-      <w:r>
-        <w:rPr>
-          <w:rFonts w:ascii="Times New Roman" w:hAnsi="Times New Roman"/>
-          <w:b w:val="0"/>
-          <w:i w:val="0"/>
-          <w:sz w:val="20"/>
-        </w:rPr>
-        <w:t>Обробка одного зразка складається з п'яти кроків. Спершу суміщають початкові точки концепту й нового графа, щоб обидва обходи стартували з відповідних місць контуру. Потім виконують попередню обробку критичних точок стратегіями редукції. Далі обидва графи обходять синхронно, на зіставлених шляхах визначають спільну структуру, і наприкінці зливають властивості відповідних вузлів. У концепті лишається та частина структури, яка повторюється в усіх опрацьованих зразках класу.</w:t>
-      </w:r>
-    </w:p>
-    <w:p>
-      <w:pPr>
-        <w:spacing w:lineRule="exact" w:line="280" w:before="0" w:after="0"/>
-        <w:ind w:firstLine="567"/>
-        <w:jc w:val="both"/>
-      </w:pPr>
-      <w:r>
-        <w:rPr>
-          <w:rFonts w:ascii="Times New Roman" w:hAnsi="Times New Roman"/>
-          <w:b w:val="0"/>
-          <w:i w:val="0"/>
-          <w:sz w:val="20"/>
-        </w:rPr>
-        <w:t>Застосовано три стратегії редукції. Перша вилучає кінцеві точки, які не мають відповідника в другому графі: за матрицею подібності знаходять точку без відповідника і вилучають її разом зі шляхом до найближчої критичної точки. Друга зливає точки перетину: IntersectionPoint зі степенем не більше двох перекласифіковують у CornerPoint або EndPoint, а надлишкові перетини вилучають, починаючи з тих, що мають найнижчу подібність. Третя нормалізує шляхи між критичними точками: серед простих шляхів обирають пару з найвищою подібністю вузлів, і коротший шлях стає шаблоном для довшого.</w:t>
-      </w:r>
-    </w:p>
-    <w:p>
-      <w:pPr>
-        <w:spacing w:lineRule="exact" w:line="280" w:before="0" w:after="0"/>
-        <w:ind w:firstLine="567"/>
-        <w:jc w:val="both"/>
-      </w:pPr>
-      <w:r>
-        <w:rPr>
-          <w:rFonts w:ascii="Times New Roman" w:hAnsi="Times New Roman"/>
-          <w:b w:val="0"/>
-          <w:i w:val="0"/>
-          <w:sz w:val="20"/>
-        </w:rPr>
-        <w:t>Редукція типів вузлів відбувається за ієрархією IntersectionPoint → CornerPoint → Point. Вузол може втратити тип, але не набути складнішого. StartPoint і EndPoint не редукуються: вони задають межі структури і точку входу в обхід.</w:t>
-      </w:r>
-    </w:p>
-    <w:p>
-      <w:pPr>
-        <w:spacing w:lineRule="exact" w:line="280" w:before="0" w:after="0"/>
-        <w:ind w:firstLine="567"/>
-        <w:jc w:val="both"/>
-      </w:pPr>
-      <w:r>
-        <w:rPr>
-          <w:rFonts w:ascii="Times New Roman" w:hAnsi="Times New Roman"/>
-          <w:b w:val="0"/>
-          <w:i w:val="0"/>
-          <w:sz w:val="20"/>
-        </w:rPr>
-        <w:t>Разом зі структурою узагальнюють і атрибути. Числові атрибути перетворюють на інтервали з трьома значеннями: min, max і center. Категорійні атрибути зберігають лише тоді, коли вони збігаються в усіх зразках; розбіжність призводить до вилучення атрибута. Списки міток замінюють перетином множин. Концепт зберігає діапазон допустимої варіації ознаки, а не її точкове значення.</w:t>
-      </w:r>
-    </w:p>
-    <w:p>
-      <w:pPr>
-        <w:spacing w:lineRule="exact" w:line="280" w:before="0" w:after="0"/>
-        <w:ind w:firstLine="567"/>
-        <w:jc w:val="both"/>
-      </w:pPr>
-      <w:r>
-        <w:rPr>
-          <w:rFonts w:ascii="Times New Roman" w:hAnsi="Times New Roman"/>
-          <w:b w:val="0"/>
-          <w:i w:val="0"/>
-          <w:sz w:val="20"/>
-        </w:rPr>
-        <w:t>Формування зупиняють, коли додавання наступного зразка вже не змінює концепт. Такий концепт є нерухомою точкою операції CRO щодо решти зразків класу. Кількість зразків до зупинки залежить від класу і наперед не задана.</w:t>
-      </w:r>
-    </w:p>
-    <w:p>
-      <w:pPr>
-        <w:spacing w:lineRule="exact" w:line="280" w:before="160" w:after="80"/>
-        <w:jc w:val="both"/>
-      </w:pPr>
-      <w:r>
-        <w:rPr>
-          <w:rFonts w:ascii="Times New Roman" w:hAnsi="Times New Roman"/>
-          <w:b/>
-          <w:i w:val="0"/>
-          <w:sz w:val="20"/>
-        </w:rPr>
-        <w:t>2.4 Навчальні дані та політика відбору зразків</w:t>
-      </w:r>
-    </w:p>
-    <w:p>
-      <w:pPr>
-        <w:spacing w:lineRule="exact" w:line="280" w:before="0" w:after="0"/>
-        <w:ind w:firstLine="567"/>
-        <w:jc w:val="both"/>
-      </w:pPr>
-      <w:r>
-        <w:rPr>
-          <w:rFonts w:ascii="Times New Roman" w:hAnsi="Times New Roman"/>
-          <w:b w:val="0"/>
-          <w:i w:val="0"/>
-          <w:sz w:val="20"/>
-        </w:rPr>
-        <w:t>Алфавіт складається з 13 концептів для 10 класів цифр. Класи 1, 2 і 4 мають по два структурні підконцепти — 1_1 і 1_3, 2_1 і 2_2, 4_1 і 4_2, — бо ці цифри пишуть у двох топологічно різних стилях, які не зводяться один до одного редукцією. Решта класів мають по одному концепту. Розміри концептів і кількість навчальних зразків наведено в підрозділі 3.1.</w:t>
-      </w:r>
-    </w:p>
-    <w:p>
-      <w:pPr>
-        <w:spacing w:lineRule="exact" w:line="280" w:before="0" w:after="0"/>
-        <w:ind w:firstLine="567"/>
-        <w:jc w:val="both"/>
-      </w:pPr>
-      <w:r>
-        <w:rPr>
-          <w:rFonts w:ascii="Times New Roman" w:hAnsi="Times New Roman"/>
-          <w:b w:val="0"/>
-          <w:i w:val="0"/>
-          <w:sz w:val="20"/>
-        </w:rPr>
-        <w:t>Кількість зразків, потрібних для одного концепту, визначає правило зупинки з підрозділу 2.3; наперед заданої квоти немає. Кожен зразок доповнено приблизно десятьма аугментованими варіантами: випадковий поворот у межах ±10° і зсув до 10 % розміру зображення. Разом навчальна вибірка містить 805 зображень.</w:t>
-      </w:r>
-    </w:p>
-    <w:p>
-      <w:pPr>
-        <w:spacing w:lineRule="exact" w:line="280" w:before="0" w:after="0"/>
-        <w:ind w:firstLine="567"/>
-        <w:jc w:val="both"/>
-      </w:pPr>
-      <w:r>
-        <w:rPr>
-          <w:rFonts w:ascii="Times New Roman" w:hAnsi="Times New Roman"/>
-          <w:b w:val="0"/>
-          <w:i w:val="0"/>
-          <w:sz w:val="20"/>
-        </w:rPr>
-        <w:t>Зразки відібрано вручну, а не випадково з навчальної частини набору. Критерій відбору — найменш спотворені написання без розривів контуру. В основі такого відбору лежить припущення, що правильно розпізнаний представник класу вже містить усі структурні й топологічні ознаки цього класу. Тоді формування концепту потребує не репрезентативної вибірки розподілу, а невеликої кількості структурно повних написань. Розподіл варіацій вносить аугментація: структуру концепту задають самі зразки, а межі інтервалів параметрів формують їхні аугментовані варіанти.</w:t>
-      </w:r>
-    </w:p>
-    <w:p>
-      <w:pPr>
-        <w:spacing w:lineRule="exact" w:line="280" w:before="0" w:after="0"/>
-        <w:ind w:firstLine="567"/>
-        <w:jc w:val="both"/>
-      </w:pPr>
-      <w:r>
-        <w:rPr>
-          <w:rFonts w:ascii="Times New Roman" w:hAnsi="Times New Roman"/>
-          <w:b w:val="0"/>
-          <w:i w:val="0"/>
-          <w:sz w:val="20"/>
-        </w:rPr>
-        <w:t>Межі цього припущення відомі лише частково. Чутливість підсумкової точності до конкретного вибору зразків у цій роботі не вимірювали, тому невідомо, наскільки інший добір змінив би результат. Це обмеження зазначено в розділі 4.</w:t>
-      </w:r>
-    </w:p>
-    <w:p>
-      <w:pPr>
-        <w:spacing w:lineRule="exact" w:line="280" w:before="160" w:after="80"/>
-        <w:jc w:val="both"/>
-      </w:pPr>
-      <w:r>
-        <w:rPr>
-          <w:rFonts w:ascii="Times New Roman" w:hAnsi="Times New Roman"/>
-          <w:b/>
-          <w:i w:val="0"/>
-          <w:sz w:val="20"/>
-        </w:rPr>
-        <w:t>2.5 Класифікація</w:t>
-      </w:r>
-    </w:p>
-    <w:p>
-      <w:pPr>
-        <w:spacing w:lineRule="exact" w:line="280" w:before="0" w:after="0"/>
-        <w:ind w:firstLine="567"/>
-        <w:jc w:val="both"/>
-      </w:pPr>
-      <w:r>
-        <w:rPr>
-          <w:rFonts w:ascii="Times New Roman" w:hAnsi="Times New Roman"/>
-          <w:b w:val="0"/>
-          <w:i w:val="0"/>
-          <w:sz w:val="20"/>
-        </w:rPr>
-        <w:t xml:space="preserve">Класифікація зіставляє граф вхідного зображення з кожним концептом алфавіту. Перед обчисленням відстані працює попередній фільтр складності. Складність графа визначено як </w:t>
-      </w:r>
-      <m:oMath>
-        <m:r>
-          <w:rPr>
-            <w:sz w:val="20"/>
-            <w:szCs w:val="20"/>
-          </w:rPr>
-          <m:t>C</m:t>
-        </m:r>
-        <m:r>
-          <m:rPr>
-            <m:sty m:val="p"/>
-          </m:rPr>
-          <w:rPr>
-            <w:sz w:val="20"/>
-            <w:szCs w:val="20"/>
-          </w:rPr>
-          <m:t>=</m:t>
-        </m:r>
-        <m:r>
-          <m:rPr>
-            <m:sty m:val="p"/>
-          </m:rPr>
-          <w:rPr>
-            <w:sz w:val="20"/>
-            <w:szCs w:val="20"/>
-          </w:rPr>
-          <m:t>|</m:t>
-        </m:r>
-        <m:r>
-          <w:rPr>
-            <w:sz w:val="20"/>
-            <w:szCs w:val="20"/>
-          </w:rPr>
-          <m:t>V</m:t>
-        </m:r>
-        <m:r>
-          <m:rPr>
-            <m:sty m:val="p"/>
-          </m:rPr>
-          <w:rPr>
-            <w:sz w:val="20"/>
-            <w:szCs w:val="20"/>
-          </w:rPr>
-          <m:t>|</m:t>
-        </m:r>
-        <m:r>
-          <m:rPr>
-            <m:sty m:val="p"/>
-          </m:rPr>
-          <w:rPr>
-            <w:sz w:val="20"/>
-            <w:szCs w:val="20"/>
-          </w:rPr>
-          <m:t>+</m:t>
-        </m:r>
-        <m:r>
-          <m:rPr>
-            <m:sty m:val="p"/>
-          </m:rPr>
-          <w:rPr>
-            <w:sz w:val="20"/>
-            <w:szCs w:val="20"/>
-          </w:rPr>
-          <m:t>|</m:t>
-        </m:r>
-        <m:r>
-          <w:rPr>
-            <w:sz w:val="20"/>
-            <w:szCs w:val="20"/>
-          </w:rPr>
-          <m:t>E</m:t>
-        </m:r>
-        <m:r>
-          <m:rPr>
-            <m:sty m:val="p"/>
-          </m:rPr>
-          <w:rPr>
-            <w:sz w:val="20"/>
-            <w:szCs w:val="20"/>
-          </w:rPr>
-          <m:t>|</m:t>
-        </m:r>
-      </m:oMath>
-      <w:r>
-        <w:rPr>
-          <w:rFonts w:ascii="Times New Roman" w:hAnsi="Times New Roman"/>
-          <w:b w:val="0"/>
-          <w:i w:val="0"/>
-          <w:sz w:val="20"/>
-        </w:rPr>
-        <w:t>, тобто суму кількості вузлів і кількості ребер. Концепти, складність яких перевищує складність вхідного графа, відкидаються ще до порівняння.</w:t>
-      </w:r>
-    </w:p>
-    <w:p>
-      <w:pPr>
-        <w:spacing w:lineRule="exact" w:line="280" w:before="0" w:after="0"/>
-        <w:ind w:firstLine="567"/>
-        <w:jc w:val="both"/>
-      </w:pPr>
-      <w:r>
-        <w:rPr>
-          <w:rFonts w:ascii="Times New Roman" w:hAnsi="Times New Roman"/>
-          <w:b w:val="0"/>
-          <w:i w:val="0"/>
-          <w:sz w:val="20"/>
-        </w:rPr>
-        <w:t>Міру відмінності двох графів дає GED — мінімальна сумарна вартість послідовності операцій, яка перетворює один граф на інший. Операціями редагування є вставлення, вилучення та заміщення вузлів і ребер. Точне обчислення GED є NP-складною задачею, тому практичні системи спираються на наближені алгоритми [18]. У цій роботі відстань обчислює anytime-розв'язувач, який шукає оптимальні шляхи редагування з обмеженням часу 5 с на одне порівняння "зображення — концепт" і повертає найкращий знайдений на цей момент результат.</w:t>
-      </w:r>
-    </w:p>
-    <w:p>
-      <w:pPr>
-        <w:spacing w:lineRule="exact" w:line="280" w:before="0" w:after="0"/>
-        <w:ind w:firstLine="567"/>
-        <w:jc w:val="both"/>
-      </w:pPr>
-      <w:r>
-        <w:rPr>
-          <w:rFonts w:ascii="Times New Roman" w:hAnsi="Times New Roman"/>
-          <w:b w:val="0"/>
-          <w:i w:val="0"/>
-          <w:sz w:val="20"/>
-        </w:rPr>
-        <w:t>Вартості заміщення задано монотонною шкалою: NO_COST = 0, MINOR = 0,25, GENERAL = 0,5, SEVERE = 0,8, NO_MATCH = 1,0 та IMPOSSIBLE = 6,0. Рівень IMPOSSIBLE призначено несумісним типам вузлів; його вартість фактично блокує таке заміщення.</w:t>
-      </w:r>
-    </w:p>
-    <w:p>
-      <w:pPr>
-        <w:spacing w:lineRule="exact" w:line="280" w:before="0" w:after="0"/>
-        <w:ind w:firstLine="567"/>
-        <w:jc w:val="both"/>
-      </w:pPr>
-      <w:r>
-        <w:rPr>
-          <w:rFonts w:ascii="Times New Roman" w:hAnsi="Times New Roman"/>
-          <w:b w:val="0"/>
-          <w:i w:val="0"/>
-          <w:sz w:val="20"/>
-        </w:rPr>
-        <w:t>Порівняння вузлів спирається на 13 ознак: нормалізовані координати, відстань до центроїда, горизонтальний і вертикальний напрямки, кут з віссю абсцис, мінімальний кут у вузлі розгалуження, індикатор кінцевої точки, індикатор кутової точки, відношення довжини до максимальної, середню довжину сусідніх векторів, кількість сусідніх кінцевих точок і кількість сусідніх розгалужень.</w:t>
-      </w:r>
-    </w:p>
-    <w:p>
-      <w:pPr>
-        <w:spacing w:lineRule="exact" w:line="280" w:before="0" w:after="0"/>
-        <w:ind w:firstLine="567"/>
-        <w:jc w:val="both"/>
-      </w:pPr>
-      <w:r>
-        <w:rPr>
-          <w:rFonts w:ascii="Times New Roman" w:hAnsi="Times New Roman"/>
-          <w:b w:val="0"/>
-          <w:i w:val="0"/>
-          <w:sz w:val="20"/>
-        </w:rPr>
-        <w:t>Внесок ознаки у вартість заміщення зважено діагностично: вага обернено пропорційна ширині інтервалу цієї ознаки у вузлі концепту (3):</w:t>
-      </w:r>
-    </w:p>
-    <w:p>
-      <w:pPr>
-        <w:tabs>
-          <w:tab w:pos="9638" w:val="right"/>
-        </w:tabs>
-        <w:spacing w:lineRule="auto" w:line="240" w:before="80" w:after="80"/>
-        <w:jc w:val="center"/>
-      </w:pPr>
-      <m:oMathPara>
-        <m:oMath>
-          <m:sSub>
-            <m:e>
-              <m:r>
-                <w:rPr>
-                  <w:sz w:val="20"/>
-                  <w:szCs w:val="20"/>
-                </w:rPr>
-                <m:t>w</m:t>
-              </m:r>
-            </m:e>
-            <m:sub>
-              <m:r>
-                <w:rPr>
-                  <w:sz w:val="20"/>
-                  <w:szCs w:val="20"/>
-                </w:rPr>
-                <m:t>f</m:t>
-              </m:r>
-            </m:sub>
-          </m:sSub>
-          <m:r>
-            <m:rPr>
-              <m:sty m:val="p"/>
-            </m:rPr>
-            <w:rPr>
-              <w:sz w:val="20"/>
-              <w:szCs w:val="20"/>
-            </w:rPr>
-            <m:t>=</m:t>
-          </m:r>
-          <m:f>
-            <m:fPr>
-              <m:type m:val="bar"/>
-            </m:fPr>
-            <m:num>
-              <m:r>
-                <w:rPr>
-                  <w:sz w:val="20"/>
-                  <w:szCs w:val="20"/>
-                </w:rPr>
-                <m:t>1</m:t>
-              </m:r>
-            </m:num>
-            <m:den>
-              <m:sSub>
-                <m:e>
-                  <m:r>
-                    <m:rPr>
-                      <m:sty m:val="p"/>
-                    </m:rPr>
-                    <w:rPr>
-                      <w:sz w:val="20"/>
-                      <w:szCs w:val="20"/>
-                    </w:rPr>
-                    <m:t>Δ</m:t>
-                  </m:r>
-                </m:e>
-                <m:sub>
-                  <m:r>
-                    <w:rPr>
-                      <w:sz w:val="20"/>
-                      <w:szCs w:val="20"/>
-                    </w:rPr>
-                    <m:t>f</m:t>
-                  </m:r>
-                </m:sub>
-              </m:sSub>
-              <m:r>
-                <m:rPr>
-                  <m:sty m:val="p"/>
-                </m:rPr>
-                <w:rPr>
-                  <w:sz w:val="20"/>
-                  <w:szCs w:val="20"/>
-                </w:rPr>
-                <m:t>+</m:t>
-              </m:r>
-              <m:r>
-                <w:rPr>
-                  <w:sz w:val="20"/>
-                  <w:szCs w:val="20"/>
-                </w:rPr>
-                <m:t>ε</m:t>
-              </m:r>
-            </m:den>
-          </m:f>
-        </m:oMath>
-      </m:oMathPara>
-      <w:r>
-        <w:rPr>
-          <w:rFonts w:ascii="Times New Roman" w:hAnsi="Times New Roman"/>
-          <w:b w:val="0"/>
-          <w:i w:val="0"/>
-          <w:sz w:val="20"/>
-        </w:rPr>
-        <w:tab/>
-        <w:t>(3)</w:t>
-      </w:r>
-    </w:p>
-    <w:p>
-      <w:pPr>
-        <w:spacing w:lineRule="exact" w:line="280" w:before="0" w:after="0"/>
-        <w:ind w:firstLine="567"/>
-        <w:jc w:val="both"/>
-      </w:pPr>
-      <w:r>
-        <w:rPr>
-          <w:rFonts w:ascii="Times New Roman" w:hAnsi="Times New Roman"/>
-          <w:b w:val="0"/>
-          <w:i w:val="0"/>
-          <w:sz w:val="20"/>
-        </w:rPr>
-        <w:t xml:space="preserve">де </w:t>
-      </w:r>
-      <m:oMath>
-        <m:sSub>
-          <m:e>
-            <m:r>
-              <m:rPr>
-                <m:sty m:val="p"/>
-              </m:rPr>
-              <w:rPr>
-                <w:sz w:val="20"/>
-                <w:szCs w:val="20"/>
-              </w:rPr>
-              <m:t>Δ</m:t>
-            </m:r>
-          </m:e>
-          <m:sub>
-            <m:r>
-              <w:rPr>
-                <w:sz w:val="20"/>
-                <w:szCs w:val="20"/>
-              </w:rPr>
-              <m:t>f</m:t>
-            </m:r>
-          </m:sub>
-        </m:sSub>
-      </m:oMath>
-      <w:r>
-        <w:rPr>
-          <w:rFonts w:ascii="Times New Roman" w:hAnsi="Times New Roman"/>
-          <w:b w:val="0"/>
-          <w:i w:val="0"/>
-          <w:sz w:val="20"/>
-        </w:rPr>
-        <w:t xml:space="preserve"> — ширина інтервалу ознаки </w:t>
-      </w:r>
-      <m:oMath>
-        <m:r>
-          <w:rPr>
-            <w:sz w:val="20"/>
-            <w:szCs w:val="20"/>
-          </w:rPr>
-          <m:t>f</m:t>
-        </m:r>
-      </m:oMath>
-      <w:r>
-        <w:rPr>
-          <w:rFonts w:ascii="Times New Roman" w:hAnsi="Times New Roman"/>
-          <w:b w:val="0"/>
-          <w:i w:val="0"/>
-          <w:sz w:val="20"/>
-        </w:rPr>
-        <w:t xml:space="preserve"> у вузлі концепту, </w:t>
-      </w:r>
-      <m:oMath>
-        <m:r>
-          <w:rPr>
-            <w:sz w:val="20"/>
-            <w:szCs w:val="20"/>
-          </w:rPr>
-          <m:t>ε</m:t>
-        </m:r>
-      </m:oMath>
-      <w:r>
-        <w:rPr>
-          <w:rFonts w:ascii="Times New Roman" w:hAnsi="Times New Roman"/>
-          <w:b w:val="0"/>
-          <w:i w:val="0"/>
-          <w:sz w:val="20"/>
-        </w:rPr>
-        <w:t xml:space="preserve"> = 0,1 — згладжувальний доданок. Вузький інтервал значень означає, що ознака стабільна в усіх навчальних зразках, тому вона несе сильніший діагностичний сигнал і важить більше. Широкий інтервал майже не впливає на вартість. Значення поза інтервалом концепту отримує повний штраф NO_MATCH.</w:t>
+        <w:t xml:space="preserve"> = 0,1, тому вузькі інтервали важать більше. Категорійні ознаки ширини не мають: вага кожного з двох напрямків дорівнює 0,6, індикаторів кінцевої й кутової точки — 0,4. Ваги нормують за спільними вибраними ознаками двох вузлів; відсутній ключ пропускають, а за відсутності спільних ознак призначають NO_MATCH. Значення в інтервалі коштує від нуля в center до нормованої ваги ознаки на межі інтервалу, лінійно за відстанню від center; нульова ширина дає точний збіг. Значення поза інтервалом завжди коштує 1,0 незалежно від ширини. Вартість заміщення вузла є сумою вартостей ознак.</w:t>
       </w:r>
     </w:p>
     <w:p>
@@ -2461,7 +1253,7 @@
           <w:i w:val="0"/>
           <w:sz w:val="20"/>
         </w:rPr>
-        <w:t xml:space="preserve"> переводять у подібність за формулою (4):</w:t>
+        <w:t xml:space="preserve"> переводять у подібність за формулою (1):</w:t>
       </w:r>
     </w:p>
     <w:p>
@@ -2731,7 +1523,7 @@
           <w:sz w:val="20"/>
         </w:rPr>
         <w:tab/>
-        <w:t>(4)</w:t>
+        <w:t>(1)</w:t>
       </w:r>
     </w:p>
     <w:p>
@@ -2809,7 +1601,7 @@
           <w:i w:val="0"/>
           <w:sz w:val="20"/>
         </w:rPr>
-        <w:t xml:space="preserve"> — кількості вузлів двох графів. Подібність лежить у діапазоні від 0 до 1, а нормування на більший граф робить її порівнянною для концептів різного розміру.</w:t>
+        <w:t xml:space="preserve"> — складності двох графів після залежної від концепту попередньої обробки. Подібність округлюють до чотирьох знаків; нормування на більшу складність робить її порівнянною для концептів різного розміру.</w:t>
       </w:r>
     </w:p>
     <w:p>
@@ -2825,7 +1617,7 @@
           <w:i w:val="0"/>
           <w:sz w:val="20"/>
         </w:rPr>
-        <w:t>Переможця обирають за правилом "переможець отримує все" (winner-take-all) з поправкою на складність концепту (5):</w:t>
+        <w:t>Переможця обирають за правилом "переможець отримує все" (winner-take-all) з поправкою на складність концепту (2):</w:t>
       </w:r>
     </w:p>
     <w:p>
@@ -2985,7 +1777,7 @@
           <w:sz w:val="20"/>
         </w:rPr>
         <w:tab/>
-        <w:t>(5)</w:t>
+        <w:t>(2)</w:t>
       </w:r>
     </w:p>
     <w:p>
@@ -3002,6 +1794,24 @@
           <w:sz w:val="20"/>
         </w:rPr>
         <w:t xml:space="preserve">де </w:t>
+      </w:r>
+      <m:oMath>
+        <m:r>
+          <w:rPr>
+            <w:sz w:val="20"/>
+            <w:szCs w:val="20"/>
+          </w:rPr>
+          <m:t>C</m:t>
+        </m:r>
+      </m:oMath>
+      <w:r>
+        <w:rPr>
+          <w:rFonts w:ascii="Times New Roman" w:hAnsi="Times New Roman"/>
+          <w:b w:val="0"/>
+          <w:i w:val="0"/>
+          <w:sz w:val="20"/>
+        </w:rPr>
+        <w:t xml:space="preserve"> — складність концепту, </w:t>
       </w:r>
       <m:oMath>
         <m:r>
@@ -3019,7 +1829,7 @@
           <w:i w:val="0"/>
           <w:sz w:val="20"/>
         </w:rPr>
-        <w:t xml:space="preserve"> = 0,10 — коефіцієнт м'якої переваги складніших концептів за близьких подібностей. Оцінку обчислюють для кожного концепту, який пройшов фільтр складності; перемагає концепт з найбільшою оцінкою. Якщо жоден концепт не активується, зображення позначають як нерозпізнане. Усі параметри порівняння фіксовані, а вся інформація про класи міститься в концептах.</w:t>
+        <w:t xml:space="preserve"> = 0,10. Концепт активується, якщо його попередня обробка й структурна перевірка завершилися успішно та GED обчислено. Активовані результати мають пріоритет над структурно відхиленими; серед активованих перемагає найбільша оцінка. Якщо активованих концептів немає, зображення позначають як нерозпізнане.</w:t>
       </w:r>
     </w:p>
     <w:p>
@@ -3065,23 +1875,7 @@
           <w:i w:val="0"/>
           <w:sz w:val="20"/>
         </w:rPr>
-        <w:t>Результати за першим і другим завданнями подано разом: графове подання, побудоване за першим завданням, не має числового результату окремо від структур, сформованих на ньому, тому його викладено у складі сформованого алфавіту.</w:t>
-      </w:r>
-    </w:p>
-    <w:p>
-      <w:pPr>
-        <w:spacing w:lineRule="exact" w:line="280" w:before="0" w:after="0"/>
-        <w:ind w:firstLine="567"/>
-        <w:jc w:val="both"/>
-      </w:pPr>
-      <w:r>
-        <w:rPr>
-          <w:rFonts w:ascii="Times New Roman" w:hAnsi="Times New Roman"/>
-          <w:b w:val="0"/>
-          <w:i w:val="0"/>
-          <w:sz w:val="20"/>
-        </w:rPr>
-        <w:t>Структурною редукцією з 76 унікальних навчальних зразків сформовано алфавіт з 13 концептів-атракторів для 10 класів цифр. Готові концепти містять від 3 до 12 вузлів, а на формування одного концепту пішло від 3 до 9 зразків. Розміри концептів і кількість зразків наведено в табл. 1.</w:t>
+        <w:t>Point–Vector подання з двома видами вузлів і 13 вибраними ознаками зіставлення побудовано. Структурною редукцією одним проходом через 76 вручну відібраних джерел та їхні аугментації, разом 805 зображень, сформовано 13 концептів-атракторів для 10 класів цифр. Концепти містять від 3 до 12 вузлів, на кожен подано від 3 до 9 вихідних джерел (табл. 1).</w:t>
       </w:r>
     </w:p>
     <w:p>
@@ -3096,7 +1890,7 @@
           <w:i/>
           <w:sz w:val="18"/>
         </w:rPr>
-        <w:t>Таблиця 1 – Алфавіт концептів: кількість вузлів і навчальних зразків</w:t>
+        <w:t>Таблиця 1 – Алфавіт концептів: кількість вузлів і вихідних джерел</w:t>
       </w:r>
     </w:p>
     <w:tbl>
@@ -3172,7 +1966,7 @@
                 <w:i w:val="0"/>
                 <w:sz w:val="18"/>
               </w:rPr>
-              <w:t>Унікальних зразків</w:t>
+              <w:t>Вихідних джерел</w:t>
             </w:r>
           </w:p>
         </w:tc>
@@ -4057,7 +2851,7 @@
           <w:i w:val="0"/>
           <w:sz w:val="20"/>
         </w:rPr>
-        <w:t>Стандартний тестовий набір MNIST містить 10 000 зображень [39]. До оцінювання допускалися лише ті з них, контурна структура яких повна, тобто не має розривів штриха. Таких зображень 8 707. Фільтр повноти відсіяв 1 293 зображення, або 12,9 % набору.</w:t>
+        <w:t>Повноту контуру розмічено вручну: кожне тестове зображення позначили як повне або неповне, до оцінювання допустили лише повні. Детальнішого протоколу розмітки не існує, а його незалежність від результатів класифікації не перевірено.</w:t>
       </w:r>
     </w:p>
     <w:p>
@@ -4073,7 +2867,7 @@
           <w:i w:val="0"/>
           <w:sz w:val="20"/>
         </w:rPr>
-        <w:t>Підстава цього обмеження така. Розірваний контур порушує структурні припущення, на яких побудоване подання, і граф такого зображення описує вже іншу фігуру. Розпізнавання розірваних структур потребує окремого механізму — асоціативного розпізнавання, яке в цій роботі не реалізоване. Тому оцінювання обмежене повними структурами. Звідси прямий наслідок: головна метрика є умовною щодо фільтра повноти, і наведені нижче числа не переносяться автоматично на повний тестовий набір MNIST.</w:t>
+        <w:t>Із 10 000 тестових зображень MNIST [40] допущено 8 707, тобто 87,07 %; 1 293 (12,93 %) виключено. Розпізнавання розірваних структур потребує окремого асоціативного механізму, якого система не має, тому метрики характеризують лише допущену підмножину.</w:t>
       </w:r>
     </w:p>
     <w:p>
@@ -4089,7 +2883,7 @@
           <w:i w:val="0"/>
           <w:sz w:val="20"/>
         </w:rPr>
-        <w:t>Фільтр діє нерівномірно за класами (табл. 2). Найбільше зображень зберігає клас 1 — 1 129, найменше клас 8 — 582, тобто 51,6 % від найбільшого класу. Такий перекіс означає, що покласові показники спираються на різні за обсягом вибірки, і для класу 8 підстава вужча.</w:t>
+        <w:t>Збереження за класами нерівномірне (табл. 2): від 582/974 = 59,75 % для цифри 8 до 1 129/1 135 = 99,47 % для цифри 1.</w:t>
       </w:r>
     </w:p>
     <w:p>
@@ -4104,7 +2898,7 @@
           <w:i/>
           <w:sz w:val="18"/>
         </w:rPr>
-        <w:t>Таблиця 2 – Розподіл тестових зображень за класами після фільтра повноти</w:t>
+        <w:t>Таблиця 2 – Збереження класів MNIST після ручного фільтра повноти</w:t>
       </w:r>
     </w:p>
     <w:tbl>
@@ -4159,7 +2953,7 @@
                 <w:i w:val="0"/>
                 <w:sz w:val="18"/>
               </w:rPr>
-              <w:t>Допущено зображень</w:t>
+              <w:t>Допущено / у MNIST</w:t>
             </w:r>
           </w:p>
         </w:tc>
@@ -4180,7 +2974,7 @@
                 <w:i w:val="0"/>
                 <w:sz w:val="18"/>
               </w:rPr>
-              <w:t>Частка від найбільшого класу, %</w:t>
+              <w:t>Збережено, %</w:t>
             </w:r>
           </w:p>
         </w:tc>
@@ -4224,7 +3018,7 @@
                 <w:i w:val="0"/>
                 <w:sz w:val="18"/>
               </w:rPr>
-              <w:t>830</w:t>
+              <w:t>830 / 980</w:t>
             </w:r>
           </w:p>
         </w:tc>
@@ -4245,7 +3039,7 @@
                 <w:i w:val="0"/>
                 <w:sz w:val="18"/>
               </w:rPr>
-              <w:t>73,5</w:t>
+              <w:t>84,69</w:t>
             </w:r>
           </w:p>
         </w:tc>
@@ -4289,7 +3083,7 @@
                 <w:i w:val="0"/>
                 <w:sz w:val="18"/>
               </w:rPr>
-              <w:t>1 129</w:t>
+              <w:t>1 129 / 1 135</w:t>
             </w:r>
           </w:p>
         </w:tc>
@@ -4310,7 +3104,7 @@
                 <w:i w:val="0"/>
                 <w:sz w:val="18"/>
               </w:rPr>
-              <w:t>100,0</w:t>
+              <w:t>99,47</w:t>
             </w:r>
           </w:p>
         </w:tc>
@@ -4354,7 +3148,7 @@
                 <w:i w:val="0"/>
                 <w:sz w:val="18"/>
               </w:rPr>
-              <w:t>956</w:t>
+              <w:t>956 / 1 032</w:t>
             </w:r>
           </w:p>
         </w:tc>
@@ -4375,7 +3169,7 @@
                 <w:i w:val="0"/>
                 <w:sz w:val="18"/>
               </w:rPr>
-              <w:t>84,7</w:t>
+              <w:t>92,64</w:t>
             </w:r>
           </w:p>
         </w:tc>
@@ -4419,7 +3213,7 @@
                 <w:i w:val="0"/>
                 <w:sz w:val="18"/>
               </w:rPr>
-              <w:t>969</w:t>
+              <w:t>969 / 1 010</w:t>
             </w:r>
           </w:p>
         </w:tc>
@@ -4440,7 +3234,7 @@
                 <w:i w:val="0"/>
                 <w:sz w:val="18"/>
               </w:rPr>
-              <w:t>85,8</w:t>
+              <w:t>95,94</w:t>
             </w:r>
           </w:p>
         </w:tc>
@@ -4484,7 +3278,7 @@
                 <w:i w:val="0"/>
                 <w:sz w:val="18"/>
               </w:rPr>
-              <w:t>953</w:t>
+              <w:t>953 / 982</w:t>
             </w:r>
           </w:p>
         </w:tc>
@@ -4505,7 +3299,7 @@
                 <w:i w:val="0"/>
                 <w:sz w:val="18"/>
               </w:rPr>
-              <w:t>84,4</w:t>
+              <w:t>97,05</w:t>
             </w:r>
           </w:p>
         </w:tc>
@@ -4549,7 +3343,7 @@
                 <w:i w:val="0"/>
                 <w:sz w:val="18"/>
               </w:rPr>
-              <w:t>796</w:t>
+              <w:t>796 / 892</w:t>
             </w:r>
           </w:p>
         </w:tc>
@@ -4570,7 +3364,7 @@
                 <w:i w:val="0"/>
                 <w:sz w:val="18"/>
               </w:rPr>
-              <w:t>70,5</w:t>
+              <w:t>89,24</w:t>
             </w:r>
           </w:p>
         </w:tc>
@@ -4614,7 +3408,7 @@
                 <w:i w:val="0"/>
                 <w:sz w:val="18"/>
               </w:rPr>
-              <w:t>742</w:t>
+              <w:t>742 / 958</w:t>
             </w:r>
           </w:p>
         </w:tc>
@@ -4635,7 +3429,7 @@
                 <w:i w:val="0"/>
                 <w:sz w:val="18"/>
               </w:rPr>
-              <w:t>65,7</w:t>
+              <w:t>77,45</w:t>
             </w:r>
           </w:p>
         </w:tc>
@@ -4679,7 +3473,7 @@
                 <w:i w:val="0"/>
                 <w:sz w:val="18"/>
               </w:rPr>
-              <w:t>1 014</w:t>
+              <w:t>1 014 / 1 028</w:t>
             </w:r>
           </w:p>
         </w:tc>
@@ -4700,7 +3494,7 @@
                 <w:i w:val="0"/>
                 <w:sz w:val="18"/>
               </w:rPr>
-              <w:t>89,8</w:t>
+              <w:t>98,64</w:t>
             </w:r>
           </w:p>
         </w:tc>
@@ -4744,7 +3538,7 @@
                 <w:i w:val="0"/>
                 <w:sz w:val="18"/>
               </w:rPr>
-              <w:t>582</w:t>
+              <w:t>582 / 974</w:t>
             </w:r>
           </w:p>
         </w:tc>
@@ -4765,7 +3559,7 @@
                 <w:i w:val="0"/>
                 <w:sz w:val="18"/>
               </w:rPr>
-              <w:t>51,6</w:t>
+              <w:t>59,75</w:t>
             </w:r>
           </w:p>
         </w:tc>
@@ -4809,7 +3603,7 @@
                 <w:i w:val="0"/>
                 <w:sz w:val="18"/>
               </w:rPr>
-              <w:t>736</w:t>
+              <w:t>736 / 1 009</w:t>
             </w:r>
           </w:p>
         </w:tc>
@@ -4830,7 +3624,7 @@
                 <w:i w:val="0"/>
                 <w:sz w:val="18"/>
               </w:rPr>
-              <w:t>65,2</w:t>
+              <w:t>72,94</w:t>
             </w:r>
           </w:p>
         </w:tc>
@@ -4874,7 +3668,7 @@
                 <w:i w:val="0"/>
                 <w:sz w:val="18"/>
               </w:rPr>
-              <w:t>8 707</w:t>
+              <w:t>8 707 / 10 000</w:t>
             </w:r>
           </w:p>
         </w:tc>
@@ -4895,7 +3689,7 @@
                 <w:i w:val="0"/>
                 <w:sz w:val="18"/>
               </w:rPr>
-              <w:t>—</w:t>
+              <w:t>87,07</w:t>
             </w:r>
           </w:p>
         </w:tc>
@@ -4920,7 +3714,7 @@
           <w:i w:val="0"/>
           <w:sz w:val="20"/>
         </w:rPr>
-        <w:t>Ще 22 зображення (0,25 %) не пройшли конвеєр побудови графа: скелетизація дала незв'язний граф. Ці випадки зараховано як помилки конвеєра. Класифікаційне рішення ухвалено для 8 685 зображень.</w:t>
+        <w:t>Для 22 допущених зображень (0,25 %) побудова графа не завершилася успішно, а артефакти не зберігають причини збою. Класифікаційне рішення одержано для 8 685 зображень; ці 22 випадки входять до знаменника точності на всіх допущених зображеннях.</w:t>
       </w:r>
     </w:p>
     <w:p>
@@ -4951,23 +3745,7 @@
           <w:i w:val="0"/>
           <w:sz w:val="20"/>
         </w:rPr>
-        <w:t>Підрозділ подає результат за третім і четвертим завданнями разом: якість побудованої процедури класифікації виміряно на даних, описаних у підрозділі 3.2.</w:t>
-      </w:r>
-    </w:p>
-    <w:p>
-      <w:pPr>
-        <w:spacing w:lineRule="exact" w:line="280" w:before="0" w:after="0"/>
-        <w:ind w:firstLine="567"/>
-        <w:jc w:val="both"/>
-      </w:pPr>
-      <w:r>
-        <w:rPr>
-          <w:rFonts w:ascii="Times New Roman" w:hAnsi="Times New Roman"/>
-          <w:b w:val="0"/>
-          <w:i w:val="0"/>
-          <w:sz w:val="20"/>
-        </w:rPr>
-        <w:t>На 8 685 класифікованих зображеннях точність становить 91,13 %, влучність — 91,92 %, повнота — 91,13 %, F1 — 91,34 %.</w:t>
+        <w:t>На 8 685 оброблених зображеннях отримано 7 915 правильних рішень: точність становить 91,13 %. Якщо 22 збої конвеєра вважати невдалими рішеннями й використати всі 8 707 допущених зображень, точність становить 90,90 %. Влучність 91,92 %, повнота 91,13 % і F1 91,34 % є середніми, зваженими за кількістю оброблених зображень класу.</w:t>
       </w:r>
     </w:p>
     <w:p>
@@ -5997,7 +4775,7 @@
           <w:i w:val="0"/>
           <w:sz w:val="20"/>
         </w:rPr>
-        <w:t>Помилки зосереджені на невеликій кількості пар (рис. 2). Найбільші пари сплутування (справжній клас → передбачений): 2→7 — 111 випадків, 4→7 — 62, 2→6 — 57, 4→1 — 52, 9→4 — 46, 5→3 — 43, 0→6 — 42, 1→7 — 26, 7→2 — 26, 2→3 — 25. На перші десять пар припадає понад дві третини всіх хибних віднесень. Два класи дають більшість помилок: клас 2 — 215, клас 4 — 155. Нерозпізнані зображення концентруються в класах 6 (16) і 8 (14).</w:t>
+        <w:t>Помилки зосереджені на невеликій кількості пар (рис. 2). Найбільші пари сплутування (справжній клас → передбачений): 2→7 — 111 випадків, 4→7 — 62, 2→6 — 57, 4→1 — 52, 9→4 — 46, 5→3 — 43, 0→6 — 42, 1→7 — 26, 7→2 — 26, 2→3 — 25. На перші десять пар припадає 490 із 726 хибних віднесень, або 67,5 %. Два найбільші внески серед 770 помилкових оброблених випадків дають класи 2 — 214 і 4 — 152, разом 47,53 %. Нерозпізнані зображення концентруються в класах 6 (16) і 8 (14).</w:t>
       </w:r>
     </w:p>
     <w:p>
@@ -6083,23 +4861,7 @@
           <w:i w:val="0"/>
           <w:sz w:val="20"/>
         </w:rPr>
-        <w:t>Цей підрозділ і наступний разом відповідають п'ятому завданню: тут показано пояснюваність рішення, у підрозділі 3.5 — вартість виведення.</w:t>
-      </w:r>
-    </w:p>
-    <w:p>
-      <w:pPr>
-        <w:spacing w:lineRule="exact" w:line="280" w:before="0" w:after="0"/>
-        <w:ind w:firstLine="567"/>
-        <w:jc w:val="both"/>
-      </w:pPr>
-      <w:r>
-        <w:rPr>
-          <w:rFonts w:ascii="Times New Roman" w:hAnsi="Times New Roman"/>
-          <w:b w:val="0"/>
-          <w:i w:val="0"/>
-          <w:sz w:val="20"/>
-        </w:rPr>
-        <w:t>Структурне подання дає змогу простежити кожне рішення до конкретних величин. Це показано на зображенні mnist_test_2_00766, справжній клас якого 2, а передбачений — 7. Випадок узято навмисно помилковий: пояснення має працювати й тоді, коли рішення хибне. Побудову графа і концепти-конкуренти показано на рис. 3, хід рішення — у табл. 4.</w:t>
+        <w:t>Зображення mnist_test_2_00766 має справжній клас 2, а передбачений — 7. Рис. 3 показує граф і концепти. Числа в табл. 4 походять з відтворення цього рішення налагоджувальним інструментом за параметрами прогону оцінювання; сам прогін поознакових вартостей не записував.</w:t>
       </w:r>
     </w:p>
     <w:p>
@@ -6170,7 +4932,7 @@
           <w:i w:val="0"/>
           <w:sz w:val="20"/>
         </w:rPr>
-        <w:t>Граф зображення має складність 21. Перший крок — фільтр складності. Багатший концепт двійки 2_2 має 12 вузлів і складність 24, тож умова 24 &gt; 21 відкидає його ще до порівняння. Причину збіднення входу видно з самого зображення: нижня петля двійки втрачена ще під час бінаризації, замкнена структура перетворилася на незамкнений відросток, і в графі немає ні циклу, ні точки перетину.</w:t>
+        <w:t>Початковий граф має 11 вузлів, 10 ребер і складність 21. Він ациклічний, але розгалужений і містить IntersectionPoint. Артефакти фіксують відсутність циклу й бінарної петлі, але не доводять, що петлю зруйнувала саме бінаризація. Концепт 2_2 зі складністю 24 відсікає умова 24 &gt; 21. Після залежної від концепту попередньої обробки структурно допустимі шість кандидатів: 7_1, 2_1, 3_1, 5_1, 1_3 і 1_1.</w:t>
       </w:r>
     </w:p>
     <w:p>
@@ -6186,7 +4948,23 @@
           <w:i w:val="0"/>
           <w:sz w:val="20"/>
         </w:rPr>
-        <w:t>Далі конкурують два концепти. У концепту 7_1 п'ять вузлів, усі вони заміщені в межах інтервалів концепту, вартості заміщень лежать у діапазоні 0,04–0,39, подібність — 0,8317. Концепт 2_1 має сім вузлів і структурно відповідає входу, проте три ознаки виходять за інтервали концепту й отримують повний штраф: distance_to_centroid — 1,01, normalized_x — 1,10, length_ratio_to_max — 1,30. Його подібність — 0,7300. Перемагає 7_1 з розривом 0,10 за подібністю.</w:t>
+        <w:t>Для 7_1 п'ять заміщень вузлів коштують 0,038–0,388, чотири вузли входу вилучено по 0,25; разом з операціями над ребрами c ≈ 3,44. Для 2_1 сім заміщень і два вилучення вузлів разом з операціями над ребрами дають c ≈ 6,29. Три окремі поознакові штрафи distance_to_centroid, normalized_x і length_ratio_to_max дорівнюють 1,000 кожен; 1,010, 1,103 і 1,302 є повними вартостями трьох заміщень вузлів.</w:t>
+      </w:r>
+    </w:p>
+    <w:p>
+      <w:pPr>
+        <w:spacing w:lineRule="exact" w:line="280" w:before="0" w:after="0"/>
+        <w:ind w:firstLine="567"/>
+        <w:jc w:val="both"/>
+      </w:pPr>
+      <w:r>
+        <w:rPr>
+          <w:rFonts w:ascii="Times New Roman" w:hAnsi="Times New Roman"/>
+          <w:b w:val="0"/>
+          <w:i w:val="0"/>
+          <w:sz w:val="20"/>
+        </w:rPr>
+        <w:t>В обох парах нормувальна складність попередньо обробленого графа зображення дорівнює 17. Тому 7_1 має подібність 0,8317 і оцінку 0,8317 + 0,1 · log₂ 9 = 1,1487, а 2_1 — 0,7300 і 0,7300 + 0,1 · log₂ 13 = 1,1000. Рішення обирає 7_1 з розривом оцінки 0,0486.</w:t>
       </w:r>
     </w:p>
     <w:p>
@@ -6201,7 +4979,7 @@
           <w:i/>
           <w:sz w:val="18"/>
         </w:rPr>
-        <w:t>Таблиця 4 – Хід ухвалення рішення для зображення mnist_test_2_00766 (складність вхідного графа 21)</w:t>
+        <w:t>Таблиця 4 – Архівне трасування mnist_test_2_00766: від операцій GED до оцінки</w:t>
       </w:r>
     </w:p>
     <w:tbl>
@@ -6257,7 +5035,7 @@
                 <w:i w:val="0"/>
                 <w:sz w:val="18"/>
               </w:rPr>
-              <w:t>Вузлів</w:t>
+              <w:t>Операції та вартість c</w:t>
             </w:r>
           </w:p>
         </w:tc>
@@ -6278,7 +5056,7 @@
                 <w:i w:val="0"/>
                 <w:sz w:val="18"/>
               </w:rPr>
-              <w:t>Результат зіставлення</w:t>
+              <w:t>Нормування і подібність</w:t>
             </w:r>
           </w:p>
         </w:tc>
@@ -6299,93 +5077,7 @@
                 <w:i w:val="0"/>
                 <w:sz w:val="18"/>
               </w:rPr>
-              <w:t>Подібність</w:t>
-            </w:r>
-          </w:p>
-        </w:tc>
-      </w:tr>
-      <w:tr>
-        <w:tc>
-          <w:tcPr>
-            <w:tcW w:type="dxa" w:w="2409"/>
-          </w:tcPr>
-          <w:p>
-            <w:pPr>
-              <w:spacing w:line="240" w:lineRule="auto" w:before="0" w:after="0"/>
-              <w:jc w:val="left"/>
-            </w:pPr>
-            <w:r/>
-            <w:r>
-              <w:rPr>
-                <w:rFonts w:ascii="Times New Roman" w:hAnsi="Times New Roman"/>
-                <w:b w:val="0"/>
-                <w:i w:val="0"/>
-                <w:sz w:val="18"/>
-              </w:rPr>
-              <w:t>2_2</w:t>
-            </w:r>
-          </w:p>
-        </w:tc>
-        <w:tc>
-          <w:tcPr>
-            <w:tcW w:type="dxa" w:w="2409"/>
-          </w:tcPr>
-          <w:p>
-            <w:pPr>
-              <w:spacing w:line="240" w:lineRule="auto" w:before="0" w:after="0"/>
-              <w:jc w:val="center"/>
-            </w:pPr>
-            <w:r/>
-            <w:r>
-              <w:rPr>
-                <w:rFonts w:ascii="Times New Roman" w:hAnsi="Times New Roman"/>
-                <w:b w:val="0"/>
-                <w:i w:val="0"/>
-                <w:sz w:val="18"/>
-              </w:rPr>
-              <w:t>12</w:t>
-            </w:r>
-          </w:p>
-        </w:tc>
-        <w:tc>
-          <w:tcPr>
-            <w:tcW w:type="dxa" w:w="2409"/>
-          </w:tcPr>
-          <w:p>
-            <w:pPr>
-              <w:spacing w:line="240" w:lineRule="auto" w:before="0" w:after="0"/>
-              <w:jc w:val="center"/>
-            </w:pPr>
-            <w:r/>
-            <w:r>
-              <w:rPr>
-                <w:rFonts w:ascii="Times New Roman" w:hAnsi="Times New Roman"/>
-                <w:b w:val="0"/>
-                <w:i w:val="0"/>
-                <w:sz w:val="18"/>
-              </w:rPr>
-              <w:t>складність 24 &gt; 21 — відсічений пре-фільтром</w:t>
-            </w:r>
-          </w:p>
-        </w:tc>
-        <w:tc>
-          <w:tcPr>
-            <w:tcW w:type="dxa" w:w="2409"/>
-          </w:tcPr>
-          <w:p>
-            <w:pPr>
-              <w:spacing w:line="240" w:lineRule="auto" w:before="0" w:after="0"/>
-              <w:jc w:val="center"/>
-            </w:pPr>
-            <w:r/>
-            <w:r>
-              <w:rPr>
-                <w:rFonts w:ascii="Times New Roman" w:hAnsi="Times New Roman"/>
-                <w:b w:val="0"/>
-                <w:i w:val="0"/>
-                <w:sz w:val="18"/>
-              </w:rPr>
-              <w:t>—</w:t>
+              <w:t>Оцінка</w:t>
             </w:r>
           </w:p>
         </w:tc>
@@ -6429,7 +5121,7 @@
                 <w:i w:val="0"/>
                 <w:sz w:val="18"/>
               </w:rPr>
-              <w:t>5</w:t>
+              <w:t>5 заміщень, 4 вилучення вузлів, 6 вилучень ребер; c ≈ 3,44</w:t>
             </w:r>
           </w:p>
         </w:tc>
@@ -6450,7 +5142,7 @@
                 <w:i w:val="0"/>
                 <w:sz w:val="18"/>
               </w:rPr>
-              <w:t>усі 5 вузлів у межах інтервалів, вартості 0,04–0,39</w:t>
+              <w:t>max(17, 9) = 17; sim = 0,8317</w:t>
             </w:r>
           </w:p>
         </w:tc>
@@ -6471,7 +5163,7 @@
                 <w:i w:val="0"/>
                 <w:sz w:val="18"/>
               </w:rPr>
-              <w:t>0,8317</w:t>
+              <w:t>1,1487</w:t>
             </w:r>
           </w:p>
         </w:tc>
@@ -6515,7 +5207,7 @@
                 <w:i w:val="0"/>
                 <w:sz w:val="18"/>
               </w:rPr>
-              <w:t>7</w:t>
+              <w:t>7 заміщень, 2 вилучення вузлів, 3 вилучення ребер; c ≈ 6,29</w:t>
             </w:r>
           </w:p>
         </w:tc>
@@ -6536,7 +5228,7 @@
                 <w:i w:val="0"/>
                 <w:sz w:val="18"/>
               </w:rPr>
-              <w:t>три ознаки поза інтервалами: distance_to_centroid (1,01), normalized_x (1,10), length_ratio_to_max (1,30)</w:t>
+              <w:t>max(17, 13) = 17; sim = 0,7300</w:t>
             </w:r>
           </w:p>
         </w:tc>
@@ -6557,7 +5249,7 @@
                 <w:i w:val="0"/>
                 <w:sz w:val="18"/>
               </w:rPr>
-              <w:t>0,7300</w:t>
+              <w:t>1,1000</w:t>
             </w:r>
           </w:p>
         </w:tc>
@@ -6582,102 +5274,7 @@
           <w:i w:val="0"/>
           <w:sz w:val="20"/>
         </w:rPr>
-        <w:t>Рішення розкладається на три складники: іменований концепт-атрактор, перелік заміщень вузлів і вартості за окремими ознаками. Кожну з цих величин можна перевірити за даними прогону.</w:t>
-      </w:r>
-    </w:p>
-    <w:p>
-      <w:pPr>
-        <w:spacing w:lineRule="exact" w:line="280" w:before="0" w:after="0"/>
-        <w:ind w:firstLine="567"/>
-        <w:jc w:val="both"/>
-      </w:pPr>
-      <w:r>
-        <w:rPr>
-          <w:rFonts w:ascii="Times New Roman" w:hAnsi="Times New Roman"/>
-          <w:b w:val="0"/>
-          <w:i w:val="0"/>
-          <w:sz w:val="20"/>
-        </w:rPr>
-        <w:t>Описаний механізм не обмежується одним прикладом. Серед усіх 111 помилок 2→7 концепт 2_2 відсічено фільтром складності у 86 випадках (77,5 %). Сам фільтр, однак, не є причиною помилки: у контрольному прогоні зі знятим фільтром складності 2_2 не виграв жодного з 111 випадків, бо його зупиняє структурна умова щодо точок перетину, а не порівняння складності. Концепт 2_1 конкурував у всіх 111 випадках і в усіх програв за подібністю, середній розрив — 0,14. Випадків, де концепт двійки вигравав за подібністю і програвав уже через поправку на складність, немає жодного. Отже, домінантна помилка виникає на двох етапах: втрата топології під час бінаризації та повні штрафи інтервального зважування. Поправка на складність на неї не впливає.</w:t>
-      </w:r>
-    </w:p>
-    <w:p>
-      <w:pPr>
-        <w:spacing w:lineRule="exact" w:line="280" w:before="160" w:after="80"/>
-        <w:jc w:val="both"/>
-      </w:pPr>
-      <w:r>
-        <w:rPr>
-          <w:rFonts w:ascii="Times New Roman" w:hAnsi="Times New Roman"/>
-          <w:b/>
-          <w:i w:val="0"/>
-          <w:sz w:val="20"/>
-        </w:rPr>
-        <w:t>3.5 Обчислювальна вартість виведення</w:t>
-      </w:r>
-    </w:p>
-    <w:p>
-      <w:pPr>
-        <w:spacing w:lineRule="exact" w:line="280" w:before="0" w:after="0"/>
-        <w:ind w:firstLine="567"/>
-        <w:jc w:val="both"/>
-      </w:pPr>
-      <w:r>
-        <w:rPr>
-          <w:rFonts w:ascii="Times New Roman" w:hAnsi="Times New Roman"/>
-          <w:b w:val="0"/>
-          <w:i w:val="0"/>
-          <w:sz w:val="20"/>
-        </w:rPr>
-        <w:t>Теоретична верхня межа часу на одне зображення — 65 с (13 концептів за обмеження 5 с на кожне порівняння). Вимірювання показують, що ця межа не досягається.</w:t>
-      </w:r>
-    </w:p>
-    <w:p>
-      <w:pPr>
-        <w:spacing w:lineRule="exact" w:line="280" w:before="0" w:after="0"/>
-        <w:ind w:firstLine="567"/>
-        <w:jc w:val="both"/>
-      </w:pPr>
-      <w:r>
-        <w:rPr>
-          <w:rFonts w:ascii="Times New Roman" w:hAnsi="Times New Roman"/>
-          <w:b w:val="0"/>
-          <w:i w:val="0"/>
-          <w:sz w:val="20"/>
-        </w:rPr>
-        <w:t>Усі вимірювання виконано на одній робочій станції; конвеєр розгорнуто у 24 контейнерах Docker: чотири екземпляри скелетизації, чотири — контурного аналізу і шістнадцять — класифікації. Тривалості прогону загалом система не фіксує, тому наскрізної пропускної здатності тут не наведено: далі йдуть лише поетапні вимірювання, взяті безпосередньо із записів профілювання.</w:t>
-      </w:r>
-    </w:p>
-    <w:p>
-      <w:pPr>
-        <w:spacing w:lineRule="exact" w:line="280" w:before="0" w:after="0"/>
-        <w:ind w:firstLine="567"/>
-        <w:jc w:val="both"/>
-      </w:pPr>
-      <w:r>
-        <w:rPr>
-          <w:rFonts w:ascii="Times New Roman" w:hAnsi="Times New Roman"/>
-          <w:b w:val="0"/>
-          <w:i w:val="0"/>
-          <w:sz w:val="20"/>
-        </w:rPr>
-        <w:t>Вимірювання за етапами конвеєра взято із записів профілювання. Профілювалися лише неправильно класифіковані зображення — 770 записів. Це зміщена підмножина: правильно класифіковані зображення до неї не потрапляють, тому наведені величини характеризують саме помилкові випадки. Напрям зміщення за наявними даними не визначений: кількість порівнянь GED задають фільтр складності та гейтинг, а не правильність підсумкового рішення, тому наведені величини не можна вважати ані верхньою, ані нижньою оцінкою типового випадку. Медіана скелетизації становить 52,8 мс за максимуму 533 мс. Медіана контурного аналізу — 211,5 мс за максимуму 1 905 мс. Стадія класифікації, тобто всі порівняння GED для одного зображення разом, має медіану 167,1 мс, 99-й процентиль 835 мс і максимум 1 414 мс.</w:t>
-      </w:r>
-    </w:p>
-    <w:p>
-      <w:pPr>
-        <w:spacing w:lineRule="exact" w:line="280" w:before="0" w:after="0"/>
-        <w:ind w:firstLine="567"/>
-        <w:jc w:val="both"/>
-      </w:pPr>
-      <w:r>
-        <w:rPr>
-          <w:rFonts w:ascii="Times New Roman" w:hAnsi="Times New Roman"/>
-          <w:b w:val="0"/>
-          <w:i w:val="0"/>
-          <w:sz w:val="20"/>
-        </w:rPr>
-        <w:t>Жодне з профільованих зображень не наблизилося до п'ятисекундного обмеження часу одного порівняння. Хронометраж окремого порівняння GED система поки що не зберігає. Його систематичне вимірювання, яке охопить і правильно класифіковані зображення, лишається предметом подальшої роботи.</w:t>
+        <w:t>Усі 111 помилок 2→7 відтворено окремо, без фільтра складності, тому значення подібності не збігаються з табл. 4. Концепт 2_1 отримав оцінку в 106 випадках і всі 106 разів програв 7_1; середній розрив сирої подібності становив 0,1132. У п'яти інших випадках 2_1 відхилено структурно, тому вони не входять до середнього. 2_2 відсікався фільтром складності у 86 випадках, але після зняття фільтра не був структурно допустимим у жодному зі 111.</w:t>
       </w:r>
     </w:p>
     <w:p>
@@ -6708,7 +5305,7 @@
           <w:i w:val="0"/>
           <w:sz w:val="20"/>
         </w:rPr>
-        <w:t>Пояснення у цій системі збігається з самим рішенням. Немає окремої моделі, яка наближала б поведінку класифікатора ззовні: щоб зрозуміти вибір, достатньо відкрити граф зображення, подивитися на навчені інтервали концепту-атрактора і на вартість кожної ознаки. Трасування з підрозділу 3.4 показує весь ланцюг — від фільтра складності до конкретного числа 1,10 за ознакою normalized_x. Цим виконано дві з умов, перелічених у підрозділі 1.2: структура подання є носієм і рішення, і пояснення, а вартості зіставлення прив'язані до наперед визначених геометричних характеристик, а не засвоєні з даних.</w:t>
+        <w:t>Пояснення у цій системі збігається з самим рішенням. Немає окремої моделі, яка наближала б поведінку класифікатора ззовні. Архівне відтворення показує конкретний ланцюг: операції редагування, сумарну вартість, нормувальну складність, подібність і підсумкову оцінку. Поознаковий штраф 1,000 і повна вартість заміщення вузла 1,010, 1,103 або 1,302 є різними рівнями цього розкладу.</w:t>
       </w:r>
     </w:p>
     <w:p>
@@ -6724,7 +5321,7 @@
           <w:i w:val="0"/>
           <w:sz w:val="20"/>
         </w:rPr>
-        <w:t>Те саме стосується помилок. Механізм домінантної пари 2→7 локалізовано на двох етапах: втрата петлі під час бінаризації та повні штрафи за трьома ознаками. Помилку можна назвати поіменно і перевірити її поширеність на всіх 111 випадках. Самі помилки концентруються на структурно близьких парах цифр, що узгоджується з природою подання: якщо контури двох цифр після редукції дають схожі графи, різницю має забезпечити інтервальне зважування ознак, і саме воно іноді не спрацьовує. Покласові показники це підтверджують: найвищу влучність мають класи 0 (99,87 %) і 8 (98,74 %), написання яких зберігає замкнену петлю як стійку топологічну ознаку, тоді як помилки зосереджені на парах, де така ознака втрачається ще на бінаризації.</w:t>
+        <w:t>Для mnist_test_2_00766 спостерігаємо ациклічний розгалужений граф і три виходи за інтервали 2_1. Втрата топології під час побудови графа та ті самі поознакові штрафи як загальний механізм пари 2→7 є гіпотезою: для решти 110 випадків поелементних трасувань та інтервенцій немає.</w:t>
       </w:r>
     </w:p>
     <w:p>
@@ -6740,55 +5337,7 @@
           <w:i w:val="0"/>
           <w:sz w:val="20"/>
         </w:rPr>
-        <w:t>Практична ніша методу визначається простежуваністю рішення. Це задачі, де відповідь має бути придатною до аудиту: верифікація рукописних позначень у документообігу, промислове розпізнавання маркування, навчальні системи, які мають показати учневі причину оцінки. У ширшому плані метод придатний як дослідницька платформа для структурного розпізнавання з малими навчальними вибірками, оскільки один концепт формується з 3–9 зразків. Зв'язок із промисловістю визначають ті самі властивості: у названих задачах кожне спірне рішення розбирає людина, тому запис рішення у вигляді концепту, переліку заміщень і повартісного розкладу можна долучити до протоколу розбору без окремого пояснювального модуля. Мала навчальна вибірка знижує й вартість запуску на новому наборі позначень: розмічувати десятки тисяч прикладів не потрібно.</w:t>
-      </w:r>
-    </w:p>
-    <w:p>
-      <w:pPr>
-        <w:spacing w:lineRule="exact" w:line="280" w:before="0" w:after="0"/>
-        <w:ind w:firstLine="567"/>
-        <w:jc w:val="both"/>
-      </w:pPr>
-      <w:r>
-        <w:rPr>
-          <w:rFonts w:ascii="Times New Roman" w:hAnsi="Times New Roman"/>
-          <w:b w:val="0"/>
-          <w:i w:val="0"/>
-          <w:sz w:val="20"/>
-        </w:rPr>
-        <w:t>Раніше опублікований результат прототипу на шести класах становив 82,44 % за 5–6 зразків на клас і один прохід формування [32]. Поточна робота розширює оцінювання до десяти класів і до повного тестового розподілу зображень з повними контурами. Пряме зіставлення цих чисел обмежене: набір класів, обсяг тестової вибірки та процедура формування концептів різні, тому різниця між 82,44 % і 91,13 % не вимірює ефекту окремої зміни в методі.</w:t>
-      </w:r>
-    </w:p>
-    <w:p>
-      <w:pPr>
-        <w:spacing w:lineRule="exact" w:line="280" w:before="0" w:after="0"/>
-        <w:ind w:firstLine="567"/>
-        <w:jc w:val="both"/>
-      </w:pPr>
-      <w:r>
-        <w:rPr>
-          <w:rFonts w:ascii="Times New Roman" w:hAnsi="Times New Roman"/>
-          <w:b w:val="0"/>
-          <w:i w:val="0"/>
-          <w:sz w:val="20"/>
-        </w:rPr>
-        <w:t>Обмеження роботи такі. По-перше, головна метрика умовна щодо фільтра повноти: 12,9 % тестових зображень виключено, а перекіс за класами робить підставу для класу 8 найвужчою. По-друге, точне обчислення GED є NP-складною задачею; вартість виведення виміряна, але профільована підмножина охоплює лише помилкові зображення, а хронометражу окремих порівнянь немає. По-третє, інваріантність до повороту обмежена діапазоном аугментації ±10° і поза ним не гарантується. По-четверте, контурне подання відкидає текстуру і градієнти, тому його застосування обмежене силуетними та штриховими зображеннями. По-п'яте, чутливість результату до ручного відбору 76 навчальних зразків не вимірювалася, і частина точності може походити з вдалого відбору. По-шосте, розпізнавання розірваних контурів потребує окремого механізму асоціативного розпізнавання, якого в системі поки немає.</w:t>
-      </w:r>
-    </w:p>
-    <w:p>
-      <w:pPr>
-        <w:spacing w:lineRule="exact" w:line="280" w:before="0" w:after="0"/>
-        <w:ind w:firstLine="567"/>
-        <w:jc w:val="both"/>
-      </w:pPr>
-      <w:r>
-        <w:rPr>
-          <w:rFonts w:ascii="Times New Roman" w:hAnsi="Times New Roman"/>
-          <w:b w:val="0"/>
-          <w:i w:val="0"/>
-          <w:sz w:val="20"/>
-        </w:rPr>
-        <w:t>Подальша робота передбачає чотири напрями: асоціативне розпізнавання розірваних контурів, вимірювання чутливості точності до відбору навчальних зразків, хронометраж окремих порівнянь GED на всьому тестовому наборі та розширення методу на інші алфавіти символів.</w:t>
+        <w:t>Оцінювання обмежене ручним фільтром, що вилучив 12,93 % MNIST нерівномірно за класами. Чутливість до добору 76 джерел, порядку їх подання й невідомого точного діапазону аугментації не вимірювали. Контурне подання відкидає текстуру й градієнти, а розірвані контури потребують відсутнього асоціативного механізму. Прогін зафіксовано конфігурацією та артефактами результату; повного знімка розгорнутого коду не збережено, тому відтворення можливе в межах цих артефактів.</w:t>
       </w:r>
     </w:p>
     <w:p>
@@ -6819,7 +5368,7 @@
           <w:i w:val="0"/>
           <w:sz w:val="20"/>
         </w:rPr>
-        <w:t>1. Контурні зображення подано атрибутованими двочастковими графами, у яких вузли-точки й вузли-вектори чергуються, а геометричні та семантичні характеристики зберігаються безпосередньо в елементах графа. Подання дає 13 ознак вузла, на яких далі будується порівняння, тому рішення класифікатора спирається на вимірювані величини, а не на приховані ваги.</w:t>
+        <w:t>1. Побудовано Point–Vector подання з 2 видами вузлів і 13 ознаками зіставлення.</w:t>
       </w:r>
     </w:p>
     <w:p>
@@ -6835,7 +5384,7 @@
           <w:i w:val="0"/>
           <w:sz w:val="20"/>
         </w:rPr>
-        <w:t>2. Структурною редукцією без зворотного поширення помилки сформовано алфавіт з 13 концептів-атракторів для 10 класів. На один концепт пішло від 3 до 9 унікальних зразків, разом 76, а готові концепти містять від 3 до 12 вузлів. Класи 1, 2 і 4 потребували по два підконцепти, бо їхні написання топологічно не зводяться одне до одного редукцією.</w:t>
+        <w:t>2. Одним проходом структурної редукції з 76 вручну відібраних джерел, розширених до 805 зображень, сформовано 13 концептів для 10 класів, по 3–12 вузлів кожний.</w:t>
       </w:r>
     </w:p>
     <w:p>
@@ -6851,15 +5400,30 @@
           <w:i w:val="0"/>
           <w:sz w:val="20"/>
         </w:rPr>
-        <w:t>3. Класифікація за відстанню редагування графів з діагностичним зважуванням ознак розпізнає 8 685 повноконтурних зображень MNIST з точністю 91,13 % за влучності 91,92 %, повноти 91,13 % і F1 91,34 %. Покласові показники мають значно більший розкид: влучність змінюється від 82,01 % у класу 7 до 99,87 % у класу 0, а повнота — від 77,59 % у класу 2 до 96,52 % у класу 1.</w:t>
+        <w:t xml:space="preserve">3. Класифікацію побудовано за GED з драбиною вартостей заміщення 0 / 0,25 / 0,5 / 0,8 / 1,0 / 6,0, діагностичним зважуванням ознак при </w:t>
       </w:r>
-    </w:p>
-    <w:p>
-      <w:pPr>
-        <w:spacing w:lineRule="exact" w:line="280" w:before="0" w:after="0"/>
-        <w:ind w:firstLine="567"/>
-        <w:jc w:val="both"/>
-      </w:pPr>
+      <m:oMath>
+        <m:sSub>
+          <m:e>
+            <m:r>
+              <w:rPr>
+                <w:sz w:val="20"/>
+                <w:szCs w:val="20"/>
+              </w:rPr>
+              <m:t>ε</m:t>
+            </m:r>
+          </m:e>
+          <m:sub>
+            <m:r>
+              <w:rPr>
+                <w:sz w:val="20"/>
+                <w:szCs w:val="20"/>
+              </w:rPr>
+              <m:t>w</m:t>
+            </m:r>
+          </m:sub>
+        </m:sSub>
+      </m:oMath>
       <w:r>
         <w:rPr>
           <w:rFonts w:ascii="Times New Roman" w:hAnsi="Times New Roman"/>
@@ -6867,15 +5431,17 @@
           <w:i w:val="0"/>
           <w:sz w:val="20"/>
         </w:rPr>
-        <w:t>4. Оцінювання проведено на підмножині повних контурів з явним розкриттям фільтра. З тестового набору MNIST виключено 12,9 % зображень, причому фільтр діє нерівномірно за класами — клас 8 зберігає 51,6 % від обсягу найбільшого класу. Головна метрика є умовною щодо цього фільтра, а її перенесення на повний набір потребує механізму асоціативного розпізнавання.</w:t>
+        <w:t xml:space="preserve"> = 0,1, поправкою на складність концепту </w:t>
       </w:r>
-    </w:p>
-    <w:p>
-      <w:pPr>
-        <w:spacing w:lineRule="exact" w:line="280" w:before="0" w:after="0"/>
-        <w:ind w:firstLine="567"/>
-        <w:jc w:val="both"/>
-      </w:pPr>
+      <m:oMath>
+        <m:r>
+          <w:rPr>
+            <w:sz w:val="20"/>
+            <w:szCs w:val="20"/>
+          </w:rPr>
+          <m:t>λ</m:t>
+        </m:r>
+      </m:oMath>
       <w:r>
         <w:rPr>
           <w:rFonts w:ascii="Times New Roman" w:hAnsi="Times New Roman"/>
@@ -6883,7 +5449,39 @@
           <w:i w:val="0"/>
           <w:sz w:val="20"/>
         </w:rPr>
-        <w:t>5. Пояснюваність продемонстровано трасуванням окремого рішення: воно розкладається на іменований концепт-атрактор, перелік заміщень вузлів і вартості за окремими ознаками. Механізм домінантної помилки 2→7 локалізовано на 111 випадках: у 77,5 % з них багатший концепт двійки відсікається фільтром складності після втрати топології на етапі бінаризації. Вартість виведення виміряно поетапно — медіана етапу класифікації 167,1 мс, 99-й процентиль 835 мс, максимум 1 414 мс, — і п'ятисекундний дедлайн одного порівняння не досягається на жодному зображенні.</w:t>
+        <w:t xml:space="preserve"> = 0,10 та нормуванням подібності за сумою вузлів і ребер графа.</w:t>
+      </w:r>
+    </w:p>
+    <w:p>
+      <w:pPr>
+        <w:spacing w:lineRule="exact" w:line="280" w:before="0" w:after="0"/>
+        <w:ind w:firstLine="567"/>
+        <w:jc w:val="both"/>
+      </w:pPr>
+      <w:r>
+        <w:rPr>
+          <w:rFonts w:ascii="Times New Roman" w:hAnsi="Times New Roman"/>
+          <w:b w:val="0"/>
+          <w:i w:val="0"/>
+          <w:sz w:val="20"/>
+        </w:rPr>
+        <w:t>4. Ручний фільтр допустив 8 707 із 10 000 зображень MNIST; збереження класів коливається від 59,75 % до 99,47 %. Точність становить 91,13 % для оброблених і 90,90 % для всіх допущених зображень; зважені влучність, повнота і F1 дорівнюють 91,92 %, 91,13 % і 91,34 %.</w:t>
+      </w:r>
+    </w:p>
+    <w:p>
+      <w:pPr>
+        <w:spacing w:lineRule="exact" w:line="280" w:before="0" w:after="0"/>
+        <w:ind w:firstLine="567"/>
+        <w:jc w:val="both"/>
+      </w:pPr>
+      <w:r>
+        <w:rPr>
+          <w:rFonts w:ascii="Times New Roman" w:hAnsi="Times New Roman"/>
+          <w:b w:val="0"/>
+          <w:i w:val="0"/>
+          <w:sz w:val="20"/>
+        </w:rPr>
+        <w:t>5. В архівному відтворенні mnist_test_2_00766 оцінки 1,1487 для 7_1 і 1,1000 для 2_1 дають розрив 0,0486; серед 111 помилок 2→7 2_1 програв за оцінкою 106 разів і був структурно відхилений 5 разів.</w:t>
       </w:r>
     </w:p>
     <w:p>
@@ -8240,7 +6838,41 @@
           <w:i w:val="0"/>
           <w:sz w:val="20"/>
         </w:rPr>
-        <w:t xml:space="preserve">36. Zhang, T., Suen, C. (1984), "A fast parallel algorithm for thinning digital patterns", </w:t>
+        <w:t xml:space="preserve">36. Lapin, M., Parzhyn, Y., Bokhan, K., Perevoznyk, K., Aleksandrova, T. (2026), "Invariant structural learning: concept formation as hypergraph attractor dynamics", </w:t>
+      </w:r>
+      <w:r>
+        <w:rPr>
+          <w:rFonts w:ascii="Times New Roman" w:hAnsi="Times New Roman"/>
+          <w:b w:val="0"/>
+          <w:i/>
+          <w:sz w:val="20"/>
+        </w:rPr>
+        <w:t>Innovative Technologies and Scientific Solutions for Industries</w:t>
+      </w:r>
+      <w:r>
+        <w:rPr>
+          <w:rFonts w:ascii="Times New Roman" w:hAnsi="Times New Roman"/>
+          <w:b w:val="0"/>
+          <w:i w:val="0"/>
+          <w:sz w:val="20"/>
+        </w:rPr>
+        <w:t>, No. 2(36), pp. 70–94. DOI: https://doi.org/10.30837/2522-9818.2026.2.070</w:t>
+      </w:r>
+    </w:p>
+    <w:p>
+      <w:pPr>
+        <w:spacing w:lineRule="exact" w:line="280" w:before="0" w:after="0"/>
+        <w:ind w:left="567" w:hanging="567"/>
+        <w:jc w:val="both"/>
+      </w:pPr>
+      <w:r>
+        <w:rPr>
+          <w:rFonts w:ascii="Times New Roman" w:hAnsi="Times New Roman"/>
+          <w:b w:val="0"/>
+          <w:i w:val="0"/>
+          <w:sz w:val="20"/>
+        </w:rPr>
+        <w:t xml:space="preserve">37. Zhang, T., Suen, C. (1984), "A fast parallel algorithm for thinning digital patterns", </w:t>
       </w:r>
       <w:r>
         <w:rPr>
@@ -8274,7 +6906,7 @@
           <w:i w:val="0"/>
           <w:sz w:val="20"/>
         </w:rPr>
-        <w:t xml:space="preserve">37. Fritzke, B. (1995), "A growing neural gas network learns topologies", </w:t>
+        <w:t xml:space="preserve">38. Fritzke, B. (1995), "A growing neural gas network learns topologies", </w:t>
       </w:r>
       <w:r>
         <w:rPr>
@@ -8308,7 +6940,7 @@
           <w:i w:val="0"/>
           <w:sz w:val="20"/>
         </w:rPr>
-        <w:t xml:space="preserve">38. Douglas, D., Peucker, T. (1973), "Algorithms for the reduction of the number of points required to represent a digitized line or its caricature", </w:t>
+        <w:t xml:space="preserve">39. Douglas, D., Peucker, T. (1973), "Algorithms for the reduction of the number of points required to represent a digitized line or its caricature", </w:t>
       </w:r>
       <w:r>
         <w:rPr>
@@ -8342,7 +6974,7 @@
           <w:i w:val="0"/>
           <w:sz w:val="20"/>
         </w:rPr>
-        <w:t xml:space="preserve">39. LeCun, Y., Bottou, L., Bengio, Y., Haffner, P. (1998), "Gradient-based learning applied to document recognition", </w:t>
+        <w:t xml:space="preserve">40. LeCun, Y., Bottou, L., Bengio, Y., Haffner, P. (1998), "Gradient-based learning applied to document recognition", </w:t>
       </w:r>
       <w:r>
         <w:rPr>
@@ -8554,7 +7186,7 @@
           <w:i w:val="0"/>
           <w:sz w:val="20"/>
         </w:rPr>
-        <w:t>Показати, що концепти-атрактори, сформовані з малої кількості прикладів, дають розпізнавання з повністю простежуваним рішенням, і задокументувати умови чинності результату.</w:t>
+        <w:t>Показати, що концепти-атрактори, сформовані з малої кількості прикладів, дають розпізнавання з простежуваним рішенням, і задокументувати умови чинності результату.</w:t>
       </w:r>
       <w:r>
         <w:rPr>
@@ -8581,7 +7213,7 @@
           <w:i w:val="0"/>
           <w:sz w:val="20"/>
         </w:rPr>
-        <w:t>Подати контурні зображення двочастковими графами; сформувати алфавіт концептів структурною редукцією з інтервальним узагальненням параметрів; побудувати класифікацію за відстанню редагування графів з діагностичним зважуванням ознак; оцінити систему на повноконтурній підмножині MNIST з розкриттям фільтра повноти; продемонструвати пояснюваність трасуванням рішення і виміряти вартість виведення.</w:t>
+        <w:t>Подати контурні зображення двочастковими графами; сформувати алфавіт концептів структурною редукцією з інтервальним узагальненням параметрів; побудувати класифікацію за відстанню редагування графів з діагностичним зважуванням ознак; оцінити систему на повноконтурній підмножині MNIST з розкриттям фільтра повноти; продемонструвати пояснюваність трасуванням рішення.</w:t>
       </w:r>
       <w:r>
         <w:rPr>
@@ -8635,7 +7267,7 @@
           <w:i w:val="0"/>
           <w:sz w:val="20"/>
         </w:rPr>
-        <w:t>13 концептів-атракторів, сформованих із 76 унікальних зразків (3–9 на концепт), класифікують 8 685 повноконтурних зображень MNIST з точністю 91,13 %, влучністю 91,92 %, повнотою 91,13 % та F1 91,34 %. Фільтр повноти виключає 12,9 % тестового набору і діє нерівномірно за класами; це розкрито в тексті з обґрунтуванням. Трасування показує розклад рішення на атрактор, заміщення вузлів і поознакові вартості. Медіана етапу класифікації — 167 мс за максимуму 1,4 с.</w:t>
+        <w:t>13 концептів-атракторів сформовано з 76 вручну відібраних джерел, розширених до 805 зображень. Із 8 707 допущених зображень рішення одержано для 8 685: точність становить 91,13 % для оброблених і 90,90 % для всіх допущених з урахуванням 22 збоїв конвеєра; зважені влучність, повнота і F1 дорівнюють 91,92 %, 91,13 % і 91,34 %. Архівне відтворення одного рішення дає числовий ланцюг від операцій редагування до оцінки.</w:t>
       </w:r>
       <w:r>
         <w:rPr>
@@ -8662,7 +7294,7 @@
           <w:i w:val="0"/>
           <w:sz w:val="20"/>
         </w:rPr>
-        <w:t>Розпізнавання без зворотного поширення помилки з малої кількості прикладів є здійсненним, а графова структура подання робить кожне рішення придатним до перевірки. Головна метрика умовна щодо фільтра повноти; її перенесення на повний набір потребує асоціативного розпізнавання розірваних контурів.</w:t>
+        <w:t>Розпізнавання без зворотного поширення помилки за 76 навчальних джерел є здійсненним, а кожне рішення розкладається на операції редагування графів і поознакові вартості. Результат чинний у межах вручну відфільтрованої підмножини MNIST; порівняння з іншими моделями не проведено.</w:t>
       </w:r>
     </w:p>
     <w:p>

</xml_diff>

<commit_message>
docs: shorten and fix ITSSI 2026 XAI paper
</commit_message>
<xml_diff>
--- a/papers/itssi_xai_2026/itssi_xai_2026.docx
+++ b/papers/itssi_xai_2026/itssi_xai_2026.docx
@@ -150,7 +150,7 @@
           <w:i w:val="0"/>
           <w:sz w:val="20"/>
         </w:rPr>
-        <w:t>Image skeletonization, growing neural gas, Ramer–Douglas–Peucker simplification, structural graph reduction, graph edit distance, interval generalization of parameters.</w:t>
+        <w:t>Image skeletonization, Growing Neural Gas (GNG), Ramer–Douglas–Peucker simplification, structural graph reduction, graph edit distance, interval generalization of parameters.</w:t>
       </w:r>
       <w:r>
         <w:rPr>
@@ -177,7 +177,7 @@
           <w:i w:val="0"/>
           <w:sz w:val="20"/>
         </w:rPr>
-        <w:t>Thirteen concept attractors were formed from 76 manually selected sources expanded to 805 images. Of 8,707 admitted images, 8,685 produced decisions: accuracy is 91.13 % over processed images and 90.90 % over all admitted images when 22 pipeline failures are included; support-weighted precision, recall, and F1 are 91.92 %, 91.13 %, and 91.34 %. An archived replay gives one numerical chain from edit operations to the final score.</w:t>
+        <w:t>Thirteen concept attractors were formed from 76 manually selected sources expanded to 805 images. Accuracy is 91.13 %; support-weighted precision, recall, and F1 are 91.92 %, 91.13 %, and 91.34 %. An archived replay gives one numerical chain from edit operations to the final score.</w:t>
       </w:r>
       <w:r>
         <w:rPr>
@@ -204,7 +204,7 @@
           <w:i w:val="0"/>
           <w:sz w:val="20"/>
         </w:rPr>
-        <w:t>Recognition without backpropagation from 76 sources is feasible, and each decision decomposes into edit operations and per-feature costs. The result is valid within the manually filtered MNIST subset; no comparison with other models was made.</w:t>
+        <w:t>Recognition without backpropagation from 76 sources is feasible, and each decision decomposes into edit operations and per-feature costs. The result is valid within the manually filtered MNIST subset.</w:t>
       </w:r>
     </w:p>
     <w:p>
@@ -229,7 +229,7 @@
           <w:i w:val="0"/>
           <w:sz w:val="20"/>
         </w:rPr>
-        <w:t>explainable artificial intelligence; graph image representation; concept attractor; structural reduction; graph edit distance; skeletonization; handwritten digit recognition; learning from few examples.</w:t>
+        <w:t>explainable artificial intelligence; graph image representation; concept attractor; structural reduction; graph edit distance; skeletonization; handwritten digit recognition; few-shot learning.</w:t>
       </w:r>
     </w:p>
     <w:p>
@@ -275,7 +275,7 @@
           <w:i w:val="0"/>
           <w:sz w:val="20"/>
         </w:rPr>
-        <w:t>Сучасні системи розпізнавання зображень дають високу точність, але їхній внутрішній стан лишається закритим для людини. Модель повертає відповідь і не показує ознак, за якими цю відповідь отримано. Там, де рішення треба обґрунтувати перед оператором, лікарем або аудитором, така закритість стає самостійною проблемою, окремою від якості класифікації.</w:t>
+        <w:t>Сучасні системи розпізнавання зображень досягають високої точності, але їхній внутрішній стан лишається закритим для людини. Модель повертає відповідь і не показує ознак, за якими цю відповідь отримано. Там, де рішення треба обґрунтувати перед оператором, лікарем або аудитором, така закритість стає самостійною проблемою, окремою від якості класифікації.</w:t>
       </w:r>
     </w:p>
     <w:p>
@@ -291,7 +291,7 @@
           <w:i w:val="0"/>
           <w:sz w:val="20"/>
         </w:rPr>
-        <w:t>Найпоширеніший спосіб її подолання — апостеріорні (post-hoc) пояснення. Метод LIME [1] будує локальну лінійну апроксимацію поведінки навченої моделі в околі окремого прикладу. SHAP [2] розподіляє внески ознак за схемою кооперативних ігор; його родина містить як модельно-незалежний Kernel SHAP, так і модельно-специфічні Linear SHAP та Deep SHAP. LIME і Kernel SHAP працюють з моделлю як із чорною скринькою та пояснюють внески ознак, а не відтворюють внутрішню послідовність операцій класифікатора.</w:t>
+        <w:t>Найчастіше її долають ретроспективними (post-hoc) поясненнями. Метод LIME [1] будує локальну лінійну апроксимацію поведінки навченої моделі в околі окремого прикладу. SHAP [2] розподіляє внески ознак за схемою кооперативних ігор; його родина містить як модельно-незалежний Kernel SHAP, так і модельно-специфічні Linear SHAP та Deep SHAP. LIME і Kernel SHAP працюють з моделлю як із чорною скринькою та пояснюють внески ознак, а не відтворюють внутрішню послідовність операцій класифікатора.</w:t>
       </w:r>
     </w:p>
     <w:p>
@@ -307,7 +307,7 @@
           <w:i w:val="0"/>
           <w:sz w:val="20"/>
         </w:rPr>
-        <w:t>Надійність такого наближення має документовані обмеження. Slack et al. [3] показали, що LIME і SHAP піддаються цілеспрямованій маніпуляції: класифікатор з явним упередженням можна побудувати так, щоб згенеровані пояснення це упередження приховали. Hooshyar and Yang [4] виявили нестійкість пояснень до вибору гіперпараметрів і до корельованості ознак. Rudin [5] робить із цього висновок щодо проєктування: у задачах з високою ціною помилки доцільно будувати модель, пояснювану за побудовою, а не додавати зовнішні пояснення до непрозорої; ця робота стає на таку позицію.</w:t>
+        <w:t>Обмеження такого наближення описано в літературі. Slack et al. [3] показали, що LIME і SHAP піддаються цілеспрямованій маніпуляції: класифікатор з явним упередженням можна побудувати так, щоб згенеровані пояснення це упередження приховали. Hooshyar and Yang [4] виявили нестійкість пояснень до вибору гіперпараметрів і до корельованості ознак. Rudin [5] робить із цього висновок щодо проєктування: у задачах з високою ціною помилки доцільно будувати модель, пояснювану за побудовою, а не додавати зовнішні пояснення до непрозорої; у цій роботі прийнято ту саму позицію.</w:t>
       </w:r>
     </w:p>
     <w:p>
@@ -323,7 +323,7 @@
           <w:i w:val="0"/>
           <w:sz w:val="20"/>
         </w:rPr>
-        <w:t>Підхід, викладений у статті, робить носієм пояснення структуру подання. Контур зображення кодується атрибутованим графом: вузли відповідають характерним точкам і векторам між ними, а геометричні й семантичні характеристики зберігаються безпосередньо в елементах графа. Пояснення тоді перетворюється на об'єкт, який можна оглянути й перевірити. Цикл у графі відповідає замкненому контуру, степінь вузла описує розгалуження, інтервал значення атрибута задає допустимий діапазон варіації цієї ознаки в межах концепту. Окремий пояснювальний модуль над класифікатором не будується.</w:t>
+        <w:t>Підхід, викладений у статті, робить носієм пояснення структуру подання. Контур зображення закодовано атрибутованим графом: вузли відповідають характерним точкам і векторам між ними, а геометричні й семантичні характеристики збережено безпосередньо в елементах графа. Пояснення тоді перетворюється на об'єкт, який можна оглянути й перевірити. Цикл у графі відповідає замкненому контуру, степінь вузла описує розгалуження, інтервал значень атрибута задає допустимий діапазон варіації цієї ознаки в межах концепту. Окремого пояснювального модуля над класифікатором не будують.</w:t>
       </w:r>
     </w:p>
     <w:p>
@@ -339,7 +339,7 @@
           <w:i w:val="0"/>
           <w:sz w:val="20"/>
         </w:rPr>
-        <w:t>Статус отриманого результату варто окреслити відверто. Система перебуває на дослідницькій стадії й не є готовим продуктом. Вона не претендує на рівень точності нейромережевих класифікаторів на еталонних наборах і не порівнюється з ними за цим показником. Рівень розпізнавання людини є заявленим орієнтиром проєкту, але експерименту за участю людей не проводили й досягнення цього рівня не стверджуємо. Наукове питання формулюється інакше, ніж у порівняльних дослідженнях точності: чи можливе розпізнавання без зворотного поширення помилки, з малої кількості навчальних прикладів і з простежуваним за збереженими даними шляхом ухвалення рішення. Практична цінність такої постановки з'являється там, де навчальних даних мало, а рішення має бути придатним до перевірки вручну.</w:t>
+        <w:t>Ця робота відповідає на запитання, чи можливе розпізнавання без зворотного поширення помилки, за малої кількості навчальних прикладів і так, щоб шлях до рішення можна було простежити за збереженими даними. Така постановка практично цінна там, де навчальних даних мало, а рішення має бути придатним до перевірки вручну.</w:t>
       </w:r>
     </w:p>
     <w:p>
@@ -355,7 +355,7 @@
           <w:i w:val="0"/>
           <w:sz w:val="20"/>
         </w:rPr>
-        <w:t>У статті викладено подання зображень атрибутованими двочастковими графами, процедуру формування концептів-атракторів структурною редукцією, класифікацію за подібністю графів і результати оцінювання на MNIST з ручним фільтром повноти контуру. На 8 685 оброблених зображеннях отримано точність 91,13 %, а на всіх 8 707 допущених — 90,90 %. Алфавіт із 13 концептів сформовано з 76 вручну відібраних джерел, розширених до 805 зображень. Окремо наведено архівне відтворення одного рішення.</w:t>
+        <w:t>У статті викладено подання зображень атрибутованими двочастковими графами, процедуру формування концептів-атракторів структурною редукцією, класифікацію за подібністю графів і результати оцінювання на MNIST з ручним фільтром повноти контуру. Отримано точність 91,13 %. Алфавіт із 13 концептів сформовано з 76 вручну відібраних оригіналів, розширених до 805 зразків. Окремо наведено відтворення одного рішення за збереженими даними.</w:t>
       </w:r>
     </w:p>
     <w:p>
@@ -402,7 +402,7 @@
           <w:i w:val="0"/>
           <w:sz w:val="20"/>
         </w:rPr>
-        <w:t>Апостеріорні методи, названі в підрозділі 1.1, лишаються фактичним стандартом пояснюваності, тому дослідження останніх п'яти років зосередилися на тому, наскільки їхнім поясненням можна довіряти.</w:t>
+        <w:t>Ретроспективні методи, названі в підрозділі 1.1, лишаються фактичним стандартом пояснюваності, тому дослідження останніх п'яти років зосередилися на тому, наскільки їхнім поясненням можна довіряти.</w:t>
       </w:r>
     </w:p>
     <w:p>
@@ -418,7 +418,7 @@
           <w:i w:val="0"/>
           <w:sz w:val="20"/>
         </w:rPr>
-        <w:t>Baniecki and Biecek [6] зводять у спільну систему позначень роботи двох галузей — змагального машинного навчання та пояснюваного інтелекту — і систематизують атаки на пояснення разом зі способами захисту від них. Автори показують, що маніпуляція поясненням, його підміна та приховування ознак упередженості моделі (fairwashing) можливі для більшості поширених методів, і формулюють вимоги до протоколів оцінювання пояснень. Предметом огляду є захист апостеріорних пояснювачів; питання про подання, у якому пояснення неможливо відокремити від обчислення, у ньому не порушено.</w:t>
+        <w:t>Baniecki and Biecek [6] зводять у спільну систему позначень роботи зі змагального машинного навчання та пояснюваного штучного інтелекту й систематизують атаки на пояснення разом зі способами захисту від них. Автори показують, що маніпуляція поясненням, його підміна та приховування ознак упередженості моделі (fairwashing) можливі для більшості поширених методів, і формулюють вимоги до протоколів оцінювання пояснень. Предметом огляду є захист ретроспективних пояснювачів; питання про подання, у якому пояснення неможливо відокремити від обчислення, в огляді не порушено.</w:t>
       </w:r>
     </w:p>
     <w:p>
@@ -434,7 +434,7 @@
           <w:i w:val="0"/>
           <w:sz w:val="20"/>
         </w:rPr>
-        <w:t>Bello et al. [7] звертаються до головної труднощі кількісного оцінювання пояснень: для пояснення немає еталона, з яким його можна звірити. Автори пропонують міру LSE (Level of Strength of an Explanation), побудовану за аналогією з відношенням правдоподібності в судовій експертизі, яка показує, наскільки пояснення підтримує саме той клас, що його передбачив класифікатор. Нерозв'язаним лишається те, що якість апостеріорного пояснення доводиться встановлювати опосередковано, окремою процедурою поверх пояснювача, а не читати із самого обчислення.</w:t>
+        <w:t>Bello et al. [7] звертаються до головної труднощі кількісного оцінювання пояснень: для пояснення немає еталона, з яким його можна звірити. Автори пропонують міру LSE (Level of Strength of an Explanation), яка показує, наскільки пояснення підтримує саме той клас, що його передбачив класифікатор; міру побудовано за аналогією з відношенням правдоподібності в судовій експертизі. Нерозв'язаним лишається те, що якість ретроспективного пояснення доводиться встановлювати опосередковано, окремою процедурою поверх пояснювача, а не читати із самого обчислення.</w:t>
       </w:r>
     </w:p>
     <w:p>
@@ -450,7 +450,7 @@
           <w:i w:val="0"/>
           <w:sz w:val="20"/>
         </w:rPr>
-        <w:t>Альтернативний напрям проєктування — моделі, пояснювані за побудовою, на потребі в яких наполягає Rudin [5]. Огляд методів пояснюваності на основі графів знань [8] систематизує способи, якими явні структурні подання входять до систем пояснюваного інтелекту — від видобування ознак і відношень до міркування над графом.</w:t>
+        <w:t>Альтернативний напрям проєктування утворюють моделі, пояснювані за побудовою, на потребі в яких наполягає Rudin [5]. Огляд методів пояснюваності на основі графів знань [8] систематизує способи, якими явні структурні подання входять до систем пояснюваного штучного інтелекту: від видобування ознак і відношень до міркування над графом.</w:t>
       </w:r>
     </w:p>
     <w:p>
@@ -466,7 +466,7 @@
           <w:i w:val="0"/>
           <w:sz w:val="20"/>
         </w:rPr>
-        <w:t>Forest et al. [9] застосовують моделі з концептним вузьким місцем (concept bottleneck models) до прогнозування залишкового ресурсу обладнання, обравши проміжними концептами режими деградації вузлів. Прогноз завдяки цьому розкладається за станом кожного компонента, а експерт може втрутитися в активації концептів під час випробування без перенавчання моделі. Робота показує практичну користь проміжного шару зрозумілих понять порівняно з методами приписування важливості вхідним ознакам. Відображення "вхід — концепт" у цій схемі лишається навченою нейронною мережею, тому простежити його елементами подання неможливо.</w:t>
+        <w:t>Forest et al. [9] застосовують моделі з концептним вузьким місцем (concept bottleneck models) до прогнозування залишкового ресурсу обладнання, узявши за проміжні концепти режими деградації компонентів. Прогноз завдяки цьому розкладається за станом кожного компонента, а експерт може втрутитися в активації концептів під час випробування без перенавчання моделі. Робота показує практичну користь проміжного шару зрозумілих понять порівняно з методами приписування важливості вхідним ознакам. Відображення входу на концепти в цій схемі лишається навченою нейронною мережею, тому простежити його за елементами подання неможливо.</w:t>
       </w:r>
     </w:p>
     <w:p>
@@ -482,7 +482,7 @@
           <w:i w:val="0"/>
           <w:sz w:val="20"/>
         </w:rPr>
-        <w:t>Sovatzidi et al. [10] будують класифікацію зображень на інтуїціоністських нечітких когнітивних картах, структуру графа яких визначає алгоритм навчання за даними. Ступінь вагання (hesitancy) слугує мірою невпевненості віднесення зображення до класу, а рішення подаються лінгвістичними термінами, зрозумілими без додаткового тлумачення. Це один з небагатьох сучасних прикладів, де носієм пояснення є граф, а не надбудова над навченою мережею. Вузли графа відповідають ознакам областей зображення, тому геометрія контуру та топологія його зв'язності в подання не входять.</w:t>
+        <w:t>Sovatzidi et al. [10] будують класифікацію зображень на інтуїціоністських нечітких когнітивних картах, структуру графа яких визначає алгоритм навчання за даними. Ступінь вагання (hesitancy) є мірою невпевненості, з якою зображення віднесено до класу, а рішення подано лінгвістичними термінами, зрозумілими без додаткового тлумачення. Тут носієм пояснення є граф, а не надбудова над навченою мережею. Вузли графа відповідають ознакам областей зображення, тому геометрія контуру та топологія його зв'язності в подання не входять.</w:t>
       </w:r>
     </w:p>
     <w:p>
@@ -498,7 +498,7 @@
           <w:i w:val="0"/>
           <w:sz w:val="20"/>
         </w:rPr>
-        <w:t>García-Cuesta et al. [11] показують, що подання прототипів у прототипних мережах можна змінити навмисно або ненавмисно без втрати зовнішньої правдоподібності пояснення. Цей результат мотивує перевіряти, чи має елемент пояснення зміст поза навченим простором вкладень.</w:t>
+        <w:t>García-Cuesta et al. [11] показують, що подання прототипів у прототипних мережах можна змінити навмисно або ненавмисно без втрати зовнішньої правдоподібності пояснення. Цей результат спонукає перевіряти, чи має елемент пояснення зміст поза навченим простором вкладень.</w:t>
       </w:r>
     </w:p>
     <w:p>
@@ -514,7 +514,7 @@
           <w:i w:val="0"/>
           <w:sz w:val="20"/>
         </w:rPr>
-        <w:t>Структурні подання форми мають довгу історію в комп'ютерному зорі. Vision GNN [12] трактує зображення як граф вузлів-фрагментів і будує на ньому мережу передавання повідомлень, і тим повертає графове подання в основний напрям глибокого навчання. Chatbri et al. [13] досліджують контури та скелети як подання форми для зіставлення бінарних зображень. Shen et al. [14] будують розпізнавання форми на наборі контурних частин, асоційованих зі скелетом, тобто поєднують обидва описи в одному поданні. Ці роботи підтверджують доцільність структурного опису, але зупиняються на рівні ознак і не роблять структуру носієм самого пояснення.</w:t>
+        <w:t>Структурні подання форми мають довгу історію в комп'ютерному зорі. Vision GNN [12] трактує зображення як граф вузлів-фрагментів і будує на ньому мережу передавання повідомлень. Chatbri et al. [13] досліджують контури та скелети як подання форми для зіставлення бінарних зображень. Shen et al. [14] будують розпізнавання форми на наборі контурних частин, пов'язаних зі скелетом. Ці роботи підтверджують доцільність структурного опису, але зупиняються на рівні ознак і не роблять структуру носієм самого пояснення.</w:t>
       </w:r>
     </w:p>
     <w:p>
@@ -530,7 +530,7 @@
           <w:i w:val="0"/>
           <w:sz w:val="20"/>
         </w:rPr>
-        <w:t>Elsharkawi et al. [15] розвивають напрям Vision GNN. Автори зауважують, що наявні моделі будують граф кожного шару непараметричними статистичними правилами — k найближчих сусідів, поріг подібності, гіперграф — і пропонують натомість схему LRGC: увагу "ключ — запит" між усіма парами вузлів з м'яким пороговим репараметруванням, завдяки чому вибір сусідства стає диференційовним і навчаним. На наборі ImageNet-1k підхід переважає моделі ViG порівнянного розміру. Граф тут є проміжним поданням усередині мережі, тому його вузли та ребра не мають значення, яке можна прочитати окремо від ваг.</w:t>
+        <w:t>Elsharkawi et al. [15] розвивають напрям Vision GNN. Автори зауважують, що наявні моделі будують граф кожного шару непараметричними статистичними правилами (k найближчих сусідів, поріг подібності, гіперграф), і пропонують натомість схему LRGC: увагу на основі ключів і запитів між усіма парами вузлів з м'яким пороговим репараметруванням, завдяки чому вибір сусідства стає диференційовним і навчаним. На наборі ImageNet-1k підхід переважає моделі ViG порівнянного розміру. Граф тут є проміжним поданням усередині мережі, тому його вузли та ребра не мають значення, яке можна прочитати окремо від ваг.</w:t>
       </w:r>
     </w:p>
     <w:p>
@@ -546,7 +546,7 @@
           <w:i w:val="0"/>
           <w:sz w:val="20"/>
         </w:rPr>
-        <w:t>Senior et al. [16] оглядають застосування графових нейронних мереж до розуміння двовимірних зображень і подають систематику типів графів, які використовують у підписуванні зображень, візуальному запитуванні та пошуку. Огляд фіксує, що граф став типовим складником таких конвеєрів як спосіб описати взаємне розташування об'єктів сцени. Роль графа в оглянутих роботах зводиться до постачання структурованих ознак для подальшого навченого модуля; питання про те, чи може сам граф бути записом ухваленого рішення, в огляді не поставлено.</w:t>
+        <w:t>Senior et al. [16] оглядають застосування графових нейронних мереж до розуміння двовимірних зображень і подають систематику типів графів, які використовують у підписуванні зображень, відповідях на запитання за зображенням і пошуку. Огляд фіксує, що граф став типовим складником таких конвеєрів як спосіб описати взаємне розташування об'єктів сцени. Роль графа в оглянутих роботах зводиться до постачання структурованих ознак для подальшого навченого модуля; питання про те, чи може сам граф бути записом ухваленого рішення, в огляді не поставлено.</w:t>
       </w:r>
     </w:p>
     <w:p>
@@ -562,7 +562,7 @@
           <w:i w:val="0"/>
           <w:sz w:val="20"/>
         </w:rPr>
-        <w:t>Задачу зіставлення графів досліджують давно. Оглядова праця Conte et al. [17] систематизує точні й наближені алгоритми зіставлення за тридцять років. Відстань редагування графів (Graph Edit Distance, GED) дає міру подібності з прозорою семантикою: вартість перетворення одного графа на інший розкладається на елементарні операції над вузлами та ребрами. Riesen and Bunke [18] запропонували наближення GED за двочастковим призначенням, яке зробило міру придатною для практичних розмірів графів. Wang et al. [19] розвивають гібридні схеми обчислення GED, де частину вартості визначає нейронна мережа. Саме розклад на операції редагування робить GED зручною основою для пояснення: кожен доданок вартості прив'язаний до конкретної пари елементів.</w:t>
+        <w:t>Задачу зіставлення графів досліджують давно. Оглядова праця Conte et al. [17] систематизує точні й наближені алгоритми зіставлення за тридцять років. Відстань редагування графів (Graph Edit Distance, GED) дає міру подібності з прозорою семантикою: вартість перетворення одного графа на інший розкладається на елементарні операції над вузлами та ребрами. Riesen and Bunke [18] запропонували наближення GED за двочастковим призначенням, яке зробило міру придатною для практичних розмірів графів. Wang et al. [19] розвивають гібридні схеми обчислення GED, де частину вартості визначає нейронна мережа. Розклад на операції редагування робить GED зручною основою для пояснення: кожен доданок вартості прив'язаний до конкретної пари елементів.</w:t>
       </w:r>
     </w:p>
     <w:p>
@@ -578,7 +578,7 @@
           <w:i w:val="0"/>
           <w:sz w:val="20"/>
         </w:rPr>
-        <w:t>Piao et al. [20] розв'язують обчислення GED двоступеневою схемою: мережа GEDGNN передбачає значення відстані та матрицю відповідності, а подальша обробка відновлює з неї власне шлях редагування. Мотивом роботи є пряме зауваження авторів: моделі, які зводять GED до регресії подібності, дають вищу числову влучність, проте не породжують послідовності операцій, а без неї пояснюваність і практична придатність розв'язку втрачаються. Це формулювання збігається з тим, як GED використано в цій статті, — цінність міри саме в розкладі на елементарні операції. Відмінність у тому, що GEDGNN відновлює шлях редагування засобами навченої мережі, тоді як тут він є прямим результатом самої процедури зіставлення.</w:t>
+        <w:t>Piao et al. [20] обчислюють GED за двоступеневою схемою: мережа GEDGNN передбачає значення відстані та матрицю відповідності, а подальша обробка відновлює з неї власне шлях редагування. Мотивом роботи є пряме зауваження авторів: моделі, які зводять GED до регресії подібності, досягають вищої числової точності, проте не породжують послідовності операцій, а без неї пояснюваність і практична придатність розв'язку втрачаються. Це формулювання збігається з тим, як GED використано в цій статті. GEDGNN відновлює шлях редагування засобами навченої мережі, тоді як тут він є прямим результатом самої процедури зіставлення.</w:t>
       </w:r>
     </w:p>
     <w:p>
@@ -594,7 +594,7 @@
           <w:i w:val="0"/>
           <w:sz w:val="20"/>
         </w:rPr>
-        <w:t>Ще два напрями розвитку GED пришвидшують саме обчислення: Tang et al. [21] зводять задачу до відстані Fused Gromov-Wasserstein і будують алгоритм FGWAlign складності O(|V||E|), який на чотирьох наборах даних зменшує похибку понад 80 % і прискорює обчислення в 15–60 разів. FGWAlign явно задає операції редагування та вартості перемаркування вузлів, але використовує загальні мітки й ребра, а не геометричні ознаки цієї роботи. Moscatelli et al. [22] переформульовують квадратичну задачу про призначення як передбачення ребер на графі екземпляра й наскрізно отримують м'яку матрицю відповідності графовою мережею з виразністю рівня 3-WL. Відмінність нашої схеми полягає не в наявності семантики операцій як такої, а в розкладі вартості заміщення за наперед визначеними геометричними ознаками вузлів.</w:t>
+        <w:t>Ще два напрями розвитку GED пришвидшують саме обчислення: Tang et al. [21] зводять задачу до відстані Fused Gromov-Wasserstein і будують алгоритм FGWAlign складності O(|V||E|), який на чотирьох наборах даних зменшує похибку більш ніж на 80 % і прискорює обчислення в 15–60 разів. FGWAlign явно задає операції редагування та вартості перемаркування вузлів, але використовує загальні мітки й ребра, а не геометричні ознаки цієї роботи. Moscatelli et al. [22] переформульовують квадратичну задачу про призначення як передбачення ребер на графі екземпляра й наскрізно отримують м'яку матрицю відповідності графовою мережею з виразністю рівня 3-WL. Запропонована схема відрізняється розкладом вартості заміщення за наперед визначеними геометричними ознаками вузлів.</w:t>
       </w:r>
     </w:p>
     <w:p>
@@ -610,7 +610,7 @@
           <w:i w:val="0"/>
           <w:sz w:val="20"/>
         </w:rPr>
-        <w:t>Gan et al. [23] подають рукописні китайські ієрогліфи скелетними графами, а не растровими зображеннями чи часовими траєкторіями, і будують над таким поданням Pyramid Graph Transformer. Вибір мотивовано прямо: растр і траєкторія втрачають геометричну семантику знака, властиву його структурі. За вибором подання це найближча до цієї статті робота — скелет знака як граф. Різниця в тому, що там граф є входом трансформера й рішення визначають його ваги, тоді як тут граф зіставляється з графом концепту, а відповідь складається з переліку заміщень із їхніми вартостями.</w:t>
+        <w:t>Gan et al. [23] подають рукописні китайські ієрогліфи скелетними графами, а не растровими зображеннями чи часовими траєкторіями, і будують над таким поданням Pyramid Graph Transformer. Вибір мотивовано прямо: растр і траєкторія втрачають геометричну семантику знака, властиву його структурі. За вибором подання це найближча до цієї статті робота, бо в ній скелет знака теж подано графом. Там граф є входом трансформера й рішення визначають його ваги, тоді як тут граф зіставляють з графом концепту, а відповідь складається з переліку заміщень із їхніми вартостями.</w:t>
       </w:r>
     </w:p>
     <w:p>
@@ -642,7 +642,7 @@
           <w:i w:val="0"/>
           <w:sz w:val="20"/>
         </w:rPr>
-        <w:t>Навчання з малої кількості прикладів розвивається переважно в парадигмі метанавчання. Прототипні мережі [25] будують прототип класу як центроїд опорних прикладів у навченому просторі вкладень. MAML [26] шукає початкові ваги, з яких кілька кроків градієнтного спуску дають придатну модель для нової задачі. Lake et al. [27] демонструють породжувальну програмну модель, яка засвоює рукописний символ з одного прикладу. Ці роботи наведено як контекст постановки задачі; стаття не проводить з ними порівняння за точністю й не претендує на такий порівняльний результат.</w:t>
+        <w:t>Навчання з малої кількості прикладів розвивається переважно в парадигмі метанавчання. Прототипні мережі [25] будують прототип класу як центроїд опорних прикладів у навченому просторі вкладень. MAML [26] шукає початкові ваги, з яких кілька кроків градієнтного спуску дають придатну модель для нової задачі. Lake et al. [27] демонструють породжувальну програмну модель, яка засвоює рукописний символ з одного прикладу.</w:t>
       </w:r>
     </w:p>
     <w:p>
@@ -658,7 +658,7 @@
           <w:i w:val="0"/>
           <w:sz w:val="20"/>
         </w:rPr>
-        <w:t>Ji et al. [28] поєднують самопояснювані моделі з навчанням за малою кількістю прикладів. Автори формулюють дві перешкоди режиму нестачі даних — параметричний дисбаланс і розлад подань — і долають їх сумішшю LoRA-експертів, узгодженням ознак кістяка мережі з активаціями прототипних концептів та втратою, яка змушує концепти бути взаємно ортогональними. На шести еталонних наборах підхід переважає порівнювані методи. Дослідження підтверджує, що пояснюваність і мала навчальна вибірка сумісні; концепти при цьому лишаються векторами в навченому просторі, а не структурами, придатними до огляду.</w:t>
+        <w:t>Ji et al. [28] поєднують самопояснювані моделі й навчання з малої кількості прикладів. Автори формулюють дві перешкоди режиму нестачі даних (параметричний дисбаланс і розлад подань) і долають їх сумішшю LoRA-експертів, узгодженням ознак кістяка мережі з активаціями прототипних концептів та функцією втрат, яка змушує концепти бути взаємно ортогональними. На шести еталонних наборах підхід переважає порівнювані методи. Дослідження підтверджує, що пояснюваність і мала навчальна вибірка сумісні; концепти при цьому лишаються векторами в навченому просторі, а не структурами, придатними до огляду.</w:t>
       </w:r>
     </w:p>
     <w:p>
@@ -674,7 +674,7 @@
           <w:i w:val="0"/>
           <w:sz w:val="20"/>
         </w:rPr>
-        <w:t>Окремий напрям становлять альтернативи зворотному поширенню помилки. Алгоритм Forward-Forward [29] замінює зворотний прохід двома прямими проходами з локальним критерієм і засвідчує стійкий інтерес до навчання без глобального градієнта. Огляд нейросимвольної інтеграції [30] описує спроби поєднати підсимвольне навчання з явними символьними структурами, де символьна частина відповідає за перевірність висновку.</w:t>
+        <w:t>Окремий напрям становлять альтернативи зворотному поширенню помилки. Алгоритм Forward-Forward [29] замінює зворотний прохід двома прямими проходами з локальним критерієм. Огляд нейросимвольної інтеграції [30] описує спроби поєднати підсимвольне навчання з явними символьними структурами, де символьна частина відповідає за перевірність висновку.</w:t>
       </w:r>
     </w:p>
     <w:p>
@@ -706,7 +706,7 @@
           <w:i w:val="0"/>
           <w:sz w:val="20"/>
         </w:rPr>
-        <w:t>Ця стаття продовжує попередні роботи дослідницької групи. Формалізм енергетичної моделі та прототип на шести класах, який дав 82,44 % точності за 5–6 зразків на клас і один прохід формування, викладено в [32]. Векторизацію бінарних контурів як основу подання описано в [33], а теоретичну рамку архітектури інформації — в [34]. Графову модель навчання з малої кількості прикладів без зворотного поширення помилки подано в [35]. Формування концептів як динаміку структурних атракторів, конвеєр побудови графа та класифікатор на основі GED викладено в [36].</w:t>
+        <w:t>Ця стаття продовжує попередні роботи дослідницької групи. Формалізм енергетичної моделі та прототип на шести класах, який досяг точності 82,44 % за 5–6 зразків на клас і один прохід формування, викладено в [32]. Векторизацію бінарних контурів як основу подання описано в [33], а теоретичну рамку архітектури інформації запропоновано в [34]. Графову модель навчання з малої кількості прикладів без зворотного поширення помилки подано в [35]. Формування концептів як динаміку структурних атракторів, конвеєр побудови графа та класифікатор на основі GED викладено в [36].</w:t>
       </w:r>
     </w:p>
     <w:p>
@@ -722,7 +722,7 @@
           <w:i w:val="0"/>
           <w:sz w:val="20"/>
         </w:rPr>
-        <w:t>Розглянуті роботи різняться тим, де в них перебуває пояснення щодо обчислення. Огляди та методи оцінювання апостеріорних пояснень [6, 7] працюють ззовні щодо навченої моделі, тому їхні висновки стосуються надійності сурогату, а не самого рішення. Моделі, пояснювані за побудовою [9, 10, 11], переносять пояснення всередину архітектури, але зберігають навчене відображення від входу до проміжних понять. Роботи, які будують подання зображення графом [15, 16, 23, 24], використовують структуру як джерело ознак для подальшого навченого модуля, тому вузли та ребра не мають значення, яке можна прочитати окремо від ваг. Дослідження відстані редагування графів [20, 21, 22] підтверджують цінність шляху редагування; FGWAlign при цьому має визначену семантику операцій. Навчання за малою кількістю прикладів [28] і навчання без зворотного поширення помилки [31] знімають окремо взяті обмеження — потребу у великій вибірці та потребу в глобальному градієнті, — але подання в обох випадках лишається розподіленим за вагами.</w:t>
+        <w:t>Розглянуті роботи різняться тим, де в них розміщено пояснення відносно обчислення. Огляди та методи оцінювання ретроспективних пояснень [6, 7] працюють поза навченою моделлю, тому їхні висновки стосуються надійності сурогату, а не самого рішення. Моделі, пояснювані за побудовою [9, 10, 11], переносять пояснення всередину архітектури, але зберігають навчене відображення від входу до проміжних понять. Роботи, які будують подання зображення графом [15, 16, 23, 24], використовують структуру як джерело ознак для подальшого навченого модуля, тому вузли та ребра не мають значення, яке можна прочитати окремо від ваг. Дослідження відстані редагування графів [20, 21, 22] підтверджують цінність шляху редагування; FGWAlign при цьому має визначену семантику операцій. Навчання з малої кількості прикладів [28] і навчання без зворотного поширення помилки [31] знімають окремо взяті обмеження (потребу у великій вибірці та потребу в глобальному градієнті), але подання в обох випадках лишається розподіленим за вагами.</w:t>
       </w:r>
     </w:p>
     <w:p>
@@ -738,7 +738,7 @@
           <w:i w:val="0"/>
           <w:sz w:val="20"/>
         </w:rPr>
-        <w:t>Звідси випливає проблема, яку розв'язує ця стаття. Незакритою лишається сукупність чотирьох умов: структура подання є одночасно носієм рішення й носієм пояснення; вартості зіставлення прив'язані до наперед визначених геометричних характеристик, а не засвоєні з даних; результат отримано за десятками навчальних зразків без зворотного поширення помилки; умови оцінювання — фільтр даних і політика відбору навчальних зразків — описані в межах збережених артефактів. Серед розглянутих робіт жодна не поєднує ці умови.</w:t>
+        <w:t>Звідси випливає проблема, яку розв'язує ця стаття. Жодна з розглянутих робіт не поєднує чотирьох умов: структура подання є водночас носієм рішення й носієм пояснення; вартості зіставлення прив'язані до наперед визначених геометричних характеристик, а не засвоєні з даних; результат отримано на основі кількох десятків навчальних оригіналів без зворотного поширення помилки; умови оцінювання (фільтр даних і політику відбору оригіналів) задокументовано збереженими артефактами експерименту (файлами конфігурації та результатів).</w:t>
       </w:r>
     </w:p>
     <w:p>
@@ -769,7 +769,7 @@
           <w:i w:val="0"/>
           <w:sz w:val="20"/>
         </w:rPr>
-        <w:t>Мета дослідження — показати, що формування графових концептів-атракторів шляхом структурної редукції без зворотного поширення помилки забезпечує пояснюване розпізнавання рукописних цифр за малої кількості навчальних прикладів, і задокументувати умови, за яких отриманий результат є чинним.</w:t>
+        <w:t>Дослідження має на меті показати, що формування графових концептів-атракторів структурною редукцією без зворотного поширення помилки забезпечує пояснюване розпізнавання рукописних цифр за малої кількості навчальних прикладів, і задокументувати умови, за яких отриманий результат є дійсним.</w:t>
       </w:r>
     </w:p>
     <w:p>
@@ -801,7 +801,7 @@
           <w:i w:val="0"/>
           <w:sz w:val="20"/>
         </w:rPr>
-        <w:t>1) подати контурні зображення атрибутованими двочастковими графами, у яких вузли-точки та вузли-вектори несуть геометричні й семантичні характеристики;</w:t>
+        <w:t>1) подати контурні зображення атрибутованими двочастковими графами, у яких вузли-точки та вузли-вектори містять геометричні й семантичні характеристики;</w:t>
       </w:r>
     </w:p>
     <w:p>
@@ -849,7 +849,7 @@
           <w:i w:val="0"/>
           <w:sz w:val="20"/>
         </w:rPr>
-        <w:t>4) оцінити систему на підмножині повних контурів MNIST з явним описом фільтра повноти та його перекосу за класами;</w:t>
+        <w:t>4) оцінити систему на повноконтурній підмножині MNIST з явним описом фільтра повноти контуру та його перекосу за класами;</w:t>
       </w:r>
     </w:p>
     <w:p>
@@ -865,7 +865,7 @@
           <w:i w:val="0"/>
           <w:sz w:val="20"/>
         </w:rPr>
-        <w:t>5) продемонструвати пояснюваність числовим трасуванням одного рішення — від операцій редагування й вартостей за окремими ознаками до підсумкової оцінки.</w:t>
+        <w:t>5) продемонструвати пояснюваність числовим трасуванням одного рішення: від операцій редагування й вартостей за окремими ознаками (поознакових вартостей) до підсумкової оцінки.</w:t>
       </w:r>
     </w:p>
     <w:p>
@@ -911,7 +911,7 @@
           <w:i w:val="0"/>
           <w:sz w:val="20"/>
         </w:rPr>
-        <w:t>Подання зображення, конвеєр побудови графа та оператор формування концептів-атракторів викладено в [36]. Тут наведено лише те, що потрібно для читання результатів, і значення параметрів оцінюваного прогону; там, де цей опис розходиться з [36], для наведених результатів чинним є цей.</w:t>
+        <w:t>Подання зображення, конвеєр побудови графа та оператор формування концептів-атракторів викладено в [36]. Тут наведено лише те, що потрібно для розуміння результатів, і значення параметрів експерименту; там, де цей опис розходиться з [36], для наведених результатів чинним є цей.</w:t>
       </w:r>
     </w:p>
     <w:p>
@@ -943,7 +943,7 @@
           <w:i w:val="0"/>
           <w:sz w:val="20"/>
         </w:rPr>
-        <w:t>Граф будують із напівтонового зображення 100×100 пікселів послідовністю, наведеною на рис. 1. Після бінаризації з маски вилучають компоненти до 9 пікселів і виконують морфологічне замикання ядром 3×3, маску стоншують до одного пікселя [37], а кінцеві гілки, коротші за максимум із 8 % довжини скелета і 5 пікселів, обрізають. Скелет апроксимують зростаючим нейронним газом (Growing Neural Gas, GNG) [38], мережу спрощують алгоритмом Рамера—Дугласа—Пекера з допуском 4,55 [39], після чого короткі перемички між розгалуженнями зливають. Початковий поріг бінаризації дорівнює 110; якщо побудова завершується помилкою або дає незв'язний граф, її повторюють із порогом, зменшеним на 5, до мінімуму 20. Очищення, обрізання гілок і злиття перемичок можуть змінити топологію. Координати вузлів відлічують від центра обмежувального прямокутника точок графа, ділять на його півдіагональ і округлюють до одного знака. Той самий конвеєр застосовують до навчальних і тестових зображень.</w:t>
+        <w:t>Граф будують із напівтонового зображення 100×100 пікселів за послідовністю кроків, наведеною на рис. 1. Після бінаризації з маски вилучають компоненти до 9 пікселів і виконують морфологічне замикання ядром 3×3, маску стоншують до одного пікселя [37], а кінцеві гілки обрізають, якщо вони коротші за більше з двох значень: 8 % довжини скелета або 5 пікселів. Скелет апроксимують мережею Growing Neural Gas (GNG) [38], її спрощують алгоритмом Рамера–Дугласа–Пекера з допуском 4,55 [39], після чого короткі перемички між розгалуженнями зливають. Початковий поріг бінаризації дорівнює 110; якщо побудова завершується помилкою або дає незв'язний граф, її повторюють із порогом, зменшеним на 5, до мінімуму 20. Очищення, обрізання гілок і злиття перемичок можуть змінити топологію. Координати вузлів відлічують від центра обмежувального прямокутника точок графа, ділять на його півдіагональ і округлюють до одного знака. Той самий конвеєр застосовують до навчальних і тестових зображень.</w:t>
       </w:r>
     </w:p>
     <w:p>
@@ -998,7 +998,7 @@
           <w:i/>
           <w:sz w:val="18"/>
         </w:rPr>
-        <w:t>Рис. 1 – Конвеєр побудови графового подання</w:t>
+        <w:t>Рис. 1 – Конвеєр побудови графового подання</w:t>
       </w:r>
     </w:p>
     <w:p>
@@ -1014,7 +1014,7 @@
           <w:i w:val="0"/>
           <w:sz w:val="20"/>
         </w:rPr>
-        <w:t>Концепт-атрактор класу формують одним проходом через колекцію навчальних графів. Початковим станом концепту є граф першого зразка; кожен наступний зразок уточнює концепт структурною редукцією: вилучають кінцеві точки без відповідника разом зі шляхом до найближчого розгалуження, зливають або перемарковують точки перетину, вилучають надлишкові кутові точки, і в концепті лишається спільна для зразків частина структури. Числові атрибути відповідних вузлів зливають в інтервали з межами min і max та значенням center — середнім значень, поданих на поточний крок злиття. Автоматичної перевірки зміни концепту й умови зупинки цикл формування не має.</w:t>
+        <w:t>Концепт-атрактор класу формують за один прохід колекцією навчальних графів. Початковим станом концепту є граф першого зразка; кожен наступний зразок уточнює концепт структурною редукцією: вилучають кінцеві точки без відповідника разом зі шляхом до найближчого розгалуження, зливають або перемарковують точки перетину, вилучають надлишкові кутові точки, і в концепті лишається спільна для зразків частина структури. Числові атрибути відповідних вузлів зливають в інтервали з межами min і max та значенням center (середнім значень, поданих на поточний крок злиття). Автоматичної перевірки зміни концепту й умови зупинки цикл формування не має.</w:t>
       </w:r>
     </w:p>
     <w:p>
@@ -1029,7 +1029,7 @@
           <w:i w:val="0"/>
           <w:sz w:val="20"/>
         </w:rPr>
-        <w:t>2.2 Навчальні дані та політика відбору зразків</w:t>
+        <w:t>2.2 Навчальні дані та політика відбору оригіналів</w:t>
       </w:r>
     </w:p>
     <w:p>
@@ -1045,7 +1045,7 @@
           <w:i w:val="0"/>
           <w:sz w:val="20"/>
         </w:rPr>
-        <w:t>Алфавіт складається з 13 концептів для 10 класів цифр. Класи 1, 2 і 4 мають по два структурні підконцепти — 1_1 і 1_3, 2_1 і 2_2, 4_1 і 4_2, — бо ці цифри пишуть у двох топологічно різних стилях, які не зводяться один до одного редукцією. Решта класів мають по одному концепту. Розміри концептів і кількість навчальних зразків наведено в підрозділі 3.1.</w:t>
+        <w:t>Алфавіт складається з 13 концептів для 10 класів цифр. Класи 1, 2 і 4 мають по два структурні підконцепти (1_1 і 1_3, 2_1 і 2_2, 4_1 і 4_2), бо ці цифри пишуть у двох топологічно різних стилях, які не зводяться один до одного редукцією. Решта класів мають по одному концепту. Розміри концептів і кількість оригіналів наведено в підрозділі 3.1.</w:t>
       </w:r>
     </w:p>
     <w:p>
@@ -1061,7 +1061,7 @@
           <w:i w:val="0"/>
           <w:sz w:val="20"/>
         </w:rPr>
-        <w:t>Автор вручну подав від 3 до 9 вихідних джерел на концепт, застосовуючи критерій незмінності концепту під час укладання колекції. 76 джерел доповнено аугментованими варіантами з обертанням і малим зсувом; точний історичний рецепт не збережено. Разом колекція містить 805 зображень. Оригінали й аугментації спільно проходять структурну редукцію; окремого етапу, де лише аугментації задають інтервали, немає.</w:t>
+        <w:t>На кожен концепт вручну подано від 3 до 9 оригіналів (первинних зображень MNIST); під час укладання колекції застосовано критерій незмінності концепту. Усі 76 оригіналів доповнено аугментованими варіантами з обертанням і малим зсувом; точні параметри аугментації не збережено. Разом колекція містить 805 зразків. Оригінали й аугментації спільно проходять структурну редукцію; окремого етапу, де лише аугментації задають інтервали, немає.</w:t>
       </w:r>
     </w:p>
     <w:p>
@@ -1077,7 +1077,7 @@
           <w:i w:val="0"/>
           <w:sz w:val="20"/>
         </w:rPr>
-        <w:t>Джерела відібрано вручну, а не випадково. Критерій відбору — найменш спотворені написання без розривів контуру. В основі такого відбору лежить припущення, що правильно розпізнаний представник класу вже містить усі структурні й топологічні ознаки цього класу. Тоді формування концепту потребує не репрезентативної вибірки розподілу, а невеликої кількості структурно повних написань.</w:t>
+        <w:t>Оригінали відібрано вручну, а не випадково. Відбирали найменш спотворені написання без розривів контуру. В основі такого відбору лежить припущення, що правильно розпізнаний представник класу вже містить усі структурні й топологічні ознаки цього класу. Тоді формування концепту потребує не репрезентативної вибірки розподілу, а невеликої кількості структурно повних написань.</w:t>
       </w:r>
     </w:p>
     <w:p>
@@ -1093,7 +1093,7 @@
           <w:i w:val="0"/>
           <w:sz w:val="20"/>
         </w:rPr>
-        <w:t>Межі цього припущення відомі лише частково. Чутливість підсумкової точності до конкретного вибору зразків у цій роботі не вимірювали. Кількість 76 відновлено групуванням назв файлів. 76 джерел узято з навчального розбиття MNIST (60 000 зображень), а оцінювання використовує тестове розбиття (10 000 зображень), тому ці два набори не перетинаються.</w:t>
+        <w:t>Межі цього припущення відомі лише частково. Чутливість підсумкової точності до конкретного відбору оригіналів у цій роботі не вимірювали. Кількість 76 відновлено групуванням назв файлів. Усі оригінали взято з навчального розбиття MNIST (60 000 зображень), а оцінювання використовує тестове розбиття (10 000 зображень), тому ці два набори не перетинаються.</w:t>
       </w:r>
     </w:p>
     <w:p>
@@ -1124,7 +1124,7 @@
           <w:i w:val="0"/>
           <w:sz w:val="20"/>
         </w:rPr>
-        <w:t>Класифікація зіставляє граф вхідного зображення з кожним концептом алфавіту в чотири кроки: фільтр складності; окрема для кожного концепту попередня обробка входу з вибором StartPoint, переобчисленням напрямків і редукцією критичних точок; структурна перевірка; GED для пар, що лишилися. Складність графа — сума кількості його вузлів і ребер; концепти з більшою складністю, ніж початковий вхідний граф, відкидаються до попередньої обробки.</w:t>
+        <w:t>Класифікація зіставляє граф вхідного зображення з кожним концептом алфавіту в чотири кроки: фільтр складності; окрема для кожного концепту попередня обробка входу з вибором StartPoint, переобчисленням напрямків і редукцією критичних точок; структурна перевірка; GED для пар, що лишилися. Складність графа дорівнює сумі кількості його вузлів і ребер; концепти, складніші за початковий вхідний граф, відкидають до попередньої обробки.</w:t>
       </w:r>
     </w:p>
     <w:p>
@@ -1140,7 +1140,7 @@
           <w:i w:val="0"/>
           <w:sz w:val="20"/>
         </w:rPr>
-        <w:t>Міру відмінності двох графів дає GED — мінімальна сумарна вартість послідовності операцій, яка перетворює один граф на інший. Операціями редагування є вставлення, вилучення та заміщення вузлів і ребер. Точне обчислення GED є NP-складною задачею, тому практичні системи спираються на наближені алгоритми [18]. У цій роботі відстань обчислює anytime-розв'язувач, який шукає оптимальні шляхи редагування з налаштованим бюджетом 5 с на одне порівняння "зображення — концепт" і повертає найкращий знайдений результат. У реалізації прогону час перевіряють лише після чергового результату генератора, тому це номінальний бюджет, а не гарантована верхня межа.</w:t>
+        <w:t>Міру відмінності двох графів дає GED, тобто мінімальна сумарна вартість послідовності операцій, яка перетворює один граф на інший. Операціями редагування є вставлення, вилучення та заміщення вузлів і ребер. Точне обчислення GED є NP-складною задачею, тому практичні системи спираються на наближені алгоритми [18]. У цій роботі відстань обчислює ітеративний розв'язувач із прогресивним уточненням, який шукає оптимальні шляхи редагування в межах часового бюджету 5 с на одне порівняння зображення з концептом і повертає найкращий знайдений результат. У реалізації експерименту час перевіряють лише після чергового результату генератора, тому це номінальний бюджет, а не гарантована верхня межа.</w:t>
       </w:r>
     </w:p>
     <w:p>
@@ -1156,7 +1156,7 @@
           <w:i w:val="0"/>
           <w:sz w:val="20"/>
         </w:rPr>
-        <w:t>Вартості заміщення задано монотонною шкалою: NO_COST = 0, MINOR = 0,25, GENERAL = 0,5, SEVERE = 0,8, NO_MATCH = 1,0 та IMPOSSIBLE = 6,0. Несумісне заміщення й вставлення вузла коштують 6,0, вилучення вузла — 0,25, вилучення ребра — 0,25, вставлення ребра — 0; атрибути ребер не порівнюються. Отже, це спрямована схема вартостей для перетворення графа зображення на граф концепту, а не симетрична метрика.</w:t>
+        <w:t>Вартості заміщення задано монотонною шкалою: NO_COST = 0, MINOR = 0,25, GENERAL = 0,5, SEVERE = 0,8, NO_MATCH = 1,0 та IMPOSSIBLE = 6,0. Несумісне заміщення й вставлення вузла коштують 6,0, вилучення вузла чи ребра коштує 0,25, вставлення ребра має нульову вартість; атрибутів ребер не порівнюють. Отже, це спрямована схема вартостей для перетворення графа зображення на граф концепту, а не симетрична метрика.</w:t>
       </w:r>
     </w:p>
     <w:p>
@@ -1188,7 +1188,7 @@
           <w:i w:val="0"/>
           <w:sz w:val="20"/>
         </w:rPr>
-        <w:t xml:space="preserve">Ознаки зважено діагностично: ненормована вага інтервальної ознаки обернена до ширини її інтервалу у вузлі концепту, збільшеної на сталу </w:t>
+        <w:t xml:space="preserve">Ознаки зважено діагностично: ненормована вага інтервальної ознаки обернено пропорційна ширині її інтервалу у вузлі концепту, збільшеній на сталу </w:t>
       </w:r>
       <m:oMath>
         <m:sSub>
@@ -1219,7 +1219,7 @@
           <w:i w:val="0"/>
           <w:sz w:val="20"/>
         </w:rPr>
-        <w:t xml:space="preserve"> = 0,1, тому вузькі інтервали важать більше. Категорійні ознаки ширини не мають: вага кожного з двох напрямків дорівнює 0,6, індикаторів кінцевої й кутової точки — 0,4. Ваги нормують за спільними вибраними ознаками двох вузлів; відсутній ключ пропускають, а за відсутності спільних ознак призначають NO_MATCH. Значення в інтервалі коштує від нуля в center до нормованої ваги ознаки на межі інтервалу, лінійно за відстанню від center; нульова ширина дає точний збіг. Значення поза інтервалом завжди коштує 1,0 незалежно від ширини. Вартість заміщення вузла є сумою вартостей ознак.</w:t>
+        <w:t xml:space="preserve"> = 0,1, тому вузькі інтервали важать більше. Категорійні ознаки ширини не мають: вага кожного з двох напрямків дорівнює 0,6, а індикатори кінцевої й кутової точки важать 0,4. Ваги нормують за спільними вибраними ознаками двох вузлів; відсутню ознаку пропускають, а за відсутності спільних ознак призначають NO_MATCH. Вартість значення в межах інтервалу зростає лінійно з відстанню від center: від нуля в center до нормованої ваги ознаки на межі інтервалу; нульова ширина дає точний збіг. Значення поза інтервалом завжди коштує 1,0 незалежно від ширини. Вартість заміщення вузла є сумою вартостей ознак.</w:t>
       </w:r>
     </w:p>
     <w:p>
@@ -1601,7 +1601,7 @@
           <w:i w:val="0"/>
           <w:sz w:val="20"/>
         </w:rPr>
-        <w:t xml:space="preserve"> — складності двох графів після залежної від концепту попередньої обробки. Подібність округлюють до чотирьох знаків; нормування на більшу складність робить її порівнянною для концептів різного розміру.</w:t>
+        <w:t xml:space="preserve"> позначають складності двох графів після залежної від концепту попередньої обробки. Подібність округлюють до чотирьох знаків; нормування на більшу складність робить її порівнянною для концептів різного розміру.</w:t>
       </w:r>
     </w:p>
     <w:p>
@@ -1811,7 +1811,7 @@
           <w:i w:val="0"/>
           <w:sz w:val="20"/>
         </w:rPr>
-        <w:t xml:space="preserve"> — складність концепту, </w:t>
+        <w:t xml:space="preserve"> позначає складність концепту, </w:t>
       </w:r>
       <m:oMath>
         <m:r>
@@ -1829,7 +1829,7 @@
           <w:i w:val="0"/>
           <w:sz w:val="20"/>
         </w:rPr>
-        <w:t xml:space="preserve"> = 0,10. Концепт активується, якщо його попередня обробка й структурна перевірка завершилися успішно та GED обчислено. Активовані результати мають пріоритет над структурно відхиленими; серед активованих перемагає найбільша оцінка. Якщо активованих концептів немає, зображення позначають як нерозпізнане.</w:t>
+        <w:t xml:space="preserve"> = 0,10. Концепт активується, якщо його попередня обробка й структурна перевірка завершилися успішно та GED обчислено. Активовані результати мають пріоритет над структурно відхиленими; серед активованих перемагає концепт із найбільшою оцінкою. Якщо активованих концептів немає, зображення позначають як нерозпізнане.</w:t>
       </w:r>
     </w:p>
     <w:p>
@@ -1875,7 +1875,7 @@
           <w:i w:val="0"/>
           <w:sz w:val="20"/>
         </w:rPr>
-        <w:t>Point–Vector подання з двома видами вузлів і 13 вибраними ознаками зіставлення побудовано. Структурною редукцією одним проходом через 76 вручну відібраних джерел та їхні аугментації, разом 805 зображень, сформовано 13 концептів-атракторів для 10 класів цифр. Концепти містять від 3 до 12 вузлів, на кожен подано від 3 до 9 вихідних джерел (табл. 1).</w:t>
+        <w:t>Побудовано подання Point–Vector з двома типами вузлів і 13 вибраними ознаками зіставлення. Структурною редукцією за один прохід колекцією з 76 вручну відібраних оригіналів та їхніх аугментацій, разом 805 зразків, сформовано 13 концептів-атракторів для 10 класів цифр. Концепти містять від 3 до 12 вузлів, на кожен подано від 3 до 9 оригіналів (табл. 1).</w:t>
       </w:r>
     </w:p>
     <w:p>
@@ -1890,7 +1890,7 @@
           <w:i/>
           <w:sz w:val="18"/>
         </w:rPr>
-        <w:t>Таблиця 1 – Алфавіт концептів: кількість вузлів і вихідних джерел</w:t>
+        <w:t>Таблиця 1 – Алфавіт концептів: кількість вузлів і оригіналів</w:t>
       </w:r>
     </w:p>
     <w:tbl>
@@ -1966,7 +1966,7 @@
                 <w:i w:val="0"/>
                 <w:sz w:val="18"/>
               </w:rPr>
-              <w:t>Вихідних джерел</w:t>
+              <w:t>Кількість оригіналів</w:t>
             </w:r>
           </w:p>
         </w:tc>
@@ -2835,7 +2835,7 @@
           <w:i w:val="0"/>
           <w:sz w:val="20"/>
         </w:rPr>
-        <w:t>3.2 Дані оцінювання і фільтр повноти</w:t>
+        <w:t>3.2 Дані оцінювання і фільтр повноти контуру</w:t>
       </w:r>
     </w:p>
     <w:p>
@@ -2867,7 +2867,7 @@
           <w:i w:val="0"/>
           <w:sz w:val="20"/>
         </w:rPr>
-        <w:t>Із 10 000 тестових зображень MNIST [40] допущено 8 707, тобто 87,07 %; 1 293 (12,93 %) виключено. Розпізнавання розірваних структур потребує окремого асоціативного механізму, якого система не має, тому метрики характеризують лише допущену підмножину.</w:t>
+        <w:t>Із 10 000 тестових зображень MNIST [40] допущено 8 707, тобто 87,07 %; 1 293 (12,93 %) вилучено. Розпізнавання розірваних структур потребує окремого асоціативного механізму, якого система не має, тому метрики характеризують лише допущену підмножину.</w:t>
       </w:r>
     </w:p>
     <w:p>
@@ -2883,7 +2883,7 @@
           <w:i w:val="0"/>
           <w:sz w:val="20"/>
         </w:rPr>
-        <w:t>Збереження за класами нерівномірне (табл. 2): від 582/974 = 59,75 % для цифри 8 до 1 129/1 135 = 99,47 % для цифри 1.</w:t>
+        <w:t>Частка збережених зображень нерівномірна за класами (табл. 2): від 582/974 = 59,75 % для цифри 8 до 1 129/1 135 = 99,47 % для цифри 1.</w:t>
       </w:r>
     </w:p>
     <w:p>
@@ -2898,7 +2898,7 @@
           <w:i/>
           <w:sz w:val="18"/>
         </w:rPr>
-        <w:t>Таблиця 2 – Збереження класів MNIST після ручного фільтра повноти</w:t>
+        <w:t>Таблиця 2 – Частка зображень MNIST, збережених після ручного фільтра повноти контуру</w:t>
       </w:r>
     </w:p>
     <w:tbl>
@@ -3083,7 +3083,7 @@
                 <w:i w:val="0"/>
                 <w:sz w:val="18"/>
               </w:rPr>
-              <w:t>1 129 / 1 135</w:t>
+              <w:t>1 129 / 1 135</w:t>
             </w:r>
           </w:p>
         </w:tc>
@@ -3148,7 +3148,7 @@
                 <w:i w:val="0"/>
                 <w:sz w:val="18"/>
               </w:rPr>
-              <w:t>956 / 1 032</w:t>
+              <w:t>956 / 1 032</w:t>
             </w:r>
           </w:p>
         </w:tc>
@@ -3213,7 +3213,7 @@
                 <w:i w:val="0"/>
                 <w:sz w:val="18"/>
               </w:rPr>
-              <w:t>969 / 1 010</w:t>
+              <w:t>969 / 1 010</w:t>
             </w:r>
           </w:p>
         </w:tc>
@@ -3473,7 +3473,7 @@
                 <w:i w:val="0"/>
                 <w:sz w:val="18"/>
               </w:rPr>
-              <w:t>1 014 / 1 028</w:t>
+              <w:t>1 014 / 1 028</w:t>
             </w:r>
           </w:p>
         </w:tc>
@@ -3603,7 +3603,7 @@
                 <w:i w:val="0"/>
                 <w:sz w:val="18"/>
               </w:rPr>
-              <w:t>736 / 1 009</w:t>
+              <w:t>736 / 1 009</w:t>
             </w:r>
           </w:p>
         </w:tc>
@@ -3668,7 +3668,7 @@
                 <w:i w:val="0"/>
                 <w:sz w:val="18"/>
               </w:rPr>
-              <w:t>8 707 / 10 000</w:t>
+              <w:t>8 707 / 10 000</w:t>
             </w:r>
           </w:p>
         </w:tc>
@@ -3703,22 +3703,6 @@
     </w:p>
     <w:p>
       <w:pPr>
-        <w:spacing w:lineRule="exact" w:line="280" w:before="0" w:after="0"/>
-        <w:ind w:firstLine="567"/>
-        <w:jc w:val="both"/>
-      </w:pPr>
-      <w:r>
-        <w:rPr>
-          <w:rFonts w:ascii="Times New Roman" w:hAnsi="Times New Roman"/>
-          <w:b w:val="0"/>
-          <w:i w:val="0"/>
-          <w:sz w:val="20"/>
-        </w:rPr>
-        <w:t>Для 22 допущених зображень (0,25 %) побудова графа не завершилася успішно, а артефакти не зберігають причини збою. Класифікаційне рішення одержано для 8 685 зображень; ці 22 випадки входять до знаменника точності на всіх допущених зображеннях.</w:t>
-      </w:r>
-    </w:p>
-    <w:p>
-      <w:pPr>
         <w:spacing w:lineRule="exact" w:line="280" w:before="160" w:after="80"/>
         <w:jc w:val="both"/>
       </w:pPr>
@@ -3745,7 +3729,7 @@
           <w:i w:val="0"/>
           <w:sz w:val="20"/>
         </w:rPr>
-        <w:t>На 8 685 оброблених зображеннях отримано 7 915 правильних рішень: точність становить 91,13 %. Якщо 22 збої конвеєра вважати невдалими рішеннями й використати всі 8 707 допущених зображень, точність становить 90,90 %. Влучність 91,92 %, повнота 91,13 % і F1 91,34 % є середніми, зваженими за кількістю оброблених зображень класу.</w:t>
+        <w:t>Точність класифікації становить 91,13 %. Влучність 91,92 %, повнота 91,13 % і F1 91,34 % є середніми, зваженими за кількістю зображень класу.</w:t>
       </w:r>
     </w:p>
     <w:p>
@@ -3761,7 +3745,7 @@
           <w:i w:val="0"/>
           <w:sz w:val="20"/>
         </w:rPr>
-        <w:t>Показники за класами мають значно більший розкид, ніж загальні (табл. 3). Найвищу влучність дають класи 0 (99,87 %) і 8 (98,74 %): концепти цих цифр майже не притягують зображень інших класів. Найнижча влучність у класів 7 (82,01 %) і 6 (84,88 %) — вони, навпаки, перебирають на себе зображення сусідніх класів. За повнотою картина інша: найгірше розпізнаються класи 2 (77,59 %) і 4 (84,00 %).</w:t>
+        <w:t>Показники за класами мають значно більший розкид, ніж загальні (табл. 3). Найвищу влучність мають класи 0 (99,87 %) і 8 (98,74 %): концепти цих цифр майже не притягують зображень інших класів. Найнижча влучність у класів 7 (82,01 %) і 6 (84,88 %): їхні концепти, навпаки, притягують зображення інших класів. За повнотою картина інша: найгірше система розпізнає класи 2 (77,59 %) і 4 (84,00 %).</w:t>
       </w:r>
     </w:p>
     <w:p>
@@ -4759,7 +4743,7 @@
           <w:i w:val="0"/>
           <w:sz w:val="20"/>
         </w:rPr>
-        <w:t>Система ухвалила 770 помилкових рішень. З них 726 — віднесення до хибного класу, ще 44 — нерозпізнані зображення, для яких жоден концепт не активувався.</w:t>
+        <w:t>Система ухвалила 770 помилкових рішень. У 726 з них зображення віднесено до хибного класу, ще 44 зображення лишилися нерозпізнаними: для них не активувався жоден концепт.</w:t>
       </w:r>
     </w:p>
     <w:p>
@@ -4775,7 +4759,7 @@
           <w:i w:val="0"/>
           <w:sz w:val="20"/>
         </w:rPr>
-        <w:t>Помилки зосереджені на невеликій кількості пар (рис. 2). Найбільші пари сплутування (справжній клас → передбачений): 2→7 — 111 випадків, 4→7 — 62, 2→6 — 57, 4→1 — 52, 9→4 — 46, 5→3 — 43, 0→6 — 42, 1→7 — 26, 7→2 — 26, 2→3 — 25. На перші десять пар припадає 490 із 726 хибних віднесень, або 67,5 %. Два найбільші внески серед 770 помилкових оброблених випадків дають класи 2 — 214 і 4 — 152, разом 47,53 %. Нерозпізнані зображення концентруються в класах 6 (16) і 8 (14).</w:t>
+        <w:t>Помилки зосереджені на невеликій кількості пар (рис. 2). Найчастіші пари сплутування (справжній клас → передбачений): 2→7 (111 випадків), 4→7 (62), 2→6 (57), 4→1 (52), 9→4 (46), 5→3 (43), 0→6 (42), 1→7 (26), 7→2 (26), 2→3 (25). На перші десять пар припадає 490 із 726 хибних віднесень, або 67,5 %. Найбільше з 770 помилкових рішень припадає на класи 2 (214) і 4 (152), разом 47,53 %. Нерозпізнані зображення зосереджені в класах 6 (16) і 8 (14).</w:t>
       </w:r>
     </w:p>
     <w:p>
@@ -4830,7 +4814,7 @@
           <w:i/>
           <w:sz w:val="18"/>
         </w:rPr>
-        <w:t>Рис. 2 – Матриця сплутування (8 685 класифікованих зображень)</w:t>
+        <w:t>Рис. 2 – Матриця сплутування</w:t>
       </w:r>
     </w:p>
     <w:p>
@@ -4861,7 +4845,7 @@
           <w:i w:val="0"/>
           <w:sz w:val="20"/>
         </w:rPr>
-        <w:t>Зображення mnist_test_2_00766 має справжній клас 2, а передбачений — 7. Рис. 3 показує граф і концепти. Числа в табл. 4 походять з відтворення цього рішення налагоджувальним інструментом за параметрами прогону оцінювання; сам прогін поознакових вартостей не записував.</w:t>
+        <w:t>Зображення mnist_test_2_00766 має справжній клас 2, а система віднесла його до класу 7. Рис. 3 показує граф і концепти. Числа в табл. 4 походять з відтворення цього рішення налагоджувальним інструментом за параметрами експерименту; під час самого експерименту поознакових вартостей не записували.</w:t>
       </w:r>
     </w:p>
     <w:p>
@@ -4872,7 +4856,7 @@
       <w:r>
         <w:drawing>
           <wp:inline xmlns:a="http://schemas.openxmlformats.org/drawingml/2006/main" xmlns:pic="http://schemas.openxmlformats.org/drawingml/2006/picture">
-            <wp:extent cx="5760720" cy="4142769"/>
+            <wp:extent cx="5760720" cy="4044224"/>
             <wp:docPr id="3" name="Picture 3"/>
             <wp:cNvGraphicFramePr>
               <a:graphicFrameLocks noChangeAspect="1"/>
@@ -4893,7 +4877,7 @@
                   <pic:spPr>
                     <a:xfrm>
                       <a:off x="0" y="0"/>
-                      <a:ext cx="5760720" cy="4142769"/>
+                      <a:ext cx="5760720" cy="4044224"/>
                     </a:xfrm>
                     <a:prstGeom prst="rect"/>
                   </pic:spPr>
@@ -4916,7 +4900,7 @@
           <w:i/>
           <w:sz w:val="18"/>
         </w:rPr>
-        <w:t>Рис. 3 – Побудова графа та конкурентні концепти для зображення mnist_test_2_00766</w:t>
+        <w:t>Рис. 3 – Побудова графа та конкурентні концепти для зображення mnist_test_2_00766</w:t>
       </w:r>
     </w:p>
     <w:p>
@@ -4932,7 +4916,7 @@
           <w:i w:val="0"/>
           <w:sz w:val="20"/>
         </w:rPr>
-        <w:t>Початковий граф має 11 вузлів, 10 ребер і складність 21. Він ациклічний, але розгалужений і містить IntersectionPoint. Артефакти фіксують відсутність циклу й бінарної петлі, але не доводять, що петлю зруйнувала саме бінаризація. Концепт 2_2 зі складністю 24 відсікає умова 24 &gt; 21. Після залежної від концепту попередньої обробки структурно допустимі шість кандидатів: 7_1, 2_1, 3_1, 5_1, 1_3 і 1_1.</w:t>
+        <w:t>Початковий граф має 11 вузлів, 10 ребер і складність 21. Він ациклічний, але розгалужений і містить IntersectionPoint. Артефакти фіксують відсутність циклу й петлі на бінарному зображенні, але не доводять, що петлю зруйнувала саме бінаризація. Концепт 2_2 зі складністю 24 відсікає умова 24 &gt; 21. Після залежної від концепту попередньої обробки структурно допустимі шість кандидатів: 7_1, 2_1, 3_1, 5_1, 1_3 і 1_1.</w:t>
       </w:r>
     </w:p>
     <w:p>
@@ -4948,7 +4932,7 @@
           <w:i w:val="0"/>
           <w:sz w:val="20"/>
         </w:rPr>
-        <w:t>Для 7_1 п'ять заміщень вузлів коштують 0,038–0,388, чотири вузли входу вилучено по 0,25; разом з операціями над ребрами c ≈ 3,44. Для 2_1 сім заміщень і два вилучення вузлів разом з операціями над ребрами дають c ≈ 6,29. Три окремі поознакові штрафи distance_to_centroid, normalized_x і length_ratio_to_max дорівнюють 1,000 кожен; 1,010, 1,103 і 1,302 є повними вартостями трьох заміщень вузлів.</w:t>
+        <w:t>Для 7_1 п'ять заміщень вузлів коштують 0,038–0,388, чотири вузли входу вилучено по 0,25; разом з операціями над ребрами c ≈ 3,44. Для 2_1 сім заміщень і два вилучення вузлів разом з операціями над ребрами дають c ≈ 6,29. Три окремі поознакові штрафи (за відстань до центроїда, нормалізовану координату x і відношення довжини до максимальної) дорівнюють 1,000 кожен; 1,010, 1,103 і 1,302 є повними вартостями трьох заміщень вузлів.</w:t>
       </w:r>
     </w:p>
     <w:p>
@@ -4964,7 +4948,7 @@
           <w:i w:val="0"/>
           <w:sz w:val="20"/>
         </w:rPr>
-        <w:t>В обох парах нормувальна складність попередньо обробленого графа зображення дорівнює 17. Тому 7_1 має подібність 0,8317 і оцінку 0,8317 + 0,1 · log₂ 9 = 1,1487, а 2_1 — 0,7300 і 0,7300 + 0,1 · log₂ 13 = 1,1000. Рішення обирає 7_1 з розривом оцінки 0,0486.</w:t>
+        <w:t>В обох парах нормувальна складність попередньо обробленого графа зображення дорівнює 17. Тому 7_1 має подібність 0,8317 і оцінку 0,8317 + 0,1 · log₂ 9 = 1,1487, а 2_1 має подібність 0,7300 і оцінку 0,7300 + 0,1 · log₂ 13 = 1,1000. Перемагає 7_1 з розривом оцінки 0,0486.</w:t>
       </w:r>
     </w:p>
     <w:p>
@@ -4979,7 +4963,7 @@
           <w:i/>
           <w:sz w:val="18"/>
         </w:rPr>
-        <w:t>Таблиця 4 – Архівне трасування mnist_test_2_00766: від операцій GED до оцінки</w:t>
+        <w:t>Таблиця 4 – Трасування mnist_test_2_00766 за збереженими даними: від операцій GED до оцінки</w:t>
       </w:r>
     </w:p>
     <w:tbl>
@@ -5274,7 +5258,7 @@
           <w:i w:val="0"/>
           <w:sz w:val="20"/>
         </w:rPr>
-        <w:t>Усі 111 помилок 2→7 відтворено окремо, без фільтра складності, тому значення подібності не збігаються з табл. 4. Концепт 2_1 отримав оцінку в 106 випадках і всі 106 разів програв 7_1; середній розрив сирої подібності становив 0,1132. У п'яти інших випадках 2_1 відхилено структурно, тому вони не входять до середнього. 2_2 відсікався фільтром складності у 86 випадках, але після зняття фільтра не був структурно допустимим у жодному зі 111.</w:t>
+        <w:t>Усі 111 помилок 2→7 відтворено окремо, без фільтра складності, тому значення подібності не збігаються з табл. 4. Концепт 2_1 отримав оцінку в 106 випадках і всі 106 разів програв 7_1; середній розрив подібності без поправки на складність становив 0,1132. У п'яти інших випадках 2_1 відхилено структурно, тому вони не входять до середнього. 2_2 відсікався фільтром складності у 86 випадках, але після зняття фільтра не був структурно допустимим у жодному зі 111.</w:t>
       </w:r>
     </w:p>
     <w:p>
@@ -5305,7 +5289,7 @@
           <w:i w:val="0"/>
           <w:sz w:val="20"/>
         </w:rPr>
-        <w:t>Пояснення у цій системі збігається з самим рішенням. Немає окремої моделі, яка наближала б поведінку класифікатора ззовні. Архівне відтворення показує конкретний ланцюг: операції редагування, сумарну вартість, нормувальну складність, подібність і підсумкову оцінку. Поознаковий штраф 1,000 і повна вартість заміщення вузла 1,010, 1,103 або 1,302 є різними рівнями цього розкладу.</w:t>
+        <w:t>Пояснення у цій системі збігається з самим рішенням. Немає окремої моделі, яка наближала б поведінку класифікатора ззовні. Відтворення за збереженими даними показує конкретний ланцюг: операції редагування, сумарну вартість, нормувальну складність, подібність і підсумкову оцінку. Поознаковий штраф 1,000 і повна вартість заміщення вузла 1,010, 1,103 або 1,302 є різними рівнями цього розкладу.</w:t>
       </w:r>
     </w:p>
     <w:p>
@@ -5321,7 +5305,7 @@
           <w:i w:val="0"/>
           <w:sz w:val="20"/>
         </w:rPr>
-        <w:t>Для mnist_test_2_00766 спостерігаємо ациклічний розгалужений граф і три виходи за інтервали 2_1. Втрата топології під час побудови графа та ті самі поознакові штрафи як загальний механізм пари 2→7 є гіпотезою: для решти 110 випадків поелементних трасувань та інтервенцій немає.</w:t>
+        <w:t>Для mnist_test_2_00766 зафіксовано ациклічний розгалужений граф і три виходи за інтервали 2_1. Втрата топології під час побудови графа та ті самі поознакові штрафи як загальний механізм пари 2→7 є гіпотезою: для решти 110 випадків поелементних трасувань та експериментів зі втручанням немає.</w:t>
       </w:r>
     </w:p>
     <w:p>
@@ -5337,7 +5321,7 @@
           <w:i w:val="0"/>
           <w:sz w:val="20"/>
         </w:rPr>
-        <w:t>Оцінювання обмежене ручним фільтром, що вилучив 12,93 % MNIST нерівномірно за класами. Чутливість до добору 76 джерел, порядку їх подання й невідомого точного діапазону аугментації не вимірювали. Контурне подання відкидає текстуру й градієнти, а розірвані контури потребують відсутнього асоціативного механізму. Прогін зафіксовано конфігурацією та артефактами результату; повного знімка розгорнутого коду не збережено, тому відтворення можливе в межах цих артефактів.</w:t>
+        <w:t>Оцінювання обмежене ручним фільтром, що вилучив 12,93 % MNIST нерівномірно за класами. Чутливість до відбору 76 оригіналів, порядку їх подання й невідомого точного діапазону аугментації не вимірювали. Контурне подання відкидає текстуру й градієнти, а розірвані контури потребують асоціативного механізму, якого система не має. Експеримент зафіксовано конфігурацією та артефактами результату; повної копії коду, з яким його виконано, не збережено, тому відтворення можливе в межах цих артефактів.</w:t>
       </w:r>
     </w:p>
     <w:p>
@@ -5368,7 +5352,7 @@
           <w:i w:val="0"/>
           <w:sz w:val="20"/>
         </w:rPr>
-        <w:t>1. Побудовано Point–Vector подання з 2 видами вузлів і 13 ознаками зіставлення.</w:t>
+        <w:t>1. Побудовано подання Point–Vector з 2 типами вузлів і 13 ознаками зіставлення.</w:t>
       </w:r>
     </w:p>
     <w:p>
@@ -5384,7 +5368,7 @@
           <w:i w:val="0"/>
           <w:sz w:val="20"/>
         </w:rPr>
-        <w:t>2. Одним проходом структурної редукції з 76 вручну відібраних джерел, розширених до 805 зображень, сформовано 13 концептів для 10 класів, по 3–12 вузлів кожний.</w:t>
+        <w:t>2. Одним проходом структурної редукції з 76 вручну відібраних оригіналів, розширених до 805 зразків, сформовано 13 концептів для 10 класів, по 3–12 вузлів кожний.</w:t>
       </w:r>
     </w:p>
     <w:p>
@@ -5400,7 +5384,7 @@
           <w:i w:val="0"/>
           <w:sz w:val="20"/>
         </w:rPr>
-        <w:t xml:space="preserve">3. Класифікацію побудовано за GED з драбиною вартостей заміщення 0 / 0,25 / 0,5 / 0,8 / 1,0 / 6,0, діагностичним зважуванням ознак при </w:t>
+        <w:t xml:space="preserve">3. Класифікацію побудовано за GED зі шкалою вартостей заміщення 0 / 0,25 / 0,5 / 0,8 / 1,0 / 6,0, діагностичним зважуванням ознак за </w:t>
       </w:r>
       <m:oMath>
         <m:sSub>
@@ -5465,7 +5449,7 @@
           <w:i w:val="0"/>
           <w:sz w:val="20"/>
         </w:rPr>
-        <w:t>4. Ручний фільтр допустив 8 707 із 10 000 зображень MNIST; збереження класів коливається від 59,75 % до 99,47 %. Точність становить 91,13 % для оброблених і 90,90 % для всіх допущених зображень; зважені влучність, повнота і F1 дорівнюють 91,92 %, 91,13 % і 91,34 %.</w:t>
+        <w:t>4. Ручний фільтр допустив 8 707 із 10 000 зображень MNIST; частка збережених зображень класу коливається від 59,75 % до 99,47 %. Точність становить 91,13 %; зважені влучність, повнота і F1 дорівнюють 91,92 %, 91,13 % і 91,34 %.</w:t>
       </w:r>
     </w:p>
     <w:p>
@@ -5481,7 +5465,7 @@
           <w:i w:val="0"/>
           <w:sz w:val="20"/>
         </w:rPr>
-        <w:t>5. В архівному відтворенні mnist_test_2_00766 оцінки 1,1487 для 7_1 і 1,1000 для 2_1 дають розрив 0,0486; серед 111 помилок 2→7 2_1 програв за оцінкою 106 разів і був структурно відхилений 5 разів.</w:t>
+        <w:t>5. У відтворенні mnist_test_2_00766 за збереженими даними оцінки 1,1487 для 7_1 і 1,1000 для 2_1 різняться на 0,0486; серед 111 помилок 2→7 2_1 програв за оцінкою 106 разів і був структурно відхилений 5 разів.</w:t>
       </w:r>
     </w:p>
     <w:p>
@@ -5580,7 +5564,7 @@
           <w:i w:val="0"/>
           <w:sz w:val="20"/>
         </w:rPr>
-        <w:t>Дані, що підтверджують результати цього дослідження, доступні у відкритому репозиторії проєкту NaturalAGI за посиланням https://github.com/kbokh/NaturalAGI (артефакти прогону наведено в каталозі experiments/run_20260630_235356/).</w:t>
+        <w:t>Дані, що підтверджують результати цього дослідження, доступні у відкритому репозиторії проєкту NaturalAGI за посиланням https://github.com/NaturalAGI-Lab/NaturalAGI/tree/development/experiments/run_20260630_235356.</w:t>
       </w:r>
     </w:p>
     <w:p>
@@ -5611,7 +5595,7 @@
           <w:i w:val="0"/>
           <w:sz w:val="20"/>
         </w:rPr>
-        <w:t>[TODO — заповнює автор. Обрати варіант за вимогами редакції та подати заяву тут; факти для декларації наведено в коментарі перед цим полем у content.py.]</w:t>
+        <w:t>[TODO: заповнює автор. Обрати варіант за вимогами редакції та подати заяву тут; факти для декларації наведено в коментарі перед цим полем у content.py.]</w:t>
       </w:r>
     </w:p>
     <w:p>
@@ -7113,7 +7097,7 @@
           <w:i w:val="0"/>
           <w:sz w:val="20"/>
         </w:rPr>
-        <w:t>моб. +38(0XX)XXX-XX-XX</w:t>
+        <w:t>моб. +38(099)244-45-01</w:t>
       </w:r>
     </w:p>
     <w:p>
@@ -7186,7 +7170,7 @@
           <w:i w:val="0"/>
           <w:sz w:val="20"/>
         </w:rPr>
-        <w:t>Показати, що концепти-атрактори, сформовані з малої кількості прикладів, дають розпізнавання з простежуваним рішенням, і задокументувати умови чинності результату.</w:t>
+        <w:t>Показати, що концепти-атрактори, сформовані з малої кількості прикладів, забезпечують розпізнавання з простежуваним рішенням, і задокументувати умови, за яких результат дійсний.</w:t>
       </w:r>
       <w:r>
         <w:rPr>
@@ -7213,7 +7197,7 @@
           <w:i w:val="0"/>
           <w:sz w:val="20"/>
         </w:rPr>
-        <w:t>Подати контурні зображення двочастковими графами; сформувати алфавіт концептів структурною редукцією з інтервальним узагальненням параметрів; побудувати класифікацію за відстанню редагування графів з діагностичним зважуванням ознак; оцінити систему на повноконтурній підмножині MNIST з розкриттям фільтра повноти; продемонструвати пояснюваність трасуванням рішення.</w:t>
+        <w:t>Подати контурні зображення двочастковими графами; сформувати алфавіт концептів структурною редукцією з інтервальним узагальненням параметрів; побудувати класифікацію за відстанню редагування графів з діагностичним зважуванням ознак; оцінити систему на повноконтурній підмножині MNIST з явним описом фільтра повноти контуру; продемонструвати пояснюваність трасуванням рішення.</w:t>
       </w:r>
       <w:r>
         <w:rPr>
@@ -7240,7 +7224,7 @@
           <w:i w:val="0"/>
           <w:sz w:val="20"/>
         </w:rPr>
-        <w:t>Скелетизація зображень, зростаючий нейронний газ, спрощення Рамера—Дугласа—Пекера, структурна редукція графів, відстань редагування графів, інтервальне узагальнення параметрів.</w:t>
+        <w:t>Скелетизація зображень, Growing Neural Gas (GNG), спрощення Рамера–Дугласа–Пекера, структурна редукція графів, відстань редагування графів, інтервальне узагальнення параметрів.</w:t>
       </w:r>
       <w:r>
         <w:rPr>
@@ -7267,7 +7251,7 @@
           <w:i w:val="0"/>
           <w:sz w:val="20"/>
         </w:rPr>
-        <w:t>13 концептів-атракторів сформовано з 76 вручну відібраних джерел, розширених до 805 зображень. Із 8 707 допущених зображень рішення одержано для 8 685: точність становить 91,13 % для оброблених і 90,90 % для всіх допущених з урахуванням 22 збоїв конвеєра; зважені влучність, повнота і F1 дорівнюють 91,92 %, 91,13 % і 91,34 %. Архівне відтворення одного рішення дає числовий ланцюг від операцій редагування до оцінки.</w:t>
+        <w:t>Сформовано 13 концептів-атракторів із 76 вручну відібраних оригіналів, розширених до 805 зразків. Точність становить 91,13 %; зважені влучність, повнота і F1 дорівнюють 91,92 %, 91,13 % і 91,34 %. Відтворення одного рішення за збереженими даними дає числовий ланцюг від операцій редагування до оцінки.</w:t>
       </w:r>
       <w:r>
         <w:rPr>
@@ -7294,7 +7278,7 @@
           <w:i w:val="0"/>
           <w:sz w:val="20"/>
         </w:rPr>
-        <w:t>Розпізнавання без зворотного поширення помилки за 76 навчальних джерел є здійсненним, а кожне рішення розкладається на операції редагування графів і поознакові вартості. Результат чинний у межах вручну відфільтрованої підмножини MNIST; порівняння з іншими моделями не проведено.</w:t>
+        <w:t>Розпізнавання без зворотного поширення помилки на основі 76 навчальних оригіналів можливе, а кожне рішення розкладається на операції редагування графів і поознакові вартості. Результат дійсний у межах вручну відфільтрованої підмножини MNIST.</w:t>
       </w:r>
     </w:p>
     <w:p>

</xml_diff>

<commit_message>
docs: address review 1 of the ITSSI 2026 XAI paper (abstract, section 1.1, conclusions, AI declaration)
</commit_message>
<xml_diff>
--- a/papers/itssi_xai_2026/itssi_xai_2026.docx
+++ b/papers/itssi_xai_2026/itssi_xai_2026.docx
@@ -72,7 +72,13 @@
         <w:t xml:space="preserve">Objectives. </w:t>
       </w:r>
       <w:r>
-        <w:t xml:space="preserve">To represent contour images as bipartite graphs; to form an alphabet of concepts by structural reduction with interval generalization of parameters; to build classification on graph edit distance with diagnostic feature weighting; to evaluate the system on the complete-contour subset of MNIST with the filter disclosed; to demonstrate explainability by tracing a decision. </w:t>
+        <w:t xml:space="preserve">To represent contour images as bipartite graphs; to form an alphabet of concepts by structural reduction with interval generalization of parameters; to build classification on graph edit distance with diagnostic feature weighting; to evaluate the system on the complete-contour subset of </w:t>
+      </w:r>
+      <w:r>
+        <w:t xml:space="preserve">the Modified National Institute of Standards and Technology digit set</w:t>
+      </w:r>
+      <w:r>
+        <w:t xml:space="preserve"> with the filter disclosed; to demonstrate explainability by tracing a decision. </w:t>
       </w:r>
       <w:r>
         <w:rPr>
@@ -82,7 +88,13 @@
         <w:t xml:space="preserve">Methods. </w:t>
       </w:r>
       <w:r>
-        <w:t xml:space="preserve">Image skeletonization, Growing Neural Gas (GNG), Ramer–Douglas–Peucker simplification, structural graph reduction, graph edit distance, interval generalization of parameters. </w:t>
+        <w:t xml:space="preserve">Image skeletonization, </w:t>
+      </w:r>
+      <w:r>
+        <w:t xml:space="preserve">Growing Neural Gas</w:t>
+      </w:r>
+      <w:r>
+        <w:t xml:space="preserve">, Ramer–Douglas–Peucker simplification, structural graph reduction, graph edit distance, interval generalization of parameters. </w:t>
       </w:r>
       <w:r>
         <w:rPr>
@@ -92,7 +104,10 @@
         <w:t xml:space="preserve">Results. </w:t>
       </w:r>
       <w:r>
-        <w:t xml:space="preserve">Thirteen concept attractors were formed from 76 manually selected sources expanded to 805 images. Accuracy is 91.13 %; support-weighted precision, recall, and F1 are 91.92 %, 91.13 %, and 91.34 %. An archived replay gives one numerical chain from edit operations to the final score. </w:t>
+        <w:t xml:space="preserve">Images were represented as graphs with two node types and 13 features. Thirteen concept attractors were formed from 76 manually selected sources expanded to 805 images. In classification on graph edit distance, narrow feature intervals weigh more. The contour-completeness filter admitted 8,707 of 10,000 images. Accuracy is 91.13 %; support-weighted precision, recall, and F-measure are 91.92 %, 91.13 %, and 91.34 %. </w:t>
+      </w:r>
+      <w:r>
+        <w:t xml:space="preserve">An archived replay gives one numerical chain from edit operations to the final score. </w:t>
       </w:r>
       <w:r>
         <w:rPr>
@@ -102,7 +117,13 @@
         <w:t xml:space="preserve">Conclusions. </w:t>
       </w:r>
       <w:r>
-        <w:t>Recognition without backpropagation from 76 sources is feasible, and each decision decomposes into edit operations and per-feature costs. The result is valid within the manually filtered MNIST subset.</w:t>
+        <w:t xml:space="preserve">Recognition without backpropagation from 76 sources is feasible, and each decision decomposes into edit operations and per-feature costs. The result is valid within the manually filtered subset of </w:t>
+      </w:r>
+      <w:r>
+        <w:t xml:space="preserve">this set</w:t>
+      </w:r>
+      <w:r>
+        <w:t xml:space="preserve">.</w:t>
       </w:r>
     </w:p>
     <w:p>
@@ -203,11 +224,16 @@
         <w:jc w:val="both"/>
       </w:pPr>
       <w:r>
-        <w:t xml:space="preserve">У статті викладено подання зображень атрибутованими двочастковими графами, процедуру формування концептів-атракторів структурною редукцією, класифікацію за подібністю графів і результати оцінювання на MNIST з ручним фільтром повноти контуру. Отримано точність 91,13 %. Алфавіт із 13 концептів сформовано з </w:t>
-      </w:r>
-      <w:r>
-        <w:lastRenderedPageBreak/>
-        <w:t>76 вручну відібраних оригіналів, розширених до 805 зразків. Окремо наведено відтворення одного рішення за збереженими даними.</w:t>
+        <w:t xml:space="preserve">У статті викладено подання зображень атрибутованими двочастковими графами, процедуру формування концептів-атракторів структурною редукцією, класифікацію за подібністю графів </w:t>
+      </w:r>
+      <w:r>
+        <w:t xml:space="preserve">та оцінювання системи на </w:t>
+      </w:r>
+      <w:r>
+        <w:t xml:space="preserve">MNIST</w:t>
+      </w:r>
+      <w:r>
+        <w:t xml:space="preserve"> з ручним фільтром повноти контуру.</w:t>
       </w:r>
     </w:p>
     <w:p>
@@ -4121,6 +4147,36 @@
     <w:p>
       <w:pPr>
         <w:spacing w:after="0" w:line="280" w:lineRule="exact"/>
+        <w:ind w:firstLine="567"/>
+        <w:jc w:val="both"/>
+      </w:pPr>
+      <w:r>
+        <w:t xml:space="preserve">Наукова цінність результатів полягає в поєднанні умов, якого немає в жодній із робіт, розглянутих у підрозділі 1.2: граф контуру є водночас носієм рішення й носієм пояснення; вартості зіставлення прив'язано до наперед визначених геометричних ознак вузлів; алфавіт концептів сформовано з 76 оригіналів одним проходом без зворотного поширення помилки; умови оцінювання задокументовано збереженими артефактами експерименту.</w:t>
+      </w:r>
+    </w:p>
+    <w:p>
+      <w:pPr>
+        <w:spacing w:after="0" w:line="280" w:lineRule="exact"/>
+        <w:ind w:firstLine="567"/>
+        <w:jc w:val="both"/>
+      </w:pPr>
+      <w:r>
+        <w:t xml:space="preserve">Практична цінність результатів полягає в тому, що кожне рішення класифікатора можна перевірити вручну за збереженими даними: трасування показує, які заміщення вузлів і які ознаки визначили оцінку. Така властивість потрібна там, де навчальних даних мало, а рішення треба обґрунтувати перед оператором або аудитором.</w:t>
+      </w:r>
+    </w:p>
+    <w:p>
+      <w:pPr>
+        <w:spacing w:after="0" w:line="280" w:lineRule="exact"/>
+        <w:ind w:firstLine="567"/>
+        <w:jc w:val="both"/>
+      </w:pPr>
+      <w:r>
+        <w:t xml:space="preserve">Напрями подальших досліджень: розроблення асоціативного механізму для розірваних контурів, щоб оцінювати систему без ручного фільтра повноти контуру; вимірювання чутливості точності до відбору оригіналів, порядку їх подання та діапазону аугментації; поелементне трасування решти 110 помилок 2→7 та експерименти зі втручанням для перевірки гіпотези про втрату топології під час побудови графа.</w:t>
+      </w:r>
+    </w:p>
+    <w:p>
+      <w:pPr>
+        <w:spacing w:after="0" w:line="280" w:lineRule="exact"/>
         <w:jc w:val="both"/>
       </w:pPr>
     </w:p>
@@ -4212,819 +4268,11 @@
         <w:ind w:firstLine="567"/>
         <w:jc w:val="both"/>
       </w:pPr>
-      <w:proofErr w:type="spellStart"/>
       <w:r>
         <w:rPr>
           <w:lang w:val="ru-RU"/>
         </w:rPr>
-        <w:t>Автори</w:t>
-      </w:r>
-      <w:proofErr w:type="spellEnd"/>
-      <w:r>
-        <w:rPr>
-          <w:lang w:val="ru-RU"/>
-        </w:rPr>
-        <w:t xml:space="preserve"> </w:t>
-      </w:r>
-      <w:proofErr w:type="spellStart"/>
-      <w:r>
-        <w:rPr>
-          <w:lang w:val="ru-RU"/>
-        </w:rPr>
-        <w:t>використовували</w:t>
-      </w:r>
-      <w:proofErr w:type="spellEnd"/>
-      <w:r>
-        <w:rPr>
-          <w:lang w:val="ru-RU"/>
-        </w:rPr>
-        <w:t xml:space="preserve"> </w:t>
-      </w:r>
-      <w:proofErr w:type="spellStart"/>
-      <w:r>
-        <w:rPr>
-          <w:lang w:val="ru-RU"/>
-        </w:rPr>
-        <w:t>інструменти</w:t>
-      </w:r>
-      <w:proofErr w:type="spellEnd"/>
-      <w:r>
-        <w:rPr>
-          <w:lang w:val="ru-RU"/>
-        </w:rPr>
-        <w:t xml:space="preserve"> ШІ (</w:t>
-      </w:r>
-      <w:r>
-        <w:t>Anthropic</w:t>
-      </w:r>
-      <w:r>
-        <w:rPr>
-          <w:lang w:val="ru-RU"/>
-        </w:rPr>
-        <w:t xml:space="preserve"> </w:t>
-      </w:r>
-      <w:r>
-        <w:t>Claude</w:t>
-      </w:r>
-      <w:r>
-        <w:rPr>
-          <w:lang w:val="ru-RU"/>
-        </w:rPr>
-        <w:t xml:space="preserve"> </w:t>
-      </w:r>
-      <w:r>
-        <w:t>Opus</w:t>
-      </w:r>
-      <w:r>
-        <w:rPr>
-          <w:lang w:val="ru-RU"/>
-        </w:rPr>
-        <w:t xml:space="preserve"> </w:t>
-      </w:r>
-      <w:r>
-        <w:rPr>
-          <w:lang w:val="ru-RU"/>
-        </w:rPr>
-        <w:t>5</w:t>
-      </w:r>
-      <w:r>
-        <w:rPr>
-          <w:lang w:val="ru-RU"/>
-        </w:rPr>
-        <w:t xml:space="preserve">, </w:t>
-      </w:r>
-      <w:r>
-        <w:t>ID</w:t>
-      </w:r>
-      <w:r>
-        <w:rPr>
-          <w:lang w:val="ru-RU"/>
-        </w:rPr>
-        <w:t xml:space="preserve"> </w:t>
-      </w:r>
-      <w:proofErr w:type="spellStart"/>
-      <w:r>
-        <w:rPr>
-          <w:lang w:val="ru-RU"/>
-        </w:rPr>
-        <w:t>моделі</w:t>
-      </w:r>
-      <w:proofErr w:type="spellEnd"/>
-      <w:r>
-        <w:rPr>
-          <w:lang w:val="ru-RU"/>
-        </w:rPr>
-        <w:t xml:space="preserve"> "</w:t>
-      </w:r>
-      <w:proofErr w:type="spellStart"/>
-      <w:r>
-        <w:t>claude</w:t>
-      </w:r>
-      <w:proofErr w:type="spellEnd"/>
-      <w:r>
-        <w:rPr>
-          <w:lang w:val="ru-RU"/>
-        </w:rPr>
-        <w:t>-</w:t>
-      </w:r>
-      <w:r>
-        <w:t>opus</w:t>
-      </w:r>
-      <w:r>
-        <w:rPr>
-          <w:lang w:val="ru-RU"/>
-        </w:rPr>
-        <w:t>-</w:t>
-      </w:r>
-      <w:r>
-        <w:rPr>
-          <w:lang w:val="ru-RU"/>
-        </w:rPr>
-        <w:t>5</w:t>
-      </w:r>
-      <w:r>
-        <w:rPr>
-          <w:lang w:val="ru-RU"/>
-        </w:rPr>
-        <w:t xml:space="preserve">", доступ через </w:t>
-      </w:r>
-      <w:r>
-        <w:t>Anthropic</w:t>
-      </w:r>
-      <w:r>
-        <w:rPr>
-          <w:lang w:val="ru-RU"/>
-        </w:rPr>
-        <w:t xml:space="preserve"> </w:t>
-      </w:r>
-      <w:r>
-        <w:t>API</w:t>
-      </w:r>
-      <w:r>
-        <w:rPr>
-          <w:lang w:val="ru-RU"/>
-        </w:rPr>
-        <w:t xml:space="preserve">) на </w:t>
-      </w:r>
-      <w:proofErr w:type="spellStart"/>
-      <w:r>
-        <w:rPr>
-          <w:lang w:val="ru-RU"/>
-        </w:rPr>
-        <w:t>чотирьох</w:t>
-      </w:r>
-      <w:proofErr w:type="spellEnd"/>
-      <w:r>
-        <w:rPr>
-          <w:lang w:val="ru-RU"/>
-        </w:rPr>
-        <w:t xml:space="preserve"> </w:t>
-      </w:r>
-      <w:proofErr w:type="spellStart"/>
-      <w:r>
-        <w:rPr>
-          <w:lang w:val="ru-RU"/>
-        </w:rPr>
-        <w:t>етапах</w:t>
-      </w:r>
-      <w:proofErr w:type="spellEnd"/>
-      <w:r>
-        <w:rPr>
-          <w:lang w:val="ru-RU"/>
-        </w:rPr>
-        <w:t xml:space="preserve"> </w:t>
-      </w:r>
-      <w:proofErr w:type="spellStart"/>
-      <w:r>
-        <w:rPr>
-          <w:lang w:val="ru-RU"/>
-        </w:rPr>
-        <w:t>підготовки</w:t>
-      </w:r>
-      <w:proofErr w:type="spellEnd"/>
-      <w:r>
-        <w:rPr>
-          <w:lang w:val="ru-RU"/>
-        </w:rPr>
-        <w:t xml:space="preserve"> </w:t>
-      </w:r>
-      <w:proofErr w:type="spellStart"/>
-      <w:r>
-        <w:rPr>
-          <w:lang w:val="ru-RU"/>
-        </w:rPr>
-        <w:t>цього</w:t>
-      </w:r>
-      <w:proofErr w:type="spellEnd"/>
-      <w:r>
-        <w:rPr>
-          <w:lang w:val="ru-RU"/>
-        </w:rPr>
-        <w:t xml:space="preserve"> </w:t>
-      </w:r>
-      <w:proofErr w:type="spellStart"/>
-      <w:r>
-        <w:rPr>
-          <w:lang w:val="ru-RU"/>
-        </w:rPr>
-        <w:t>рукопису</w:t>
-      </w:r>
-      <w:proofErr w:type="spellEnd"/>
-      <w:r>
-        <w:rPr>
-          <w:lang w:val="ru-RU"/>
-        </w:rPr>
-        <w:t xml:space="preserve">. (1) </w:t>
-      </w:r>
-      <w:proofErr w:type="spellStart"/>
-      <w:r>
-        <w:rPr>
-          <w:lang w:val="ru-RU"/>
-        </w:rPr>
-        <w:t>Попередній</w:t>
-      </w:r>
-      <w:proofErr w:type="spellEnd"/>
-      <w:r>
-        <w:rPr>
-          <w:lang w:val="ru-RU"/>
-        </w:rPr>
-        <w:t xml:space="preserve"> </w:t>
-      </w:r>
-      <w:proofErr w:type="spellStart"/>
-      <w:r>
-        <w:rPr>
-          <w:lang w:val="ru-RU"/>
-        </w:rPr>
-        <w:t>доменний</w:t>
-      </w:r>
-      <w:proofErr w:type="spellEnd"/>
-      <w:r>
-        <w:rPr>
-          <w:lang w:val="ru-RU"/>
-        </w:rPr>
-        <w:t xml:space="preserve"> </w:t>
-      </w:r>
-      <w:proofErr w:type="spellStart"/>
-      <w:r>
-        <w:rPr>
-          <w:lang w:val="ru-RU"/>
-        </w:rPr>
-        <w:t>аналіз</w:t>
-      </w:r>
-      <w:proofErr w:type="spellEnd"/>
-      <w:r>
-        <w:rPr>
-          <w:lang w:val="ru-RU"/>
-        </w:rPr>
-        <w:t xml:space="preserve"> — </w:t>
-      </w:r>
-      <w:proofErr w:type="spellStart"/>
-      <w:r>
-        <w:rPr>
-          <w:lang w:val="ru-RU"/>
-        </w:rPr>
-        <w:t>запити</w:t>
-      </w:r>
-      <w:proofErr w:type="spellEnd"/>
-      <w:r>
-        <w:rPr>
-          <w:lang w:val="ru-RU"/>
-        </w:rPr>
-        <w:t xml:space="preserve"> </w:t>
-      </w:r>
-      <w:proofErr w:type="spellStart"/>
-      <w:r>
-        <w:rPr>
-          <w:lang w:val="ru-RU"/>
-        </w:rPr>
-        <w:t>щодо</w:t>
-      </w:r>
-      <w:proofErr w:type="spellEnd"/>
-      <w:r>
-        <w:rPr>
-          <w:lang w:val="ru-RU"/>
-        </w:rPr>
-        <w:t xml:space="preserve"> </w:t>
-      </w:r>
-      <w:proofErr w:type="spellStart"/>
-      <w:r>
-        <w:rPr>
-          <w:lang w:val="ru-RU"/>
-        </w:rPr>
-        <w:t>суміжних</w:t>
-      </w:r>
-      <w:proofErr w:type="spellEnd"/>
-      <w:r>
-        <w:rPr>
-          <w:lang w:val="ru-RU"/>
-        </w:rPr>
-        <w:t xml:space="preserve"> областей (</w:t>
-      </w:r>
-      <w:proofErr w:type="spellStart"/>
-      <w:r>
-        <w:rPr>
-          <w:lang w:val="ru-RU"/>
-        </w:rPr>
-        <w:t>відстань</w:t>
-      </w:r>
-      <w:proofErr w:type="spellEnd"/>
-      <w:r>
-        <w:rPr>
-          <w:lang w:val="ru-RU"/>
-        </w:rPr>
-        <w:t xml:space="preserve"> </w:t>
-      </w:r>
-      <w:proofErr w:type="spellStart"/>
-      <w:r>
-        <w:rPr>
-          <w:lang w:val="ru-RU"/>
-        </w:rPr>
-        <w:t>редагування</w:t>
-      </w:r>
-      <w:proofErr w:type="spellEnd"/>
-      <w:r>
-        <w:rPr>
-          <w:lang w:val="ru-RU"/>
-        </w:rPr>
-        <w:t xml:space="preserve"> графа, </w:t>
-      </w:r>
-      <w:proofErr w:type="spellStart"/>
-      <w:r>
-        <w:rPr>
-          <w:lang w:val="ru-RU"/>
-        </w:rPr>
-        <w:t>структурне</w:t>
-      </w:r>
-      <w:proofErr w:type="spellEnd"/>
-      <w:r>
-        <w:rPr>
-          <w:lang w:val="ru-RU"/>
-        </w:rPr>
-        <w:t xml:space="preserve"> </w:t>
-      </w:r>
-      <w:proofErr w:type="spellStart"/>
-      <w:r>
-        <w:rPr>
-          <w:lang w:val="ru-RU"/>
-        </w:rPr>
-        <w:t>розпізнавання</w:t>
-      </w:r>
-      <w:proofErr w:type="spellEnd"/>
-      <w:r>
-        <w:rPr>
-          <w:lang w:val="ru-RU"/>
-        </w:rPr>
-        <w:t xml:space="preserve"> </w:t>
-      </w:r>
-      <w:proofErr w:type="spellStart"/>
-      <w:r>
-        <w:rPr>
-          <w:lang w:val="ru-RU"/>
-        </w:rPr>
-        <w:t>образів</w:t>
-      </w:r>
-      <w:proofErr w:type="spellEnd"/>
-      <w:r>
-        <w:rPr>
-          <w:lang w:val="ru-RU"/>
-        </w:rPr>
-        <w:t xml:space="preserve">, </w:t>
-      </w:r>
-      <w:proofErr w:type="spellStart"/>
-      <w:r>
-        <w:rPr>
-          <w:lang w:val="ru-RU"/>
-        </w:rPr>
-        <w:t>маловибіркове</w:t>
-      </w:r>
-      <w:proofErr w:type="spellEnd"/>
-      <w:r>
-        <w:rPr>
-          <w:lang w:val="ru-RU"/>
-        </w:rPr>
-        <w:t xml:space="preserve"> </w:t>
-      </w:r>
-      <w:proofErr w:type="spellStart"/>
-      <w:r>
-        <w:rPr>
-          <w:lang w:val="ru-RU"/>
-        </w:rPr>
-        <w:t>навчання</w:t>
-      </w:r>
-      <w:proofErr w:type="spellEnd"/>
-      <w:r>
-        <w:rPr>
-          <w:lang w:val="ru-RU"/>
-        </w:rPr>
-        <w:t xml:space="preserve">, </w:t>
-      </w:r>
-      <w:r>
-        <w:t>post</w:t>
-      </w:r>
-      <w:r>
-        <w:rPr>
-          <w:lang w:val="ru-RU"/>
-        </w:rPr>
-        <w:t>-</w:t>
-      </w:r>
-      <w:r>
-        <w:t>hoc</w:t>
-      </w:r>
-      <w:r>
-        <w:rPr>
-          <w:lang w:val="ru-RU"/>
-        </w:rPr>
-        <w:t xml:space="preserve"> пояснюваність) для </w:t>
-      </w:r>
-      <w:proofErr w:type="spellStart"/>
-      <w:r>
-        <w:rPr>
-          <w:lang w:val="ru-RU"/>
-        </w:rPr>
-        <w:t>окреслення</w:t>
-      </w:r>
-      <w:proofErr w:type="spellEnd"/>
-      <w:r>
-        <w:rPr>
-          <w:lang w:val="ru-RU"/>
-        </w:rPr>
-        <w:t xml:space="preserve"> </w:t>
-      </w:r>
-      <w:proofErr w:type="spellStart"/>
-      <w:r>
-        <w:rPr>
-          <w:lang w:val="ru-RU"/>
-        </w:rPr>
-        <w:t>суміжного</w:t>
-      </w:r>
-      <w:proofErr w:type="spellEnd"/>
-      <w:r>
-        <w:rPr>
-          <w:lang w:val="ru-RU"/>
-        </w:rPr>
-        <w:t xml:space="preserve"> кола </w:t>
-      </w:r>
-      <w:proofErr w:type="spellStart"/>
-      <w:r>
-        <w:rPr>
-          <w:lang w:val="ru-RU"/>
-        </w:rPr>
-        <w:t>робіт</w:t>
-      </w:r>
-      <w:proofErr w:type="spellEnd"/>
-      <w:r>
-        <w:rPr>
-          <w:lang w:val="ru-RU"/>
-        </w:rPr>
-        <w:t xml:space="preserve">. </w:t>
-      </w:r>
-      <w:proofErr w:type="spellStart"/>
-      <w:r>
-        <w:rPr>
-          <w:lang w:val="ru-RU"/>
-        </w:rPr>
-        <w:t>Кожне</w:t>
-      </w:r>
-      <w:proofErr w:type="spellEnd"/>
-      <w:r>
-        <w:rPr>
-          <w:lang w:val="ru-RU"/>
-        </w:rPr>
-        <w:t xml:space="preserve"> </w:t>
-      </w:r>
-      <w:proofErr w:type="spellStart"/>
-      <w:r>
-        <w:rPr>
-          <w:lang w:val="ru-RU"/>
-        </w:rPr>
-        <w:t>запропоноване</w:t>
-      </w:r>
-      <w:proofErr w:type="spellEnd"/>
-      <w:r>
-        <w:rPr>
-          <w:lang w:val="ru-RU"/>
-        </w:rPr>
-        <w:t xml:space="preserve"> ШІ </w:t>
-      </w:r>
-      <w:proofErr w:type="spellStart"/>
-      <w:r>
-        <w:rPr>
-          <w:lang w:val="ru-RU"/>
-        </w:rPr>
-        <w:t>твердження</w:t>
-      </w:r>
-      <w:proofErr w:type="spellEnd"/>
-      <w:r>
-        <w:rPr>
-          <w:lang w:val="ru-RU"/>
-        </w:rPr>
-        <w:t xml:space="preserve"> </w:t>
-      </w:r>
-      <w:proofErr w:type="spellStart"/>
-      <w:r>
-        <w:rPr>
-          <w:lang w:val="ru-RU"/>
-        </w:rPr>
-        <w:t>автори</w:t>
-      </w:r>
-      <w:proofErr w:type="spellEnd"/>
-      <w:r>
-        <w:rPr>
-          <w:lang w:val="ru-RU"/>
-        </w:rPr>
-        <w:t xml:space="preserve"> </w:t>
-      </w:r>
-      <w:proofErr w:type="spellStart"/>
-      <w:r>
-        <w:rPr>
-          <w:lang w:val="ru-RU"/>
-        </w:rPr>
-        <w:t>незалежно</w:t>
-      </w:r>
-      <w:proofErr w:type="spellEnd"/>
-      <w:r>
-        <w:rPr>
-          <w:lang w:val="ru-RU"/>
-        </w:rPr>
-        <w:t xml:space="preserve"> </w:t>
-      </w:r>
-      <w:proofErr w:type="spellStart"/>
-      <w:r>
-        <w:rPr>
-          <w:lang w:val="ru-RU"/>
-        </w:rPr>
-        <w:t>перевіряли</w:t>
-      </w:r>
-      <w:proofErr w:type="spellEnd"/>
-      <w:r>
-        <w:rPr>
-          <w:lang w:val="ru-RU"/>
-        </w:rPr>
-        <w:t xml:space="preserve"> за </w:t>
-      </w:r>
-      <w:proofErr w:type="spellStart"/>
-      <w:r>
-        <w:rPr>
-          <w:lang w:val="ru-RU"/>
-        </w:rPr>
-        <w:t>першоджерелами</w:t>
-      </w:r>
-      <w:proofErr w:type="spellEnd"/>
-      <w:r>
-        <w:rPr>
-          <w:lang w:val="ru-RU"/>
-        </w:rPr>
-        <w:t xml:space="preserve"> перед </w:t>
-      </w:r>
-      <w:proofErr w:type="spellStart"/>
-      <w:r>
-        <w:rPr>
-          <w:lang w:val="ru-RU"/>
-        </w:rPr>
-        <w:t>включенням</w:t>
-      </w:r>
-      <w:proofErr w:type="spellEnd"/>
-      <w:r>
-        <w:rPr>
-          <w:lang w:val="ru-RU"/>
-        </w:rPr>
-        <w:t xml:space="preserve">. (2) </w:t>
-      </w:r>
-      <w:proofErr w:type="spellStart"/>
-      <w:r>
-        <w:rPr>
-          <w:lang w:val="ru-RU"/>
-        </w:rPr>
-        <w:t>Пошук</w:t>
-      </w:r>
-      <w:proofErr w:type="spellEnd"/>
-      <w:r>
-        <w:rPr>
-          <w:lang w:val="ru-RU"/>
-        </w:rPr>
-        <w:t xml:space="preserve"> </w:t>
-      </w:r>
-      <w:proofErr w:type="spellStart"/>
-      <w:r>
-        <w:rPr>
-          <w:lang w:val="ru-RU"/>
-        </w:rPr>
-        <w:t>літератури</w:t>
-      </w:r>
-      <w:proofErr w:type="spellEnd"/>
-      <w:r>
-        <w:rPr>
-          <w:lang w:val="ru-RU"/>
-        </w:rPr>
-        <w:t xml:space="preserve"> — </w:t>
-      </w:r>
-      <w:proofErr w:type="spellStart"/>
-      <w:r>
-        <w:rPr>
-          <w:lang w:val="ru-RU"/>
-        </w:rPr>
-        <w:t>генерація</w:t>
-      </w:r>
-      <w:proofErr w:type="spellEnd"/>
-      <w:r>
-        <w:rPr>
-          <w:lang w:val="ru-RU"/>
-        </w:rPr>
-        <w:t xml:space="preserve"> </w:t>
-      </w:r>
-      <w:proofErr w:type="spellStart"/>
-      <w:r>
-        <w:rPr>
-          <w:lang w:val="ru-RU"/>
-        </w:rPr>
-        <w:t>списків</w:t>
-      </w:r>
-      <w:proofErr w:type="spellEnd"/>
-      <w:r>
-        <w:rPr>
-          <w:lang w:val="ru-RU"/>
-        </w:rPr>
-        <w:t xml:space="preserve"> </w:t>
-      </w:r>
-      <w:proofErr w:type="spellStart"/>
-      <w:r>
-        <w:rPr>
-          <w:lang w:val="ru-RU"/>
-        </w:rPr>
-        <w:t>кандидатів-посилань</w:t>
-      </w:r>
-      <w:proofErr w:type="spellEnd"/>
-      <w:r>
-        <w:rPr>
-          <w:lang w:val="ru-RU"/>
-        </w:rPr>
-        <w:t xml:space="preserve">, </w:t>
-      </w:r>
-      <w:proofErr w:type="spellStart"/>
-      <w:r>
-        <w:rPr>
-          <w:lang w:val="ru-RU"/>
-        </w:rPr>
-        <w:t>які</w:t>
-      </w:r>
-      <w:proofErr w:type="spellEnd"/>
-      <w:r>
-        <w:rPr>
-          <w:lang w:val="ru-RU"/>
-        </w:rPr>
-        <w:t xml:space="preserve"> </w:t>
-      </w:r>
-      <w:proofErr w:type="spellStart"/>
-      <w:r>
-        <w:rPr>
-          <w:lang w:val="ru-RU"/>
-        </w:rPr>
-        <w:t>потім</w:t>
-      </w:r>
-      <w:proofErr w:type="spellEnd"/>
-      <w:r>
-        <w:rPr>
-          <w:lang w:val="ru-RU"/>
-        </w:rPr>
-        <w:t xml:space="preserve"> були </w:t>
-      </w:r>
-      <w:proofErr w:type="spellStart"/>
-      <w:r>
-        <w:rPr>
-          <w:lang w:val="ru-RU"/>
-        </w:rPr>
-        <w:t>перевірені</w:t>
-      </w:r>
-      <w:proofErr w:type="spellEnd"/>
-      <w:r>
-        <w:rPr>
-          <w:lang w:val="ru-RU"/>
-        </w:rPr>
-        <w:t xml:space="preserve"> авторами через </w:t>
-      </w:r>
-      <w:proofErr w:type="spellStart"/>
-      <w:r>
-        <w:t>Crossref</w:t>
-      </w:r>
-      <w:proofErr w:type="spellEnd"/>
-      <w:r>
-        <w:rPr>
-          <w:lang w:val="ru-RU"/>
-        </w:rPr>
-        <w:t xml:space="preserve"> / </w:t>
-      </w:r>
-      <w:proofErr w:type="spellStart"/>
-      <w:r>
-        <w:t>OpenAlex</w:t>
-      </w:r>
-      <w:proofErr w:type="spellEnd"/>
-      <w:r>
-        <w:rPr>
-          <w:lang w:val="ru-RU"/>
-        </w:rPr>
-        <w:t xml:space="preserve"> / </w:t>
-      </w:r>
-      <w:r>
-        <w:t>Scopus</w:t>
-      </w:r>
-      <w:r>
-        <w:rPr>
-          <w:lang w:val="ru-RU"/>
-        </w:rPr>
-        <w:t xml:space="preserve"> на </w:t>
-      </w:r>
-      <w:r>
-        <w:t>DOI</w:t>
-      </w:r>
-      <w:r>
-        <w:rPr>
-          <w:lang w:val="ru-RU"/>
-        </w:rPr>
-        <w:t xml:space="preserve">, </w:t>
-      </w:r>
-      <w:proofErr w:type="spellStart"/>
-      <w:r>
-        <w:rPr>
-          <w:lang w:val="ru-RU"/>
-        </w:rPr>
-        <w:t>ідентичність</w:t>
-      </w:r>
-      <w:proofErr w:type="spellEnd"/>
-      <w:r>
-        <w:rPr>
-          <w:lang w:val="ru-RU"/>
-        </w:rPr>
-        <w:t xml:space="preserve"> </w:t>
-      </w:r>
-      <w:proofErr w:type="spellStart"/>
-      <w:r>
-        <w:rPr>
-          <w:lang w:val="ru-RU"/>
-        </w:rPr>
-        <w:t>авторів</w:t>
-      </w:r>
-      <w:proofErr w:type="spellEnd"/>
-      <w:r>
-        <w:rPr>
-          <w:lang w:val="ru-RU"/>
-        </w:rPr>
-        <w:t xml:space="preserve"> і </w:t>
-      </w:r>
-      <w:proofErr w:type="spellStart"/>
-      <w:r>
-        <w:rPr>
-          <w:lang w:val="ru-RU"/>
-        </w:rPr>
-        <w:t>метадані</w:t>
-      </w:r>
-      <w:proofErr w:type="spellEnd"/>
-      <w:r>
-        <w:rPr>
-          <w:lang w:val="ru-RU"/>
-        </w:rPr>
-        <w:t xml:space="preserve"> </w:t>
-      </w:r>
-      <w:proofErr w:type="spellStart"/>
-      <w:r>
-        <w:rPr>
-          <w:lang w:val="ru-RU"/>
-        </w:rPr>
-        <w:t>публікації</w:t>
-      </w:r>
-      <w:proofErr w:type="spellEnd"/>
-      <w:r>
-        <w:rPr>
-          <w:lang w:val="ru-RU"/>
-        </w:rPr>
-        <w:t xml:space="preserve"> перед </w:t>
-      </w:r>
-      <w:proofErr w:type="spellStart"/>
-      <w:r>
-        <w:rPr>
-          <w:lang w:val="ru-RU"/>
-        </w:rPr>
-        <w:t>включенням</w:t>
-      </w:r>
-      <w:proofErr w:type="spellEnd"/>
-      <w:r>
-        <w:rPr>
-          <w:lang w:val="ru-RU"/>
-        </w:rPr>
-        <w:t xml:space="preserve"> у </w:t>
-      </w:r>
-      <w:proofErr w:type="spellStart"/>
-      <w:r>
-        <w:rPr>
-          <w:lang w:val="ru-RU"/>
-        </w:rPr>
-        <w:t>цитування</w:t>
-      </w:r>
-      <w:proofErr w:type="spellEnd"/>
-      <w:r>
-        <w:rPr>
-          <w:lang w:val="ru-RU"/>
-        </w:rPr>
-        <w:t>.</w:t>
+        <w:t xml:space="preserve">Автор використовував інструменти ШІ (Anthropic Claude Opus 5, ID моделі "claude-opus-5", доступ через Anthropic API) на двох етапах підготовки цього рукопису. (1) Попередній доменний аналіз — запити щодо суміжних областей (відстань редагування графа, структурне розпізнавання образів, маловибіркове навчання, post-hoc пояснюваність) для окреслення суміжного кола робіт. Кожне запропоноване ШІ твердження автор незалежно перевіряв за першоджерелами перед включенням. (2) Пошук літератури — генерація списків кандидатів-посилань, які потім були перевірені автором через Crossref / OpenAlex / Scopus на DOI, ідентичність авторів і метадані публікації перед включенням у цитування.</w:t>
       </w:r>
     </w:p>
     <w:p>
@@ -5929,7 +5177,16 @@
         <w:t xml:space="preserve">Завдання. </w:t>
       </w:r>
       <w:r>
-        <w:t xml:space="preserve">Подати контурні зображення двочастковими графами; сформувати алфавіт концептів структурною редукцією з інтервальним узагальненням параметрів; побудувати класифікацію за відстанню редагування графів з діагностичним зважуванням ознак; оцінити систему на повноконтурній підмножині MNIST з явним описом фільтра повноти контуру; продемонструвати пояснюваність трасуванням рішення. </w:t>
+        <w:t xml:space="preserve">Подати контурні зображення двочастковими графами; сформувати алфавіт концептів структурною редукцією з інтервальним узагальненням параметрів; побудувати класифікацію за відстанню редагування графів з діагностичним зважуванням ознак; оцінити систему на повноконтурній підмножині </w:t>
+      </w:r>
+      <w:r>
+        <w:t xml:space="preserve">набору </w:t>
+      </w:r>
+      <w:r>
+        <w:t xml:space="preserve">Modified National Institute of Standards and Technology</w:t>
+      </w:r>
+      <w:r>
+        <w:t xml:space="preserve"> з явним описом фільтра повноти контуру; продемонструвати пояснюваність трасуванням рішення. </w:t>
       </w:r>
       <w:r>
         <w:rPr>
@@ -5939,17 +5196,33 @@
         <w:t xml:space="preserve">Методи. </w:t>
       </w:r>
       <w:r>
-        <w:t xml:space="preserve">Скелетизація зображень, Growing Neural Gas (GNG), спрощення Рамера–Дугласа–Пекера, структурна редукція графів, відстань редагування графів, інтервальне узагальнення параметрів. </w:t>
+        <w:t xml:space="preserve">Скелетизація зображень, </w:t>
+      </w:r>
+      <w:r>
+        <w:t xml:space="preserve">Growing Neural Gas</w:t>
+      </w:r>
+      <w:r>
+        <w:t xml:space="preserve">, спрощення Рамера–Дугласа–Пекера, структурна редукція графів, відстань редагування графів, інтервальне узагальнення параметрів. </w:t>
       </w:r>
       <w:r>
         <w:rPr>
           <w:b/>
           <w:i/>
         </w:rPr>
-        <w:t xml:space="preserve">Результати. </w:t>
-      </w:r>
-      <w:r>
-        <w:t xml:space="preserve">Сформовано 13 концептів-атракторів із 76 вручну відібраних оригіналів, розширених до 805 зразків. Точність становить 91,13 %; зважені влучність, повнота і F1 дорівнюють 91,92 %, 91,13 % і 91,34 %. Відтворення одного рішення за збереженими даними дає числовий ланцюг від операцій редагування до оцінки. </w:t>
+        <w:t xml:space="preserve">Результати</w:t>
+      </w:r>
+      <w:r>
+        <w:rPr>
+          <w:b/>
+          <w:i/>
+        </w:rPr>
+        <w:t xml:space="preserve">. </w:t>
+      </w:r>
+      <w:r>
+        <w:t xml:space="preserve">Зображення подано графами з вузлами двох типів і 13 ознаками. Із 76 вручну відібраних оригіналів, розширених до 805 зразків, сформовано 13 концептів-атракторів. У класифікації за відстанню редагування графів вузькі інтервали ознак важать більше. Фільтр повноти контуру допустив 8 707 із 10 000 зображень. Точність становить 91,13 %; зважені влучність, повнота і F-міра дорівнюють 91,92 %, 91,13 % і 91,34 %. </w:t>
+      </w:r>
+      <w:r>
+        <w:t xml:space="preserve">Відтворення одного рішення за збереженими даними дає числовий ланцюг від операцій редагування до оцінки. </w:t>
       </w:r>
       <w:r>
         <w:rPr>
@@ -5959,7 +5232,13 @@
         <w:t xml:space="preserve">Висновки. </w:t>
       </w:r>
       <w:r>
-        <w:t>Розпізнавання без зворотного поширення помилки на основі 76 навчальних оригіналів можливе, а кожне рішення розкладається на операції редагування графів і поознакові вартості. Результат дійсний у межах вручну відфільтрованої підмножини MNIST.</w:t>
+        <w:t xml:space="preserve">Розпізнавання без зворотного поширення помилки на основі 76 оригіналів можливе, а кожне рішення розкладається на операції редагування графів і поознакові вартості. Результат дійсний у межах вручну відфільтрованої підмножини </w:t>
+      </w:r>
+      <w:r>
+        <w:t xml:space="preserve">цього набору</w:t>
+      </w:r>
+      <w:r>
+        <w:t xml:space="preserve">.</w:t>
       </w:r>
     </w:p>
     <w:p>

</xml_diff>

<commit_message>
docs: extend the XAI paper abstracts to the journal's 1900–2200 characters (1789 to 2040, 1739 to 2008)
</commit_message>
<xml_diff>
--- a/papers/itssi_xai_2026/itssi_xai_2026.docx
+++ b/papers/itssi_xai_2026/itssi_xai_2026.docx
@@ -104,7 +104,7 @@
         <w:t xml:space="preserve">Results. </w:t>
       </w:r>
       <w:r>
-        <w:t xml:space="preserve">Images were represented as graphs with two node types and 13 features. Thirteen concept attractors were formed from 76 manually selected sources expanded to 805 images. In classification on graph edit distance, narrow feature intervals weigh more. The contour-completeness filter admitted 8,707 of 10,000 images. Accuracy is 91.13 %; support-weighted precision, recall, and F-measure are 91.92 %, 91.13 %, and 91.34 %. </w:t>
+        <w:t xml:space="preserve">Images were represented as graphs with two node types, points and vectors, and 13 features. In a single pass of structural reduction, thirteen concept attractors for 10 classes, with 3 to 12 nodes each, were formed from 76 manually selected sources expanded to 805 images. In classification on graph edit distance, narrow feature intervals weigh more. The contour-completeness filter admitted 8,707 of 10,000 images; the share of retained images per class ranges from 59.75 % to 99.47 %. Accuracy is 91.13 %; support-weighted precision, recall, and F-measure are 91.92 %, 91.13 %, and 91.34 %. The most frequent error is digit 2 classified as digit 7: 111 of the 770 erroneous decisions. </w:t>
       </w:r>
       <w:r>
         <w:t xml:space="preserve">An archived replay gives one numerical chain from edit operations to the final score. </w:t>
@@ -5219,7 +5219,7 @@
         <w:t xml:space="preserve">. </w:t>
       </w:r>
       <w:r>
-        <w:t xml:space="preserve">Зображення подано графами з вузлами двох типів і 13 ознаками. Із 76 вручну відібраних оригіналів, розширених до 805 зразків, сформовано 13 концептів-атракторів. У класифікації за відстанню редагування графів вузькі інтервали ознак важать більше. Фільтр повноти контуру допустив 8 707 із 10 000 зображень. Точність становить 91,13 %; зважені влучність, повнота і F-міра дорівнюють 91,92 %, 91,13 % і 91,34 %. </w:t>
+        <w:t xml:space="preserve">Зображення подано графами з вузлами двох типів, точками й векторами, і 13 ознаками. Із 76 вручну відібраних оригіналів, розширених до 805 зразків, одним проходом структурної редукції сформовано 13 концептів-атракторів для 10 класів, по 3–12 вузлів кожний. У класифікації за відстанню редагування графів вузькі інтервали ознак важать більше. Фільтр повноти контуру допустив 8 707 із 10 000 зображень; частка збережених зображень класу коливається від 59,75 % до 99,47 %. Точність становить 91,13 %; зважені влучність, повнота і F-міра дорівнюють 91,92 %, 91,13 % і 91,34 %. Найчастіше система сплутує цифру 2 з цифрою 7: 111 випадків із 770 помилкових рішень. </w:t>
       </w:r>
       <w:r>
         <w:t xml:space="preserve">Відтворення одного рішення за збереженими даними дає числовий ланцюг від операцій редагування до оцінки. </w:t>

</xml_diff>

<commit_message>
docs: answer review 3 of article 065 with an evaluation protocol, Wilson intervals, a parameter table and a trace of all 111 2→7 errors
</commit_message>
<xml_diff>
--- a/papers/itssi_xai_2026/itssi_xai_2026.docx
+++ b/papers/itssi_xai_2026/itssi_xai_2026.docx
@@ -78,7 +78,12 @@
         <w:t xml:space="preserve">the Modified National Institute of Standards and Technology digit set</w:t>
       </w:r>
       <w:r>
-        <w:t xml:space="preserve"> with the filter disclosed; to demonstrate explainability by tracing a decision. </w:t>
+        <w:rPr/>
+        <w:t xml:space="preserve"> with the filter disclosed; to demonstrate explainability by tracing </w:t>
+      </w:r>
+      <w:r>
+        <w:rPr/>
+        <w:t xml:space="preserve">decisions. </w:t>
       </w:r>
       <w:r>
         <w:rPr>
@@ -104,10 +109,28 @@
         <w:t xml:space="preserve">Results. </w:t>
       </w:r>
       <w:r>
-        <w:t xml:space="preserve">Images were represented as graphs with two node types, points and vectors, and 13 features. In a single pass of structural reduction, thirteen concept attractors for 10 classes, with 3 to 12 nodes each, were formed from 76 manually selected sources expanded to 805 images. In classification on graph edit distance, narrow feature intervals weigh more. The contour-completeness filter admitted 8,707 of 10,000 images; the share of retained images per class ranges from 59.75 % to 99.47 %. Accuracy is 91.13 %; support-weighted precision, recall, and F-measure are 91.92 %, 91.13 %, and 91.34 %. The most frequent error is digit 2 classified as digit 7: 111 of the 770 erroneous decisions. </w:t>
-      </w:r>
-      <w:r>
-        <w:t xml:space="preserve">An archived replay gives one numerical chain from edit operations to the final score. </w:t>
+        <w:rPr/>
+        <w:t xml:space="preserve">Images were represented as graphs with two node types, points and vectors, and 13 features. In a single pass of structural reduction, thirteen concept attractors for 10 classes, with 3 to 12 nodes each, were formed from 76 manually selected sources expanded to 805 images. In classification on graph edit distance, narrow feature intervals weigh more. The contour-completeness filter admitted 8,707 of 10,000 images; the share of retained images per class ranges from 59.75 % to 99.47 %. Accuracy is 91.13 %</w:t>
+      </w:r>
+      <w:r>
+        <w:rPr/>
+        <w:t xml:space="preserve"> (95 % confidence interval 90.52–91.71 %)</w:t>
+      </w:r>
+      <w:r>
+        <w:rPr/>
+        <w:t xml:space="preserve">; support-weighted precision, recall, and F-measure are 91.92 %, 91.13 %, and 91.34 %. The most frequent error is digit 2 classified as digit 7: 111 of the 770 erroneous decisions. </w:t>
+      </w:r>
+      <w:r>
+        <w:rPr/>
+        <w:t xml:space="preserve">An archived replay gives one numerical chain from edit operations to the final score</w:t>
+      </w:r>
+      <w:r>
+        <w:rPr/>
+        <w:t xml:space="preserve">, and a trace of all these 111 cases showed that in 110 of them the binary image already has no closed loop</w:t>
+      </w:r>
+      <w:r>
+        <w:rPr/>
+        <w:t xml:space="preserve">. </w:t>
       </w:r>
       <w:r>
         <w:rPr>
@@ -214,7 +237,16 @@
         <w:jc w:val="both"/>
       </w:pPr>
       <w:r>
-        <w:t>Ця робота відповідає на запитання, чи можливе розпізнавання без зворотного поширення помилки, за малої кількості навчальних прикладів і так, щоб шлях до рішення можна було простежити за збереженими даними. Така постановка практично цінна там, де навчальних даних мало, а рішення має бути придатним до перевірки вручну.</w:t>
+        <w:rPr/>
+        <w:t xml:space="preserve">Ця робота відповідає на запитання, чи можливе розпізнавання без зворотного поширення помилки, за малої кількості навчальних прикладів і так, щоб шлях до рішення можна було простежити за збереженими даними. </w:t>
+      </w:r>
+      <w:r>
+        <w:rPr/>
+        <w:t xml:space="preserve">Потенційно така постановка корисна</w:t>
+      </w:r>
+      <w:r>
+        <w:rPr/>
+        <w:t xml:space="preserve"> там, де навчальних даних мало, а рішення має бути придатним до перевірки вручну.</w:t>
       </w:r>
     </w:p>
     <w:p>
@@ -275,7 +307,10 @@
         <w:jc w:val="both"/>
       </w:pPr>
       <w:r>
-        <w:t>Baniecki and Biecek [6] зводять у спільну систему позначень роботи зі змагального машинного навчання та пояснюваного штучного інтелекту й систематизують атаки на пояснення разом зі способами захисту від них. Автори показують, що маніпуляція поясненням, його підміна та приховування ознак упередженості моделі (fairwashing) можливі для більшості поширених методів, і формулюють вимоги до протоколів оцінювання пояснень. Предметом огляду є захист ретроспективних пояснювачів; питання про подання, у якому пояснення неможливо відокремити від обчислення, в огляді не порушено.</w:t>
+        <w:rPr>
+          <w:lang w:val="uk-UA"/>
+        </w:rPr>
+        <w:t xml:space="preserve">Baniecki and Biecek [6] систематизують атаки на ретроспективні пояснення та способи захисту від них. Вони показують, що маніпуляція поясненням і приховування упередженості моделі (fairwashing) можливі для більшості поширених методів. Подання, у якому пояснення неможливо відокремити від обчислення, огляд не розглядає.</w:t>
       </w:r>
     </w:p>
     <w:p>
@@ -285,7 +320,10 @@
         <w:jc w:val="both"/>
       </w:pPr>
       <w:r>
-        <w:t>Bello et al. [7] звертаються до головної труднощі кількісного оцінювання пояснень: для пояснення немає еталона, з яким його можна звірити. Автори пропонують міру LSE (Level of Strength of an Explanation), яка показує, наскільки пояснення підтримує саме той клас, що його передбачив класифікатор; міру побудовано за аналогією з відношенням правдоподібності в судовій експертизі. Нерозв'язаним лишається те, що якість ретроспективного пояснення доводиться встановлювати опосередковано, окремою процедурою поверх пояснювача, а не читати із самого обчислення.</w:t>
+        <w:rPr>
+          <w:lang w:val="uk-UA"/>
+        </w:rPr>
+        <w:t xml:space="preserve">Bello et al. [7] зауважують, що для пояснення немає еталона, і пропонують міру LSE (Level of Strength of an Explanation): наскільки пояснення підтримує передбачений клас. Якість ретроспективного пояснення при цьому встановлюють окремою процедурою, а не читають із самого обчислення.</w:t>
       </w:r>
     </w:p>
     <w:p>
@@ -295,7 +333,10 @@
         <w:jc w:val="both"/>
       </w:pPr>
       <w:r>
-        <w:t>Альтернативний напрям проєктування утворюють моделі, пояснювані за побудовою, на потребі в яких наполягає Rudin [5]. Огляд методів пояснюваності на основі графів знань [8] систематизує способи, якими явні структурні подання входять до систем пояснюваного штучного інтелекту: від видобування ознак і відношень до міркування над графом.</w:t>
+        <w:rPr>
+          <w:lang w:val="uk-UA"/>
+        </w:rPr>
+        <w:t xml:space="preserve">Альтернативу утворюють моделі, пояснювані за побудовою, на потребі в яких наполягає Rudin [5]. Огляд [8] систематизує способи, якими явні структурні подання, зокрема графи знань, входять до систем пояснюваного штучного інтелекту.</w:t>
       </w:r>
     </w:p>
     <w:p>
@@ -305,7 +346,10 @@
         <w:jc w:val="both"/>
       </w:pPr>
       <w:r>
-        <w:t>Forest et al. [9] застосовують моделі з концептним вузьким місцем (concept bottleneck models) до прогнозування залишкового ресурсу обладнання, узявши за проміжні концепти режими деградації компонентів. Прогноз завдяки цьому розкладається за станом кожного компонента, а експерт може втрутитися в активації концептів під час випробування без перенавчання моделі. Робота показує практичну користь проміжного шару зрозумілих понять порівняно з методами приписування важливості вхідним ознакам. Відображення входу на концепти в цій схемі лишається навченою нейронною мережею, тому простежити його за елементами подання неможливо.</w:t>
+        <w:rPr>
+          <w:lang w:val="uk-UA"/>
+        </w:rPr>
+        <w:t xml:space="preserve">Forest et al. [9] застосовують моделі з концептним вузьким місцем (concept bottleneck models) до прогнозування залишкового ресурсу обладнання. Прогноз розкладається за станом компонентів, а експерт може змінити активації концептів без перенавчання. Відображення входу на концепти лишається навченою мережею, тому простежити його за елементами подання неможливо.</w:t>
       </w:r>
     </w:p>
     <w:p>
@@ -315,7 +359,10 @@
         <w:jc w:val="both"/>
       </w:pPr>
       <w:r>
-        <w:t>Sovatzidi et al. [10] будують класифікацію зображень на інтуїціоністських нечітких когнітивних картах, структуру графа яких визначає алгоритм навчання за даними. Ступінь вагання (hesitancy) є мірою невпевненості, з якою зображення віднесено до класу, а рішення подано лінгвістичними термінами, зрозумілими без додаткового тлумачення. Тут носієм пояснення є граф, а не надбудова над навченою мережею. Вузли графа відповідають ознакам областей зображення, тому геометрія контуру та топологія його зв'язності в подання не входять.</w:t>
+        <w:rPr>
+          <w:lang w:val="uk-UA"/>
+        </w:rPr>
+        <w:t xml:space="preserve">Sovatzidi et al. [10] класифікують зображення інтуїціоністськими нечіткими когнітивними картами. Носієм пояснення тут є граф, а невпевненість рішення виражає ступінь вагання (hesitancy). Вузли графа відповідають ознакам областей зображення, тому геометрія й топологія контуру в подання не входять.</w:t>
       </w:r>
     </w:p>
     <w:p>
@@ -325,7 +372,10 @@
         <w:jc w:val="both"/>
       </w:pPr>
       <w:r>
-        <w:t>García-Cuesta et al. [11] показують, що подання прототипів у прототипних мережах можна змінити навмисно або ненавмисно без втрати зовнішньої правдоподібності пояснення. Цей результат спонукає перевіряти, чи має елемент пояснення зміст поза навченим простором вкладень.</w:t>
+        <w:rPr>
+          <w:lang w:val="uk-UA"/>
+        </w:rPr>
+        <w:t xml:space="preserve">García-Cuesta et al. [11] показують, що прототипи прототипних мереж можна змінити без втрати зовнішньої правдоподібності пояснення. Отже, елемент такого пояснення може не мати змісту поза навченим простором вкладень.</w:t>
       </w:r>
     </w:p>
     <w:p>
@@ -335,7 +385,10 @@
         <w:jc w:val="both"/>
       </w:pPr>
       <w:r>
-        <w:t>Структурні подання форми мають довгу історію в комп'ютерному зорі. Vision GNN [12] трактує зображення як граф вузлів-фрагментів і будує на ньому мережу передавання повідомлень. Chatbri et al. [13] досліджують контури та скелети як подання форми для зіставлення бінарних зображень. Shen et al. [14] будують розпізнавання форми на наборі контурних частин, пов'язаних зі скелетом. Ці роботи підтверджують доцільність структурного опису, але зупиняються на рівні ознак і не роблять структуру носієм самого пояснення.</w:t>
+        <w:rPr>
+          <w:lang w:val="uk-UA"/>
+        </w:rPr>
+        <w:t xml:space="preserve">Структурні подання форми мають довгу історію: Vision GNN [12] будує мережу передавання повідомлень на графі фрагментів зображення, а [13, 14] описують форму контурами й скелетами. Ці роботи використовують структуру як ознаки, але не роблять її носієм пояснення.</w:t>
       </w:r>
     </w:p>
     <w:p>
@@ -345,7 +398,10 @@
         <w:jc w:val="both"/>
       </w:pPr>
       <w:r>
-        <w:t>Elsharkawi et al. [15] розвивають напрям Vision GNN. Автори зауважують, що наявні моделі будують граф кожного шару непараметричними статистичними правилами (k найближчих сусідів, поріг подібності, гіперграф), і пропонують натомість схему LRGC: увагу на основі ключів і запитів між усіма парами вузлів з м'яким пороговим репараметруванням, завдяки чому вибір сусідства стає диференційовним і навчаним. На наборі ImageNet-1k підхід переважає моделі ViG порівнянного розміру. Граф тут є проміжним поданням усередині мережі, тому його вузли та ребра не мають значення, яке можна прочитати окремо від ваг.</w:t>
+        <w:rPr>
+          <w:lang w:val="uk-UA"/>
+        </w:rPr>
+        <w:t xml:space="preserve">Elsharkawi et al. [15] у схемі LRGC роблять вибір сусідства в графі кожного шару Vision GNN диференційовним і навчаним; на ImageNet-1k підхід переважає моделі ViG порівнянного розміру. Граф тут є проміжним поданням мережі, і його вузли та ребра не мають значення окремо від ваг.</w:t>
       </w:r>
     </w:p>
     <w:p>
@@ -355,8 +411,10 @@
         <w:jc w:val="both"/>
       </w:pPr>
       <w:r>
-        <w:lastRenderedPageBreak/>
-        <w:t>Senior et al. [16] оглядають застосування графових нейронних мереж до розуміння двовимірних зображень і подають систематику типів графів, які використовують у підписуванні зображень, відповідях на запитання за зображенням і пошуку. Огляд фіксує, що граф став типовим складником таких конвеєрів як спосіб описати взаємне розташування об'єктів сцени. Роль графа в оглянутих роботах зводиться до постачання структурованих ознак для подальшого навченого модуля; питання про те, чи може сам граф бути записом ухваленого рішення, в огляді не поставлено.</w:t>
+        <w:rPr>
+          <w:lang w:val="uk-UA"/>
+        </w:rPr>
+        <w:t xml:space="preserve">Senior et al. [16] в огляді графових нейронних мереж для розуміння зображень показують, що граф описує розташування об'єктів сцени й постачає структуровані ознаки навченому модулю. Граф як запис ухваленого рішення огляд не розглядає.</w:t>
       </w:r>
     </w:p>
     <w:p>
@@ -366,7 +424,10 @@
         <w:jc w:val="both"/>
       </w:pPr>
       <w:r>
-        <w:t>Задачу зіставлення графів досліджують давно. Оглядова праця Conte et al. [17] систематизує точні й наближені алгоритми зіставлення за тридцять років. Відстань редагування графів (Graph Edit Distance, GED) дає міру подібності з прозорою семантикою: вартість перетворення одного графа на інший розкладається на елементарні операції над вузлами та ребрами. Riesen and Bunke [18] запропонували наближення GED за двочастковим призначенням, яке зробило міру придатною для практичних розмірів графів. Wang et al. [19] розвивають гібридні схеми обчислення GED, де частину вартості визначає нейронна мережа. Розклад на операції редагування робить GED зручною основою для пояснення: кожен доданок вартості прив'язаний до конкретної пари елементів.</w:t>
+        <w:rPr>
+          <w:lang w:val="uk-UA"/>
+        </w:rPr>
+        <w:t xml:space="preserve">Зіставлення графів досліджують понад тридцять років [17]. Відстань редагування графів (Graph Edit Distance, GED) розкладає вартість перетворення одного графа на інший на елементарні операції над вузлами та ребрами. Наближення за двочастковим призначенням [18] зробило GED придатною для практичних розмірів графів, а гібридні схеми [19] доручають частину вартості нейронній мережі. Кожен доданок вартості прив'язаний до конкретної пари елементів, тому GED є зручною основою пояснення.</w:t>
       </w:r>
     </w:p>
     <w:p>
@@ -376,7 +437,10 @@
         <w:jc w:val="both"/>
       </w:pPr>
       <w:r>
-        <w:t>Piao et al. [20] обчислюють GED за двоступеневою схемою: мережа GEDGNN передбачає значення відстані та матрицю відповідності, а подальша обробка відновлює з неї власне шлях редагування. Мотивом роботи є пряме зауваження авторів: моделі, які зводять GED до регресії подібності, досягають вищої числової точності, проте не породжують послідовності операцій, а без неї пояснюваність і практична придатність розв'язку втрачаються. Це формулювання збігається з тим, як GED використано в цій статті. GEDGNN відновлює шлях редагування засобами навченої мережі, тоді як тут він є прямим результатом самої процедури зіставлення.</w:t>
+        <w:rPr>
+          <w:lang w:val="uk-UA"/>
+        </w:rPr>
+        <w:t xml:space="preserve">Piao et al. [20] наголошують, що моделі, які зводять GED до регресії подібності, не породжують послідовності операцій, і пояснюваність розв'язку втрачається. Їхня мережа GEDGNN відновлює шлях редагування з передбаченої матриці відповідності. У цій статті шлях редагування є прямим результатом самої процедури зіставлення.</w:t>
       </w:r>
     </w:p>
     <w:p>
@@ -386,7 +450,10 @@
         <w:jc w:val="both"/>
       </w:pPr>
       <w:r>
-        <w:t>Ще два напрями розвитку GED пришвидшують саме обчислення: Tang et al. [21] зводять задачу до відстані Fused Gromov-Wasserstein і будують алгоритм FGWAlign складності O(|V||E|), який на чотирьох наборах даних зменшує похибку більш ніж на 80 % і прискорює обчислення в 15–60 разів. FGWAlign явно задає операції редагування та вартості перемаркування вузлів, але використовує загальні мітки й ребра, а не геометричні ознаки цієї роботи. Moscatelli et al. [22] переформульовують квадратичну задачу про призначення як передбачення ребер на графі екземпляра й наскрізно отримують м'яку матрицю відповідності графовою мережею з виразністю рівня 3-WL. Запропонована схема відрізняється розкладом вартості заміщення за наперед визначеними геометричними ознаками вузлів.</w:t>
+        <w:rPr>
+          <w:lang w:val="uk-UA"/>
+        </w:rPr>
+        <w:t xml:space="preserve">Tang et al. [21] зводять GED до відстані Fused Gromov–Wasserstein і прискорюють обчислення в 15–60 разів, а Moscatelli et al. [22] наскрізно отримують м'яку матрицю відповідності графовою мережею. Обидві роботи пришвидшують або навчають зіставлення, тоді як тут вартість заміщення розкладено за наперед визначеними геометричними ознаками вузлів.</w:t>
       </w:r>
     </w:p>
     <w:p>
@@ -396,7 +463,10 @@
         <w:jc w:val="both"/>
       </w:pPr>
       <w:r>
-        <w:t>Gan et al. [23] подають рукописні китайські ієрогліфи скелетними графами, а не растровими зображеннями чи часовими траєкторіями, і будують над таким поданням Pyramid Graph Transformer. Вибір мотивовано прямо: растр і траєкторія втрачають геометричну семантику знака, властиву його структурі. За вибором подання це найближча до цієї статті робота, бо в ній скелет знака теж подано графом. Там граф є входом трансформера й рішення визначають його ваги, тоді як тут граф зіставляють з графом концепту, а відповідь складається з переліку заміщень із їхніми вартостями.</w:t>
+        <w:rPr>
+          <w:lang w:val="uk-UA"/>
+        </w:rPr>
+        <w:t xml:space="preserve">Gan et al. [23] подають рукописні китайські ієрогліфи скелетними графами, бо растр і траєкторія втрачають геометричну семантику знака. За вибором подання це найближча до цієї статті робота. Граф там є входом трансформера, і рішення визначають ваги, а тут відповідь складається з переліку заміщень із їхніми вартостями.</w:t>
       </w:r>
     </w:p>
     <w:p>
@@ -406,7 +476,10 @@
         <w:jc w:val="both"/>
       </w:pPr>
       <w:r>
-        <w:t>Dong et al. [24] для розпізнавання ієрогліфів без навчальних прикладів класу будують низхідне орієнтоване дерево радикалів, яке кодує графова нейронна мережа; спрямоване позиційне кодування розрізняє просторові відношення вузлів у межах одного піддерева. Підхід перевірено на рукописних, сценових, художніх і давніх написаннях. Робота показує, що явний структурний опис знака дає змогу впізнавати класи, яких не було в навчальній вибірці. Сам опис, однак, задано наперед словником радикалів, а не виведено із зображень процедурою узагальнення, як алфавіт концептів у цій статті.</w:t>
+        <w:rPr>
+          <w:lang w:val="uk-UA"/>
+        </w:rPr>
+        <w:t xml:space="preserve">Dong et al. [24] розпізнають ієрогліфи без навчальних прикладів класу за деревом радикалів, яке кодує графова нейронна мережа. Робота показує, що явний структурний опис знака дає змогу впізнавати нові класи, проте сам опис задано словником радикалів, а не виведено із зображень.</w:t>
       </w:r>
     </w:p>
     <w:p>
@@ -416,7 +489,10 @@
         <w:jc w:val="both"/>
       </w:pPr>
       <w:r>
-        <w:t>Навчання з малої кількості прикладів розвивається переважно в парадигмі метанавчання. Прототипні мережі [25] будують прототип класу як центроїд опорних прикладів у навченому просторі вкладень. MAML [26] шукає початкові ваги, з яких кілька кроків градієнтного спуску дають придатну модель для нової задачі. Lake et al. [27] демонструють породжувальну програмну модель, яка засвоює рукописний символ з одного прикладу.</w:t>
+        <w:rPr>
+          <w:lang w:val="uk-UA"/>
+        </w:rPr>
+        <w:t xml:space="preserve">Навчання з малої кількості прикладів розвивається переважно в парадигмі метанавчання: прототипні мережі [25] будують прототип класу як центроїд вкладень опорних прикладів, MAML [26] шукає початкові ваги для швидкого донавчання, а породжувальна програмна модель [27] засвоює рукописний символ з одного прикладу.</w:t>
       </w:r>
     </w:p>
     <w:p>
@@ -426,7 +502,10 @@
         <w:jc w:val="both"/>
       </w:pPr>
       <w:r>
-        <w:t>Ji et al. [28] поєднують самопояснювані моделі й навчання з малої кількості прикладів. Автори формулюють дві перешкоди режиму нестачі даних (параметричний дисбаланс і розлад подань) і долають їх сумішшю LoRA-експертів, узгодженням ознак кістяка мережі з активаціями прототипних концептів та функцією втрат, яка змушує концепти бути взаємно ортогональними. На шести еталонних наборах підхід переважає порівнювані методи. Дослідження підтверджує, що пояснюваність і мала навчальна вибірка сумісні; концепти при цьому лишаються векторами в навченому просторі, а не структурами, придатними до огляду.</w:t>
+        <w:rPr>
+          <w:lang w:val="uk-UA"/>
+        </w:rPr>
+        <w:t xml:space="preserve">Ji et al. [28] поєднують самопояснювані моделі з навчанням на малій вибірці: суміш LoRA-експертів узгоджує ознаки мережі з прототипними концептами й на шести еталонних наборах переважає порівнювані методи. Концепти при цьому лишаються векторами в навченому просторі, а не структурами, придатними до огляду.</w:t>
       </w:r>
     </w:p>
     <w:p>
@@ -436,8 +515,10 @@
         <w:jc w:val="both"/>
       </w:pPr>
       <w:r>
-        <w:lastRenderedPageBreak/>
-        <w:t>Окремий напрям становлять альтернативи зворотному поширенню помилки. Алгоритм Forward-Forward [29] замінює зворотний прохід двома прямими проходами з локальним критерієм. Огляд нейросимвольної інтеграції [30] описує спроби поєднати підсимвольне навчання з явними символьними структурами, де символьна частина відповідає за перевірність висновку.</w:t>
+        <w:rPr>
+          <w:lang w:val="uk-UA"/>
+        </w:rPr>
+        <w:t xml:space="preserve">Альтернативи зворотному поширенню помилки представлено алгоритмом Forward-Forward [29], який замінює зворотний прохід двома прямими з локальним критерієм, і нейросимвольною інтеграцією [30], де символьна частина відповідає за перевірність висновку.</w:t>
       </w:r>
     </w:p>
     <w:p>
@@ -447,7 +528,10 @@
         <w:jc w:val="both"/>
       </w:pPr>
       <w:r>
-        <w:t>Ghader et al. [31] навчають імпульсні нейронні мережі алгоритмом Forward-Forward: двома прямими проходами з локальним пошаровим критерієм замість зворотного проходу. На статичних наборах MNIST, Fashion-MNIST і Kuzushiji-MNIST модель переважає попередні мережі цього класу за значно легшої архітектури, а на складніших імпульсних завданнях лишається порівнянною з мережами, навченими зворотним поширенням. Робота засвідчує, що відмова від глобального градієнта не є принциповою перешкодою для точності на задачах рівня MNIST. Локальність критерію стосується процедури навчання; подання, з яким працює мережа, лишається розподіленим за вагами й поелементному прочитанню не піддається.</w:t>
+        <w:rPr>
+          <w:lang w:val="uk-UA"/>
+        </w:rPr>
+        <w:t xml:space="preserve">Ghader et al. [31] навчають імпульсні мережі алгоритмом Forward-Forward і на MNIST, Fashion-MNIST та Kuzushiji-MNIST переважають попередні мережі цього класу. Отже, відмова від глобального градієнта не перешкоджає точності на задачах рівня MNIST, але подання лишається розподіленим за вагами.</w:t>
       </w:r>
     </w:p>
     <w:p>
@@ -467,7 +551,10 @@
         <w:jc w:val="both"/>
       </w:pPr>
       <w:r>
-        <w:t>Розглянуті роботи різняться тим, де в них розміщено пояснення відносно обчислення. Огляди та методи оцінювання ретроспективних пояснень [6, 7] працюють поза навченою моделлю, тому їхні висновки стосуються надійності сурогату, а не самого рішення. Моделі, пояснювані за побудовою [9, 10, 11], переносять пояснення всередину архітектури, але зберігають навчене відображення від входу до проміжних понять. Роботи, які будують подання зображення графом [15, 16, 23, 24], використовують структуру як джерело ознак для подальшого навченого модуля, тому вузли та ребра не мають значення, яке можна прочитати окремо від ваг. Дослідження відстані редагування графів [20, 21, 22] підтверджують цінність шляху редагування; FGWAlign при цьому має визначену семантику операцій. Навчання з малої кількості прикладів [28] і навчання без зворотного поширення помилки [31] знімають окремо взяті обмеження (потребу у великій вибірці та потребу в глобальному градієнті), але подання в обох випадках лишається розподіленим за вагами.</w:t>
+        <w:rPr>
+          <w:lang w:val="uk-UA"/>
+        </w:rPr>
+        <w:t xml:space="preserve">Отже, розглянуті роботи різняться тим, де розміщено пояснення. Ретроспективні методи та їх оцінювання [6, 7] працюють поза навченою моделлю. Моделі, пояснювані за побудовою [9–11], зберігають навчене відображення від входу до проміжних понять. Графові подання зображень [15, 16, 23, 24] постачають ознаки навченому модулю. Роботи з GED [20–22] підтверджують цінність шляху редагування, а навчання на малій вибірці [28] і без зворотного поширення помилки [31] знімають окремі обмеження, але подання лишається розподіленим за вагами.</w:t>
       </w:r>
     </w:p>
     <w:p>
@@ -559,7 +646,23 @@
         <w:jc w:val="both"/>
       </w:pPr>
       <w:r>
-        <w:t>5) продемонструвати пояснюваність числовим трасуванням одного рішення: від операцій редагування й вартостей за окремими ознаками (поознакових вартостей) до підсумкової оцінки.</w:t>
+        <w:rPr>
+          <w:lang w:val="uk-UA"/>
+        </w:rPr>
+        <w:t xml:space="preserve">5) продемонструвати пояснюваність трасуванням рішень: числовим для одного рішення, від операцій редагування й вартостей за окремими ознаками (поознакових вартостей) до підсумкової оцінки, і поетапним для всіх помилок найчастішої пари сплутування.</w:t>
+      </w:r>
+    </w:p>
+    <w:p>
+      <w:pPr>
+        <w:spacing w:after="0" w:line="280" w:lineRule="exact"/>
+        <w:ind w:firstLine="567"/>
+        <w:jc w:val="both"/>
+      </w:pPr>
+      <w:r>
+        <w:rPr>
+          <w:lang w:val="uk-UA"/>
+        </w:rPr>
+        <w:t xml:space="preserve">Мету вважають досягнутою за трьох умов: алфавіт концептів сформовано без зворотного поширення помилки, не більше ніж з 10 оригіналів на концепт; нижня межа 95 % довірчого інтервалу точності на допущеній підмножині перевищує 90 %; рішення відтворюється за збереженими даними від операцій редагування до підсумкової оцінки.</w:t>
       </w:r>
     </w:p>
     <w:p>
@@ -593,8 +696,10 @@
         <w:jc w:val="both"/>
       </w:pPr>
       <w:r>
-        <w:lastRenderedPageBreak/>
-        <w:t>Подання зображення, конвеєр побудови графа та оператор формування концептів-атракторів викладено в [36]. Тут наведено лише те, що потрібно для розуміння результатів, і значення параметрів експерименту; там, де цей опис розходиться з [36], для наведених результатів чинним є цей.</w:t>
+        <w:rPr>
+          <w:lang w:val="uk-UA"/>
+        </w:rPr>
+        <w:t xml:space="preserve">Загальний формалізм подання зображень і формування концептів-атракторів викладено в [36]. Нижче метод описано в обсязі, потрібному для відтворення результатів, а значення всіх параметрів експерименту зведено в табл. 1. Там, де цей опис розходиться з [36], для наведених результатів дійсним є цей.</w:t>
       </w:r>
     </w:p>
     <w:p>
@@ -614,7 +719,12 @@
         <w:jc w:val="both"/>
       </w:pPr>
       <w:r>
-        <w:t>Граф будують із напівтонового зображення 100×100 пікселів за послідовністю кроків, наведеною на рис. 1. Після бінаризації з маски вилучають компоненти до 9 пікселів і виконують морфологічне замикання ядром 3×3, маску стоншують до одного пікселя [37], а кінцеві гілки обрізають, якщо вони коротші за більше з двох значень: 8 % довжини скелета або 5 пікселів. Скелет апроксимують мережею Growing Neural Gas (GNG) [38], її спрощують алгоритмом Рамера–Дугласа–Пекера з допуском 4,55 [39], після чого короткі перемички між розгалуженнями зливають. Початковий поріг бінаризації дорівнює 110; якщо побудова завершується помилкою або дає незв'язний граф, її повторюють із порогом, зменшеним на 5, до мінімуму 20. Очищення, обрізання гілок і злиття перемичок можуть змінити топологію. Координати вузлів відлічують від центра обмежувального прямокутника точок графа, ділять на його півдіагональ і округлюють до одного знака. Той самий конвеєр застосовують до навчальних і тестових зображень.</w:t>
+        <w:rPr/>
+        <w:t xml:space="preserve">Зображення MNIST розміром 28×28 пікселів збільшують до 100×100 пікселів інтерполяцією Ланцоша, і граф будують із цього напівтонового зображення</w:t>
+      </w:r>
+      <w:r>
+        <w:rPr/>
+        <w:t xml:space="preserve"> за послідовністю кроків, наведеною на рис. 1. Після бінаризації з маски вилучають компоненти до 9 пікселів і виконують морфологічне замикання ядром 3×3, маску стоншують до одного пікселя [37], а кінцеві гілки обрізають, якщо вони коротші за більше з двох значень: 8 % довжини скелета або 5 пікселів. Скелет апроксимують мережею Growing Neural Gas (GNG) [38], її спрощують алгоритмом Рамера–Дугласа–Пекера з допуском 4,55 [39], після чого короткі перемички між розгалуженнями зливають. Початковий поріг бінаризації дорівнює 110; якщо побудова завершується помилкою або дає незв'язний граф, її повторюють із порогом, зменшеним на 5, до мінімуму 20. Очищення, обрізання гілок і злиття перемичок можуть змінити топологію. Координати вузлів відлічують від центра обмежувального прямокутника точок графа, ділять на його півдіагональ і округлюють до одного знака. Той самий конвеєр застосовують до навчальних і тестових зображень.</w:t>
       </w:r>
     </w:p>
     <w:p>
@@ -683,7 +793,88 @@
         <w:jc w:val="both"/>
       </w:pPr>
       <w:r>
-        <w:t>Концепт-атрактор класу формують за один прохід колекцією навчальних графів. Початковим станом концепту є граф першого зразка; кожен наступний зразок уточнює концепт структурною редукцією: вилучають кінцеві точки без відповідника разом зі шляхом до найближчого розгалуження, зливають або перемарковують точки перетину, вилучають надлишкові кутові точки, і в концепті лишається спільна для зразків частина структури. Числові атрибути відповідних вузлів зливають в інтервали з межами min і max та значенням center (середнім значень, поданих на поточний крок злиття). Автоматичної перевірки зміни концепту й умови зупинки цикл формування не має.</w:t>
+        <w:rPr>
+          <w:lang w:val="uk-UA"/>
+        </w:rPr>
+        <w:t xml:space="preserve">Концепт-атрактор класу формують за один прохід колекцією навчальних графів цього концепту. Кожен крок порівнює поточний стан концепту з графом чергового зразка через їхні критичні графи. Критичний граф лишає вузли з мітками StartPoint, EndPoint, IntersectionPoint і CornerPoint та з'єднує два такі вузли, якщо їх сполучає шлях через інші вузли. Формування складається з таких кроків:</w:t>
+      </w:r>
+    </w:p>
+    <w:p>
+      <w:pPr>
+        <w:spacing w:after="0" w:line="280" w:lineRule="exact"/>
+        <w:ind w:firstLine="567"/>
+        <w:jc w:val="both"/>
+      </w:pPr>
+      <w:r>
+        <w:rPr>
+          <w:lang w:val="uk-UA"/>
+        </w:rPr>
+        <w:t xml:space="preserve">1) у кожному навчальному графі позначають StartPoint за правилом, спільним для всіх зразків концепту; StartPoint задає точку входу обходу й редукції не підлягає;</w:t>
+      </w:r>
+    </w:p>
+    <w:p>
+      <w:pPr>
+        <w:spacing w:after="0" w:line="280" w:lineRule="exact"/>
+        <w:ind w:firstLine="567"/>
+        <w:jc w:val="both"/>
+      </w:pPr>
+      <w:r>
+        <w:rPr>
+          <w:lang w:val="uk-UA"/>
+        </w:rPr>
+        <w:t xml:space="preserve">2) початковим станом концепту беруть граф першого зразка;</w:t>
+      </w:r>
+    </w:p>
+    <w:p>
+      <w:pPr>
+        <w:spacing w:after="0" w:line="280" w:lineRule="exact"/>
+        <w:ind w:firstLine="567"/>
+        <w:jc w:val="both"/>
+      </w:pPr>
+      <w:r>
+        <w:rPr>
+          <w:lang w:val="uk-UA"/>
+        </w:rPr>
+        <w:t xml:space="preserve">3) поточний стан концепту й граф чергового зразка редукують, доки їхні критичні графи не стануть ізоморфними, але не більше ніж за п'ять раундів: вилучають кінцеві точки без відповідника разом зі шляхом до найближчого розгалуження, перемарковують або вилучають надлишкові точки перетину, знімають мітку CornerPoint з надлишкових кутових точок;</w:t>
+      </w:r>
+    </w:p>
+    <w:p>
+      <w:pPr>
+        <w:spacing w:after="0" w:line="280" w:lineRule="exact"/>
+        <w:ind w:firstLine="567"/>
+        <w:jc w:val="both"/>
+      </w:pPr>
+      <w:r>
+        <w:rPr>
+          <w:lang w:val="uk-UA"/>
+        </w:rPr>
+        <w:t xml:space="preserve">4) редуковані графи обходять синхронно від StartPoint, вузли відповідних шляхів між критичними точками вирівнюють один до одного, а вирівняні пари з об'єднаними атрибутами утворюють новий стан концепту;</w:t>
+      </w:r>
+    </w:p>
+    <w:p>
+      <w:pPr>
+        <w:spacing w:after="0" w:line="280" w:lineRule="exact"/>
+        <w:ind w:firstLine="567"/>
+        <w:jc w:val="both"/>
+      </w:pPr>
+      <w:r>
+        <w:rPr>
+          <w:lang w:val="uk-UA"/>
+        </w:rPr>
+        <w:t xml:space="preserve">5) кроки 3 і 4 повторюють для кожного наступного зразка; якщо за п'ять раундів ізоморфізму не досягнуто, формування завершується помилкою.</w:t>
+      </w:r>
+    </w:p>
+    <w:p>
+      <w:pPr>
+        <w:spacing w:after="0" w:line="280" w:lineRule="exact"/>
+        <w:ind w:firstLine="567"/>
+        <w:jc w:val="both"/>
+      </w:pPr>
+      <w:r>
+        <w:rPr>
+          <w:lang w:val="uk-UA"/>
+        </w:rPr>
+        <w:t xml:space="preserve">Після останнього зразка в концепті лишається частина структури, спільна для всіх зразків. Числові атрибути відповідних вузлів зливають в інтервали з межами min і max та значенням center (середнім значень, поданих на поточний крок злиття); категорійний атрибут зберігається, лише якщо він однаковий в усіх зразках. Автоматичної перевірки зміни концепту й умови зупинки цикл формування не має: процедура використовує всі подані зразки.</w:t>
       </w:r>
     </w:p>
     <w:p>
@@ -725,8 +916,10 @@
         <w:jc w:val="both"/>
       </w:pPr>
       <w:r>
-        <w:lastRenderedPageBreak/>
-        <w:t>Оригінали відібрано вручну, а не випадково. Відбирали найменш спотворені написання без розривів контуру. В основі такого відбору лежить припущення, що правильно розпізнаний представник класу вже містить усі структурні й топологічні ознаки цього класу. Тоді формування концепту потребує не репрезентативної вибірки розподілу, а невеликої кількості структурно повних написань.</w:t>
+        <w:rPr>
+          <w:lang w:val="uk-UA"/>
+        </w:rPr>
+        <w:t xml:space="preserve">Оригінали відібрано вручну, а не випадково, і цього вимагає сам метод. Концепт-атрактор зберігає лише структуру, спільну для всіх поданих зразків: кожен крок редукції вилучає з концепту елементи, яких немає в черговому зразку. Зразок з розривом контуру, шумовою гілкою чи іншою топологією не додає концепту варіативності, а вилучає з нього частину структури класу. Кількості петель редукція не змінює, тому зразок з розімкненою петлею несумісний з концептом свого класу, і формування завершується помилкою. Через це для формування відбирали найменш спотворені написання без розривів контуру. В основі відбору лежить припущення, що правильно написаний представник класу вже містить усі структурні й топологічні ознаки цього класу. Формуванню тоді потрібна не репрезентативна вибірка розподілу, а кілька структурно повних написань, а мінливість почерку в межах класу задають аугментації та інтервали атрибутів.</w:t>
       </w:r>
     </w:p>
     <w:p>
@@ -736,7 +929,12 @@
         <w:jc w:val="both"/>
       </w:pPr>
       <w:r>
-        <w:t>Межі цього припущення відомі лише частково. Чутливість підсумкової точності до конкретного відбору оригіналів у цій роботі не вимірювали. Кількість 76 відновлено групуванням назв файлів. Усі оригінали взято з навчального розбиття MNIST (60 000 зображень), а оцінювання використовує тестове розбиття (10 000 зображень), тому ці два набори не перетинаються.</w:t>
+        <w:rPr/>
+        <w:t xml:space="preserve">Відбір оригіналів є обмеженням методу: результат характеризує систему, концепти якої сформовано зі структурно правильних написань. </w:t>
+      </w:r>
+      <w:r>
+        <w:rPr/>
+        <w:t xml:space="preserve">Чутливість підсумкової точності до конкретного відбору оригіналів у цій роботі не вимірювали. Кількість 76 відновлено групуванням назв файлів. Усі оригінали взято з навчального розбиття MNIST (60 000 зображень), а оцінювання використовує тестове розбиття (10 000 зображень), тому ці два набори не перетинаються.</w:t>
       </w:r>
     </w:p>
     <w:p>
@@ -798,72 +996,877 @@
         <w:jc w:val="both"/>
       </w:pPr>
       <w:r>
-        <w:t xml:space="preserve">Ознаки зважено діагностично: ненормована вага інтервальної ознаки обернено пропорційна ширині її інтервалу у вузлі концепту, </w:t>
-      </w:r>
-      <w:proofErr w:type="spellStart"/>
-      <w:r>
-        <w:t>збільшеній</w:t>
-      </w:r>
-      <w:proofErr w:type="spellEnd"/>
-      <w:r>
-        <w:t xml:space="preserve"> </w:t>
-      </w:r>
-      <w:proofErr w:type="spellStart"/>
-      <w:r>
-        <w:t>на</w:t>
-      </w:r>
-      <w:proofErr w:type="spellEnd"/>
-      <w:r>
-        <w:t xml:space="preserve"> </w:t>
-      </w:r>
-      <w:proofErr w:type="spellStart"/>
-      <w:r>
-        <w:t>сталу</w:t>
-      </w:r>
-      <w:proofErr w:type="spellEnd"/>
-      <w:r>
-        <w:t xml:space="preserve"> </w:t>
-      </w:r>
-      <w:r>
         <w:rPr>
-          <w:position w:val="-12"/>
+          <w:lang w:val="uk-UA"/>
         </w:rPr>
-        <w:object w:dxaOrig="279" w:dyaOrig="360" w14:anchorId="37EF2F5B">
-          <v:shapetype id="_x0000_t75" coordsize="21600,21600" o:spt="75" o:preferrelative="t" path="m@4@5l@4@11@9@11@9@5xe" filled="f" stroked="f">
-            <v:stroke joinstyle="miter"/>
-            <v:formulas>
-              <v:f eqn="if lineDrawn pixelLineWidth 0"/>
-              <v:f eqn="sum @0 1 0"/>
-              <v:f eqn="sum 0 0 @1"/>
-              <v:f eqn="prod @2 1 2"/>
-              <v:f eqn="prod @3 21600 pixelWidth"/>
-              <v:f eqn="prod @3 21600 pixelHeight"/>
-              <v:f eqn="sum @0 0 1"/>
-              <v:f eqn="prod @6 1 2"/>
-              <v:f eqn="prod @7 21600 pixelWidth"/>
-              <v:f eqn="sum @8 21600 0"/>
-              <v:f eqn="prod @7 21600 pixelHeight"/>
-              <v:f eqn="sum @10 21600 0"/>
-            </v:formulas>
-            <v:path o:extrusionok="f" gradientshapeok="t" o:connecttype="rect"/>
-            <o:lock v:ext="edit" aspectratio="t"/>
-          </v:shapetype>
-          <v:shape id="_x0000_i1053" type="#_x0000_t75" style="width:14.25pt;height:18pt" o:ole="">
-            <v:imagedata r:id="rId7" o:title=""/>
-          </v:shape>
-          <o:OLEObject Type="Embed" ProgID="Equation.DSMT4" ShapeID="_x0000_i1053" DrawAspect="Content" ObjectID="_1852313324" r:id="rId8"/>
-        </w:object>
-      </w:r>
-      <w:r>
-        <w:t xml:space="preserve"> = 0,1, </w:t>
-      </w:r>
-      <w:proofErr w:type="spellStart"/>
-      <w:r>
-        <w:t>тому</w:t>
-      </w:r>
-      <w:proofErr w:type="spellEnd"/>
-      <w:r>
-        <w:t xml:space="preserve"> вузькі інтервали важать більше. Категорійні ознаки ширини не мають: вага кожного з двох напрямків дорівнює 0,6, а індикатори кінцевої й кутової точки важать 0,4. Ваги нормують за спільними вибраними ознаками двох вузлів; відсутню ознаку пропускають, а за відсутності спільних ознак призначають NO_MATCH. Вартість значення в межах інтервалу зростає лінійно з відстанню від center: від нуля в center до нормованої ваги ознаки на межі інтервалу; нульова ширина дає точний збіг. Значення поза інтервалом завжди коштує 1,0 незалежно від ширини. Вартість заміщення вузла є сумою вартостей ознак.</w:t>
+        <w:t xml:space="preserve">Ознаки зважено діагностично. Дев'ять ознак зберігають у вузлі концепту інтервал, і ненормовану вагу такої ознаки </w:t>
+      </w:r>
+      <m:oMath>
+        <m:r>
+          <w:rPr>
+            <w:rFonts w:ascii="Cambria Math" w:hAnsi="Cambria Math"/>
+            <w:lang w:val="uk-UA"/>
+          </w:rPr>
+          <m:t xml:space="preserve">f</m:t>
+        </m:r>
+      </m:oMath>
+      <w:r>
+        <w:rPr>
+          <w:lang w:val="uk-UA"/>
+        </w:rPr>
+        <w:t xml:space="preserve"> визначає формула (1):</w:t>
+      </w:r>
+    </w:p>
+    <w:p>
+      <w:pPr>
+        <w:tabs>
+          <w:tab w:val="center" w:pos="4819"/>
+          <w:tab w:val="right" w:pos="9638"/>
+        </w:tabs>
+        <w:spacing w:before="80" w:after="80" w:line="240" w:lineRule="auto"/>
+      </w:pPr>
+      <w:r>
+        <w:tab/>
+      </w:r>
+      <m:oMath>
+        <m:sSub>
+          <m:e>
+            <m:r>
+              <w:rPr>
+                <w:rFonts w:ascii="Cambria Math" w:hAnsi="Cambria Math"/>
+                <w:lang w:val="uk-UA"/>
+              </w:rPr>
+              <m:t xml:space="preserve">w</m:t>
+            </m:r>
+          </m:e>
+          <m:sub>
+            <m:r>
+              <w:rPr>
+                <w:rFonts w:ascii="Cambria Math" w:hAnsi="Cambria Math"/>
+                <w:lang w:val="uk-UA"/>
+              </w:rPr>
+              <m:t xml:space="preserve">f</m:t>
+            </m:r>
+          </m:sub>
+        </m:sSub>
+        <m:r>
+          <w:rPr>
+            <w:rFonts w:ascii="Cambria Math" w:hAnsi="Cambria Math"/>
+            <w:lang w:val="uk-UA"/>
+          </w:rPr>
+          <m:t xml:space="preserve">=</m:t>
+        </m:r>
+        <m:f>
+          <m:num>
+            <m:sSub>
+              <m:e>
+                <m:r>
+                  <w:rPr>
+                    <w:rFonts w:ascii="Cambria Math" w:hAnsi="Cambria Math"/>
+                    <w:lang w:val="uk-UA"/>
+                  </w:rPr>
+                  <m:t xml:space="preserve">s</m:t>
+                </m:r>
+              </m:e>
+              <m:sub>
+                <m:r>
+                  <w:rPr>
+                    <w:rFonts w:ascii="Cambria Math" w:hAnsi="Cambria Math"/>
+                    <w:lang w:val="uk-UA"/>
+                  </w:rPr>
+                  <m:t xml:space="preserve">f</m:t>
+                </m:r>
+              </m:sub>
+            </m:sSub>
+          </m:num>
+          <m:den>
+            <m:sSub>
+              <m:e>
+                <m:r>
+                  <w:rPr>
+                    <w:rFonts w:ascii="Cambria Math" w:hAnsi="Cambria Math"/>
+                    <w:lang w:val="uk-UA"/>
+                  </w:rPr>
+                  <m:t xml:space="preserve">Δ</m:t>
+                </m:r>
+              </m:e>
+              <m:sub>
+                <m:r>
+                  <w:rPr>
+                    <w:rFonts w:ascii="Cambria Math" w:hAnsi="Cambria Math"/>
+                    <w:lang w:val="uk-UA"/>
+                  </w:rPr>
+                  <m:t xml:space="preserve">f</m:t>
+                </m:r>
+              </m:sub>
+            </m:sSub>
+            <m:r>
+              <w:rPr>
+                <w:rFonts w:ascii="Cambria Math" w:hAnsi="Cambria Math"/>
+                <w:lang w:val="uk-UA"/>
+              </w:rPr>
+              <m:t xml:space="preserve">+</m:t>
+            </m:r>
+            <m:r>
+              <w:rPr>
+                <w:rFonts w:ascii="Cambria Math" w:hAnsi="Cambria Math"/>
+                <w:lang w:val="uk-UA"/>
+              </w:rPr>
+              <m:t xml:space="preserve">ε</m:t>
+            </m:r>
+          </m:den>
+        </m:f>
+      </m:oMath>
+      <w:r>
+        <w:tab/>
+      </w:r>
+      <w:r>
+        <w:rPr>
+          <w:lang w:val="uk-UA"/>
+        </w:rPr>
+        <w:t>(1)</w:t>
+      </w:r>
+    </w:p>
+    <w:p>
+      <w:pPr>
+        <w:spacing w:after="0" w:line="280" w:lineRule="exact"/>
+        <w:ind w:firstLine="567"/>
+        <w:jc w:val="both"/>
+      </w:pPr>
+      <w:r>
+        <w:rPr>
+          <w:lang w:val="uk-UA"/>
+        </w:rPr>
+        <w:t xml:space="preserve">де </w:t>
+      </w:r>
+      <m:oMath>
+        <m:sSub>
+          <m:e>
+            <m:r>
+              <w:rPr>
+                <w:rFonts w:ascii="Cambria Math" w:hAnsi="Cambria Math"/>
+                <w:lang w:val="uk-UA"/>
+              </w:rPr>
+              <m:t xml:space="preserve">Δ</m:t>
+            </m:r>
+          </m:e>
+          <m:sub>
+            <m:r>
+              <w:rPr>
+                <w:rFonts w:ascii="Cambria Math" w:hAnsi="Cambria Math"/>
+                <w:lang w:val="uk-UA"/>
+              </w:rPr>
+              <m:t xml:space="preserve">f</m:t>
+            </m:r>
+          </m:sub>
+        </m:sSub>
+      </m:oMath>
+      <w:r>
+        <w:rPr>
+          <w:lang w:val="uk-UA"/>
+        </w:rPr>
+        <w:t xml:space="preserve"> – ширина інтервалу ознаки у вузлі концепту, </w:t>
+      </w:r>
+      <m:oMath>
+        <m:r>
+          <w:rPr>
+            <w:rFonts w:ascii="Cambria Math" w:hAnsi="Cambria Math"/>
+            <w:lang w:val="uk-UA"/>
+          </w:rPr>
+          <m:t xml:space="preserve">ε</m:t>
+        </m:r>
+      </m:oMath>
+      <w:r>
+        <w:rPr>
+          <w:lang w:val="uk-UA"/>
+        </w:rPr>
+        <w:t xml:space="preserve"> = 0,1 – стала, що обмежує вагу вузьких інтервалів, </w:t>
+      </w:r>
+      <m:oMath>
+        <m:sSub>
+          <m:e>
+            <m:r>
+              <w:rPr>
+                <w:rFonts w:ascii="Cambria Math" w:hAnsi="Cambria Math"/>
+                <w:lang w:val="uk-UA"/>
+              </w:rPr>
+              <m:t xml:space="preserve">s</m:t>
+            </m:r>
+          </m:e>
+          <m:sub>
+            <m:r>
+              <w:rPr>
+                <w:rFonts w:ascii="Cambria Math" w:hAnsi="Cambria Math"/>
+                <w:lang w:val="uk-UA"/>
+              </w:rPr>
+              <m:t xml:space="preserve">f</m:t>
+            </m:r>
+          </m:sub>
+        </m:sSub>
+      </m:oMath>
+      <w:r>
+        <w:rPr>
+          <w:lang w:val="uk-UA"/>
+        </w:rPr>
+        <w:t xml:space="preserve"> = 1. Ознака з вузьким інтервалом була стабільною в навчальних зразках, тому важить більше. Решта чотири ознаки категорійні й інтервалу не мають, і їхньою вагою є </w:t>
+      </w:r>
+      <m:oMath>
+        <m:sSub>
+          <m:e>
+            <m:r>
+              <w:rPr>
+                <w:rFonts w:ascii="Cambria Math" w:hAnsi="Cambria Math"/>
+                <w:lang w:val="uk-UA"/>
+              </w:rPr>
+              <m:t xml:space="preserve">s</m:t>
+            </m:r>
+          </m:e>
+          <m:sub>
+            <m:r>
+              <w:rPr>
+                <w:rFonts w:ascii="Cambria Math" w:hAnsi="Cambria Math"/>
+                <w:lang w:val="uk-UA"/>
+              </w:rPr>
+              <m:t xml:space="preserve">f</m:t>
+            </m:r>
+          </m:sub>
+        </m:sSub>
+      </m:oMath>
+      <w:r>
+        <w:rPr>
+          <w:lang w:val="uk-UA"/>
+        </w:rPr>
+        <w:t xml:space="preserve">: 0,6 для кожного з двох напрямків і 0,4 для індикаторів кінцевої й кутової точки. Ваги нормують за ознаками, спільними для двох вузлів: </w:t>
+      </w:r>
+      <m:oMath>
+        <m:sSub>
+          <m:e>
+            <m:acc>
+              <m:accPr>
+                <m:chr m:val="̃"/>
+              </m:accPr>
+              <m:e>
+                <m:r>
+                  <w:rPr>
+                    <w:rFonts w:ascii="Cambria Math" w:hAnsi="Cambria Math"/>
+                    <w:lang w:val="uk-UA"/>
+                  </w:rPr>
+                  <m:t xml:space="preserve">w</m:t>
+                </m:r>
+              </m:e>
+            </m:acc>
+          </m:e>
+          <m:sub>
+            <m:r>
+              <w:rPr>
+                <w:rFonts w:ascii="Cambria Math" w:hAnsi="Cambria Math"/>
+                <w:lang w:val="uk-UA"/>
+              </w:rPr>
+              <m:t xml:space="preserve">f</m:t>
+            </m:r>
+          </m:sub>
+        </m:sSub>
+        <m:r>
+          <w:rPr>
+            <w:rFonts w:ascii="Cambria Math" w:hAnsi="Cambria Math"/>
+            <w:lang w:val="uk-UA"/>
+          </w:rPr>
+          <m:t xml:space="preserve">=</m:t>
+        </m:r>
+        <m:f>
+          <m:fPr>
+            <m:type m:val="lin"/>
+          </m:fPr>
+          <m:num>
+            <m:sSub>
+              <m:e>
+                <m:r>
+                  <w:rPr>
+                    <w:rFonts w:ascii="Cambria Math" w:hAnsi="Cambria Math"/>
+                    <w:lang w:val="uk-UA"/>
+                  </w:rPr>
+                  <m:t xml:space="preserve">w</m:t>
+                </m:r>
+              </m:e>
+              <m:sub>
+                <m:r>
+                  <w:rPr>
+                    <w:rFonts w:ascii="Cambria Math" w:hAnsi="Cambria Math"/>
+                    <w:lang w:val="uk-UA"/>
+                  </w:rPr>
+                  <m:t xml:space="preserve">f</m:t>
+                </m:r>
+              </m:sub>
+            </m:sSub>
+          </m:num>
+          <m:den>
+            <m:nary>
+              <m:naryPr>
+                <m:chr m:val="∑"/>
+                <m:supHide m:val="1"/>
+              </m:naryPr>
+              <m:sub>
+                <m:r>
+                  <w:rPr>
+                    <w:rFonts w:ascii="Cambria Math" w:hAnsi="Cambria Math"/>
+                    <w:lang w:val="uk-UA"/>
+                  </w:rPr>
+                  <m:t xml:space="preserve">g</m:t>
+                </m:r>
+              </m:sub>
+              <m:sup/>
+              <m:e>
+                <m:sSub>
+                  <m:e>
+                    <m:r>
+                      <w:rPr>
+                        <w:rFonts w:ascii="Cambria Math" w:hAnsi="Cambria Math"/>
+                        <w:lang w:val="uk-UA"/>
+                      </w:rPr>
+                      <m:t xml:space="preserve">w</m:t>
+                    </m:r>
+                  </m:e>
+                  <m:sub>
+                    <m:r>
+                      <w:rPr>
+                        <w:rFonts w:ascii="Cambria Math" w:hAnsi="Cambria Math"/>
+                        <w:lang w:val="uk-UA"/>
+                      </w:rPr>
+                      <m:t xml:space="preserve">g</m:t>
+                    </m:r>
+                  </m:sub>
+                </m:sSub>
+              </m:e>
+            </m:nary>
+          </m:den>
+        </m:f>
+      </m:oMath>
+      <w:r>
+        <w:rPr>
+          <w:lang w:val="uk-UA"/>
+        </w:rPr>
+        <w:t xml:space="preserve">; відсутню ознаку пропускають, а за відсутності спільних ознак призначають NO_MATCH. Вартість інтервальної ознаки для значення </w:t>
+      </w:r>
+      <m:oMath>
+        <m:r>
+          <w:rPr>
+            <w:rFonts w:ascii="Cambria Math" w:hAnsi="Cambria Math"/>
+            <w:lang w:val="uk-UA"/>
+          </w:rPr>
+          <m:t xml:space="preserve">v</m:t>
+        </m:r>
+      </m:oMath>
+      <w:r>
+        <w:rPr>
+          <w:lang w:val="uk-UA"/>
+        </w:rPr>
+        <w:t xml:space="preserve"> вузла зображення визначає формула (2):</w:t>
+      </w:r>
+    </w:p>
+    <w:p>
+      <w:pPr>
+        <w:tabs>
+          <w:tab w:val="center" w:pos="4819"/>
+          <w:tab w:val="right" w:pos="9638"/>
+        </w:tabs>
+        <w:spacing w:before="80" w:after="80" w:line="240" w:lineRule="auto"/>
+      </w:pPr>
+      <w:r>
+        <w:tab/>
+      </w:r>
+      <m:oMath>
+        <m:sSub>
+          <m:e>
+            <m:r>
+              <w:rPr>
+                <w:rFonts w:ascii="Cambria Math" w:hAnsi="Cambria Math"/>
+                <w:lang w:val="uk-UA"/>
+              </w:rPr>
+              <m:t xml:space="preserve">c</m:t>
+            </m:r>
+          </m:e>
+          <m:sub>
+            <m:r>
+              <w:rPr>
+                <w:rFonts w:ascii="Cambria Math" w:hAnsi="Cambria Math"/>
+                <w:lang w:val="uk-UA"/>
+              </w:rPr>
+              <m:t xml:space="preserve">f</m:t>
+            </m:r>
+          </m:sub>
+        </m:sSub>
+        <m:d>
+          <m:dPr>
+            <m:begChr m:val="("/>
+            <m:endChr m:val=")"/>
+          </m:dPr>
+          <m:e>
+            <m:r>
+              <w:rPr>
+                <w:rFonts w:ascii="Cambria Math" w:hAnsi="Cambria Math"/>
+                <w:lang w:val="uk-UA"/>
+              </w:rPr>
+              <m:t xml:space="preserve">v</m:t>
+            </m:r>
+          </m:e>
+        </m:d>
+        <m:r>
+          <w:rPr>
+            <w:rFonts w:ascii="Cambria Math" w:hAnsi="Cambria Math"/>
+            <w:lang w:val="uk-UA"/>
+          </w:rPr>
+          <m:t xml:space="preserve">=</m:t>
+        </m:r>
+        <m:d>
+          <m:dPr>
+            <m:begChr m:val="{"/>
+            <m:endChr m:val=""/>
+          </m:dPr>
+          <m:e>
+            <m:eqArr>
+              <m:e>
+                <m:func>
+                  <m:fName>
+                    <m:r>
+                      <m:rPr>
+                        <m:sty m:val="p"/>
+                      </m:rPr>
+                      <w:rPr>
+                        <w:rFonts w:ascii="Cambria Math" w:hAnsi="Cambria Math"/>
+                        <w:lang w:val="uk-UA"/>
+                      </w:rPr>
+                      <m:t xml:space="preserve">min</m:t>
+                    </m:r>
+                  </m:fName>
+                  <m:e>
+                    <m:d>
+                      <m:dPr>
+                        <m:begChr m:val="("/>
+                        <m:endChr m:val=")"/>
+                      </m:dPr>
+                      <m:e>
+                        <m:sSub>
+                          <m:e>
+                            <m:acc>
+                              <m:accPr>
+                                <m:chr m:val="̃"/>
+                              </m:accPr>
+                              <m:e>
+                                <m:r>
+                                  <w:rPr>
+                                    <w:rFonts w:ascii="Cambria Math" w:hAnsi="Cambria Math"/>
+                                    <w:lang w:val="uk-UA"/>
+                                  </w:rPr>
+                                  <m:t xml:space="preserve">w</m:t>
+                                </m:r>
+                              </m:e>
+                            </m:acc>
+                          </m:e>
+                          <m:sub>
+                            <m:r>
+                              <w:rPr>
+                                <w:rFonts w:ascii="Cambria Math" w:hAnsi="Cambria Math"/>
+                                <w:lang w:val="uk-UA"/>
+                              </w:rPr>
+                              <m:t xml:space="preserve">f</m:t>
+                            </m:r>
+                          </m:sub>
+                        </m:sSub>
+                        <m:f>
+                          <m:num>
+                            <m:d>
+                              <m:dPr>
+                                <m:begChr m:val="|"/>
+                                <m:endChr m:val="|"/>
+                              </m:dPr>
+                              <m:e>
+                                <m:r>
+                                  <w:rPr>
+                                    <w:rFonts w:ascii="Cambria Math" w:hAnsi="Cambria Math"/>
+                                    <w:lang w:val="uk-UA"/>
+                                  </w:rPr>
+                                  <m:t xml:space="preserve">v</m:t>
+                                </m:r>
+                                <m:r>
+                                  <w:rPr>
+                                    <w:rFonts w:ascii="Cambria Math" w:hAnsi="Cambria Math"/>
+                                    <w:lang w:val="uk-UA"/>
+                                  </w:rPr>
+                                  <m:t xml:space="preserve">−</m:t>
+                                </m:r>
+                                <m:sSub>
+                                  <m:e>
+                                    <m:r>
+                                      <w:rPr>
+                                        <w:rFonts w:ascii="Cambria Math" w:hAnsi="Cambria Math"/>
+                                        <w:lang w:val="uk-UA"/>
+                                      </w:rPr>
+                                      <m:t xml:space="preserve">m</m:t>
+                                    </m:r>
+                                  </m:e>
+                                  <m:sub>
+                                    <m:r>
+                                      <w:rPr>
+                                        <w:rFonts w:ascii="Cambria Math" w:hAnsi="Cambria Math"/>
+                                        <w:lang w:val="uk-UA"/>
+                                      </w:rPr>
+                                      <m:t xml:space="preserve">f</m:t>
+                                    </m:r>
+                                  </m:sub>
+                                </m:sSub>
+                              </m:e>
+                            </m:d>
+                          </m:num>
+                          <m:den>
+                            <m:sSub>
+                              <m:e>
+                                <m:r>
+                                  <w:rPr>
+                                    <w:rFonts w:ascii="Cambria Math" w:hAnsi="Cambria Math"/>
+                                    <w:lang w:val="uk-UA"/>
+                                  </w:rPr>
+                                  <m:t xml:space="preserve">Δ</m:t>
+                                </m:r>
+                              </m:e>
+                              <m:sub>
+                                <m:r>
+                                  <w:rPr>
+                                    <w:rFonts w:ascii="Cambria Math" w:hAnsi="Cambria Math"/>
+                                    <w:lang w:val="uk-UA"/>
+                                  </w:rPr>
+                                  <m:t xml:space="preserve">f</m:t>
+                                </m:r>
+                              </m:sub>
+                            </m:sSub>
+                            <m:r>
+                              <m:rPr>
+                                <m:sty m:val="p"/>
+                              </m:rPr>
+                              <w:rPr>
+                                <w:rFonts w:ascii="Cambria Math" w:hAnsi="Cambria Math"/>
+                                <w:lang w:val="uk-UA"/>
+                              </w:rPr>
+                              <m:t xml:space="preserve">/2</m:t>
+                            </m:r>
+                          </m:den>
+                        </m:f>
+                        <m:r>
+                          <w:rPr>
+                            <w:rFonts w:ascii="Cambria Math" w:hAnsi="Cambria Math"/>
+                            <w:lang w:val="uk-UA"/>
+                          </w:rPr>
+                          <m:t xml:space="preserve">; </m:t>
+                        </m:r>
+                        <m:sSub>
+                          <m:e>
+                            <m:acc>
+                              <m:accPr>
+                                <m:chr m:val="̃"/>
+                              </m:accPr>
+                              <m:e>
+                                <m:r>
+                                  <w:rPr>
+                                    <w:rFonts w:ascii="Cambria Math" w:hAnsi="Cambria Math"/>
+                                    <w:lang w:val="uk-UA"/>
+                                  </w:rPr>
+                                  <m:t xml:space="preserve">w</m:t>
+                                </m:r>
+                              </m:e>
+                            </m:acc>
+                          </m:e>
+                          <m:sub>
+                            <m:r>
+                              <w:rPr>
+                                <w:rFonts w:ascii="Cambria Math" w:hAnsi="Cambria Math"/>
+                                <w:lang w:val="uk-UA"/>
+                              </w:rPr>
+                              <m:t xml:space="preserve">f</m:t>
+                            </m:r>
+                          </m:sub>
+                        </m:sSub>
+                      </m:e>
+                    </m:d>
+                  </m:e>
+                </m:func>
+                <m:r>
+                  <m:rPr>
+                    <m:sty m:val="p"/>
+                  </m:rPr>
+                  <w:rPr>
+                    <w:rFonts w:ascii="Cambria Math" w:hAnsi="Cambria Math"/>
+                    <w:lang w:val="uk-UA"/>
+                  </w:rPr>
+                  <m:t xml:space="preserve">,   якщо </m:t>
+                </m:r>
+                <m:sSub>
+                  <m:e>
+                    <m:r>
+                      <w:rPr>
+                        <w:rFonts w:ascii="Cambria Math" w:hAnsi="Cambria Math"/>
+                        <w:lang w:val="uk-UA"/>
+                      </w:rPr>
+                      <m:t xml:space="preserve">a</m:t>
+                    </m:r>
+                  </m:e>
+                  <m:sub>
+                    <m:r>
+                      <w:rPr>
+                        <w:rFonts w:ascii="Cambria Math" w:hAnsi="Cambria Math"/>
+                        <w:lang w:val="uk-UA"/>
+                      </w:rPr>
+                      <m:t xml:space="preserve">f</m:t>
+                    </m:r>
+                  </m:sub>
+                </m:sSub>
+                <m:r>
+                  <w:rPr>
+                    <w:rFonts w:ascii="Cambria Math" w:hAnsi="Cambria Math"/>
+                    <w:lang w:val="uk-UA"/>
+                  </w:rPr>
+                  <m:t xml:space="preserve">≤</m:t>
+                </m:r>
+                <m:r>
+                  <w:rPr>
+                    <w:rFonts w:ascii="Cambria Math" w:hAnsi="Cambria Math"/>
+                    <w:lang w:val="uk-UA"/>
+                  </w:rPr>
+                  <m:t xml:space="preserve">v</m:t>
+                </m:r>
+                <m:r>
+                  <w:rPr>
+                    <w:rFonts w:ascii="Cambria Math" w:hAnsi="Cambria Math"/>
+                    <w:lang w:val="uk-UA"/>
+                  </w:rPr>
+                  <m:t xml:space="preserve">≤</m:t>
+                </m:r>
+                <m:sSub>
+                  <m:e>
+                    <m:r>
+                      <w:rPr>
+                        <w:rFonts w:ascii="Cambria Math" w:hAnsi="Cambria Math"/>
+                        <w:lang w:val="uk-UA"/>
+                      </w:rPr>
+                      <m:t xml:space="preserve">b</m:t>
+                    </m:r>
+                  </m:e>
+                  <m:sub>
+                    <m:r>
+                      <w:rPr>
+                        <w:rFonts w:ascii="Cambria Math" w:hAnsi="Cambria Math"/>
+                        <w:lang w:val="uk-UA"/>
+                      </w:rPr>
+                      <m:t xml:space="preserve">f</m:t>
+                    </m:r>
+                  </m:sub>
+                </m:sSub>
+              </m:e>
+              <m:e>
+                <m:r>
+                  <m:rPr>
+                    <m:sty m:val="p"/>
+                  </m:rPr>
+                  <w:rPr>
+                    <w:rFonts w:ascii="Cambria Math" w:hAnsi="Cambria Math"/>
+                    <w:lang w:val="uk-UA"/>
+                  </w:rPr>
+                  <m:t xml:space="preserve">1,0</m:t>
+                </m:r>
+                <m:r>
+                  <m:rPr>
+                    <m:sty m:val="p"/>
+                  </m:rPr>
+                  <w:rPr>
+                    <w:rFonts w:ascii="Cambria Math" w:hAnsi="Cambria Math"/>
+                    <w:lang w:val="uk-UA"/>
+                  </w:rPr>
+                  <m:t xml:space="preserve">,   якщо </m:t>
+                </m:r>
+                <m:r>
+                  <w:rPr>
+                    <w:rFonts w:ascii="Cambria Math" w:hAnsi="Cambria Math"/>
+                    <w:lang w:val="uk-UA"/>
+                  </w:rPr>
+                  <m:t xml:space="preserve">v</m:t>
+                </m:r>
+                <m:r>
+                  <w:rPr>
+                    <w:rFonts w:ascii="Cambria Math" w:hAnsi="Cambria Math"/>
+                    <w:lang w:val="uk-UA"/>
+                  </w:rPr>
+                  <m:t xml:space="preserve">∉</m:t>
+                </m:r>
+                <m:d>
+                  <m:dPr>
+                    <m:begChr m:val="["/>
+                    <m:endChr m:val="]"/>
+                  </m:dPr>
+                  <m:e>
+                    <m:sSub>
+                      <m:e>
+                        <m:r>
+                          <w:rPr>
+                            <w:rFonts w:ascii="Cambria Math" w:hAnsi="Cambria Math"/>
+                            <w:lang w:val="uk-UA"/>
+                          </w:rPr>
+                          <m:t xml:space="preserve">a</m:t>
+                        </m:r>
+                      </m:e>
+                      <m:sub>
+                        <m:r>
+                          <w:rPr>
+                            <w:rFonts w:ascii="Cambria Math" w:hAnsi="Cambria Math"/>
+                            <w:lang w:val="uk-UA"/>
+                          </w:rPr>
+                          <m:t xml:space="preserve">f</m:t>
+                        </m:r>
+                      </m:sub>
+                    </m:sSub>
+                    <m:r>
+                      <w:rPr>
+                        <w:rFonts w:ascii="Cambria Math" w:hAnsi="Cambria Math"/>
+                        <w:lang w:val="uk-UA"/>
+                      </w:rPr>
+                      <m:t xml:space="preserve">; </m:t>
+                    </m:r>
+                    <m:sSub>
+                      <m:e>
+                        <m:r>
+                          <w:rPr>
+                            <w:rFonts w:ascii="Cambria Math" w:hAnsi="Cambria Math"/>
+                            <w:lang w:val="uk-UA"/>
+                          </w:rPr>
+                          <m:t xml:space="preserve">b</m:t>
+                        </m:r>
+                      </m:e>
+                      <m:sub>
+                        <m:r>
+                          <w:rPr>
+                            <w:rFonts w:ascii="Cambria Math" w:hAnsi="Cambria Math"/>
+                            <w:lang w:val="uk-UA"/>
+                          </w:rPr>
+                          <m:t xml:space="preserve">f</m:t>
+                        </m:r>
+                      </m:sub>
+                    </m:sSub>
+                  </m:e>
+                </m:d>
+              </m:e>
+            </m:eqArr>
+          </m:e>
+        </m:d>
+      </m:oMath>
+      <w:r>
+        <w:tab/>
+      </w:r>
+      <w:r>
+        <w:rPr>
+          <w:lang w:val="uk-UA"/>
+        </w:rPr>
+        <w:t>(2)</w:t>
+      </w:r>
+    </w:p>
+    <w:p>
+      <w:pPr>
+        <w:spacing w:after="0" w:line="280" w:lineRule="exact"/>
+        <w:ind w:firstLine="567"/>
+        <w:jc w:val="both"/>
+      </w:pPr>
+      <w:r>
+        <w:rPr>
+          <w:lang w:val="uk-UA"/>
+        </w:rPr>
+        <w:t xml:space="preserve">де </w:t>
+      </w:r>
+      <m:oMath>
+        <m:d>
+          <m:dPr>
+            <m:begChr m:val="["/>
+            <m:endChr m:val="]"/>
+          </m:dPr>
+          <m:e>
+            <m:sSub>
+              <m:e>
+                <m:r>
+                  <w:rPr>
+                    <w:rFonts w:ascii="Cambria Math" w:hAnsi="Cambria Math"/>
+                    <w:lang w:val="uk-UA"/>
+                  </w:rPr>
+                  <m:t xml:space="preserve">a</m:t>
+                </m:r>
+              </m:e>
+              <m:sub>
+                <m:r>
+                  <w:rPr>
+                    <w:rFonts w:ascii="Cambria Math" w:hAnsi="Cambria Math"/>
+                    <w:lang w:val="uk-UA"/>
+                  </w:rPr>
+                  <m:t xml:space="preserve">f</m:t>
+                </m:r>
+              </m:sub>
+            </m:sSub>
+            <m:r>
+              <w:rPr>
+                <w:rFonts w:ascii="Cambria Math" w:hAnsi="Cambria Math"/>
+                <w:lang w:val="uk-UA"/>
+              </w:rPr>
+              <m:t xml:space="preserve">; </m:t>
+            </m:r>
+            <m:sSub>
+              <m:e>
+                <m:r>
+                  <w:rPr>
+                    <w:rFonts w:ascii="Cambria Math" w:hAnsi="Cambria Math"/>
+                    <w:lang w:val="uk-UA"/>
+                  </w:rPr>
+                  <m:t xml:space="preserve">b</m:t>
+                </m:r>
+              </m:e>
+              <m:sub>
+                <m:r>
+                  <w:rPr>
+                    <w:rFonts w:ascii="Cambria Math" w:hAnsi="Cambria Math"/>
+                    <w:lang w:val="uk-UA"/>
+                  </w:rPr>
+                  <m:t xml:space="preserve">f</m:t>
+                </m:r>
+              </m:sub>
+            </m:sSub>
+          </m:e>
+        </m:d>
+      </m:oMath>
+      <w:r>
+        <w:rPr>
+          <w:lang w:val="uk-UA"/>
+        </w:rPr>
+        <w:t xml:space="preserve"> – інтервал ознаки у вузлі концепту, </w:t>
+      </w:r>
+      <m:oMath>
+        <m:sSub>
+          <m:e>
+            <m:r>
+              <w:rPr>
+                <w:rFonts w:ascii="Cambria Math" w:hAnsi="Cambria Math"/>
+                <w:lang w:val="uk-UA"/>
+              </w:rPr>
+              <m:t xml:space="preserve">m</m:t>
+            </m:r>
+          </m:e>
+          <m:sub>
+            <m:r>
+              <w:rPr>
+                <w:rFonts w:ascii="Cambria Math" w:hAnsi="Cambria Math"/>
+                <w:lang w:val="uk-UA"/>
+              </w:rPr>
+              <m:t xml:space="preserve">f</m:t>
+            </m:r>
+          </m:sub>
+        </m:sSub>
+      </m:oMath>
+      <w:r>
+        <w:rPr>
+          <w:lang w:val="uk-UA"/>
+        </w:rPr>
+        <w:t xml:space="preserve"> – його значення center. Вартість у межах інтервалу зростає від нуля в center до нормованої ваги ознаки на межі; за нульової ширини значення в межах інтервалу дає точний збіг, а значення поза інтервалом коштує 1,0 незалежно від ширини. Вартість заміщення вузла є сумою вартостей його ознак, тому один вихід за інтервал робить її не меншою за 1,0.</w:t>
       </w:r>
     </w:p>
     <w:p>
@@ -924,7 +1927,12 @@
       </w:r>
       <w:proofErr w:type="spellEnd"/>
       <w:r>
-        <w:t xml:space="preserve"> за формулою (1):</w:t>
+        <w:rPr/>
+        <w:t xml:space="preserve"> за формулою </w:t>
+      </w:r>
+      <w:r>
+        <w:rPr/>
+        <w:t xml:space="preserve">(3):</w:t>
       </w:r>
     </w:p>
     <w:p>
@@ -951,7 +1959,10 @@
       </w:r>
       <w:r>
         <w:tab/>
-        <w:t>(1)</w:t>
+      </w:r>
+      <w:r>
+        <w:rPr/>
+        <w:t xml:space="preserve">(3)</w:t>
       </w:r>
     </w:p>
     <w:p>
@@ -1028,7 +2039,12 @@
         <w:jc w:val="both"/>
       </w:pPr>
       <w:r>
-        <w:t>Переможця обирають за правилом "переможець отримує все" (winner-take-all) з поправкою на складність концепту (2):</w:t>
+        <w:rPr/>
+        <w:t xml:space="preserve">Переможця обирають за правилом "переможець отримує все" (winner-take-all) з поправкою на складність концепту </w:t>
+      </w:r>
+      <w:r>
+        <w:rPr/>
+        <w:t xml:space="preserve">(4):</w:t>
       </w:r>
     </w:p>
     <w:p>
@@ -1055,7 +2071,10 @@
       </w:r>
       <w:r>
         <w:tab/>
-        <w:t>(2)</w:t>
+      </w:r>
+      <w:r>
+        <w:rPr/>
+        <w:t xml:space="preserve">(4)</w:t>
       </w:r>
     </w:p>
     <w:p>
@@ -1131,6 +2150,833 @@
     </w:p>
     <w:p>
       <w:pPr>
+        <w:spacing w:after="0" w:line="280" w:lineRule="exact"/>
+        <w:ind w:firstLine="567"/>
+        <w:jc w:val="both"/>
+      </w:pPr>
+      <w:r>
+        <w:rPr>
+          <w:lang w:val="uk-UA"/>
+        </w:rPr>
+        <w:t xml:space="preserve">Значення всіх параметрів побудови графа й класифікації наведено в табл. 1.</w:t>
+      </w:r>
+    </w:p>
+    <w:p>
+      <w:pPr>
+        <w:keepNext/>
+        <w:spacing w:before="120" w:after="0" w:line="280" w:lineRule="exact"/>
+        <w:jc w:val="center"/>
+      </w:pPr>
+      <w:r>
+        <w:rPr>
+          <w:b/>
+          <w:i/>
+          <w:sz w:val="18"/>
+          <w:lang w:val="uk-UA"/>
+        </w:rPr>
+        <w:t xml:space="preserve">Таблиця 1 – Параметри експерименту</w:t>
+      </w:r>
+    </w:p>
+    <w:tbl>
+      <w:tblPr>
+        <w:tblStyle w:val="aff0"/>
+        <w:tblW w:w="0" w:type="auto"/>
+        <w:jc w:val="center"/>
+        <w:tblLook w:val="04A0" w:firstRow="1" w:lastRow="0" w:firstColumn="1" w:lastColumn="0" w:noHBand="0" w:noVBand="1"/>
+      </w:tblPr>
+      <w:tblGrid>
+        <w:gridCol w:w="2000"/>
+        <w:gridCol w:w="4638"/>
+        <w:gridCol w:w="3000"/>
+      </w:tblGrid>
+      <w:tr>
+        <w:trPr>
+          <w:tblHeader/>
+          <w:jc w:val="center"/>
+        </w:trPr>
+        <w:tc>
+          <w:tcPr>
+            <w:tcW w:w="2000" w:type="dxa"/>
+          </w:tcPr>
+          <w:p>
+            <w:pPr>
+              <w:jc w:val="center"/>
+            </w:pPr>
+            <w:r>
+              <w:rPr>
+                <w:b/>
+                <w:sz w:val="18"/>
+                <w:lang w:val="uk-UA"/>
+              </w:rPr>
+              <w:t xml:space="preserve">Етап</w:t>
+            </w:r>
+          </w:p>
+        </w:tc>
+        <w:tc>
+          <w:tcPr>
+            <w:tcW w:w="4638" w:type="dxa"/>
+          </w:tcPr>
+          <w:p>
+            <w:pPr>
+              <w:jc w:val="center"/>
+            </w:pPr>
+            <w:r>
+              <w:rPr>
+                <w:b/>
+                <w:sz w:val="18"/>
+                <w:lang w:val="uk-UA"/>
+              </w:rPr>
+              <w:t xml:space="preserve">Параметр</w:t>
+            </w:r>
+          </w:p>
+        </w:tc>
+        <w:tc>
+          <w:tcPr>
+            <w:tcW w:w="3000" w:type="dxa"/>
+          </w:tcPr>
+          <w:p>
+            <w:pPr>
+              <w:jc w:val="center"/>
+            </w:pPr>
+            <w:r>
+              <w:rPr>
+                <w:b/>
+                <w:sz w:val="18"/>
+                <w:lang w:val="uk-UA"/>
+              </w:rPr>
+              <w:t xml:space="preserve">Значення</w:t>
+            </w:r>
+          </w:p>
+        </w:tc>
+      </w:tr>
+      <w:tr>
+        <w:trPr>
+          <w:jc w:val="center"/>
+        </w:trPr>
+        <w:tc>
+          <w:tcPr>
+            <w:tcW w:w="2000" w:type="dxa"/>
+            <w:vMerge w:val="restart"/>
+          </w:tcPr>
+          <w:p>
+            <w:r>
+              <w:rPr>
+                <w:sz w:val="18"/>
+                <w:lang w:val="uk-UA"/>
+              </w:rPr>
+              <w:t xml:space="preserve">Підготовка</w:t>
+            </w:r>
+          </w:p>
+        </w:tc>
+        <w:tc>
+          <w:tcPr>
+            <w:tcW w:w="4638" w:type="dxa"/>
+          </w:tcPr>
+          <w:p>
+            <w:pPr>
+              <w:jc w:val="center"/>
+            </w:pPr>
+            <w:r>
+              <w:rPr>
+                <w:sz w:val="18"/>
+                <w:lang w:val="uk-UA"/>
+              </w:rPr>
+              <w:t xml:space="preserve">Розмір зображення після збільшення</w:t>
+            </w:r>
+          </w:p>
+        </w:tc>
+        <w:tc>
+          <w:tcPr>
+            <w:tcW w:w="3000" w:type="dxa"/>
+          </w:tcPr>
+          <w:p>
+            <w:pPr>
+              <w:jc w:val="center"/>
+            </w:pPr>
+            <w:r>
+              <w:rPr>
+                <w:sz w:val="18"/>
+                <w:lang w:val="uk-UA"/>
+              </w:rPr>
+              <w:t xml:space="preserve">100×100 пікселів</w:t>
+            </w:r>
+          </w:p>
+        </w:tc>
+      </w:tr>
+      <w:tr>
+        <w:trPr>
+          <w:jc w:val="center"/>
+        </w:trPr>
+        <w:tc>
+          <w:tcPr>
+            <w:tcW w:w="2000" w:type="dxa"/>
+            <w:vMerge w:val="restart"/>
+          </w:tcPr>
+          <w:p>
+            <w:r>
+              <w:rPr>
+                <w:sz w:val="18"/>
+                <w:lang w:val="uk-UA"/>
+              </w:rPr>
+              <w:t xml:space="preserve">Побудова графа</w:t>
+            </w:r>
+          </w:p>
+        </w:tc>
+        <w:tc>
+          <w:tcPr>
+            <w:tcW w:w="4638" w:type="dxa"/>
+          </w:tcPr>
+          <w:p>
+            <w:pPr>
+              <w:jc w:val="center"/>
+            </w:pPr>
+            <w:r>
+              <w:rPr>
+                <w:sz w:val="18"/>
+                <w:lang w:val="uk-UA"/>
+              </w:rPr>
+              <w:t xml:space="preserve">Поріг бінаризації: початковий, крок, мінімум</w:t>
+            </w:r>
+          </w:p>
+        </w:tc>
+        <w:tc>
+          <w:tcPr>
+            <w:tcW w:w="3000" w:type="dxa"/>
+          </w:tcPr>
+          <w:p>
+            <w:pPr>
+              <w:jc w:val="center"/>
+            </w:pPr>
+            <w:r>
+              <w:rPr>
+                <w:sz w:val="18"/>
+                <w:lang w:val="uk-UA"/>
+              </w:rPr>
+              <w:t xml:space="preserve">110; 5; 20</w:t>
+            </w:r>
+          </w:p>
+        </w:tc>
+      </w:tr>
+      <w:tr>
+        <w:trPr>
+          <w:jc w:val="center"/>
+        </w:trPr>
+        <w:tc>
+          <w:tcPr>
+            <w:tcW w:w="2000" w:type="dxa"/>
+            <w:vMerge/>
+          </w:tcPr>
+          <w:p/>
+        </w:tc>
+        <w:tc>
+          <w:tcPr>
+            <w:tcW w:w="4638" w:type="dxa"/>
+          </w:tcPr>
+          <w:p>
+            <w:pPr>
+              <w:jc w:val="center"/>
+            </w:pPr>
+            <w:r>
+              <w:rPr>
+                <w:sz w:val="18"/>
+                <w:lang w:val="uk-UA"/>
+              </w:rPr>
+              <w:t xml:space="preserve">Вилучення малих компонентів; ядро замикання</w:t>
+            </w:r>
+          </w:p>
+        </w:tc>
+        <w:tc>
+          <w:tcPr>
+            <w:tcW w:w="3000" w:type="dxa"/>
+          </w:tcPr>
+          <w:p>
+            <w:pPr>
+              <w:jc w:val="center"/>
+            </w:pPr>
+            <w:r>
+              <w:rPr>
+                <w:sz w:val="18"/>
+                <w:lang w:val="uk-UA"/>
+              </w:rPr>
+              <w:t xml:space="preserve">до 9 пікселів; 3×3</w:t>
+            </w:r>
+          </w:p>
+        </w:tc>
+      </w:tr>
+      <w:tr>
+        <w:trPr>
+          <w:jc w:val="center"/>
+        </w:trPr>
+        <w:tc>
+          <w:tcPr>
+            <w:tcW w:w="2000" w:type="dxa"/>
+            <w:vMerge/>
+          </w:tcPr>
+          <w:p/>
+        </w:tc>
+        <w:tc>
+          <w:tcPr>
+            <w:tcW w:w="4638" w:type="dxa"/>
+          </w:tcPr>
+          <w:p>
+            <w:pPr>
+              <w:jc w:val="center"/>
+            </w:pPr>
+            <w:r>
+              <w:rPr>
+                <w:sz w:val="18"/>
+                <w:lang w:val="uk-UA"/>
+              </w:rPr>
+              <w:t xml:space="preserve">Обрізання кінцевих гілок, коротших за</w:t>
+            </w:r>
+          </w:p>
+        </w:tc>
+        <w:tc>
+          <w:tcPr>
+            <w:tcW w:w="3000" w:type="dxa"/>
+          </w:tcPr>
+          <w:p>
+            <w:pPr>
+              <w:jc w:val="center"/>
+            </w:pPr>
+            <w:r>
+              <w:rPr>
+                <w:sz w:val="18"/>
+                <w:lang w:val="uk-UA"/>
+              </w:rPr>
+              <w:t xml:space="preserve">більше з 8 % довжини скелета та 5 пікселів</w:t>
+            </w:r>
+          </w:p>
+        </w:tc>
+      </w:tr>
+      <w:tr>
+        <w:trPr>
+          <w:jc w:val="center"/>
+        </w:trPr>
+        <w:tc>
+          <w:tcPr>
+            <w:tcW w:w="2000" w:type="dxa"/>
+            <w:vMerge/>
+          </w:tcPr>
+          <w:p/>
+        </w:tc>
+        <w:tc>
+          <w:tcPr>
+            <w:tcW w:w="4638" w:type="dxa"/>
+          </w:tcPr>
+          <w:p>
+            <w:pPr>
+              <w:jc w:val="center"/>
+            </w:pPr>
+            <w:r>
+              <w:rPr>
+                <w:sz w:val="18"/>
+                <w:lang w:val="uk-UA"/>
+              </w:rPr>
+              <w:t xml:space="preserve">Допуск Рамера–Дугласа–Пекера</w:t>
+            </w:r>
+          </w:p>
+        </w:tc>
+        <w:tc>
+          <w:tcPr>
+            <w:tcW w:w="3000" w:type="dxa"/>
+          </w:tcPr>
+          <w:p>
+            <w:pPr>
+              <w:jc w:val="center"/>
+            </w:pPr>
+            <w:r>
+              <w:rPr>
+                <w:sz w:val="18"/>
+                <w:lang w:val="uk-UA"/>
+              </w:rPr>
+              <w:t xml:space="preserve">4,55</w:t>
+            </w:r>
+          </w:p>
+        </w:tc>
+      </w:tr>
+      <w:tr>
+        <w:trPr>
+          <w:jc w:val="center"/>
+        </w:trPr>
+        <w:tc>
+          <w:tcPr>
+            <w:tcW w:w="2000" w:type="dxa"/>
+            <w:vMerge w:val="restart"/>
+          </w:tcPr>
+          <w:p>
+            <w:r>
+              <w:rPr>
+                <w:sz w:val="18"/>
+                <w:lang w:val="uk-UA"/>
+              </w:rPr>
+              <w:t xml:space="preserve">Класифікація</w:t>
+            </w:r>
+          </w:p>
+        </w:tc>
+        <w:tc>
+          <w:tcPr>
+            <w:tcW w:w="4638" w:type="dxa"/>
+          </w:tcPr>
+          <w:p>
+            <w:pPr>
+              <w:jc w:val="center"/>
+            </w:pPr>
+            <w:r>
+              <w:rPr>
+                <w:sz w:val="18"/>
+                <w:lang w:val="uk-UA"/>
+              </w:rPr>
+              <w:t xml:space="preserve">Кількість ознак вузла</w:t>
+            </w:r>
+          </w:p>
+        </w:tc>
+        <w:tc>
+          <w:tcPr>
+            <w:tcW w:w="3000" w:type="dxa"/>
+          </w:tcPr>
+          <w:p>
+            <w:pPr>
+              <w:jc w:val="center"/>
+            </w:pPr>
+            <w:r>
+              <w:rPr>
+                <w:sz w:val="18"/>
+                <w:lang w:val="uk-UA"/>
+              </w:rPr>
+              <w:t xml:space="preserve">13</w:t>
+            </w:r>
+          </w:p>
+        </w:tc>
+      </w:tr>
+      <w:tr>
+        <w:trPr>
+          <w:jc w:val="center"/>
+        </w:trPr>
+        <w:tc>
+          <w:tcPr>
+            <w:tcW w:w="2000" w:type="dxa"/>
+            <w:vMerge/>
+          </w:tcPr>
+          <w:p/>
+        </w:tc>
+        <w:tc>
+          <w:tcPr>
+            <w:tcW w:w="4638" w:type="dxa"/>
+          </w:tcPr>
+          <w:p>
+            <w:pPr>
+              <w:jc w:val="center"/>
+            </w:pPr>
+            <w:r>
+              <w:rPr>
+                <w:sz w:val="18"/>
+                <w:lang w:val="uk-UA"/>
+              </w:rPr>
+              <w:t xml:space="preserve">Шкала вартостей заміщення</w:t>
+            </w:r>
+          </w:p>
+        </w:tc>
+        <w:tc>
+          <w:tcPr>
+            <w:tcW w:w="3000" w:type="dxa"/>
+          </w:tcPr>
+          <w:p>
+            <w:pPr>
+              <w:jc w:val="center"/>
+            </w:pPr>
+            <w:r>
+              <w:rPr>
+                <w:sz w:val="18"/>
+                <w:lang w:val="uk-UA"/>
+              </w:rPr>
+              <w:t xml:space="preserve">0; 0,25; 0,5; 0,8; 1,0; 6,0</w:t>
+            </w:r>
+          </w:p>
+        </w:tc>
+      </w:tr>
+      <w:tr>
+        <w:trPr>
+          <w:jc w:val="center"/>
+        </w:trPr>
+        <w:tc>
+          <w:tcPr>
+            <w:tcW w:w="2000" w:type="dxa"/>
+            <w:vMerge/>
+          </w:tcPr>
+          <w:p/>
+        </w:tc>
+        <w:tc>
+          <w:tcPr>
+            <w:tcW w:w="4638" w:type="dxa"/>
+          </w:tcPr>
+          <w:p>
+            <w:pPr>
+              <w:jc w:val="center"/>
+            </w:pPr>
+            <w:r>
+              <w:rPr>
+                <w:sz w:val="18"/>
+                <w:lang w:val="uk-UA"/>
+              </w:rPr>
+              <w:t xml:space="preserve">Вартість вилучення вузла й ребра</w:t>
+            </w:r>
+          </w:p>
+        </w:tc>
+        <w:tc>
+          <w:tcPr>
+            <w:tcW w:w="3000" w:type="dxa"/>
+          </w:tcPr>
+          <w:p>
+            <w:pPr>
+              <w:jc w:val="center"/>
+            </w:pPr>
+            <w:r>
+              <w:rPr>
+                <w:sz w:val="18"/>
+                <w:lang w:val="uk-UA"/>
+              </w:rPr>
+              <w:t xml:space="preserve">0,25</w:t>
+            </w:r>
+          </w:p>
+        </w:tc>
+      </w:tr>
+      <w:tr>
+        <w:trPr>
+          <w:jc w:val="center"/>
+        </w:trPr>
+        <w:tc>
+          <w:tcPr>
+            <w:tcW w:w="2000" w:type="dxa"/>
+            <w:vMerge/>
+          </w:tcPr>
+          <w:p/>
+        </w:tc>
+        <w:tc>
+          <w:tcPr>
+            <w:tcW w:w="4638" w:type="dxa"/>
+          </w:tcPr>
+          <w:p>
+            <w:pPr>
+              <w:jc w:val="center"/>
+            </w:pPr>
+            <w:r>
+              <w:rPr>
+                <w:sz w:val="18"/>
+                <w:lang w:val="uk-UA"/>
+              </w:rPr>
+              <w:t xml:space="preserve">Вартість вставлення вузла; ребра</w:t>
+            </w:r>
+          </w:p>
+        </w:tc>
+        <w:tc>
+          <w:tcPr>
+            <w:tcW w:w="3000" w:type="dxa"/>
+          </w:tcPr>
+          <w:p>
+            <w:pPr>
+              <w:jc w:val="center"/>
+            </w:pPr>
+            <w:r>
+              <w:rPr>
+                <w:sz w:val="18"/>
+                <w:lang w:val="uk-UA"/>
+              </w:rPr>
+              <w:t xml:space="preserve">6,0; 0</w:t>
+            </w:r>
+          </w:p>
+        </w:tc>
+      </w:tr>
+      <w:tr>
+        <w:trPr>
+          <w:jc w:val="center"/>
+        </w:trPr>
+        <w:tc>
+          <w:tcPr>
+            <w:tcW w:w="2000" w:type="dxa"/>
+            <w:vMerge/>
+          </w:tcPr>
+          <w:p/>
+        </w:tc>
+        <w:tc>
+          <w:tcPr>
+            <w:tcW w:w="4638" w:type="dxa"/>
+          </w:tcPr>
+          <w:p>
+            <w:pPr>
+              <w:jc w:val="center"/>
+            </w:pPr>
+            <m:oMath>
+              <m:r>
+                <w:rPr>
+                  <w:rFonts w:ascii="Cambria Math" w:hAnsi="Cambria Math"/>
+                  <w:sz w:val="18"/>
+                  <w:lang w:val="uk-UA"/>
+                </w:rPr>
+                <m:t xml:space="preserve">ε</m:t>
+              </m:r>
+            </m:oMath>
+            <w:r>
+              <w:rPr>
+                <w:sz w:val="18"/>
+                <w:lang w:val="uk-UA"/>
+              </w:rPr>
+              <w:t xml:space="preserve"> у формулі (1)</w:t>
+            </w:r>
+          </w:p>
+        </w:tc>
+        <w:tc>
+          <w:tcPr>
+            <w:tcW w:w="3000" w:type="dxa"/>
+          </w:tcPr>
+          <w:p>
+            <w:pPr>
+              <w:jc w:val="center"/>
+            </w:pPr>
+            <w:r>
+              <w:rPr>
+                <w:sz w:val="18"/>
+                <w:lang w:val="uk-UA"/>
+              </w:rPr>
+              <w:t xml:space="preserve">0,1</w:t>
+            </w:r>
+          </w:p>
+        </w:tc>
+      </w:tr>
+      <w:tr>
+        <w:trPr>
+          <w:jc w:val="center"/>
+        </w:trPr>
+        <w:tc>
+          <w:tcPr>
+            <w:tcW w:w="2000" w:type="dxa"/>
+            <w:vMerge/>
+          </w:tcPr>
+          <w:p/>
+        </w:tc>
+        <w:tc>
+          <w:tcPr>
+            <w:tcW w:w="4638" w:type="dxa"/>
+          </w:tcPr>
+          <w:p>
+            <w:pPr>
+              <w:jc w:val="center"/>
+            </w:pPr>
+            <m:oMath>
+              <m:sSub>
+                <m:e>
+                  <m:r>
+                    <w:rPr>
+                      <w:rFonts w:ascii="Cambria Math" w:hAnsi="Cambria Math"/>
+                      <w:sz w:val="18"/>
+                      <w:lang w:val="uk-UA"/>
+                    </w:rPr>
+                    <m:t xml:space="preserve">s</m:t>
+                  </m:r>
+                </m:e>
+                <m:sub>
+                  <m:r>
+                    <w:rPr>
+                      <w:rFonts w:ascii="Cambria Math" w:hAnsi="Cambria Math"/>
+                      <w:sz w:val="18"/>
+                      <w:lang w:val="uk-UA"/>
+                    </w:rPr>
+                    <m:t xml:space="preserve">f</m:t>
+                  </m:r>
+                </m:sub>
+              </m:sSub>
+            </m:oMath>
+            <w:r>
+              <w:rPr>
+                <w:sz w:val="18"/>
+                <w:lang w:val="uk-UA"/>
+              </w:rPr>
+              <w:t xml:space="preserve">: інтервальні ознаки; напрямки; індикатори</w:t>
+            </w:r>
+          </w:p>
+        </w:tc>
+        <w:tc>
+          <w:tcPr>
+            <w:tcW w:w="3000" w:type="dxa"/>
+          </w:tcPr>
+          <w:p>
+            <w:pPr>
+              <w:jc w:val="center"/>
+            </w:pPr>
+            <w:r>
+              <w:rPr>
+                <w:sz w:val="18"/>
+                <w:lang w:val="uk-UA"/>
+              </w:rPr>
+              <w:t xml:space="preserve">1; 0,6; 0,4</w:t>
+            </w:r>
+          </w:p>
+        </w:tc>
+      </w:tr>
+      <w:tr>
+        <w:trPr>
+          <w:jc w:val="center"/>
+        </w:trPr>
+        <w:tc>
+          <w:tcPr>
+            <w:tcW w:w="2000" w:type="dxa"/>
+            <w:vMerge/>
+          </w:tcPr>
+          <w:p/>
+        </w:tc>
+        <w:tc>
+          <w:tcPr>
+            <w:tcW w:w="4638" w:type="dxa"/>
+          </w:tcPr>
+          <w:p>
+            <w:pPr>
+              <w:jc w:val="center"/>
+            </w:pPr>
+            <m:oMath>
+              <m:r>
+                <w:rPr>
+                  <w:rFonts w:ascii="Cambria Math" w:hAnsi="Cambria Math"/>
+                  <w:sz w:val="18"/>
+                  <w:lang w:val="uk-UA"/>
+                </w:rPr>
+                <m:t xml:space="preserve">λ</m:t>
+              </m:r>
+            </m:oMath>
+            <w:r>
+              <w:rPr>
+                <w:sz w:val="18"/>
+                <w:lang w:val="uk-UA"/>
+              </w:rPr>
+              <w:t xml:space="preserve"> у формулі (4)</w:t>
+            </w:r>
+          </w:p>
+        </w:tc>
+        <w:tc>
+          <w:tcPr>
+            <w:tcW w:w="3000" w:type="dxa"/>
+          </w:tcPr>
+          <w:p>
+            <w:pPr>
+              <w:jc w:val="center"/>
+            </w:pPr>
+            <w:r>
+              <w:rPr>
+                <w:sz w:val="18"/>
+                <w:lang w:val="uk-UA"/>
+              </w:rPr>
+              <w:t xml:space="preserve">0,10</w:t>
+            </w:r>
+          </w:p>
+        </w:tc>
+      </w:tr>
+      <w:tr>
+        <w:trPr>
+          <w:jc w:val="center"/>
+        </w:trPr>
+        <w:tc>
+          <w:tcPr>
+            <w:tcW w:w="2000" w:type="dxa"/>
+            <w:vMerge/>
+          </w:tcPr>
+          <w:p/>
+        </w:tc>
+        <w:tc>
+          <w:tcPr>
+            <w:tcW w:w="4638" w:type="dxa"/>
+          </w:tcPr>
+          <w:p>
+            <w:pPr>
+              <w:jc w:val="center"/>
+            </w:pPr>
+            <w:r>
+              <w:rPr>
+                <w:sz w:val="18"/>
+                <w:lang w:val="uk-UA"/>
+              </w:rPr>
+              <w:t xml:space="preserve">Бюджет часу GED на одне порівняння</w:t>
+            </w:r>
+          </w:p>
+        </w:tc>
+        <w:tc>
+          <w:tcPr>
+            <w:tcW w:w="3000" w:type="dxa"/>
+          </w:tcPr>
+          <w:p>
+            <w:pPr>
+              <w:jc w:val="center"/>
+            </w:pPr>
+            <w:r>
+              <w:rPr>
+                <w:sz w:val="18"/>
+                <w:lang w:val="uk-UA"/>
+              </w:rPr>
+              <w:t xml:space="preserve">5 с</w:t>
+            </w:r>
+          </w:p>
+        </w:tc>
+      </w:tr>
+    </w:tbl>
+    <w:p>
+      <w:pPr>
+        <w:spacing w:after="0" w:line="280" w:lineRule="exact"/>
+        <w:jc w:val="both"/>
+      </w:pPr>
+    </w:p>
+    <w:p>
+      <w:pPr>
+        <w:keepNext/>
+        <w:spacing w:before="160" w:after="80" w:line="280" w:lineRule="exact"/>
+        <w:jc w:val="both"/>
+      </w:pPr>
+      <w:r>
+        <w:rPr>
+          <w:b/>
+          <w:lang w:val="uk-UA"/>
+        </w:rPr>
+        <w:t xml:space="preserve">2.4 Протокол оцінювання</w:t>
+      </w:r>
+    </w:p>
+    <w:p>
+      <w:pPr>
+        <w:spacing w:after="0" w:line="280" w:lineRule="exact"/>
+        <w:ind w:firstLine="567"/>
+        <w:jc w:val="both"/>
+      </w:pPr>
+      <w:r>
+        <w:rPr>
+          <w:lang w:val="uk-UA"/>
+        </w:rPr>
+        <w:t xml:space="preserve">Оцінювання виконано на тестовому розбитті MNIST з 10 000 зображень [40], яке не перетинається з навчальними оригіналами (підрозділ 2.2). Параметри (табл. 1) і алфавіт концептів зафіксовано до оцінювання, і кожне тестове зображення класифіковано один раз.</w:t>
+      </w:r>
+    </w:p>
+    <w:p>
+      <w:pPr>
+        <w:spacing w:after="0" w:line="280" w:lineRule="exact"/>
+        <w:ind w:firstLine="567"/>
+        <w:jc w:val="both"/>
+      </w:pPr>
+      <w:r>
+        <w:rPr>
+          <w:lang w:val="uk-UA"/>
+        </w:rPr>
+        <w:t xml:space="preserve">Повноту контуру розмічено вручну до будь-якого експерименту з класифікацією. Для кожного тестового зображення розмітник бачив три панелі: напівтонове зображення, бінарну маску за порогом 110 і скелет завтовшки один піксель. Зображення позначали як повне, якщо цифру дописано повністю, а всі штрихи з'єднано. Розмітка спирається лише на цю структурну властивість і не враховує ні класу, ні результату класифікації. Кожне зображення має одну мітку; узгодженість кількох розмітників не вимірювали.</w:t>
+      </w:r>
+    </w:p>
+    <w:p>
+      <w:pPr>
+        <w:spacing w:after="0" w:line="280" w:lineRule="exact"/>
+        <w:ind w:firstLine="567"/>
+        <w:jc w:val="both"/>
+      </w:pPr>
+      <w:r>
+        <w:rPr>
+          <w:lang w:val="uk-UA"/>
+        </w:rPr>
+        <w:t xml:space="preserve">Помилкою вважають і віднесення зображення до хибного класу, і випадок, коли не активувався жоден концепт. Точність є часткою правильно розпізнаних зображень. Влучність, повноту й F1 обчислено для кожного класу та усереднено з вагами, пропорційними кількості зображень класу. Для точності та покласових влучності й повноти наведено 95 % довірчі інтервали (ДІ) Вільсона [41].</w:t>
+      </w:r>
+    </w:p>
+    <w:p>
+      <w:pPr>
         <w:spacing w:before="160" w:after="80" w:line="280" w:lineRule="exact"/>
         <w:jc w:val="both"/>
       </w:pPr>
@@ -1160,7 +3006,12 @@
         <w:jc w:val="both"/>
       </w:pPr>
       <w:r>
-        <w:t>Побудовано подання Point–Vector з двома типами вузлів і 13 вибраними ознаками зіставлення. Структурною редукцією за один прохід колекцією з 76 вручну відібраних оригіналів та їхніх аугментацій, разом 805 зразків, сформовано 13 концептів-атракторів для 10 класів цифр. Концепти містять від 3 до 12 вузлів, на кожен подано від 3 до 9 оригіналів (табл. 1).</w:t>
+        <w:rPr/>
+        <w:t xml:space="preserve">Побудовано подання Point–Vector з двома типами вузлів і 13 вибраними ознаками зіставлення. Структурною редукцією за один прохід колекцією з 76 вручну відібраних оригіналів та їхніх аугментацій, разом 805 зразків, сформовано 13 концептів-атракторів для 10 класів цифр. Концепти містять від 3 до 12 вузлів, на кожен подано від 3 до 9 оригіналів (табл.</w:t>
+      </w:r>
+      <w:r>
+        <w:rPr/>
+        <w:t xml:space="preserve"> 2).</w:t>
       </w:r>
     </w:p>
     <w:p>
@@ -1174,7 +3025,15 @@
           <w:i/>
           <w:sz w:val="18"/>
         </w:rPr>
-        <w:t>Таблиця 1 – Алфавіт концептів: кількість вузлів і оригіналів</w:t>
+        <w:t xml:space="preserve">Таблиця 2</w:t>
+      </w:r>
+      <w:r>
+        <w:rPr>
+          <w:b/>
+          <w:i/>
+          <w:sz w:val="18"/>
+        </w:rPr>
+        <w:t xml:space="preserve"> – Алфавіт концептів: кількість вузлів і оригіналів</w:t>
       </w:r>
     </w:p>
     <w:tbl>
@@ -1921,7 +3780,10 @@
         <w:jc w:val="both"/>
       </w:pPr>
       <w:r>
-        <w:t>Повноту контуру розмічено вручну: кожне тестове зображення позначили як повне або неповне, до оцінювання допустили лише повні. Детальнішого протоколу розмітки не існує, а його незалежність від результатів класифікації не перевірено.</w:t>
+        <w:rPr>
+          <w:lang w:val="uk-UA"/>
+        </w:rPr>
+        <w:t xml:space="preserve">Повноту контуру розмічено вручну за протоколом підрозділу 2.4; до оцінювання допустили лише повні зображення.</w:t>
       </w:r>
     </w:p>
     <w:p>
@@ -1941,7 +3803,16 @@
         <w:jc w:val="both"/>
       </w:pPr>
       <w:r>
-        <w:t>Частка збережених зображень нерівномірна за класами (табл. 2): від 582/974 = 59,75 % для цифри 8 до 1 129/1 135 = 99,47 % для цифри 1.</w:t>
+        <w:rPr/>
+        <w:t xml:space="preserve">Частка збережених зображень нерівномірна за класами (табл. </w:t>
+      </w:r>
+      <w:r>
+        <w:rPr/>
+        <w:t xml:space="preserve">3)</w:t>
+      </w:r>
+      <w:r>
+        <w:rPr/>
+        <w:t xml:space="preserve">: від 582/974 = 59,75 % для цифри 8 до 1 129/1 135 = 99,47 % для цифри 1.</w:t>
       </w:r>
     </w:p>
     <w:p>
@@ -1955,7 +3826,15 @@
           <w:i/>
           <w:sz w:val="18"/>
         </w:rPr>
-        <w:t>Таблиця 2 – Частка зображень MNIST, збережених після ручного фільтра повноти контуру</w:t>
+        <w:t xml:space="preserve">Таблиця 3</w:t>
+      </w:r>
+      <w:r>
+        <w:rPr>
+          <w:b/>
+          <w:i/>
+          <w:sz w:val="18"/>
+        </w:rPr>
+        <w:t xml:space="preserve"> – Частка зображень MNIST, збережених після ручного фільтра повноти контуру</w:t>
       </w:r>
     </w:p>
     <w:tbl>
@@ -2602,7 +4481,16 @@
         <w:jc w:val="both"/>
       </w:pPr>
       <w:r>
-        <w:t>Точність класифікації становить 91,13 %. Влучність 91,92 %, повнота 91,13 % і F1 91,34 % є середніми, зваженими за кількістю зображень класу.</w:t>
+        <w:rPr/>
+        <w:t xml:space="preserve">Точність класифікації становить 91,13 %</w:t>
+      </w:r>
+      <w:r>
+        <w:rPr/>
+        <w:t xml:space="preserve"> (95 % ДІ 90,52–91,71 %)</w:t>
+      </w:r>
+      <w:r>
+        <w:rPr/>
+        <w:t xml:space="preserve">. Влучність 91,92 %, повнота 91,13 % і F1 91,34 % є середніми, зваженими за кількістю зображень класу.</w:t>
       </w:r>
     </w:p>
     <w:p>
@@ -2612,7 +4500,16 @@
         <w:jc w:val="both"/>
       </w:pPr>
       <w:r>
-        <w:t xml:space="preserve">Показники за класами мають значно більший розкид, ніж загальні (табл. 3, рис. 2). Найвищу влучність мають класи 0 (99,87 %) і 8 (98,74 %): концепти цих цифр майже не притягують зображень інших класів. Найнижча влучність у класів 7 (82,01 %) і 6 (84,88 %): їхні концепти, навпаки, притягують зображення інших </w:t>
+        <w:rPr/>
+        <w:t xml:space="preserve">Показники за класами мають значно більший розкид, ніж загальні (табл. </w:t>
+      </w:r>
+      <w:r>
+        <w:rPr/>
+        <w:t xml:space="preserve">4,</w:t>
+      </w:r>
+      <w:r>
+        <w:rPr/>
+        <w:t xml:space="preserve"> рис. 2). Найвищу влучність мають класи 0 (99,87 %) і 8 (98,74 %): концепти цих цифр майже не притягують зображень інших класів. Найнижча влучність у класів 7 (82,01 %) і 6 (84,88 %): їхні концепти, навпаки, притягують зображення інших </w:t>
       </w:r>
       <w:r>
         <w:lastRenderedPageBreak/>
@@ -2630,7 +4527,15 @@
           <w:i/>
           <w:sz w:val="18"/>
         </w:rPr>
-        <w:t>Таблиця 3 – Покласові показники класифікації</w:t>
+        <w:t xml:space="preserve">Таблиця 4</w:t>
+      </w:r>
+      <w:r>
+        <w:rPr>
+          <w:b/>
+          <w:i/>
+          <w:sz w:val="18"/>
+        </w:rPr>
+        <w:t xml:space="preserve"> – Покласові показники класифікації</w:t>
       </w:r>
     </w:p>
     <w:tbl>
@@ -2641,18 +4546,21 @@
         <w:tblLook w:val="04A0" w:firstRow="1" w:lastRow="0" w:firstColumn="1" w:lastColumn="0" w:noHBand="0" w:noVBand="1"/>
       </w:tblPr>
       <w:tblGrid>
-        <w:gridCol w:w="2409"/>
-        <w:gridCol w:w="2409"/>
-        <w:gridCol w:w="2409"/>
-        <w:gridCol w:w="2409"/>
+        <w:gridCol w:w="1000"/>
+        <w:gridCol w:w="1650"/>
+        <w:gridCol w:w="1950"/>
+        <w:gridCol w:w="1650"/>
+        <w:gridCol w:w="1950"/>
+        <w:gridCol w:w="1438"/>
       </w:tblGrid>
       <w:tr>
         <w:trPr>
+          <w:tblHeader/>
           <w:jc w:val="center"/>
         </w:trPr>
         <w:tc>
           <w:tcPr>
-            <w:tcW w:w="2409" w:type="dxa"/>
+            <w:tcW w:w="1000" w:type="dxa"/>
           </w:tcPr>
           <w:p>
             <w:pPr>
@@ -2662,14 +4570,15 @@
               <w:rPr>
                 <w:b/>
                 <w:sz w:val="18"/>
-              </w:rPr>
-              <w:t>Клас</w:t>
-            </w:r>
-          </w:p>
-        </w:tc>
-        <w:tc>
-          <w:tcPr>
-            <w:tcW w:w="2409" w:type="dxa"/>
+                <w:lang w:val="uk-UA"/>
+              </w:rPr>
+              <w:t xml:space="preserve">Клас</w:t>
+            </w:r>
+          </w:p>
+        </w:tc>
+        <w:tc>
+          <w:tcPr>
+            <w:tcW w:w="1650" w:type="dxa"/>
           </w:tcPr>
           <w:p>
             <w:pPr>
@@ -2679,14 +4588,15 @@
               <w:rPr>
                 <w:b/>
                 <w:sz w:val="18"/>
-              </w:rPr>
-              <w:t>Влучність, %</w:t>
-            </w:r>
-          </w:p>
-        </w:tc>
-        <w:tc>
-          <w:tcPr>
-            <w:tcW w:w="2409" w:type="dxa"/>
+                <w:lang w:val="uk-UA"/>
+              </w:rPr>
+              <w:t xml:space="preserve">Влучність, %</w:t>
+            </w:r>
+          </w:p>
+        </w:tc>
+        <w:tc>
+          <w:tcPr>
+            <w:tcW w:w="1950" w:type="dxa"/>
           </w:tcPr>
           <w:p>
             <w:pPr>
@@ -2696,14 +4606,15 @@
               <w:rPr>
                 <w:b/>
                 <w:sz w:val="18"/>
-              </w:rPr>
-              <w:t>Повнота, %</w:t>
-            </w:r>
-          </w:p>
-        </w:tc>
-        <w:tc>
-          <w:tcPr>
-            <w:tcW w:w="2409" w:type="dxa"/>
+                <w:lang w:val="uk-UA"/>
+              </w:rPr>
+              <w:t xml:space="preserve">95 % ДІ влучності</w:t>
+            </w:r>
+          </w:p>
+        </w:tc>
+        <w:tc>
+          <w:tcPr>
+            <w:tcW w:w="1650" w:type="dxa"/>
           </w:tcPr>
           <w:p>
             <w:pPr>
@@ -2713,8 +4624,45 @@
               <w:rPr>
                 <w:b/>
                 <w:sz w:val="18"/>
-              </w:rPr>
-              <w:t>F1, %</w:t>
+                <w:lang w:val="uk-UA"/>
+              </w:rPr>
+              <w:t xml:space="preserve">Повнота, %</w:t>
+            </w:r>
+          </w:p>
+        </w:tc>
+        <w:tc>
+          <w:tcPr>
+            <w:tcW w:w="1950" w:type="dxa"/>
+          </w:tcPr>
+          <w:p>
+            <w:pPr>
+              <w:jc w:val="center"/>
+            </w:pPr>
+            <w:r>
+              <w:rPr>
+                <w:b/>
+                <w:sz w:val="18"/>
+                <w:lang w:val="uk-UA"/>
+              </w:rPr>
+              <w:t xml:space="preserve">95 % ДІ повноти</w:t>
+            </w:r>
+          </w:p>
+        </w:tc>
+        <w:tc>
+          <w:tcPr>
+            <w:tcW w:w="1438" w:type="dxa"/>
+          </w:tcPr>
+          <w:p>
+            <w:pPr>
+              <w:jc w:val="center"/>
+            </w:pPr>
+            <w:r>
+              <w:rPr>
+                <w:b/>
+                <w:sz w:val="18"/>
+                <w:lang w:val="uk-UA"/>
+              </w:rPr>
+              <w:t xml:space="preserve">F1, %</w:t>
             </w:r>
           </w:p>
         </w:tc>
@@ -2725,20 +4673,21 @@
         </w:trPr>
         <w:tc>
           <w:tcPr>
-            <w:tcW w:w="2409" w:type="dxa"/>
-          </w:tcPr>
-          <w:p>
-            <w:r>
-              <w:rPr>
-                <w:sz w:val="18"/>
-              </w:rPr>
-              <w:t>0</w:t>
-            </w:r>
-          </w:p>
-        </w:tc>
-        <w:tc>
-          <w:tcPr>
-            <w:tcW w:w="2409" w:type="dxa"/>
+            <w:tcW w:w="1000" w:type="dxa"/>
+          </w:tcPr>
+          <w:p>
+            <w:r>
+              <w:rPr>
+                <w:sz w:val="18"/>
+                <w:lang w:val="uk-UA"/>
+              </w:rPr>
+              <w:t xml:space="preserve">0</w:t>
+            </w:r>
+          </w:p>
+        </w:tc>
+        <w:tc>
+          <w:tcPr>
+            <w:tcW w:w="1650" w:type="dxa"/>
           </w:tcPr>
           <w:p>
             <w:pPr>
@@ -2747,14 +4696,15 @@
             <w:r>
               <w:rPr>
                 <w:sz w:val="18"/>
-              </w:rPr>
-              <w:t>99,87</w:t>
-            </w:r>
-          </w:p>
-        </w:tc>
-        <w:tc>
-          <w:tcPr>
-            <w:tcW w:w="2409" w:type="dxa"/>
+                <w:lang w:val="uk-UA"/>
+              </w:rPr>
+              <w:t xml:space="preserve">99,87</w:t>
+            </w:r>
+          </w:p>
+        </w:tc>
+        <w:tc>
+          <w:tcPr>
+            <w:tcW w:w="1950" w:type="dxa"/>
           </w:tcPr>
           <w:p>
             <w:pPr>
@@ -2763,14 +4713,15 @@
             <w:r>
               <w:rPr>
                 <w:sz w:val="18"/>
-              </w:rPr>
-              <w:t>91,93</w:t>
-            </w:r>
-          </w:p>
-        </w:tc>
-        <w:tc>
-          <w:tcPr>
-            <w:tcW w:w="2409" w:type="dxa"/>
+                <w:lang w:val="uk-UA"/>
+              </w:rPr>
+              <w:t xml:space="preserve">99,26–99,98</w:t>
+            </w:r>
+          </w:p>
+        </w:tc>
+        <w:tc>
+          <w:tcPr>
+            <w:tcW w:w="1650" w:type="dxa"/>
           </w:tcPr>
           <w:p>
             <w:pPr>
@@ -2779,8 +4730,43 @@
             <w:r>
               <w:rPr>
                 <w:sz w:val="18"/>
-              </w:rPr>
-              <w:t>95,73</w:t>
+                <w:lang w:val="uk-UA"/>
+              </w:rPr>
+              <w:t xml:space="preserve">91,93</w:t>
+            </w:r>
+          </w:p>
+        </w:tc>
+        <w:tc>
+          <w:tcPr>
+            <w:tcW w:w="1950" w:type="dxa"/>
+          </w:tcPr>
+          <w:p>
+            <w:pPr>
+              <w:jc w:val="center"/>
+            </w:pPr>
+            <w:r>
+              <w:rPr>
+                <w:sz w:val="18"/>
+                <w:lang w:val="uk-UA"/>
+              </w:rPr>
+              <w:t xml:space="preserve">89,88–93,59</w:t>
+            </w:r>
+          </w:p>
+        </w:tc>
+        <w:tc>
+          <w:tcPr>
+            <w:tcW w:w="1438" w:type="dxa"/>
+          </w:tcPr>
+          <w:p>
+            <w:pPr>
+              <w:jc w:val="center"/>
+            </w:pPr>
+            <w:r>
+              <w:rPr>
+                <w:sz w:val="18"/>
+                <w:lang w:val="uk-UA"/>
+              </w:rPr>
+              <w:t xml:space="preserve">95,73</w:t>
             </w:r>
           </w:p>
         </w:tc>
@@ -2791,20 +4777,21 @@
         </w:trPr>
         <w:tc>
           <w:tcPr>
-            <w:tcW w:w="2409" w:type="dxa"/>
-          </w:tcPr>
-          <w:p>
-            <w:r>
-              <w:rPr>
-                <w:sz w:val="18"/>
-              </w:rPr>
-              <w:t>1</w:t>
-            </w:r>
-          </w:p>
-        </w:tc>
-        <w:tc>
-          <w:tcPr>
-            <w:tcW w:w="2409" w:type="dxa"/>
+            <w:tcW w:w="1000" w:type="dxa"/>
+          </w:tcPr>
+          <w:p>
+            <w:r>
+              <w:rPr>
+                <w:sz w:val="18"/>
+                <w:lang w:val="uk-UA"/>
+              </w:rPr>
+              <w:t xml:space="preserve">1</w:t>
+            </w:r>
+          </w:p>
+        </w:tc>
+        <w:tc>
+          <w:tcPr>
+            <w:tcW w:w="1650" w:type="dxa"/>
           </w:tcPr>
           <w:p>
             <w:pPr>
@@ -2813,14 +4800,15 @@
             <w:r>
               <w:rPr>
                 <w:sz w:val="18"/>
-              </w:rPr>
-              <w:t>93,69</w:t>
-            </w:r>
-          </w:p>
-        </w:tc>
-        <w:tc>
-          <w:tcPr>
-            <w:tcW w:w="2409" w:type="dxa"/>
+                <w:lang w:val="uk-UA"/>
+              </w:rPr>
+              <w:t xml:space="preserve">93,69</w:t>
+            </w:r>
+          </w:p>
+        </w:tc>
+        <w:tc>
+          <w:tcPr>
+            <w:tcW w:w="1950" w:type="dxa"/>
           </w:tcPr>
           <w:p>
             <w:pPr>
@@ -2829,14 +4817,15 @@
             <w:r>
               <w:rPr>
                 <w:sz w:val="18"/>
-              </w:rPr>
-              <w:t>96,52</w:t>
-            </w:r>
-          </w:p>
-        </w:tc>
-        <w:tc>
-          <w:tcPr>
-            <w:tcW w:w="2409" w:type="dxa"/>
+                <w:lang w:val="uk-UA"/>
+              </w:rPr>
+              <w:t xml:space="preserve">92,13–94,95</w:t>
+            </w:r>
+          </w:p>
+        </w:tc>
+        <w:tc>
+          <w:tcPr>
+            <w:tcW w:w="1650" w:type="dxa"/>
           </w:tcPr>
           <w:p>
             <w:pPr>
@@ -2845,8 +4834,43 @@
             <w:r>
               <w:rPr>
                 <w:sz w:val="18"/>
-              </w:rPr>
-              <w:t>95,08</w:t>
+                <w:lang w:val="uk-UA"/>
+              </w:rPr>
+              <w:t xml:space="preserve">96,52</w:t>
+            </w:r>
+          </w:p>
+        </w:tc>
+        <w:tc>
+          <w:tcPr>
+            <w:tcW w:w="1950" w:type="dxa"/>
+          </w:tcPr>
+          <w:p>
+            <w:pPr>
+              <w:jc w:val="center"/>
+            </w:pPr>
+            <w:r>
+              <w:rPr>
+                <w:sz w:val="18"/>
+                <w:lang w:val="uk-UA"/>
+              </w:rPr>
+              <w:t xml:space="preserve">95,28–97,45</w:t>
+            </w:r>
+          </w:p>
+        </w:tc>
+        <w:tc>
+          <w:tcPr>
+            <w:tcW w:w="1438" w:type="dxa"/>
+          </w:tcPr>
+          <w:p>
+            <w:pPr>
+              <w:jc w:val="center"/>
+            </w:pPr>
+            <w:r>
+              <w:rPr>
+                <w:sz w:val="18"/>
+                <w:lang w:val="uk-UA"/>
+              </w:rPr>
+              <w:t xml:space="preserve">95,08</w:t>
             </w:r>
           </w:p>
         </w:tc>
@@ -2857,20 +4881,21 @@
         </w:trPr>
         <w:tc>
           <w:tcPr>
-            <w:tcW w:w="2409" w:type="dxa"/>
-          </w:tcPr>
-          <w:p>
-            <w:r>
-              <w:rPr>
-                <w:sz w:val="18"/>
-              </w:rPr>
-              <w:t>2</w:t>
-            </w:r>
-          </w:p>
-        </w:tc>
-        <w:tc>
-          <w:tcPr>
-            <w:tcW w:w="2409" w:type="dxa"/>
+            <w:tcW w:w="1000" w:type="dxa"/>
+          </w:tcPr>
+          <w:p>
+            <w:r>
+              <w:rPr>
+                <w:sz w:val="18"/>
+                <w:lang w:val="uk-UA"/>
+              </w:rPr>
+              <w:t xml:space="preserve">2</w:t>
+            </w:r>
+          </w:p>
+        </w:tc>
+        <w:tc>
+          <w:tcPr>
+            <w:tcW w:w="1650" w:type="dxa"/>
           </w:tcPr>
           <w:p>
             <w:pPr>
@@ -2879,14 +4904,15 @@
             <w:r>
               <w:rPr>
                 <w:sz w:val="18"/>
-              </w:rPr>
-              <w:t>92,28</w:t>
-            </w:r>
-          </w:p>
-        </w:tc>
-        <w:tc>
-          <w:tcPr>
-            <w:tcW w:w="2409" w:type="dxa"/>
+                <w:lang w:val="uk-UA"/>
+              </w:rPr>
+              <w:t xml:space="preserve">92,28</w:t>
+            </w:r>
+          </w:p>
+        </w:tc>
+        <w:tc>
+          <w:tcPr>
+            <w:tcW w:w="1950" w:type="dxa"/>
           </w:tcPr>
           <w:p>
             <w:pPr>
@@ -2895,14 +4921,15 @@
             <w:r>
               <w:rPr>
                 <w:sz w:val="18"/>
-              </w:rPr>
-              <w:t>77,59</w:t>
-            </w:r>
-          </w:p>
-        </w:tc>
-        <w:tc>
-          <w:tcPr>
-            <w:tcW w:w="2409" w:type="dxa"/>
+                <w:lang w:val="uk-UA"/>
+              </w:rPr>
+              <w:t xml:space="preserve">90,22–93,93</w:t>
+            </w:r>
+          </w:p>
+        </w:tc>
+        <w:tc>
+          <w:tcPr>
+            <w:tcW w:w="1650" w:type="dxa"/>
           </w:tcPr>
           <w:p>
             <w:pPr>
@@ -2911,8 +4938,43 @@
             <w:r>
               <w:rPr>
                 <w:sz w:val="18"/>
-              </w:rPr>
-              <w:t>84,30</w:t>
+                <w:lang w:val="uk-UA"/>
+              </w:rPr>
+              <w:t xml:space="preserve">77,59</w:t>
+            </w:r>
+          </w:p>
+        </w:tc>
+        <w:tc>
+          <w:tcPr>
+            <w:tcW w:w="1950" w:type="dxa"/>
+          </w:tcPr>
+          <w:p>
+            <w:pPr>
+              <w:jc w:val="center"/>
+            </w:pPr>
+            <w:r>
+              <w:rPr>
+                <w:sz w:val="18"/>
+                <w:lang w:val="uk-UA"/>
+              </w:rPr>
+              <w:t xml:space="preserve">74,84–80,12</w:t>
+            </w:r>
+          </w:p>
+        </w:tc>
+        <w:tc>
+          <w:tcPr>
+            <w:tcW w:w="1438" w:type="dxa"/>
+          </w:tcPr>
+          <w:p>
+            <w:pPr>
+              <w:jc w:val="center"/>
+            </w:pPr>
+            <w:r>
+              <w:rPr>
+                <w:sz w:val="18"/>
+                <w:lang w:val="uk-UA"/>
+              </w:rPr>
+              <w:t xml:space="preserve">84,30</w:t>
             </w:r>
           </w:p>
         </w:tc>
@@ -2923,20 +4985,21 @@
         </w:trPr>
         <w:tc>
           <w:tcPr>
-            <w:tcW w:w="2409" w:type="dxa"/>
-          </w:tcPr>
-          <w:p>
-            <w:r>
-              <w:rPr>
-                <w:sz w:val="18"/>
-              </w:rPr>
-              <w:t>3</w:t>
-            </w:r>
-          </w:p>
-        </w:tc>
-        <w:tc>
-          <w:tcPr>
-            <w:tcW w:w="2409" w:type="dxa"/>
+            <w:tcW w:w="1000" w:type="dxa"/>
+          </w:tcPr>
+          <w:p>
+            <w:r>
+              <w:rPr>
+                <w:sz w:val="18"/>
+                <w:lang w:val="uk-UA"/>
+              </w:rPr>
+              <w:t xml:space="preserve">3</w:t>
+            </w:r>
+          </w:p>
+        </w:tc>
+        <w:tc>
+          <w:tcPr>
+            <w:tcW w:w="1650" w:type="dxa"/>
           </w:tcPr>
           <w:p>
             <w:pPr>
@@ -2945,14 +5008,15 @@
             <w:r>
               <w:rPr>
                 <w:sz w:val="18"/>
-              </w:rPr>
-              <w:t>91,78</w:t>
-            </w:r>
-          </w:p>
-        </w:tc>
-        <w:tc>
-          <w:tcPr>
-            <w:tcW w:w="2409" w:type="dxa"/>
+                <w:lang w:val="uk-UA"/>
+              </w:rPr>
+              <w:t xml:space="preserve">91,78</w:t>
+            </w:r>
+          </w:p>
+        </w:tc>
+        <w:tc>
+          <w:tcPr>
+            <w:tcW w:w="1950" w:type="dxa"/>
           </w:tcPr>
           <w:p>
             <w:pPr>
@@ -2961,14 +5025,15 @@
             <w:r>
               <w:rPr>
                 <w:sz w:val="18"/>
-              </w:rPr>
-              <w:t>95,76</w:t>
-            </w:r>
-          </w:p>
-        </w:tc>
-        <w:tc>
-          <w:tcPr>
-            <w:tcW w:w="2409" w:type="dxa"/>
+                <w:lang w:val="uk-UA"/>
+              </w:rPr>
+              <w:t xml:space="preserve">89,93–93,32</w:t>
+            </w:r>
+          </w:p>
+        </w:tc>
+        <w:tc>
+          <w:tcPr>
+            <w:tcW w:w="1650" w:type="dxa"/>
           </w:tcPr>
           <w:p>
             <w:pPr>
@@ -2977,8 +5042,43 @@
             <w:r>
               <w:rPr>
                 <w:sz w:val="18"/>
-              </w:rPr>
-              <w:t>93,73</w:t>
+                <w:lang w:val="uk-UA"/>
+              </w:rPr>
+              <w:t xml:space="preserve">95,76</w:t>
+            </w:r>
+          </w:p>
+        </w:tc>
+        <w:tc>
+          <w:tcPr>
+            <w:tcW w:w="1950" w:type="dxa"/>
+          </w:tcPr>
+          <w:p>
+            <w:pPr>
+              <w:jc w:val="center"/>
+            </w:pPr>
+            <w:r>
+              <w:rPr>
+                <w:sz w:val="18"/>
+                <w:lang w:val="uk-UA"/>
+              </w:rPr>
+              <w:t xml:space="preserve">94,30–96,86</w:t>
+            </w:r>
+          </w:p>
+        </w:tc>
+        <w:tc>
+          <w:tcPr>
+            <w:tcW w:w="1438" w:type="dxa"/>
+          </w:tcPr>
+          <w:p>
+            <w:pPr>
+              <w:jc w:val="center"/>
+            </w:pPr>
+            <w:r>
+              <w:rPr>
+                <w:sz w:val="18"/>
+                <w:lang w:val="uk-UA"/>
+              </w:rPr>
+              <w:t xml:space="preserve">93,73</w:t>
             </w:r>
           </w:p>
         </w:tc>
@@ -2989,20 +5089,21 @@
         </w:trPr>
         <w:tc>
           <w:tcPr>
-            <w:tcW w:w="2409" w:type="dxa"/>
-          </w:tcPr>
-          <w:p>
-            <w:r>
-              <w:rPr>
-                <w:sz w:val="18"/>
-              </w:rPr>
-              <w:t>4</w:t>
-            </w:r>
-          </w:p>
-        </w:tc>
-        <w:tc>
-          <w:tcPr>
-            <w:tcW w:w="2409" w:type="dxa"/>
+            <w:tcW w:w="1000" w:type="dxa"/>
+          </w:tcPr>
+          <w:p>
+            <w:r>
+              <w:rPr>
+                <w:sz w:val="18"/>
+                <w:lang w:val="uk-UA"/>
+              </w:rPr>
+              <w:t xml:space="preserve">4</w:t>
+            </w:r>
+          </w:p>
+        </w:tc>
+        <w:tc>
+          <w:tcPr>
+            <w:tcW w:w="1650" w:type="dxa"/>
           </w:tcPr>
           <w:p>
             <w:pPr>
@@ -3011,14 +5112,15 @@
             <w:r>
               <w:rPr>
                 <w:sz w:val="18"/>
-              </w:rPr>
-              <w:t>92,15</w:t>
-            </w:r>
-          </w:p>
-        </w:tc>
-        <w:tc>
-          <w:tcPr>
-            <w:tcW w:w="2409" w:type="dxa"/>
+                <w:lang w:val="uk-UA"/>
+              </w:rPr>
+              <w:t xml:space="preserve">92,15</w:t>
+            </w:r>
+          </w:p>
+        </w:tc>
+        <w:tc>
+          <w:tcPr>
+            <w:tcW w:w="1950" w:type="dxa"/>
           </w:tcPr>
           <w:p>
             <w:pPr>
@@ -3027,14 +5129,15 @@
             <w:r>
               <w:rPr>
                 <w:sz w:val="18"/>
-              </w:rPr>
-              <w:t>84,00</w:t>
-            </w:r>
-          </w:p>
-        </w:tc>
-        <w:tc>
-          <w:tcPr>
-            <w:tcW w:w="2409" w:type="dxa"/>
+                <w:lang w:val="uk-UA"/>
+              </w:rPr>
+              <w:t xml:space="preserve">90,16–93,76</w:t>
+            </w:r>
+          </w:p>
+        </w:tc>
+        <w:tc>
+          <w:tcPr>
+            <w:tcW w:w="1650" w:type="dxa"/>
           </w:tcPr>
           <w:p>
             <w:pPr>
@@ -3043,8 +5146,43 @@
             <w:r>
               <w:rPr>
                 <w:sz w:val="18"/>
-              </w:rPr>
-              <w:t>87,89</w:t>
+                <w:lang w:val="uk-UA"/>
+              </w:rPr>
+              <w:t xml:space="preserve">84,00</w:t>
+            </w:r>
+          </w:p>
+        </w:tc>
+        <w:tc>
+          <w:tcPr>
+            <w:tcW w:w="1950" w:type="dxa"/>
+          </w:tcPr>
+          <w:p>
+            <w:pPr>
+              <w:jc w:val="center"/>
+            </w:pPr>
+            <w:r>
+              <w:rPr>
+                <w:sz w:val="18"/>
+                <w:lang w:val="uk-UA"/>
+              </w:rPr>
+              <w:t xml:space="preserve">81,53–86,19</w:t>
+            </w:r>
+          </w:p>
+        </w:tc>
+        <w:tc>
+          <w:tcPr>
+            <w:tcW w:w="1438" w:type="dxa"/>
+          </w:tcPr>
+          <w:p>
+            <w:pPr>
+              <w:jc w:val="center"/>
+            </w:pPr>
+            <w:r>
+              <w:rPr>
+                <w:sz w:val="18"/>
+                <w:lang w:val="uk-UA"/>
+              </w:rPr>
+              <w:t xml:space="preserve">87,89</w:t>
             </w:r>
           </w:p>
         </w:tc>
@@ -3055,20 +5193,21 @@
         </w:trPr>
         <w:tc>
           <w:tcPr>
-            <w:tcW w:w="2409" w:type="dxa"/>
-          </w:tcPr>
-          <w:p>
-            <w:r>
-              <w:rPr>
-                <w:sz w:val="18"/>
-              </w:rPr>
-              <w:t>5</w:t>
-            </w:r>
-          </w:p>
-        </w:tc>
-        <w:tc>
-          <w:tcPr>
-            <w:tcW w:w="2409" w:type="dxa"/>
+            <w:tcW w:w="1000" w:type="dxa"/>
+          </w:tcPr>
+          <w:p>
+            <w:r>
+              <w:rPr>
+                <w:sz w:val="18"/>
+                <w:lang w:val="uk-UA"/>
+              </w:rPr>
+              <w:t xml:space="preserve">5</w:t>
+            </w:r>
+          </w:p>
+        </w:tc>
+        <w:tc>
+          <w:tcPr>
+            <w:tcW w:w="1650" w:type="dxa"/>
           </w:tcPr>
           <w:p>
             <w:pPr>
@@ -3077,14 +5216,15 @@
             <w:r>
               <w:rPr>
                 <w:sz w:val="18"/>
-              </w:rPr>
-              <w:t>93,97</w:t>
-            </w:r>
-          </w:p>
-        </w:tc>
-        <w:tc>
-          <w:tcPr>
-            <w:tcW w:w="2409" w:type="dxa"/>
+                <w:lang w:val="uk-UA"/>
+              </w:rPr>
+              <w:t xml:space="preserve">93,97</w:t>
+            </w:r>
+          </w:p>
+        </w:tc>
+        <w:tc>
+          <w:tcPr>
+            <w:tcW w:w="1950" w:type="dxa"/>
           </w:tcPr>
           <w:p>
             <w:pPr>
@@ -3093,14 +5233,15 @@
             <w:r>
               <w:rPr>
                 <w:sz w:val="18"/>
-              </w:rPr>
-              <w:t>91,96</w:t>
-            </w:r>
-          </w:p>
-        </w:tc>
-        <w:tc>
-          <w:tcPr>
-            <w:tcW w:w="2409" w:type="dxa"/>
+                <w:lang w:val="uk-UA"/>
+              </w:rPr>
+              <w:t xml:space="preserve">92,07–95,43</w:t>
+            </w:r>
+          </w:p>
+        </w:tc>
+        <w:tc>
+          <w:tcPr>
+            <w:tcW w:w="1650" w:type="dxa"/>
           </w:tcPr>
           <w:p>
             <w:pPr>
@@ -3109,8 +5250,43 @@
             <w:r>
               <w:rPr>
                 <w:sz w:val="18"/>
-              </w:rPr>
-              <w:t>92,95</w:t>
+                <w:lang w:val="uk-UA"/>
+              </w:rPr>
+              <w:t xml:space="preserve">91,96</w:t>
+            </w:r>
+          </w:p>
+        </w:tc>
+        <w:tc>
+          <w:tcPr>
+            <w:tcW w:w="1950" w:type="dxa"/>
+          </w:tcPr>
+          <w:p>
+            <w:pPr>
+              <w:jc w:val="center"/>
+            </w:pPr>
+            <w:r>
+              <w:rPr>
+                <w:sz w:val="18"/>
+                <w:lang w:val="uk-UA"/>
+              </w:rPr>
+              <w:t xml:space="preserve">89,86–93,65</w:t>
+            </w:r>
+          </w:p>
+        </w:tc>
+        <w:tc>
+          <w:tcPr>
+            <w:tcW w:w="1438" w:type="dxa"/>
+          </w:tcPr>
+          <w:p>
+            <w:pPr>
+              <w:jc w:val="center"/>
+            </w:pPr>
+            <w:r>
+              <w:rPr>
+                <w:sz w:val="18"/>
+                <w:lang w:val="uk-UA"/>
+              </w:rPr>
+              <w:t xml:space="preserve">92,95</w:t>
             </w:r>
           </w:p>
         </w:tc>
@@ -3121,20 +5297,21 @@
         </w:trPr>
         <w:tc>
           <w:tcPr>
-            <w:tcW w:w="2409" w:type="dxa"/>
-          </w:tcPr>
-          <w:p>
-            <w:r>
-              <w:rPr>
-                <w:sz w:val="18"/>
-              </w:rPr>
-              <w:t>6</w:t>
-            </w:r>
-          </w:p>
-        </w:tc>
-        <w:tc>
-          <w:tcPr>
-            <w:tcW w:w="2409" w:type="dxa"/>
+            <w:tcW w:w="1000" w:type="dxa"/>
+          </w:tcPr>
+          <w:p>
+            <w:r>
+              <w:rPr>
+                <w:sz w:val="18"/>
+                <w:lang w:val="uk-UA"/>
+              </w:rPr>
+              <w:t xml:space="preserve">6</w:t>
+            </w:r>
+          </w:p>
+        </w:tc>
+        <w:tc>
+          <w:tcPr>
+            <w:tcW w:w="1650" w:type="dxa"/>
           </w:tcPr>
           <w:p>
             <w:pPr>
@@ -3143,14 +5320,15 @@
             <w:r>
               <w:rPr>
                 <w:sz w:val="18"/>
-              </w:rPr>
-              <w:t>84,88</w:t>
-            </w:r>
-          </w:p>
-        </w:tc>
-        <w:tc>
-          <w:tcPr>
-            <w:tcW w:w="2409" w:type="dxa"/>
+                <w:lang w:val="uk-UA"/>
+              </w:rPr>
+              <w:t xml:space="preserve">84,88</w:t>
+            </w:r>
+          </w:p>
+        </w:tc>
+        <w:tc>
+          <w:tcPr>
+            <w:tcW w:w="1950" w:type="dxa"/>
           </w:tcPr>
           <w:p>
             <w:pPr>
@@ -3159,14 +5337,15 @@
             <w:r>
               <w:rPr>
                 <w:sz w:val="18"/>
-              </w:rPr>
-              <w:t>92,44</w:t>
-            </w:r>
-          </w:p>
-        </w:tc>
-        <w:tc>
-          <w:tcPr>
-            <w:tcW w:w="2409" w:type="dxa"/>
+                <w:lang w:val="uk-UA"/>
+              </w:rPr>
+              <w:t xml:space="preserve">82,25–87,19</w:t>
+            </w:r>
+          </w:p>
+        </w:tc>
+        <w:tc>
+          <w:tcPr>
+            <w:tcW w:w="1650" w:type="dxa"/>
           </w:tcPr>
           <w:p>
             <w:pPr>
@@ -3175,8 +5354,43 @@
             <w:r>
               <w:rPr>
                 <w:sz w:val="18"/>
-              </w:rPr>
-              <w:t>88,50</w:t>
+                <w:lang w:val="uk-UA"/>
+              </w:rPr>
+              <w:t xml:space="preserve">92,44</w:t>
+            </w:r>
+          </w:p>
+        </w:tc>
+        <w:tc>
+          <w:tcPr>
+            <w:tcW w:w="1950" w:type="dxa"/>
+          </w:tcPr>
+          <w:p>
+            <w:pPr>
+              <w:jc w:val="center"/>
+            </w:pPr>
+            <w:r>
+              <w:rPr>
+                <w:sz w:val="18"/>
+                <w:lang w:val="uk-UA"/>
+              </w:rPr>
+              <w:t xml:space="preserve">90,31–94,13</w:t>
+            </w:r>
+          </w:p>
+        </w:tc>
+        <w:tc>
+          <w:tcPr>
+            <w:tcW w:w="1438" w:type="dxa"/>
+          </w:tcPr>
+          <w:p>
+            <w:pPr>
+              <w:jc w:val="center"/>
+            </w:pPr>
+            <w:r>
+              <w:rPr>
+                <w:sz w:val="18"/>
+                <w:lang w:val="uk-UA"/>
+              </w:rPr>
+              <w:t xml:space="preserve">88,50</w:t>
             </w:r>
           </w:p>
         </w:tc>
@@ -3187,20 +5401,21 @@
         </w:trPr>
         <w:tc>
           <w:tcPr>
-            <w:tcW w:w="2409" w:type="dxa"/>
-          </w:tcPr>
-          <w:p>
-            <w:r>
-              <w:rPr>
-                <w:sz w:val="18"/>
-              </w:rPr>
-              <w:t>7</w:t>
-            </w:r>
-          </w:p>
-        </w:tc>
-        <w:tc>
-          <w:tcPr>
-            <w:tcW w:w="2409" w:type="dxa"/>
+            <w:tcW w:w="1000" w:type="dxa"/>
+          </w:tcPr>
+          <w:p>
+            <w:r>
+              <w:rPr>
+                <w:sz w:val="18"/>
+                <w:lang w:val="uk-UA"/>
+              </w:rPr>
+              <w:t xml:space="preserve">7</w:t>
+            </w:r>
+          </w:p>
+        </w:tc>
+        <w:tc>
+          <w:tcPr>
+            <w:tcW w:w="1650" w:type="dxa"/>
           </w:tcPr>
           <w:p>
             <w:pPr>
@@ -3209,14 +5424,15 @@
             <w:r>
               <w:rPr>
                 <w:sz w:val="18"/>
-              </w:rPr>
-              <w:t>82,01</w:t>
-            </w:r>
-          </w:p>
-        </w:tc>
-        <w:tc>
-          <w:tcPr>
-            <w:tcW w:w="2409" w:type="dxa"/>
+                <w:lang w:val="uk-UA"/>
+              </w:rPr>
+              <w:t xml:space="preserve">82,01</w:t>
+            </w:r>
+          </w:p>
+        </w:tc>
+        <w:tc>
+          <w:tcPr>
+            <w:tcW w:w="1950" w:type="dxa"/>
           </w:tcPr>
           <w:p>
             <w:pPr>
@@ -3225,14 +5441,15 @@
             <w:r>
               <w:rPr>
                 <w:sz w:val="18"/>
-              </w:rPr>
-              <w:t>95,15</w:t>
-            </w:r>
-          </w:p>
-        </w:tc>
-        <w:tc>
-          <w:tcPr>
-            <w:tcW w:w="2409" w:type="dxa"/>
+                <w:lang w:val="uk-UA"/>
+              </w:rPr>
+              <w:t xml:space="preserve">79,71–84,10</w:t>
+            </w:r>
+          </w:p>
+        </w:tc>
+        <w:tc>
+          <w:tcPr>
+            <w:tcW w:w="1650" w:type="dxa"/>
           </w:tcPr>
           <w:p>
             <w:pPr>
@@ -3241,8 +5458,43 @@
             <w:r>
               <w:rPr>
                 <w:sz w:val="18"/>
-              </w:rPr>
-              <w:t>88,10</w:t>
+                <w:lang w:val="uk-UA"/>
+              </w:rPr>
+              <w:t xml:space="preserve">95,15</w:t>
+            </w:r>
+          </w:p>
+        </w:tc>
+        <w:tc>
+          <w:tcPr>
+            <w:tcW w:w="1950" w:type="dxa"/>
+          </w:tcPr>
+          <w:p>
+            <w:pPr>
+              <w:jc w:val="center"/>
+            </w:pPr>
+            <w:r>
+              <w:rPr>
+                <w:sz w:val="18"/>
+                <w:lang w:val="uk-UA"/>
+              </w:rPr>
+              <w:t xml:space="preserve">93,65–96,31</w:t>
+            </w:r>
+          </w:p>
+        </w:tc>
+        <w:tc>
+          <w:tcPr>
+            <w:tcW w:w="1438" w:type="dxa"/>
+          </w:tcPr>
+          <w:p>
+            <w:pPr>
+              <w:jc w:val="center"/>
+            </w:pPr>
+            <w:r>
+              <w:rPr>
+                <w:sz w:val="18"/>
+                <w:lang w:val="uk-UA"/>
+              </w:rPr>
+              <w:t xml:space="preserve">88,10</w:t>
             </w:r>
           </w:p>
         </w:tc>
@@ -3253,20 +5505,21 @@
         </w:trPr>
         <w:tc>
           <w:tcPr>
-            <w:tcW w:w="2409" w:type="dxa"/>
-          </w:tcPr>
-          <w:p>
-            <w:r>
-              <w:rPr>
-                <w:sz w:val="18"/>
-              </w:rPr>
-              <w:t>8</w:t>
-            </w:r>
-          </w:p>
-        </w:tc>
-        <w:tc>
-          <w:tcPr>
-            <w:tcW w:w="2409" w:type="dxa"/>
+            <w:tcW w:w="1000" w:type="dxa"/>
+          </w:tcPr>
+          <w:p>
+            <w:r>
+              <w:rPr>
+                <w:sz w:val="18"/>
+                <w:lang w:val="uk-UA"/>
+              </w:rPr>
+              <w:t xml:space="preserve">8</w:t>
+            </w:r>
+          </w:p>
+        </w:tc>
+        <w:tc>
+          <w:tcPr>
+            <w:tcW w:w="1650" w:type="dxa"/>
           </w:tcPr>
           <w:p>
             <w:pPr>
@@ -3275,14 +5528,15 @@
             <w:r>
               <w:rPr>
                 <w:sz w:val="18"/>
-              </w:rPr>
-              <w:t>98,74</w:t>
-            </w:r>
-          </w:p>
-        </w:tc>
-        <w:tc>
-          <w:tcPr>
-            <w:tcW w:w="2409" w:type="dxa"/>
+                <w:lang w:val="uk-UA"/>
+              </w:rPr>
+              <w:t xml:space="preserve">98,74</w:t>
+            </w:r>
+          </w:p>
+        </w:tc>
+        <w:tc>
+          <w:tcPr>
+            <w:tcW w:w="1950" w:type="dxa"/>
           </w:tcPr>
           <w:p>
             <w:pPr>
@@ -3291,14 +5545,15 @@
             <w:r>
               <w:rPr>
                 <w:sz w:val="18"/>
-              </w:rPr>
-              <w:t>94,49</w:t>
-            </w:r>
-          </w:p>
-        </w:tc>
-        <w:tc>
-          <w:tcPr>
-            <w:tcW w:w="2409" w:type="dxa"/>
+                <w:lang w:val="uk-UA"/>
+              </w:rPr>
+              <w:t xml:space="preserve">97,42–99,39</w:t>
+            </w:r>
+          </w:p>
+        </w:tc>
+        <w:tc>
+          <w:tcPr>
+            <w:tcW w:w="1650" w:type="dxa"/>
           </w:tcPr>
           <w:p>
             <w:pPr>
@@ -3307,8 +5562,43 @@
             <w:r>
               <w:rPr>
                 <w:sz w:val="18"/>
-              </w:rPr>
-              <w:t>96,57</w:t>
+                <w:lang w:val="uk-UA"/>
+              </w:rPr>
+              <w:t xml:space="preserve">94,49</w:t>
+            </w:r>
+          </w:p>
+        </w:tc>
+        <w:tc>
+          <w:tcPr>
+            <w:tcW w:w="1950" w:type="dxa"/>
+          </w:tcPr>
+          <w:p>
+            <w:pPr>
+              <w:jc w:val="center"/>
+            </w:pPr>
+            <w:r>
+              <w:rPr>
+                <w:sz w:val="18"/>
+                <w:lang w:val="uk-UA"/>
+              </w:rPr>
+              <w:t xml:space="preserve">92,33–96,07</w:t>
+            </w:r>
+          </w:p>
+        </w:tc>
+        <w:tc>
+          <w:tcPr>
+            <w:tcW w:w="1438" w:type="dxa"/>
+          </w:tcPr>
+          <w:p>
+            <w:pPr>
+              <w:jc w:val="center"/>
+            </w:pPr>
+            <w:r>
+              <w:rPr>
+                <w:sz w:val="18"/>
+                <w:lang w:val="uk-UA"/>
+              </w:rPr>
+              <w:t xml:space="preserve">96,57</w:t>
             </w:r>
           </w:p>
         </w:tc>
@@ -3319,20 +5609,21 @@
         </w:trPr>
         <w:tc>
           <w:tcPr>
-            <w:tcW w:w="2409" w:type="dxa"/>
-          </w:tcPr>
-          <w:p>
-            <w:r>
-              <w:rPr>
-                <w:sz w:val="18"/>
-              </w:rPr>
-              <w:t>9</w:t>
-            </w:r>
-          </w:p>
-        </w:tc>
-        <w:tc>
-          <w:tcPr>
-            <w:tcW w:w="2409" w:type="dxa"/>
+            <w:tcW w:w="1000" w:type="dxa"/>
+          </w:tcPr>
+          <w:p>
+            <w:r>
+              <w:rPr>
+                <w:sz w:val="18"/>
+                <w:lang w:val="uk-UA"/>
+              </w:rPr>
+              <w:t xml:space="preserve">9</w:t>
+            </w:r>
+          </w:p>
+        </w:tc>
+        <w:tc>
+          <w:tcPr>
+            <w:tcW w:w="1650" w:type="dxa"/>
           </w:tcPr>
           <w:p>
             <w:pPr>
@@ -3341,14 +5632,15 @@
             <w:r>
               <w:rPr>
                 <w:sz w:val="18"/>
-              </w:rPr>
-              <w:t>92,85</w:t>
-            </w:r>
-          </w:p>
-        </w:tc>
-        <w:tc>
-          <w:tcPr>
-            <w:tcW w:w="2409" w:type="dxa"/>
+                <w:lang w:val="uk-UA"/>
+              </w:rPr>
+              <w:t xml:space="preserve">92,85</w:t>
+            </w:r>
+          </w:p>
+        </w:tc>
+        <w:tc>
+          <w:tcPr>
+            <w:tcW w:w="1950" w:type="dxa"/>
           </w:tcPr>
           <w:p>
             <w:pPr>
@@ -3357,14 +5649,15 @@
             <w:r>
               <w:rPr>
                 <w:sz w:val="18"/>
-              </w:rPr>
-              <w:t>92,34</w:t>
-            </w:r>
-          </w:p>
-        </w:tc>
-        <w:tc>
-          <w:tcPr>
-            <w:tcW w:w="2409" w:type="dxa"/>
+                <w:lang w:val="uk-UA"/>
+              </w:rPr>
+              <w:t xml:space="preserve">90,74–94,50</w:t>
+            </w:r>
+          </w:p>
+        </w:tc>
+        <w:tc>
+          <w:tcPr>
+            <w:tcW w:w="1650" w:type="dxa"/>
           </w:tcPr>
           <w:p>
             <w:pPr>
@@ -3373,8 +5666,43 @@
             <w:r>
               <w:rPr>
                 <w:sz w:val="18"/>
-              </w:rPr>
-              <w:t>92,59</w:t>
+                <w:lang w:val="uk-UA"/>
+              </w:rPr>
+              <w:t xml:space="preserve">92,34</w:t>
+            </w:r>
+          </w:p>
+        </w:tc>
+        <w:tc>
+          <w:tcPr>
+            <w:tcW w:w="1950" w:type="dxa"/>
+          </w:tcPr>
+          <w:p>
+            <w:pPr>
+              <w:jc w:val="center"/>
+            </w:pPr>
+            <w:r>
+              <w:rPr>
+                <w:sz w:val="18"/>
+                <w:lang w:val="uk-UA"/>
+              </w:rPr>
+              <w:t xml:space="preserve">90,18–94,05</w:t>
+            </w:r>
+          </w:p>
+        </w:tc>
+        <w:tc>
+          <w:tcPr>
+            <w:tcW w:w="1438" w:type="dxa"/>
+          </w:tcPr>
+          <w:p>
+            <w:pPr>
+              <w:jc w:val="center"/>
+            </w:pPr>
+            <w:r>
+              <w:rPr>
+                <w:sz w:val="18"/>
+                <w:lang w:val="uk-UA"/>
+              </w:rPr>
+              <w:t xml:space="preserve">92,59</w:t>
             </w:r>
           </w:p>
         </w:tc>
@@ -3603,7 +5931,16 @@
         <w:jc w:val="both"/>
       </w:pPr>
       <w:r>
-        <w:t>Зображення mnist_test_2_00766 має справжній клас 2, а система віднесла його до класу 7. Рис. 5 показує граф і концепти. Числа в табл. 4 походять з відтворення цього рішення налагоджувальним інструментом за параметрами експерименту; під час самого експерименту поознакових вартостей не записували.</w:t>
+        <w:rPr/>
+        <w:t xml:space="preserve">Зображення mnist_test_2_00766 має справжній клас 2, а система віднесла його до класу 7. Рис. 5 показує граф і концепти. Числа в табл. </w:t>
+      </w:r>
+      <w:r>
+        <w:rPr/>
+        <w:t xml:space="preserve">5</w:t>
+      </w:r>
+      <w:r>
+        <w:rPr/>
+        <w:t xml:space="preserve"> походять з відтворення цього рішення налагоджувальним інструментом за параметрами експерименту; під час самого експерименту поознакових вартостей не записували.</w:t>
       </w:r>
     </w:p>
     <w:p>
@@ -3707,7 +6044,15 @@
           <w:i/>
           <w:sz w:val="18"/>
         </w:rPr>
-        <w:t>Таблиця 4 – Трасування mnist_test_2_00766 за збереженими даними: від операцій GED до оцінки</w:t>
+        <w:t xml:space="preserve">Таблиця 5</w:t>
+      </w:r>
+      <w:r>
+        <w:rPr>
+          <w:b/>
+          <w:i/>
+          <w:sz w:val="18"/>
+        </w:rPr>
+        <w:t xml:space="preserve"> – Трасування mnist_test_2_00766 за збереженими даними: від операцій GED до оцінки</w:t>
       </w:r>
     </w:p>
     <w:tbl>
@@ -3942,8 +6287,424 @@
         <w:jc w:val="both"/>
       </w:pPr>
       <w:r>
-        <w:t>Усі 111 помилок 2→7 відтворено окремо, без фільтра складності, тому значення подібності не збігаються з табл. 4. Концепт 2_1 отримав оцінку в 106 випадках і всі 106 разів програв 7_1; середній розрив подібності без поправки на складність становив 0,1132. У п'яти інших випадках 2_1 відхилено структурно, тому вони не входять до середнього. 2_2 відсікався фільтром складності у 86 випадках, але після зняття фільтра не був структурно допустимим у жодному зі 111.</w:t>
-      </w:r>
+        <w:rPr>
+          <w:lang w:val="uk-UA"/>
+        </w:rPr>
+        <w:t xml:space="preserve">Щоб перевірити, чи цей ланцюг описує не лише одне зображення, усі 111 помилок 2→7 відтворено окремо без фільтра складності, тому значення подібності не збігаються з табл. 5. Результат поетапного трасування наведено в табл. 6. Бінарна маска не містить замкненої петлі у 110 випадках, а граф зображення ациклічний в усіх 111. Концепт 2_2, у якому петля є, не пройшов структурної перевірки в жодному випадку, навіть коли фільтр складності знято. Концепт 2_1 відхилено структурно у п'яти випадках, а в решті 106 він програв 7_1 уже за подібністю, до поправки на складність.</w:t>
+      </w:r>
+    </w:p>
+    <w:p>
+      <w:pPr>
+        <w:keepNext/>
+        <w:spacing w:before="120" w:after="0" w:line="280" w:lineRule="exact"/>
+        <w:jc w:val="center"/>
+      </w:pPr>
+      <w:r>
+        <w:rPr>
+          <w:b/>
+          <w:i/>
+          <w:sz w:val="18"/>
+          <w:lang w:val="uk-UA"/>
+        </w:rPr>
+        <w:t xml:space="preserve">Таблиця 6 – Поетапне трасування 111 помилок 2→7 за збереженими даними</w:t>
+      </w:r>
+    </w:p>
+    <w:tbl>
+      <w:tblPr>
+        <w:tblStyle w:val="aff0"/>
+        <w:tblW w:w="0" w:type="auto"/>
+        <w:jc w:val="center"/>
+        <w:tblLook w:val="04A0" w:firstRow="1" w:lastRow="0" w:firstColumn="1" w:lastColumn="0" w:noHBand="0" w:noVBand="1"/>
+      </w:tblPr>
+      <w:tblGrid>
+        <w:gridCol w:w="3000"/>
+        <w:gridCol w:w="4638"/>
+        <w:gridCol w:w="2000"/>
+      </w:tblGrid>
+      <w:tr>
+        <w:trPr>
+          <w:tblHeader/>
+          <w:jc w:val="center"/>
+        </w:trPr>
+        <w:tc>
+          <w:tcPr>
+            <w:tcW w:w="3000" w:type="dxa"/>
+          </w:tcPr>
+          <w:p>
+            <w:pPr>
+              <w:jc w:val="center"/>
+            </w:pPr>
+            <w:r>
+              <w:rPr>
+                <w:b/>
+                <w:sz w:val="18"/>
+                <w:lang w:val="uk-UA"/>
+              </w:rPr>
+              <w:t xml:space="preserve">Етап</w:t>
+            </w:r>
+          </w:p>
+        </w:tc>
+        <w:tc>
+          <w:tcPr>
+            <w:tcW w:w="4638" w:type="dxa"/>
+          </w:tcPr>
+          <w:p>
+            <w:pPr>
+              <w:jc w:val="center"/>
+            </w:pPr>
+            <w:r>
+              <w:rPr>
+                <w:b/>
+                <w:sz w:val="18"/>
+                <w:lang w:val="uk-UA"/>
+              </w:rPr>
+              <w:t xml:space="preserve">Зафіксовано</w:t>
+            </w:r>
+          </w:p>
+        </w:tc>
+        <w:tc>
+          <w:tcPr>
+            <w:tcW w:w="2000" w:type="dxa"/>
+          </w:tcPr>
+          <w:p>
+            <w:pPr>
+              <w:jc w:val="center"/>
+            </w:pPr>
+            <w:r>
+              <w:rPr>
+                <w:b/>
+                <w:sz w:val="18"/>
+                <w:lang w:val="uk-UA"/>
+              </w:rPr>
+              <w:t xml:space="preserve">Випадків</w:t>
+            </w:r>
+          </w:p>
+        </w:tc>
+      </w:tr>
+      <w:tr>
+        <w:trPr>
+          <w:jc w:val="center"/>
+        </w:trPr>
+        <w:tc>
+          <w:tcPr>
+            <w:tcW w:w="3000" w:type="dxa"/>
+          </w:tcPr>
+          <w:p>
+            <w:r>
+              <w:rPr>
+                <w:sz w:val="18"/>
+                <w:lang w:val="uk-UA"/>
+              </w:rPr>
+              <w:t xml:space="preserve">Бінаризація</w:t>
+            </w:r>
+          </w:p>
+        </w:tc>
+        <w:tc>
+          <w:tcPr>
+            <w:tcW w:w="4638" w:type="dxa"/>
+          </w:tcPr>
+          <w:p>
+            <w:pPr>
+              <w:jc w:val="center"/>
+            </w:pPr>
+            <w:r>
+              <w:rPr>
+                <w:sz w:val="18"/>
+                <w:lang w:val="uk-UA"/>
+              </w:rPr>
+              <w:t xml:space="preserve">бінарна маска не містить замкненої петлі</w:t>
+            </w:r>
+          </w:p>
+        </w:tc>
+        <w:tc>
+          <w:tcPr>
+            <w:tcW w:w="2000" w:type="dxa"/>
+          </w:tcPr>
+          <w:p>
+            <w:pPr>
+              <w:jc w:val="center"/>
+            </w:pPr>
+            <w:r>
+              <w:rPr>
+                <w:sz w:val="18"/>
+                <w:lang w:val="uk-UA"/>
+              </w:rPr>
+              <w:t xml:space="preserve">110 / 111</w:t>
+            </w:r>
+          </w:p>
+        </w:tc>
+      </w:tr>
+      <w:tr>
+        <w:trPr>
+          <w:jc w:val="center"/>
+        </w:trPr>
+        <w:tc>
+          <w:tcPr>
+            <w:tcW w:w="3000" w:type="dxa"/>
+          </w:tcPr>
+          <w:p>
+            <w:r>
+              <w:rPr>
+                <w:sz w:val="18"/>
+                <w:lang w:val="uk-UA"/>
+              </w:rPr>
+              <w:t xml:space="preserve">Побудова графа</w:t>
+            </w:r>
+          </w:p>
+        </w:tc>
+        <w:tc>
+          <w:tcPr>
+            <w:tcW w:w="4638" w:type="dxa"/>
+          </w:tcPr>
+          <w:p>
+            <w:pPr>
+              <w:jc w:val="center"/>
+            </w:pPr>
+            <w:r>
+              <w:rPr>
+                <w:sz w:val="18"/>
+                <w:lang w:val="uk-UA"/>
+              </w:rPr>
+              <w:t xml:space="preserve">граф зображення ациклічний</w:t>
+            </w:r>
+          </w:p>
+        </w:tc>
+        <w:tc>
+          <w:tcPr>
+            <w:tcW w:w="2000" w:type="dxa"/>
+          </w:tcPr>
+          <w:p>
+            <w:pPr>
+              <w:jc w:val="center"/>
+            </w:pPr>
+            <w:r>
+              <w:rPr>
+                <w:sz w:val="18"/>
+                <w:lang w:val="uk-UA"/>
+              </w:rPr>
+              <w:t xml:space="preserve">111 / 111</w:t>
+            </w:r>
+          </w:p>
+        </w:tc>
+      </w:tr>
+      <w:tr>
+        <w:trPr>
+          <w:jc w:val="center"/>
+        </w:trPr>
+        <w:tc>
+          <w:tcPr>
+            <w:tcW w:w="3000" w:type="dxa"/>
+          </w:tcPr>
+          <w:p>
+            <w:r>
+              <w:rPr>
+                <w:sz w:val="18"/>
+                <w:lang w:val="uk-UA"/>
+              </w:rPr>
+              <w:t xml:space="preserve">Фільтр складності</w:t>
+            </w:r>
+          </w:p>
+        </w:tc>
+        <w:tc>
+          <w:tcPr>
+            <w:tcW w:w="4638" w:type="dxa"/>
+          </w:tcPr>
+          <w:p>
+            <w:pPr>
+              <w:jc w:val="center"/>
+            </w:pPr>
+            <w:r>
+              <w:rPr>
+                <w:sz w:val="18"/>
+                <w:lang w:val="uk-UA"/>
+              </w:rPr>
+              <w:t xml:space="preserve">концепт 2_2 відсічено</w:t>
+            </w:r>
+          </w:p>
+        </w:tc>
+        <w:tc>
+          <w:tcPr>
+            <w:tcW w:w="2000" w:type="dxa"/>
+          </w:tcPr>
+          <w:p>
+            <w:pPr>
+              <w:jc w:val="center"/>
+            </w:pPr>
+            <w:r>
+              <w:rPr>
+                <w:sz w:val="18"/>
+                <w:lang w:val="uk-UA"/>
+              </w:rPr>
+              <w:t xml:space="preserve">86 / 111</w:t>
+            </w:r>
+          </w:p>
+        </w:tc>
+      </w:tr>
+      <w:tr>
+        <w:trPr>
+          <w:jc w:val="center"/>
+        </w:trPr>
+        <w:tc>
+          <w:tcPr>
+            <w:tcW w:w="3000" w:type="dxa"/>
+          </w:tcPr>
+          <w:p>
+            <w:r>
+              <w:rPr>
+                <w:sz w:val="18"/>
+                <w:lang w:val="uk-UA"/>
+              </w:rPr>
+              <w:t xml:space="preserve">Структурна перевірка без фільтра</w:t>
+            </w:r>
+          </w:p>
+        </w:tc>
+        <w:tc>
+          <w:tcPr>
+            <w:tcW w:w="4638" w:type="dxa"/>
+          </w:tcPr>
+          <w:p>
+            <w:pPr>
+              <w:jc w:val="center"/>
+            </w:pPr>
+            <w:r>
+              <w:rPr>
+                <w:sz w:val="18"/>
+                <w:lang w:val="uk-UA"/>
+              </w:rPr>
+              <w:t xml:space="preserve">2_2 недопустимий; 2_1 відхилено; 7_1 допущено</w:t>
+            </w:r>
+          </w:p>
+        </w:tc>
+        <w:tc>
+          <w:tcPr>
+            <w:tcW w:w="2000" w:type="dxa"/>
+          </w:tcPr>
+          <w:p>
+            <w:pPr>
+              <w:jc w:val="center"/>
+            </w:pPr>
+            <w:r>
+              <w:rPr>
+                <w:sz w:val="18"/>
+                <w:lang w:val="uk-UA"/>
+              </w:rPr>
+              <w:t xml:space="preserve">111 / 111; 5 / 111; 111 / 111</w:t>
+            </w:r>
+          </w:p>
+        </w:tc>
+      </w:tr>
+      <w:tr>
+        <w:trPr>
+          <w:jc w:val="center"/>
+        </w:trPr>
+        <w:tc>
+          <w:tcPr>
+            <w:tcW w:w="3000" w:type="dxa"/>
+          </w:tcPr>
+          <w:p>
+            <w:r>
+              <w:rPr>
+                <w:sz w:val="18"/>
+                <w:lang w:val="uk-UA"/>
+              </w:rPr>
+              <w:t xml:space="preserve">Подібність</w:t>
+            </w:r>
+          </w:p>
+        </w:tc>
+        <w:tc>
+          <w:tcPr>
+            <w:tcW w:w="4638" w:type="dxa"/>
+          </w:tcPr>
+          <w:p>
+            <w:pPr>
+              <w:jc w:val="center"/>
+            </w:pPr>
+            <w:r>
+              <w:rPr>
+                <w:sz w:val="18"/>
+                <w:lang w:val="uk-UA"/>
+              </w:rPr>
+              <w:t xml:space="preserve">2_1 нижча за 7_1; розрив 0,053–0,318, у середньому 0,113</w:t>
+            </w:r>
+          </w:p>
+        </w:tc>
+        <w:tc>
+          <w:tcPr>
+            <w:tcW w:w="2000" w:type="dxa"/>
+          </w:tcPr>
+          <w:p>
+            <w:pPr>
+              <w:jc w:val="center"/>
+            </w:pPr>
+            <w:r>
+              <w:rPr>
+                <w:sz w:val="18"/>
+                <w:lang w:val="uk-UA"/>
+              </w:rPr>
+              <w:t xml:space="preserve">106 / 106</w:t>
+            </w:r>
+          </w:p>
+        </w:tc>
+      </w:tr>
+      <w:tr>
+        <w:trPr>
+          <w:jc w:val="center"/>
+        </w:trPr>
+        <w:tc>
+          <w:tcPr>
+            <w:tcW w:w="3000" w:type="dxa"/>
+          </w:tcPr>
+          <w:p>
+            <w:r>
+              <w:rPr>
+                <w:sz w:val="18"/>
+                <w:lang w:val="uk-UA"/>
+              </w:rPr>
+              <w:t xml:space="preserve">Оцінка з поправкою на складність</w:t>
+            </w:r>
+          </w:p>
+        </w:tc>
+        <w:tc>
+          <w:tcPr>
+            <w:tcW w:w="4638" w:type="dxa"/>
+          </w:tcPr>
+          <w:p>
+            <w:pPr>
+              <w:jc w:val="center"/>
+            </w:pPr>
+            <w:r>
+              <w:rPr>
+                <w:sz w:val="18"/>
+                <w:lang w:val="uk-UA"/>
+              </w:rPr>
+              <w:t xml:space="preserve">7_1 перемагає 2_1; розрив у середньому 0,060</w:t>
+            </w:r>
+          </w:p>
+        </w:tc>
+        <w:tc>
+          <w:tcPr>
+            <w:tcW w:w="2000" w:type="dxa"/>
+          </w:tcPr>
+          <w:p>
+            <w:pPr>
+              <w:jc w:val="center"/>
+            </w:pPr>
+            <w:r>
+              <w:rPr>
+                <w:sz w:val="18"/>
+                <w:lang w:val="uk-UA"/>
+              </w:rPr>
+              <w:t xml:space="preserve">106 / 106</w:t>
+            </w:r>
+          </w:p>
+        </w:tc>
+      </w:tr>
+    </w:tbl>
+    <w:p>
+      <w:pPr>
+        <w:spacing w:after="0" w:line="280" w:lineRule="exact"/>
+        <w:jc w:val="both"/>
+      </w:pPr>
     </w:p>
     <w:p>
       <w:pPr>
@@ -3967,6 +6728,12 @@
         <w:lastRenderedPageBreak/>
         <w:t>Пояснення у цій системі збігається з самим рішенням. Немає окремої моделі, яка наближала б поведінку класифікатора ззовні. Відтворення за збереженими даними показує конкретний ланцюг: операції редагування, сумарну вартість, нормувальну складність, подібність і підсумкову оцінку. Поознаковий штраф 1,000 і повна вартість заміщення вузла 1,010, 1,103 або 1,302 є різними рівнями цього розкладу.</w:t>
       </w:r>
+      <w:r>
+        <w:rPr>
+          <w:lang w:val="uk-UA"/>
+        </w:rPr>
+        <w:t xml:space="preserve"> Табл. 6 показує, що той самий розклад відтворюється для всієї групи помилок 2→7, а не лише для одного зображення.</w:t>
+      </w:r>
     </w:p>
     <w:p>
       <w:pPr>
@@ -3975,7 +6742,16 @@
         <w:jc w:val="both"/>
       </w:pPr>
       <w:r>
-        <w:t>Для mnist_test_2_00766 зафіксовано ациклічний розгалужений граф і три виходи за інтервали 2_1. Втрата топології під час побудови графа та ті самі поознакові штрафи як загальний механізм пари 2→7 є гіпотезою: для решти 110 випадків поелементних трасувань та експериментів зі втручанням немає.</w:t>
+        <w:rPr>
+          <w:lang w:val="uk-UA"/>
+        </w:rPr>
+        <w:t xml:space="preserve">Для mnist_test_2_00766 зафіксовано ациклічний розгалужений граф і три виходи за інтервали 2_1. </w:t>
+      </w:r>
+      <w:r>
+        <w:rPr>
+          <w:lang w:val="uk-UA"/>
+        </w:rPr>
+        <w:t xml:space="preserve">Для всієї пари 2→7 трасування встановлює етап, на якому петлі вже немає, і те, що 2_1 програє 7_1 за подібністю (табл. 6). Чи програє він через ті самі поознакові штрафи, лишається гіпотезою: поознакових трасувань та експериментів зі втручанням для решти 110 випадків немає.</w:t>
       </w:r>
     </w:p>
     <w:p>
@@ -3985,7 +6761,41 @@
         <w:jc w:val="both"/>
       </w:pPr>
       <w:r>
-        <w:t>Оцінювання обмежене ручним фільтром, що вилучив 12,93 % MNIST нерівномірно за класами. Чутливість до відбору 76 оригіналів, порядку їх подання й невідомого точного діапазону аугментації не вимірювали. Контурне подання відкидає текстуру й градієнти, а розірвані контури потребують асоціативного механізму, якого система не має. Експеримент зафіксовано конфігурацією та артефактами результату; повної копії коду, з яким його виконано, не збережено, тому відтворення можливе в межах цих артефактів.</w:t>
+        <w:rPr>
+          <w:lang w:val="uk-UA"/>
+        </w:rPr>
+        <w:t xml:space="preserve">Оцінювання обмежене ручним фільтром, що вилучив 12,93 % MNIST нерівномірно за класами. </w:t>
+      </w:r>
+      <w:r>
+        <w:rPr>
+          <w:lang w:val="uk-UA"/>
+        </w:rPr>
+        <w:t xml:space="preserve">Ручний відбір 76 оригіналів є свідомим обмеженням методу (підрозділ 2.2): результат дійсний для концептів, сформованих зі структурно правильних написань, а чутливість точності до конкретного відбору, порядку подання й невідомого точного діапазону аугментації не вимірювали. Параметри табл. 1 підібрано емпірично в серії попередніх експериментів на тому самому тестовому розбитті; окремої валідаційної вибірки й абляцій за кожним параметром не було, тому точність може бути завищеною. </w:t>
+      </w:r>
+      <w:r>
+        <w:rPr>
+          <w:lang w:val="uk-UA"/>
+        </w:rPr>
+        <w:t xml:space="preserve">Контурне подання відкидає текстуру й градієнти, а розірвані контури потребують асоціативного механізму, якого система не має. </w:t>
+      </w:r>
+      <w:r>
+        <w:rPr>
+          <w:lang w:val="uk-UA"/>
+        </w:rPr>
+        <w:t xml:space="preserve">Код системи, конфігурацію експерименту, збережений алфавіт концептів і перелік помилкових рішень опубліковано у відкритому репозиторії https://github.com/NaturalAGI-Lab/NaturalAGI.</w:t>
+      </w:r>
+    </w:p>
+    <w:p>
+      <w:pPr>
+        <w:spacing w:after="0" w:line="280" w:lineRule="exact"/>
+        <w:ind w:firstLine="567"/>
+        <w:jc w:val="both"/>
+      </w:pPr>
+      <w:r>
+        <w:rPr>
+          <w:lang w:val="uk-UA"/>
+        </w:rPr>
+        <w:t xml:space="preserve">Найближчі аналоги цього підходу належать до трьох груп. Першу утворюють структурні методи зіставлення форми. Belongie et al. [42] описують кожну точку контуру контекстом форми й шукають відповідність точок двочастковим призначенням; класифікатор найближчого сусіда з цією мірою має на MNIST 0,63 % помилки. Dutta and Sahbi [43] перетворюють кожну цифру MNIST на скелетний граф і класифікують його вкладення графлетів методом опорних векторів. Другу групу становлять методи, що навчаються з одного чи кількох прикладів. Xu and Mestetskiy [44] подають рукописний ієрогліф плоским геометричним графом і шукають знаки за одним зразком запиту, розв'язуючи задачу про призначення, а метод лишається повністю інтерпретованим; Gan et al. [23] будують на скелетних графах ієрогліфів навчену мережу. Третю групу утворюють прототипні моделі, пояснювані за побудовою: прототипний шар Li et al. [45] і прототипи-фрагменти PIP-Net [46] пояснюють рішення подібністю до засвоєних прикладів. На відміну від цих робіт, тут клас подано графом концепту, сформованим структурною редукцією з 3–9 оригіналів, а рішення розкладається на операції редагування та поознакові вартості. Кількісно з цими методами на тій самій підмножині MNIST систему не порівнювали; числа з їхніх праць отримано за інших умов навчання й оцінювання.</w:t>
       </w:r>
     </w:p>
     <w:p>
@@ -4007,7 +6817,10 @@
         <w:jc w:val="both"/>
       </w:pPr>
       <w:r>
-        <w:t>1. Побудовано подання Point–Vector з 2 типами вузлів і 13 ознаками зіставлення.</w:t>
+        <w:rPr>
+          <w:lang w:val="uk-UA"/>
+        </w:rPr>
+        <w:t xml:space="preserve">Мету досягнуто за всіма трьома критеріями підрозділу 1.3: алфавіт сформовано без зворотного поширення помилки з 3–9 оригіналів на концепт; нижня межа 95 % довірчого інтервалу точності становить 90,52 %; рішення відтворюється за збереженими даними від операцій редагування до оцінки. Результати за завданнями такі.</w:t>
       </w:r>
     </w:p>
     <w:p>
@@ -4017,7 +6830,10 @@
         <w:jc w:val="both"/>
       </w:pPr>
       <w:r>
-        <w:t>2. Одним проходом структурної редукції з 76 вручну відібраних оригіналів, розширених до 805 зразків, сформовано 13 концептів для 10 класів, по 3–12 вузлів кожний.</w:t>
+        <w:rPr>
+          <w:lang w:val="uk-UA"/>
+        </w:rPr>
+        <w:t xml:space="preserve">1. Подання Point–Vector з двома типами вузлів і 13 ознаками зберігає топологію контуру в структурі графа: замкненому контуру відповідає цикл, тому втрату петлі видно в графі. Усі 111 графів помилок 2→7 ациклічні.</w:t>
       </w:r>
     </w:p>
     <w:p>
@@ -4027,101 +6843,10 @@
         <w:jc w:val="both"/>
       </w:pPr>
       <w:r>
-        <w:t xml:space="preserve">3. Класифікацію побудовано за GED зі шкалою вартостей заміщення 0 / 0,25 / 0,5 / 0,8 / 1,0 / 6,0, діагностичним </w:t>
-      </w:r>
-      <w:proofErr w:type="spellStart"/>
-      <w:r>
-        <w:t>зважуванням</w:t>
-      </w:r>
-      <w:proofErr w:type="spellEnd"/>
-      <w:r>
-        <w:t xml:space="preserve"> </w:t>
-      </w:r>
-      <w:proofErr w:type="spellStart"/>
-      <w:r>
-        <w:t>ознак</w:t>
-      </w:r>
-      <w:proofErr w:type="spellEnd"/>
-      <w:r>
-        <w:t xml:space="preserve"> </w:t>
-      </w:r>
-      <w:proofErr w:type="spellStart"/>
-      <w:r>
-        <w:t>за</w:t>
-      </w:r>
-      <w:proofErr w:type="spellEnd"/>
-      <w:r>
-        <w:t xml:space="preserve"> </w:t>
-      </w:r>
-      <w:r>
         <w:rPr>
-          <w:position w:val="-12"/>
+          <w:lang w:val="uk-UA"/>
         </w:rPr>
-        <w:object w:dxaOrig="279" w:dyaOrig="360" w14:anchorId="1BB52778">
-          <v:shape id="_x0000_i1029" type="#_x0000_t75" style="width:14.25pt;height:18pt" o:ole="">
-            <v:imagedata r:id="rId27" o:title=""/>
-          </v:shape>
-          <o:OLEObject Type="Embed" ProgID="Equation.DSMT4" ShapeID="_x0000_i1029" DrawAspect="Content" ObjectID="_1852313332" r:id="rId28"/>
-        </w:object>
-      </w:r>
-      <w:r>
-        <w:t xml:space="preserve"> = 0,1, </w:t>
-      </w:r>
-      <w:proofErr w:type="spellStart"/>
-      <w:r>
-        <w:t>поправкою</w:t>
-      </w:r>
-      <w:proofErr w:type="spellEnd"/>
-      <w:r>
-        <w:t xml:space="preserve"> </w:t>
-      </w:r>
-      <w:proofErr w:type="spellStart"/>
-      <w:r>
-        <w:t>на</w:t>
-      </w:r>
-      <w:proofErr w:type="spellEnd"/>
-      <w:r>
-        <w:t xml:space="preserve"> </w:t>
-      </w:r>
-      <w:proofErr w:type="spellStart"/>
-      <w:r>
-        <w:t>складність</w:t>
-      </w:r>
-      <w:proofErr w:type="spellEnd"/>
-      <w:r>
-        <w:t xml:space="preserve"> </w:t>
-      </w:r>
-      <w:proofErr w:type="spellStart"/>
-      <w:r>
-        <w:t>концепту</w:t>
-      </w:r>
-      <w:proofErr w:type="spellEnd"/>
-      <w:r>
-        <w:t xml:space="preserve"> </w:t>
-      </w:r>
-      <w:bookmarkStart w:id="0" w:name="MTBlankEqn"/>
-      <w:r>
-        <w:rPr>
-          <w:position w:val="-6"/>
-        </w:rPr>
-        <w:object w:dxaOrig="220" w:dyaOrig="279" w14:anchorId="31D571B0">
-          <v:shape id="_x0000_i1026" type="#_x0000_t75" style="width:11.25pt;height:14.25pt" o:ole="">
-            <v:imagedata r:id="rId29" o:title=""/>
-          </v:shape>
-          <o:OLEObject Type="Embed" ProgID="Equation.DSMT4" ShapeID="_x0000_i1026" DrawAspect="Content" ObjectID="_1852313333" r:id="rId30"/>
-        </w:object>
-      </w:r>
-      <w:bookmarkEnd w:id="0"/>
-      <w:r>
-        <w:t xml:space="preserve"> = 0,10 </w:t>
-      </w:r>
-      <w:proofErr w:type="spellStart"/>
-      <w:r>
-        <w:t>та</w:t>
-      </w:r>
-      <w:proofErr w:type="spellEnd"/>
-      <w:r>
-        <w:t xml:space="preserve"> нормуванням подібності за сумою вузлів і ребер графа.</w:t>
+        <w:t xml:space="preserve">2. Для 10 класів цифр достатньо 13 концептів по 3–12 вузлів, сформованих одним проходом структурної редукції з 76 оригіналів (805 зразків з аугментаціями). Класи 1, 2 і 4 потребують двох підконцептів, бо їх пишуть у двох топологічно різних стилях.</w:t>
       </w:r>
     </w:p>
     <w:p>
@@ -4131,7 +6856,10 @@
         <w:jc w:val="both"/>
       </w:pPr>
       <w:r>
-        <w:t>4. Ручний фільтр допустив 8 707 із 10 000 зображень MNIST; частка збережених зображень класу коливається від 59,75 % до 99,47 %. Точність становить 91,13 %; зважені влучність, повнота і F1 дорівнюють 91,92 %, 91,13 % і 91,34 %.</w:t>
+        <w:rPr>
+          <w:lang w:val="uk-UA"/>
+        </w:rPr>
+        <w:t xml:space="preserve">3. Діагностичне зважування робить рішення чутливим до виходу за вузькі інтервали: у трасуванні mnist_test_2_00766 три такі виходи дали заміщенням вузлів 2_1 вартості 1,010–1,302, тоді як п'ять заміщень 7_1 у межах інтервалів коштували 0,038–0,388.</w:t>
       </w:r>
     </w:p>
     <w:p>
@@ -4141,7 +6869,22 @@
         <w:jc w:val="both"/>
       </w:pPr>
       <w:r>
-        <w:t>5. У відтворенні mnist_test_2_00766 за збереженими даними оцінки 1,1487 для 7_1 і 1,1000 для 2_1 різняться на 0,0486; серед 111 помилок 2→7 2_1 програв за оцінкою 106 разів і був структурно відхилений 5 разів.</w:t>
+        <w:rPr/>
+        <w:t xml:space="preserve">4. Ручний фільтр допустив 8 707 із 10 000 зображень MNIST; частка збережених зображень класу коливається від 59,75 % до 99,47 %. Точність становить 91,13 %</w:t>
+      </w:r>
+      <w:r>
+        <w:rPr/>
+        <w:t xml:space="preserve"> (95 % ДІ 90,52–91,71 %)</w:t>
+      </w:r>
+      <w:r>
+        <w:rPr/>
+        <w:t xml:space="preserve">; зважені влучність, повнота і F1 дорівнюють 91,92 %, 91,13 % і 91,34 %.</w:t>
+      </w:r>
+      <w:r>
+        <w:rPr>
+          <w:lang w:val="uk-UA"/>
+        </w:rPr>
+        <w:t xml:space="preserve"> Найнижча повнота в класу 2 (77,59 %).</w:t>
       </w:r>
     </w:p>
     <w:p>
@@ -4151,7 +6894,10 @@
         <w:jc w:val="both"/>
       </w:pPr>
       <w:r>
-        <w:t xml:space="preserve">Наукова цінність результатів полягає в поєднанні умов, якого немає в жодній із робіт, розглянутих у підрозділі 1.2: граф контуру є водночас носієм рішення й носієм пояснення; вартості зіставлення прив'язано до наперед визначених геометричних ознак вузлів; алфавіт концептів сформовано з 76 оригіналів одним проходом без зворотного поширення помилки; умови оцінювання задокументовано збереженими артефактами експерименту.</w:t>
+        <w:rPr>
+          <w:lang w:val="uk-UA"/>
+        </w:rPr>
+        <w:t xml:space="preserve">5. Рішення простежується на двох рівнях. Для mnist_test_2_00766 оцінки 1,1487 для 7_1 і 1,1000 для 2_1 різняться на 0,0486. Для всіх 111 помилок 2→7 трасування показує, що у 110 випадках бінарна маска не містить замкненої петлі, а 2_1 програв 7_1 за подібністю в усіх 106 випадках, коли отримав оцінку.</w:t>
       </w:r>
     </w:p>
     <w:p>
@@ -4161,7 +6907,7 @@
         <w:jc w:val="both"/>
       </w:pPr>
       <w:r>
-        <w:t xml:space="preserve">Практична цінність результатів полягає в тому, що кожне рішення класифікатора можна перевірити вручну за збереженими даними: трасування показує, які заміщення вузлів і які ознаки визначили оцінку. Така властивість потрібна там, де навчальних даних мало, а рішення треба обґрунтувати перед оператором або аудитором.</w:t>
+        <w:t xml:space="preserve">Наукова цінність результатів полягає в поєднанні умов, якого немає в жодній із робіт, розглянутих у підрозділі 1.2: граф контуру є водночас носієм рішення й носієм пояснення; вартості зіставлення прив'язано до наперед визначених геометричних ознак вузлів; алфавіт концептів сформовано з 76 оригіналів одним проходом без зворотного поширення помилки; умови оцінювання задокументовано збереженими артефактами експерименту.</w:t>
       </w:r>
     </w:p>
     <w:p>
@@ -4171,7 +6917,29 @@
         <w:jc w:val="both"/>
       </w:pPr>
       <w:r>
-        <w:t xml:space="preserve">Напрями подальших досліджень: розроблення асоціативного механізму для розірваних контурів, щоб оцінювати систему без ручного фільтра повноти контуру; вимірювання чутливості точності до відбору оригіналів, порядку їх подання та діапазону аугментації; поелементне трасування решти 110 помилок 2→7 та експерименти зі втручанням для перевірки гіпотези про втрату топології під час побудови графа.</w:t>
+        <w:rPr>
+          <w:lang w:val="uk-UA"/>
+        </w:rPr>
+        <w:t xml:space="preserve">Практична цінність результатів є потенційною. Вона стосується задач, де кожне спірне рішення перевіряє людина: розпізнавання рукописних позначок у документообігу, контролю промислового маркування, навчальних систем, які мають показати причину оцінки. У статті показано властивість, на якій ґрунтується така придатність: рішення відтворюється за збереженими даними до поознакових вартостей, а концепт нового класу формується з кількох оригіналів. Застосування в цих задачах не перевіряли.</w:t>
+      </w:r>
+    </w:p>
+    <w:p>
+      <w:pPr>
+        <w:spacing w:after="0" w:line="280" w:lineRule="exact"/>
+        <w:ind w:firstLine="567"/>
+        <w:jc w:val="both"/>
+      </w:pPr>
+      <w:r>
+        <w:rPr/>
+        <w:t xml:space="preserve">Напрями подальших досліджень: розроблення асоціативного механізму для розірваних контурів, щоб оцінювати систему без ручного фільтра повноти контуру; вимірювання чутливості точності до відбору оригіналів, порядку їх подання та діапазону аугментації; </w:t>
+      </w:r>
+      <w:r>
+        <w:rPr/>
+        <w:t xml:space="preserve">поознакове</w:t>
+      </w:r>
+      <w:r>
+        <w:rPr/>
+        <w:t xml:space="preserve"> трасування решти 110 помилок 2→7 та експерименти зі втручанням для перевірки гіпотези про втрату топології під час побудови графа.</w:t>
       </w:r>
     </w:p>
     <w:p>
@@ -5058,6 +7826,162 @@
     <w:p>
       <w:pPr>
         <w:spacing w:after="0" w:line="280" w:lineRule="exact"/>
+        <w:ind w:left="567" w:hanging="567"/>
+        <w:jc w:val="both"/>
+      </w:pPr>
+      <w:r>
+        <w:rPr>
+          <w:lang w:val="uk-UA"/>
+        </w:rPr>
+        <w:t xml:space="preserve">41. Wilson, E. (1927), "Probable inference, the law of succession, and statistical inference", </w:t>
+      </w:r>
+      <w:r>
+        <w:rPr>
+          <w:i/>
+          <w:lang w:val="uk-UA"/>
+        </w:rPr>
+        <w:t xml:space="preserve">Journal of the American Statistical Association</w:t>
+      </w:r>
+      <w:r>
+        <w:rPr>
+          <w:lang w:val="uk-UA"/>
+        </w:rPr>
+        <w:t xml:space="preserve">, Vol. 22, No. 158, pp. 209–212. DOI: https://doi.org/10.1080/01621459.1927.10502953</w:t>
+      </w:r>
+    </w:p>
+    <w:p>
+      <w:pPr>
+        <w:spacing w:after="0" w:line="280" w:lineRule="exact"/>
+        <w:ind w:left="567" w:hanging="567"/>
+        <w:jc w:val="both"/>
+      </w:pPr>
+      <w:r>
+        <w:rPr>
+          <w:lang w:val="uk-UA"/>
+        </w:rPr>
+        <w:t xml:space="preserve">42. Belongie, S., Malik, J., Puzicha, J. (2002), "Shape matching and object recognition using shape contexts", </w:t>
+      </w:r>
+      <w:r>
+        <w:rPr>
+          <w:i/>
+          <w:lang w:val="uk-UA"/>
+        </w:rPr>
+        <w:t xml:space="preserve">IEEE Transactions on Pattern Analysis and Machine Intelligence</w:t>
+      </w:r>
+      <w:r>
+        <w:rPr>
+          <w:lang w:val="uk-UA"/>
+        </w:rPr>
+        <w:t xml:space="preserve">, Vol. 24, No. 4, pp. 509–522. DOI: https://doi.org/10.1109/34.993558</w:t>
+      </w:r>
+    </w:p>
+    <w:p>
+      <w:pPr>
+        <w:spacing w:after="0" w:line="280" w:lineRule="exact"/>
+        <w:ind w:left="567" w:hanging="567"/>
+        <w:jc w:val="both"/>
+      </w:pPr>
+      <w:r>
+        <w:rPr>
+          <w:lang w:val="uk-UA"/>
+        </w:rPr>
+        <w:t xml:space="preserve">43. Dutta, A., Sahbi, H. (2019), "Stochastic graphlet embedding", </w:t>
+      </w:r>
+      <w:r>
+        <w:rPr>
+          <w:i/>
+          <w:lang w:val="uk-UA"/>
+        </w:rPr>
+        <w:t xml:space="preserve">IEEE Transactions on Neural Networks and Learning Systems</w:t>
+      </w:r>
+      <w:r>
+        <w:rPr>
+          <w:lang w:val="uk-UA"/>
+        </w:rPr>
+        <w:t xml:space="preserve">, Vol. 30, No. 8, pp. 2369–2382. DOI: https://doi.org/10.1109/TNNLS.2018.2884700</w:t>
+      </w:r>
+    </w:p>
+    <w:p>
+      <w:pPr>
+        <w:spacing w:after="0" w:line="280" w:lineRule="exact"/>
+        <w:ind w:left="567" w:hanging="567"/>
+        <w:jc w:val="both"/>
+      </w:pPr>
+      <w:r>
+        <w:rPr>
+          <w:lang w:val="uk-UA"/>
+        </w:rPr>
+        <w:t xml:space="preserve">44. Xu, M., Mestetskiy, L. (2025), "An approach to searching for hieroglyphs in Chinese manuscript archives based on morphological analysis", </w:t>
+      </w:r>
+      <w:r>
+        <w:rPr>
+          <w:i/>
+          <w:lang w:val="uk-UA"/>
+        </w:rPr>
+        <w:t xml:space="preserve">The International Archives of the Photogrammetry, Remote Sensing and Spatial Information Sciences</w:t>
+      </w:r>
+      <w:r>
+        <w:rPr>
+          <w:lang w:val="uk-UA"/>
+        </w:rPr>
+        <w:t xml:space="preserve">, Vol. XLVIII-2/W9-2025, pp. 283–288. DOI: https://doi.org/10.5194/isprs-archives-XLVIII-2-W9-2025-283-2025</w:t>
+      </w:r>
+    </w:p>
+    <w:p>
+      <w:pPr>
+        <w:spacing w:after="0" w:line="280" w:lineRule="exact"/>
+        <w:ind w:left="567" w:hanging="567"/>
+        <w:jc w:val="both"/>
+      </w:pPr>
+      <w:r>
+        <w:rPr>
+          <w:lang w:val="uk-UA"/>
+        </w:rPr>
+        <w:t xml:space="preserve">45. Li, O., Liu, H., Chen, C., Rudin, C. (2018), "Deep learning for case-based reasoning through prototypes: a neural network that explains its predictions", </w:t>
+      </w:r>
+      <w:r>
+        <w:rPr>
+          <w:i/>
+          <w:lang w:val="uk-UA"/>
+        </w:rPr>
+        <w:t xml:space="preserve">Proceedings of the AAAI Conference on Artificial Intelligence</w:t>
+      </w:r>
+      <w:r>
+        <w:rPr>
+          <w:lang w:val="uk-UA"/>
+        </w:rPr>
+        <w:t xml:space="preserve">, Vol. 32, No. 1. DOI: https://doi.org/10.1609/aaai.v32i1.11771</w:t>
+      </w:r>
+    </w:p>
+    <w:p>
+      <w:pPr>
+        <w:spacing w:after="0" w:line="280" w:lineRule="exact"/>
+        <w:ind w:left="567" w:hanging="567"/>
+        <w:jc w:val="both"/>
+      </w:pPr>
+      <w:r>
+        <w:rPr>
+          <w:lang w:val="uk-UA"/>
+        </w:rPr>
+        <w:t xml:space="preserve">46. Nauta, M., Schlötterer, J., van Keulen, M., Seifert, C. (2023), "PIP-Net: patch-based intuitive prototypes for interpretable image classification", </w:t>
+      </w:r>
+      <w:r>
+        <w:rPr>
+          <w:i/>
+          <w:lang w:val="uk-UA"/>
+        </w:rPr>
+        <w:t xml:space="preserve">2023 IEEE/CVF Conference on Computer Vision and Pattern Recognition (CVPR)</w:t>
+      </w:r>
+      <w:r>
+        <w:rPr>
+          <w:lang w:val="uk-UA"/>
+        </w:rPr>
+        <w:t xml:space="preserve">, pp. 2744–2753. DOI: https://doi.org/10.1109/CVPR52729.2023.00269</w:t>
+      </w:r>
+    </w:p>
+    <w:p>
+      <w:pPr>
+        <w:spacing w:after="0" w:line="280" w:lineRule="exact"/>
         <w:jc w:val="both"/>
       </w:pPr>
     </w:p>
@@ -5186,7 +8110,12 @@
         <w:t xml:space="preserve">Modified National Institute of Standards and Technology</w:t>
       </w:r>
       <w:r>
-        <w:t xml:space="preserve"> з явним описом фільтра повноти контуру; продемонструвати пояснюваність трасуванням рішення. </w:t>
+        <w:rPr/>
+        <w:t xml:space="preserve"> з явним описом фільтра повноти контуру; продемонструвати пояснюваність трасуванням </w:t>
+      </w:r>
+      <w:r>
+        <w:rPr/>
+        <w:t xml:space="preserve">рішень. </w:t>
       </w:r>
       <w:r>
         <w:rPr>
@@ -5219,10 +8148,28 @@
         <w:t xml:space="preserve">. </w:t>
       </w:r>
       <w:r>
-        <w:t xml:space="preserve">Зображення подано графами з вузлами двох типів, точками й векторами, і 13 ознаками. Із 76 вручну відібраних оригіналів, розширених до 805 зразків, одним проходом структурної редукції сформовано 13 концептів-атракторів для 10 класів, по 3–12 вузлів кожний. У класифікації за відстанню редагування графів вузькі інтервали ознак важать більше. Фільтр повноти контуру допустив 8 707 із 10 000 зображень; частка збережених зображень класу коливається від 59,75 % до 99,47 %. Точність становить 91,13 %; зважені влучність, повнота і F-міра дорівнюють 91,92 %, 91,13 % і 91,34 %. Найчастіше система сплутує цифру 2 з цифрою 7: 111 випадків із 770 помилкових рішень. </w:t>
-      </w:r>
-      <w:r>
-        <w:t xml:space="preserve">Відтворення одного рішення за збереженими даними дає числовий ланцюг від операцій редагування до оцінки. </w:t>
+        <w:rPr/>
+        <w:t xml:space="preserve">Зображення подано графами з вузлами двох типів, точками й векторами, і 13 ознаками. Із 76 вручну відібраних оригіналів, розширених до 805 зразків, одним проходом структурної редукції сформовано 13 концептів-атракторів для 10 класів, по 3–12 вузлів кожний. У класифікації за відстанню редагування графів вузькі інтервали ознак важать більше. Фільтр повноти контуру допустив 8 707 із 10 000 зображень; частка збережених зображень класу коливається від 59,75 % до 99,47 %. Точність становить 91,13 %</w:t>
+      </w:r>
+      <w:r>
+        <w:rPr/>
+        <w:t xml:space="preserve"> (95 % довірчий інтервал 90,52–91,71 %)</w:t>
+      </w:r>
+      <w:r>
+        <w:rPr/>
+        <w:t xml:space="preserve">; зважені влучність, повнота і F-міра дорівнюють 91,92 %, 91,13 % і 91,34 %. Найчастіше система сплутує цифру 2 з цифрою 7: 111 випадків із 770 помилкових рішень. </w:t>
+      </w:r>
+      <w:r>
+        <w:rPr/>
+        <w:t xml:space="preserve">Відтворення одного рішення за збереженими даними дає числовий ланцюг від операцій редагування до оцінки</w:t>
+      </w:r>
+      <w:r>
+        <w:rPr/>
+        <w:t xml:space="preserve">, а трасування всіх цих 111 випадків показало, що у 110 з них петлі немає вже в бінарному зображенні</w:t>
+      </w:r>
+      <w:r>
+        <w:rPr/>
+        <w:t xml:space="preserve">. </w:t>
       </w:r>
       <w:r>
         <w:rPr>

</xml_diff>

<commit_message>
docs: list the contour-completeness annotation in datasets.zip among the published files of article 065
</commit_message>
<xml_diff>
--- a/papers/itssi_xai_2026/itssi_xai_2026.docx
+++ b/papers/itssi_xai_2026/itssi_xai_2026.docx
@@ -6782,7 +6782,19 @@
         <w:rPr>
           <w:lang w:val="uk-UA"/>
         </w:rPr>
-        <w:t xml:space="preserve">Код системи, конфігурацію експерименту, збережений алфавіт концептів і перелік помилкових рішень опубліковано у відкритому репозиторії https://github.com/NaturalAGI-Lab/NaturalAGI.</w:t>
+        <w:t xml:space="preserve">Код системи, конфігурацію експерименту,</w:t>
+      </w:r>
+      <w:r>
+        <w:rPr>
+          <w:lang w:val="uk-UA"/>
+        </w:rPr>
+        <w:t xml:space="preserve"> ручну розмітку повноти контуру (архів datasets.zip),</w:t>
+      </w:r>
+      <w:r>
+        <w:rPr>
+          <w:lang w:val="uk-UA"/>
+        </w:rPr>
+        <w:t xml:space="preserve"> збережений алфавіт концептів і перелік помилкових рішень опубліковано у відкритому репозиторії https://github.com/NaturalAGI-Lab/NaturalAGI.</w:t>
       </w:r>
     </w:p>
     <w:p>

</xml_diff>

<commit_message>
docs: answer review 3 of article 065 with the supervisor's arguments and a baseline comparison table
</commit_message>
<xml_diff>
--- a/papers/itssi_xai_2026/itssi_xai_2026.docx
+++ b/papers/itssi_xai_2026/itssi_xai_2026.docx
@@ -919,7 +919,7 @@
         <w:rPr>
           <w:lang w:val="uk-UA"/>
         </w:rPr>
-        <w:t xml:space="preserve">Оригінали відібрано вручну, а не випадково, і цього вимагає сам метод. Концепт-атрактор зберігає лише структуру, спільну для всіх поданих зразків: кожен крок редукції вилучає з концепту елементи, яких немає в черговому зразку. Зразок з розривом контуру, шумовою гілкою чи іншою топологією не додає концепту варіативності, а вилучає з нього частину структури класу. Кількості петель редукція не змінює, тому зразок з розімкненою петлею несумісний з концептом свого класу, і формування завершується помилкою. Через це для формування відбирали найменш спотворені написання без розривів контуру. В основі відбору лежить припущення, що правильно написаний представник класу вже містить усі структурні й топологічні ознаки цього класу. Формуванню тоді потрібна не репрезентативна вибірка розподілу, а кілька структурно повних написань, а мінливість почерку в межах класу задають аугментації та інтервали атрибутів.</w:t>
+        <w:t xml:space="preserve">Оригінали відібрано вручну, а не випадково, і цього вимагає сам метод. Концепт-атрактор зберігає лише структуру, спільну для всіх поданих зразків: кожен крок редукції вилучає з концепту елементи, яких немає в черговому зразку. Зразок з розривом контуру, шумовою гілкою чи іншою топологією не додає концепту варіативності, а вилучає з нього частину структури класу. Кількості петель редукція не змінює, тому зразок з розімкненою петлею несумісний з концептом свого класу, і формування завершується помилкою. Через це для формування відбирали найменш спотворені написання без розривів контуру. В основі відбору лежить припущення, що правильно написаний представник класу вже містить усі структурні й топологічні ознаки цього класу. Формуванню тоді потрібна не репрезентативна вибірка розподілу, а кілька структурно повних написань, а мінливість почерку в межах класу задають аугментації та інтервали атрибутів. Підготовки навчальної вибірки потребує будь-яке навчання, і тут вимогу до неї задає механізм формування. Зі зразків формується стала структура атрактора класу, тому вони мають відповідати найменш зашумленому образу класу. Спотворення конкретного написання виявляються вже під час розпізнавання як відхилення від цієї структури.</w:t>
       </w:r>
     </w:p>
     <w:p>
@@ -6715,6 +6715,718 @@
         <w:rPr>
           <w:b/>
         </w:rPr>
+        <w:t xml:space="preserve">3.5 Порівняння з базовими методами</w:t>
+      </w:r>
+    </w:p>
+    <w:p>
+      <w:pPr>
+        <w:spacing w:after="0" w:line="280" w:lineRule="exact"/>
+        <w:ind w:firstLine="567"/>
+        <w:jc w:val="both"/>
+      </w:pPr>
+      <w:r>
+        <w:rPr>
+          <w:lang w:val="uk-UA"/>
+        </w:rPr>
+        <w:t xml:space="preserve">Базові методи навчено на тих самих 805 зразках, з яких сформовано концепти (76 оригіналів з аугментаціями, 100×100 пікселів): SVM з RBF-ядром, багатошаровий перцептрон (MLP), згорткову мережу (CNN), класифікатор найближчого центроїда і k найближчих сусідів (k-NN). Оцінювання виконано на 8 708 повних тестових зображеннях за архівним переліком, що на одне більше, ніж у табл. 3; одне зображення змінює точність на 0,011 п. п. MLP і CNN навчено до збіжності з ранньою зупинкою на десяти відкладених оригіналах, по одному на клас, і окремо протягом однієї епохи. Для них наведено середнє й стандартне відхилення за п'ятьма запусками з різними початковими значеннями генератора. Умови й результати порівняння збережено в репозиторії проєкту (каталог experiments/classical_baselines_20260910T113940Z).</w:t>
+      </w:r>
+    </w:p>
+    <w:p>
+      <w:pPr>
+        <w:spacing w:after="0" w:line="280" w:lineRule="exact"/>
+        <w:ind w:firstLine="567"/>
+        <w:jc w:val="both"/>
+      </w:pPr>
+      <w:r>
+        <w:rPr>
+          <w:lang w:val="uk-UA"/>
+        </w:rPr>
+        <w:t xml:space="preserve">Найкраща з базових моделей, SVM, досягає точності 79,70 %, на 11,43 п. п. нижче за систему (табл. 7). Після однієї епохи, тобто одного проходу навчальних даних, точність MLP становить 67,13 %, а CNN — 59,00 %. Повнота системи за класами лежить у межах 18,93 п. п., у SVM — у межах 49,25 п. п. Розрив створюють переважно класи 3, 5 і 8, а на класах 2 і 4 повнота SVM вища, ніж у системи.</w:t>
+      </w:r>
+    </w:p>
+    <w:p>
+      <w:pPr>
+        <w:keepNext/>
+        <w:spacing w:before="120" w:after="0" w:line="280" w:lineRule="exact"/>
+        <w:jc w:val="center"/>
+      </w:pPr>
+      <w:r>
+        <w:rPr>
+          <w:b/>
+          <w:i/>
+          <w:sz w:val="18"/>
+          <w:lang w:val="uk-UA"/>
+        </w:rPr>
+        <w:t xml:space="preserve">Таблиця 7 – Точність базових методів, навчених на тих самих 805 зразках</w:t>
+      </w:r>
+    </w:p>
+    <w:tbl>
+      <w:tblPr>
+        <w:tblStyle w:val="aff0"/>
+        <w:tblW w:w="0" w:type="auto"/>
+        <w:jc w:val="center"/>
+        <w:tblLook w:val="04A0" w:firstRow="1" w:lastRow="0" w:firstColumn="1" w:lastColumn="0" w:noHBand="0" w:noVBand="1"/>
+      </w:tblPr>
+      <w:tblGrid>
+        <w:gridCol w:w="2700"/>
+        <w:gridCol w:w="2338"/>
+        <w:gridCol w:w="2300"/>
+        <w:gridCol w:w="2300"/>
+      </w:tblGrid>
+      <w:tr>
+        <w:trPr>
+          <w:tblHeader/>
+          <w:jc w:val="center"/>
+        </w:trPr>
+        <w:tc>
+          <w:tcPr>
+            <w:tcW w:w="2700" w:type="dxa"/>
+          </w:tcPr>
+          <w:p>
+            <w:pPr>
+              <w:jc w:val="center"/>
+            </w:pPr>
+            <w:r>
+              <w:rPr>
+                <w:b/>
+                <w:sz w:val="18"/>
+                <w:lang w:val="uk-UA"/>
+              </w:rPr>
+              <w:t xml:space="preserve">Модель</w:t>
+            </w:r>
+          </w:p>
+        </w:tc>
+        <w:tc>
+          <w:tcPr>
+            <w:tcW w:w="2338" w:type="dxa"/>
+          </w:tcPr>
+          <w:p>
+            <w:pPr>
+              <w:jc w:val="center"/>
+            </w:pPr>
+            <w:r>
+              <w:rPr>
+                <w:b/>
+                <w:sz w:val="18"/>
+                <w:lang w:val="uk-UA"/>
+              </w:rPr>
+              <w:t xml:space="preserve">Навчання</w:t>
+            </w:r>
+          </w:p>
+        </w:tc>
+        <w:tc>
+          <w:tcPr>
+            <w:tcW w:w="2300" w:type="dxa"/>
+          </w:tcPr>
+          <w:p>
+            <w:pPr>
+              <w:jc w:val="center"/>
+            </w:pPr>
+            <w:r>
+              <w:rPr>
+                <w:b/>
+                <w:sz w:val="18"/>
+                <w:lang w:val="uk-UA"/>
+              </w:rPr>
+              <w:t xml:space="preserve">Точність, %</w:t>
+            </w:r>
+          </w:p>
+        </w:tc>
+        <w:tc>
+          <w:tcPr>
+            <w:tcW w:w="2300" w:type="dxa"/>
+          </w:tcPr>
+          <w:p>
+            <w:pPr>
+              <w:jc w:val="center"/>
+            </w:pPr>
+            <w:r>
+              <w:rPr>
+                <w:b/>
+                <w:sz w:val="18"/>
+                <w:lang w:val="uk-UA"/>
+              </w:rPr>
+              <w:t xml:space="preserve">Повнота за класами, %</w:t>
+            </w:r>
+          </w:p>
+        </w:tc>
+      </w:tr>
+      <w:tr>
+        <w:trPr>
+          <w:jc w:val="center"/>
+        </w:trPr>
+        <w:tc>
+          <w:tcPr>
+            <w:tcW w:w="2700" w:type="dxa"/>
+          </w:tcPr>
+          <w:p>
+            <w:r>
+              <w:rPr>
+                <w:sz w:val="18"/>
+                <w:lang w:val="uk-UA"/>
+              </w:rPr>
+              <w:t xml:space="preserve">Система (ця робота)</w:t>
+            </w:r>
+          </w:p>
+        </w:tc>
+        <w:tc>
+          <w:tcPr>
+            <w:tcW w:w="2338" w:type="dxa"/>
+          </w:tcPr>
+          <w:p>
+            <w:pPr>
+              <w:jc w:val="center"/>
+            </w:pPr>
+            <w:r>
+              <w:rPr>
+                <w:sz w:val="18"/>
+                <w:lang w:val="uk-UA"/>
+              </w:rPr>
+              <w:t xml:space="preserve">один прохід формування</w:t>
+            </w:r>
+          </w:p>
+        </w:tc>
+        <w:tc>
+          <w:tcPr>
+            <w:tcW w:w="2300" w:type="dxa"/>
+          </w:tcPr>
+          <w:p>
+            <w:pPr>
+              <w:jc w:val="center"/>
+            </w:pPr>
+            <w:r>
+              <w:rPr>
+                <w:sz w:val="18"/>
+                <w:lang w:val="uk-UA"/>
+              </w:rPr>
+              <w:t xml:space="preserve">91,13</w:t>
+            </w:r>
+          </w:p>
+        </w:tc>
+        <w:tc>
+          <w:tcPr>
+            <w:tcW w:w="2300" w:type="dxa"/>
+          </w:tcPr>
+          <w:p>
+            <w:pPr>
+              <w:jc w:val="center"/>
+            </w:pPr>
+            <w:r>
+              <w:rPr>
+                <w:sz w:val="18"/>
+                <w:lang w:val="uk-UA"/>
+              </w:rPr>
+              <w:t xml:space="preserve">77,59–96,52</w:t>
+            </w:r>
+          </w:p>
+        </w:tc>
+      </w:tr>
+      <w:tr>
+        <w:trPr>
+          <w:jc w:val="center"/>
+        </w:trPr>
+        <w:tc>
+          <w:tcPr>
+            <w:tcW w:w="2700" w:type="dxa"/>
+          </w:tcPr>
+          <w:p>
+            <w:r>
+              <w:rPr>
+                <w:sz w:val="18"/>
+                <w:lang w:val="uk-UA"/>
+              </w:rPr>
+              <w:t xml:space="preserve">SVM, RBF-ядро</w:t>
+            </w:r>
+          </w:p>
+        </w:tc>
+        <w:tc>
+          <w:tcPr>
+            <w:tcW w:w="2338" w:type="dxa"/>
+          </w:tcPr>
+          <w:p>
+            <w:pPr>
+              <w:jc w:val="center"/>
+            </w:pPr>
+            <w:r>
+              <w:rPr>
+                <w:sz w:val="18"/>
+                <w:lang w:val="uk-UA"/>
+              </w:rPr>
+              <w:t xml:space="preserve">одноразове</w:t>
+            </w:r>
+          </w:p>
+        </w:tc>
+        <w:tc>
+          <w:tcPr>
+            <w:tcW w:w="2300" w:type="dxa"/>
+          </w:tcPr>
+          <w:p>
+            <w:pPr>
+              <w:jc w:val="center"/>
+            </w:pPr>
+            <w:r>
+              <w:rPr>
+                <w:sz w:val="18"/>
+                <w:lang w:val="uk-UA"/>
+              </w:rPr>
+              <w:t xml:space="preserve">79,70</w:t>
+            </w:r>
+          </w:p>
+        </w:tc>
+        <w:tc>
+          <w:tcPr>
+            <w:tcW w:w="2300" w:type="dxa"/>
+          </w:tcPr>
+          <w:p>
+            <w:pPr>
+              <w:jc w:val="center"/>
+            </w:pPr>
+            <w:r>
+              <w:rPr>
+                <w:sz w:val="18"/>
+                <w:lang w:val="uk-UA"/>
+              </w:rPr>
+              <w:t xml:space="preserve">48,09–97,34</w:t>
+            </w:r>
+          </w:p>
+        </w:tc>
+      </w:tr>
+      <w:tr>
+        <w:trPr>
+          <w:jc w:val="center"/>
+        </w:trPr>
+        <w:tc>
+          <w:tcPr>
+            <w:tcW w:w="2700" w:type="dxa"/>
+          </w:tcPr>
+          <w:p>
+            <w:r>
+              <w:rPr>
+                <w:sz w:val="18"/>
+                <w:lang w:val="uk-UA"/>
+              </w:rPr>
+              <w:t xml:space="preserve">MLP</w:t>
+            </w:r>
+          </w:p>
+        </w:tc>
+        <w:tc>
+          <w:tcPr>
+            <w:tcW w:w="2338" w:type="dxa"/>
+          </w:tcPr>
+          <w:p>
+            <w:pPr>
+              <w:jc w:val="center"/>
+            </w:pPr>
+            <w:r>
+              <w:rPr>
+                <w:sz w:val="18"/>
+                <w:lang w:val="uk-UA"/>
+              </w:rPr>
+              <w:t xml:space="preserve">до збіжності</w:t>
+            </w:r>
+          </w:p>
+        </w:tc>
+        <w:tc>
+          <w:tcPr>
+            <w:tcW w:w="2300" w:type="dxa"/>
+          </w:tcPr>
+          <w:p>
+            <w:pPr>
+              <w:jc w:val="center"/>
+            </w:pPr>
+            <w:r>
+              <w:rPr>
+                <w:sz w:val="18"/>
+                <w:lang w:val="uk-UA"/>
+              </w:rPr>
+              <w:t xml:space="preserve">75,71 ± 3,22</w:t>
+            </w:r>
+          </w:p>
+        </w:tc>
+        <w:tc>
+          <w:tcPr>
+            <w:tcW w:w="2300" w:type="dxa"/>
+          </w:tcPr>
+          <w:p>
+            <w:pPr>
+              <w:jc w:val="center"/>
+            </w:pPr>
+            <w:r>
+              <w:rPr>
+                <w:sz w:val="18"/>
+                <w:lang w:val="uk-UA"/>
+              </w:rPr>
+              <w:t xml:space="preserve">53,16–97,25</w:t>
+            </w:r>
+          </w:p>
+        </w:tc>
+      </w:tr>
+      <w:tr>
+        <w:trPr>
+          <w:jc w:val="center"/>
+        </w:trPr>
+        <w:tc>
+          <w:tcPr>
+            <w:tcW w:w="2700" w:type="dxa"/>
+          </w:tcPr>
+          <w:p>
+            <w:r>
+              <w:rPr>
+                <w:sz w:val="18"/>
+                <w:lang w:val="uk-UA"/>
+              </w:rPr>
+              <w:t xml:space="preserve">CNN</w:t>
+            </w:r>
+          </w:p>
+        </w:tc>
+        <w:tc>
+          <w:tcPr>
+            <w:tcW w:w="2338" w:type="dxa"/>
+          </w:tcPr>
+          <w:p>
+            <w:pPr>
+              <w:jc w:val="center"/>
+            </w:pPr>
+            <w:r>
+              <w:rPr>
+                <w:sz w:val="18"/>
+                <w:lang w:val="uk-UA"/>
+              </w:rPr>
+              <w:t xml:space="preserve">до збіжності</w:t>
+            </w:r>
+          </w:p>
+        </w:tc>
+        <w:tc>
+          <w:tcPr>
+            <w:tcW w:w="2300" w:type="dxa"/>
+          </w:tcPr>
+          <w:p>
+            <w:pPr>
+              <w:jc w:val="center"/>
+            </w:pPr>
+            <w:r>
+              <w:rPr>
+                <w:sz w:val="18"/>
+                <w:lang w:val="uk-UA"/>
+              </w:rPr>
+              <w:t xml:space="preserve">75,33 ± 1,66</w:t>
+            </w:r>
+          </w:p>
+        </w:tc>
+        <w:tc>
+          <w:tcPr>
+            <w:tcW w:w="2300" w:type="dxa"/>
+          </w:tcPr>
+          <w:p>
+            <w:pPr>
+              <w:jc w:val="center"/>
+            </w:pPr>
+            <w:r>
+              <w:rPr>
+                <w:sz w:val="18"/>
+                <w:lang w:val="uk-UA"/>
+              </w:rPr>
+              <w:t xml:space="preserve">45,26–96,85</w:t>
+            </w:r>
+          </w:p>
+        </w:tc>
+      </w:tr>
+      <w:tr>
+        <w:trPr>
+          <w:jc w:val="center"/>
+        </w:trPr>
+        <w:tc>
+          <w:tcPr>
+            <w:tcW w:w="2700" w:type="dxa"/>
+          </w:tcPr>
+          <w:p>
+            <w:r>
+              <w:rPr>
+                <w:sz w:val="18"/>
+                <w:lang w:val="uk-UA"/>
+              </w:rPr>
+              <w:t xml:space="preserve">Найближчий центроїд</w:t>
+            </w:r>
+          </w:p>
+        </w:tc>
+        <w:tc>
+          <w:tcPr>
+            <w:tcW w:w="2338" w:type="dxa"/>
+          </w:tcPr>
+          <w:p>
+            <w:pPr>
+              <w:jc w:val="center"/>
+            </w:pPr>
+            <w:r>
+              <w:rPr>
+                <w:sz w:val="18"/>
+                <w:lang w:val="uk-UA"/>
+              </w:rPr>
+              <w:t xml:space="preserve">одноразове</w:t>
+            </w:r>
+          </w:p>
+        </w:tc>
+        <w:tc>
+          <w:tcPr>
+            <w:tcW w:w="2300" w:type="dxa"/>
+          </w:tcPr>
+          <w:p>
+            <w:pPr>
+              <w:jc w:val="center"/>
+            </w:pPr>
+            <w:r>
+              <w:rPr>
+                <w:sz w:val="18"/>
+                <w:lang w:val="uk-UA"/>
+              </w:rPr>
+              <w:t xml:space="preserve">75,17</w:t>
+            </w:r>
+          </w:p>
+        </w:tc>
+        <w:tc>
+          <w:tcPr>
+            <w:tcW w:w="2300" w:type="dxa"/>
+          </w:tcPr>
+          <w:p>
+            <w:pPr>
+              <w:jc w:val="center"/>
+            </w:pPr>
+            <w:r>
+              <w:rPr>
+                <w:sz w:val="18"/>
+                <w:lang w:val="uk-UA"/>
+              </w:rPr>
+              <w:t xml:space="preserve">60,55–89,11</w:t>
+            </w:r>
+          </w:p>
+        </w:tc>
+      </w:tr>
+      <w:tr>
+        <w:trPr>
+          <w:jc w:val="center"/>
+        </w:trPr>
+        <w:tc>
+          <w:tcPr>
+            <w:tcW w:w="2700" w:type="dxa"/>
+          </w:tcPr>
+          <w:p>
+            <w:r>
+              <w:rPr>
+                <w:sz w:val="18"/>
+                <w:lang w:val="uk-UA"/>
+              </w:rPr>
+              <w:t xml:space="preserve">k-NN, k = 1</w:t>
+            </w:r>
+          </w:p>
+        </w:tc>
+        <w:tc>
+          <w:tcPr>
+            <w:tcW w:w="2338" w:type="dxa"/>
+          </w:tcPr>
+          <w:p>
+            <w:pPr>
+              <w:jc w:val="center"/>
+            </w:pPr>
+            <w:r>
+              <w:rPr>
+                <w:sz w:val="18"/>
+                <w:lang w:val="uk-UA"/>
+              </w:rPr>
+              <w:t xml:space="preserve">одноразове</w:t>
+            </w:r>
+          </w:p>
+        </w:tc>
+        <w:tc>
+          <w:tcPr>
+            <w:tcW w:w="2300" w:type="dxa"/>
+          </w:tcPr>
+          <w:p>
+            <w:pPr>
+              <w:jc w:val="center"/>
+            </w:pPr>
+            <w:r>
+              <w:rPr>
+                <w:sz w:val="18"/>
+                <w:lang w:val="uk-UA"/>
+              </w:rPr>
+              <w:t xml:space="preserve">73,08</w:t>
+            </w:r>
+          </w:p>
+        </w:tc>
+        <w:tc>
+          <w:tcPr>
+            <w:tcW w:w="2300" w:type="dxa"/>
+          </w:tcPr>
+          <w:p>
+            <w:pPr>
+              <w:jc w:val="center"/>
+            </w:pPr>
+            <w:r>
+              <w:rPr>
+                <w:sz w:val="18"/>
+                <w:lang w:val="uk-UA"/>
+              </w:rPr>
+              <w:t xml:space="preserve">48,97–93,94</w:t>
+            </w:r>
+          </w:p>
+        </w:tc>
+      </w:tr>
+      <w:tr>
+        <w:trPr>
+          <w:jc w:val="center"/>
+        </w:trPr>
+        <w:tc>
+          <w:tcPr>
+            <w:tcW w:w="2700" w:type="dxa"/>
+          </w:tcPr>
+          <w:p>
+            <w:r>
+              <w:rPr>
+                <w:sz w:val="18"/>
+                <w:lang w:val="uk-UA"/>
+              </w:rPr>
+              <w:t xml:space="preserve">MLP</w:t>
+            </w:r>
+          </w:p>
+        </w:tc>
+        <w:tc>
+          <w:tcPr>
+            <w:tcW w:w="2338" w:type="dxa"/>
+          </w:tcPr>
+          <w:p>
+            <w:pPr>
+              <w:jc w:val="center"/>
+            </w:pPr>
+            <w:r>
+              <w:rPr>
+                <w:sz w:val="18"/>
+                <w:lang w:val="uk-UA"/>
+              </w:rPr>
+              <w:t xml:space="preserve">одна епоха</w:t>
+            </w:r>
+          </w:p>
+        </w:tc>
+        <w:tc>
+          <w:tcPr>
+            <w:tcW w:w="2300" w:type="dxa"/>
+          </w:tcPr>
+          <w:p>
+            <w:pPr>
+              <w:jc w:val="center"/>
+            </w:pPr>
+            <w:r>
+              <w:rPr>
+                <w:sz w:val="18"/>
+                <w:lang w:val="uk-UA"/>
+              </w:rPr>
+              <w:t xml:space="preserve">67,13 ± 5,44</w:t>
+            </w:r>
+          </w:p>
+        </w:tc>
+        <w:tc>
+          <w:tcPr>
+            <w:tcW w:w="2300" w:type="dxa"/>
+          </w:tcPr>
+          <w:p>
+            <w:pPr>
+              <w:jc w:val="center"/>
+            </w:pPr>
+            <w:r>
+              <w:rPr>
+                <w:sz w:val="18"/>
+                <w:lang w:val="uk-UA"/>
+              </w:rPr>
+              <w:t xml:space="preserve">29,91–97,43</w:t>
+            </w:r>
+          </w:p>
+        </w:tc>
+      </w:tr>
+      <w:tr>
+        <w:trPr>
+          <w:jc w:val="center"/>
+        </w:trPr>
+        <w:tc>
+          <w:tcPr>
+            <w:tcW w:w="2700" w:type="dxa"/>
+          </w:tcPr>
+          <w:p>
+            <w:r>
+              <w:rPr>
+                <w:sz w:val="18"/>
+                <w:lang w:val="uk-UA"/>
+              </w:rPr>
+              <w:t xml:space="preserve">CNN</w:t>
+            </w:r>
+          </w:p>
+        </w:tc>
+        <w:tc>
+          <w:tcPr>
+            <w:tcW w:w="2338" w:type="dxa"/>
+          </w:tcPr>
+          <w:p>
+            <w:pPr>
+              <w:jc w:val="center"/>
+            </w:pPr>
+            <w:r>
+              <w:rPr>
+                <w:sz w:val="18"/>
+                <w:lang w:val="uk-UA"/>
+              </w:rPr>
+              <w:t xml:space="preserve">одна епоха</w:t>
+            </w:r>
+          </w:p>
+        </w:tc>
+        <w:tc>
+          <w:tcPr>
+            <w:tcW w:w="2300" w:type="dxa"/>
+          </w:tcPr>
+          <w:p>
+            <w:pPr>
+              <w:jc w:val="center"/>
+            </w:pPr>
+            <w:r>
+              <w:rPr>
+                <w:sz w:val="18"/>
+                <w:lang w:val="uk-UA"/>
+              </w:rPr>
+              <w:t xml:space="preserve">59,00 ± 6,47</w:t>
+            </w:r>
+          </w:p>
+        </w:tc>
+        <w:tc>
+          <w:tcPr>
+            <w:tcW w:w="2300" w:type="dxa"/>
+          </w:tcPr>
+          <w:p>
+            <w:pPr>
+              <w:jc w:val="center"/>
+            </w:pPr>
+            <w:r>
+              <w:rPr>
+                <w:sz w:val="18"/>
+                <w:lang w:val="uk-UA"/>
+              </w:rPr>
+              <w:t xml:space="preserve">18,27–89,85</w:t>
+            </w:r>
+          </w:p>
+        </w:tc>
+      </w:tr>
+    </w:tbl>
+    <w:p>
+      <w:pPr>
+        <w:spacing w:after="0" w:line="280" w:lineRule="exact"/>
+        <w:jc w:val="both"/>
+      </w:pPr>
+    </w:p>
+    <w:p>
+      <w:pPr>
+        <w:spacing w:before="160" w:after="80" w:line="280" w:lineRule="exact"/>
+        <w:jc w:val="both"/>
+      </w:pPr>
+      <w:r>
+        <w:rPr>
+          <w:b/>
+        </w:rPr>
         <w:t>4 Обговорення результатів</w:t>
       </w:r>
     </w:p>
@@ -6751,7 +7463,7 @@
         <w:rPr>
           <w:lang w:val="uk-UA"/>
         </w:rPr>
-        <w:t xml:space="preserve">Для всієї пари 2→7 трасування встановлює етап, на якому петлі вже немає, і те, що 2_1 програє 7_1 за подібністю (табл. 6). Чи програє він через ті самі поознакові штрафи, лишається гіпотезою: поознакових трасувань та експериментів зі втручанням для решти 110 випадків немає.</w:t>
+        <w:t xml:space="preserve">Для всієї пари 2→7 трасування встановлює етап, на якому петлі вже немає, і те, що 2_1 програє 7_1 за подібністю (табл. 6). Чи програє він через ті самі поознакові штрафи, лишається гіпотезою: поознакових трасувань та експериментів зі втручанням для решти 110 випадків немає. Розбір обмежено найчисленнішою помилкою, бо поознакове трасування кожного випадку кратно збільшило б обсяг статті. Методика трасування не залежить від класу. Для помилок інших класів вона показує причини того самого роду: концепт істинного класу не допущено до порівняння через розбіжність топології, він програє за подібністю через ознаки поза інтервалами або рішення змінює поправка на складність. Приклади поознакових трасувань помилок інших класів і правильних рішень наведено в репозиторії проєкту: https://github.com/NaturalAGI-Lab/NaturalAGI/tree/development/experiments/run_20261023_155807/traces. Їх виконано в повторному експерименті з перенавченими концептами, точність якого становить 90,05 %.</w:t>
       </w:r>
     </w:p>
     <w:p>
@@ -6770,7 +7482,7 @@
         <w:rPr>
           <w:lang w:val="uk-UA"/>
         </w:rPr>
-        <w:t xml:space="preserve">Ручний відбір 76 оригіналів є свідомим обмеженням методу (підрозділ 2.2): результат дійсний для концептів, сформованих зі структурно правильних написань, а чутливість точності до конкретного відбору, порядку подання й невідомого точного діапазону аугментації не вимірювали. Параметри табл. 1 підібрано емпірично в серії попередніх експериментів на тому самому тестовому розбитті; окремої валідаційної вибірки й абляцій за кожним параметром не було, тому точність може бути завищеною. </w:t>
+        <w:t xml:space="preserve">Ручний відбір 76 оригіналів є свідомим обмеженням методу (підрозділ 2.2): результат дійсний для концептів, сформованих зі структурно правильних написань, а чутливість точності до конкретного відбору, порядку подання й невідомого точного діапазону аугментації не вимірювали. Як і будь-яка модель, зокрема штучна нейронна мережа, система має початкові умови, які задає розробник: системи координат і їх сегментацію, типи ознак вузлів і вартості зіставлення (табл. 1). У біологічній системі подібні початкові умови задають сенсорні системи, що формують первинні примітиви сприйняття. Сенсорну систему ця робота не моделює: етап формування первинних примітивів замінено евристичним заданням параметрів, і це обмеження моделі. Параметри табл. 1 підібрано емпірично в серії попередніх експериментів на тому самому тестовому розбитті; окремої валідаційної вибірки й абляцій за кожним параметром не було, тому точність може бути завищеною. </w:t>
       </w:r>
       <w:r>
         <w:rPr>
@@ -6932,7 +7644,7 @@
         <w:rPr>
           <w:lang w:val="uk-UA"/>
         </w:rPr>
-        <w:t xml:space="preserve">Практична цінність результатів є потенційною. Вона стосується задач, де кожне спірне рішення перевіряє людина: розпізнавання рукописних позначок у документообігу, контролю промислового маркування, навчальних систем, які мають показати причину оцінки. У статті показано властивість, на якій ґрунтується така придатність: рішення відтворюється за збереженими даними до поознакових вартостей, а концепт нового класу формується з кількох оригіналів. Застосування в цих задачах не перевіряли.</w:t>
+        <w:t xml:space="preserve">Робота має фундаментальний характер: метод спершу перевіряють на простих структурах, а потім переносять на складніші. Прототип системи перевірено на шести класах [32], у цій статті — на десяти класах рукописних цифр MNIST, а наступним етапом заплановано набір рукописних символів Omniglot. Згорткові нейронні мережі так само відпрацьовували на рукописних цифрах, зокрема на MNIST [40], перш ніж перейти до складніших зображень. Практичним результатом уже є навчання з кількох прикладів (3–9 оригіналів на концепт), якого потребують задачі з малою кількістю розмічених даних: на тих самих зразках найкраща з базових моделей поступається системі на 11,43 п. п. (підрозділ 3.5). Цінність для прикладних задач є потенційною. Вона стосується задач, де кожне спірне рішення перевіряє людина: розпізнавання рукописних позначок у документообігу, контролю промислового маркування, навчальних систем, які мають показати причину оцінки. У статті показано властивість, на якій ґрунтується така придатність: рішення відтворюється за збереженими даними до поознакових вартостей, а концепт нового класу формується з кількох оригіналів. Застосування в цих задачах не перевіряли.</w:t>
       </w:r>
     </w:p>
     <w:p>

</xml_diff>

<commit_message>
docs: score table 7 of article 065 on the same 8,707 test images for the system and the baselines
</commit_message>
<xml_diff>
--- a/papers/itssi_xai_2026/itssi_xai_2026.docx
+++ b/papers/itssi_xai_2026/itssi_xai_2026.docx
@@ -6728,7 +6728,7 @@
         <w:rPr>
           <w:lang w:val="uk-UA"/>
         </w:rPr>
-        <w:t xml:space="preserve">Базові методи навчено на тих самих 805 зразках, з яких сформовано концепти (76 оригіналів з аугментаціями, 100×100 пікселів): SVM з RBF-ядром, багатошаровий перцептрон (MLP), згорткову мережу (CNN), класифікатор найближчого центроїда і k найближчих сусідів (k-NN). Оцінювання виконано на 8 708 повних тестових зображеннях за архівним переліком, що на одне більше, ніж у табл. 3; одне зображення змінює точність на 0,011 п. п. MLP і CNN навчено до збіжності з ранньою зупинкою на десяти відкладених оригіналах, по одному на клас, і окремо протягом однієї епохи. Для них наведено середнє й стандартне відхилення за п'ятьма запусками з різними початковими значеннями генератора. Умови й результати порівняння збережено в репозиторії проєкту (каталог experiments/classical_baselines_20260910T113940Z).</w:t>
+        <w:t xml:space="preserve">Базові методи навчено на тих самих 805 зразках, з яких сформовано концепти (76 оригіналів з аугментаціями, 100×100 пікселів): SVM з RBF-ядром, багатошаровий перцептрон (MLP), згорткову мережу (CNN), класифікатор найближчого центроїда і k найближчих сусідів (k-NN). Оцінювання виконано на тих самих 8 707 тестових зображеннях, що й для системи (табл. 3). Для системи 22 зображення, на яких конвеєр не побудував граф, зараховано до помилок, тому її точність у табл. 7 становить 90,90 % (7 915 з 8 707), а не 91,13 % (7 915 з 8 685 класифікованих). MLP і CNN навчено до збіжності з ранньою зупинкою на десяти відкладених оригіналах, по одному на клас, і окремо протягом однієї епохи. Для них наведено середнє й стандартне відхилення за п'ятьма запусками з різними початковими значеннями генератора. Умови й результати порівняння збережено в репозиторії проєкту (каталог experiments/classical_baselines_20260910T113940Z).</w:t>
       </w:r>
     </w:p>
     <w:p>
@@ -6741,7 +6741,7 @@
         <w:rPr>
           <w:lang w:val="uk-UA"/>
         </w:rPr>
-        <w:t xml:space="preserve">Найкраща з базових моделей, SVM, досягає точності 79,70 %, на 11,43 п. п. нижче за систему (табл. 7). Після однієї епохи, тобто одного проходу навчальних даних, точність MLP становить 67,13 %, а CNN — 59,00 %. Повнота системи за класами лежить у межах 18,93 п. п., у SVM — у межах 49,25 п. п. Розрив створюють переважно класи 3, 5 і 8, а на класах 2 і 4 повнота SVM вища, ніж у системи.</w:t>
+        <w:t xml:space="preserve">Найкраща з базових моделей, SVM, досягає точності 79,69 %, на 11,21 п. п. нижче за систему (табл. 7). Після однієї епохи, тобто одного проходу навчальних даних, точність MLP становить 67,13 %, а CNN — 59,00 %. Повнота системи за класами лежить у межах 18,42 п. п., у SVM — у межах 49,25 п. п. Найбільше система випереджає SVM на класі 3: 95,67 % проти 48,09 %. На класах 2 і 4 вища повнота в SVM: 87,34 % проти 77,51 % і 91,61 % проти 83,74 %; на класах 1 і 6 SVM випереджає систему менш ніж на 2,3 п. п.</w:t>
       </w:r>
     </w:p>
     <w:p>
@@ -6899,7 +6899,7 @@
                 <w:sz w:val="18"/>
                 <w:lang w:val="uk-UA"/>
               </w:rPr>
-              <w:t xml:space="preserve">91,13</w:t>
+              <w:t xml:space="preserve">90,90</w:t>
             </w:r>
           </w:p>
         </w:tc>
@@ -6916,7 +6916,7 @@
                 <w:sz w:val="18"/>
                 <w:lang w:val="uk-UA"/>
               </w:rPr>
-              <w:t xml:space="preserve">77,59–96,52</w:t>
+              <w:t xml:space="preserve">77,51–95,93</w:t>
             </w:r>
           </w:p>
         </w:tc>
@@ -6969,7 +6969,7 @@
                 <w:sz w:val="18"/>
                 <w:lang w:val="uk-UA"/>
               </w:rPr>
-              <w:t xml:space="preserve">79,70</w:t>
+              <w:t xml:space="preserve">79,69</w:t>
             </w:r>
           </w:p>
         </w:tc>
@@ -7039,7 +7039,7 @@
                 <w:sz w:val="18"/>
                 <w:lang w:val="uk-UA"/>
               </w:rPr>
-              <w:t xml:space="preserve">75,71 ± 3,22</w:t>
+              <w:t xml:space="preserve">75,70 ± 3,22</w:t>
             </w:r>
           </w:p>
         </w:tc>
@@ -7109,7 +7109,7 @@
                 <w:sz w:val="18"/>
                 <w:lang w:val="uk-UA"/>
               </w:rPr>
-              <w:t xml:space="preserve">75,33 ± 1,66</w:t>
+              <w:t xml:space="preserve">75,32 ± 1,66</w:t>
             </w:r>
           </w:p>
         </w:tc>
@@ -7644,7 +7644,7 @@
         <w:rPr>
           <w:lang w:val="uk-UA"/>
         </w:rPr>
-        <w:t xml:space="preserve">Робота має фундаментальний характер: метод спершу перевіряють на простих структурах, а потім переносять на складніші. Прототип системи перевірено на шести класах [32], у цій статті — на десяти класах рукописних цифр MNIST, а наступним етапом заплановано набір рукописних символів Omniglot. Згорткові нейронні мережі так само відпрацьовували на рукописних цифрах, зокрема на MNIST [40], перш ніж перейти до складніших зображень. Практичним результатом уже є навчання з кількох прикладів (3–9 оригіналів на концепт), якого потребують задачі з малою кількістю розмічених даних: на тих самих зразках найкраща з базових моделей поступається системі на 11,43 п. п. (підрозділ 3.5). Цінність для прикладних задач є потенційною. Вона стосується задач, де кожне спірне рішення перевіряє людина: розпізнавання рукописних позначок у документообігу, контролю промислового маркування, навчальних систем, які мають показати причину оцінки. У статті показано властивість, на якій ґрунтується така придатність: рішення відтворюється за збереженими даними до поознакових вартостей, а концепт нового класу формується з кількох оригіналів. Застосування в цих задачах не перевіряли.</w:t>
+        <w:t xml:space="preserve">Робота має фундаментальний характер: метод спершу перевіряють на простих структурах, а потім переносять на складніші. Прототип системи перевірено на шести класах [32], у цій статті — на десяти класах рукописних цифр MNIST, а наступним етапом заплановано набір рукописних символів Omniglot. Згорткові нейронні мережі так само відпрацьовували на рукописних цифрах, зокрема на MNIST [40], перш ніж перейти до складніших зображень. Практичним результатом уже є навчання з кількох прикладів (3–9 оригіналів на концепт), якого потребують задачі з малою кількістю розмічених даних: на тих самих зразках найкраща з базових моделей поступається системі на 11,21 п. п. (підрозділ 3.5). Цінність для прикладних задач є потенційною. Вона стосується задач, де кожне спірне рішення перевіряє людина: розпізнавання рукописних позначок у документообігу, контролю промислового маркування, навчальних систем, які мають показати причину оцінки. У статті показано властивість, на якій ґрунтується така придатність: рішення відтворюється за збереженими даними до поознакових вартостей, а концепт нового класу формується з кількох оригіналів. Застосування в цих задачах не перевіряли.</w:t>
       </w:r>
     </w:p>
     <w:p>

</xml_diff>

<commit_message>
docs: report the 22 graph-construction failures and 90.90% over all 8,707 in article 065
</commit_message>
<xml_diff>
--- a/papers/itssi_xai_2026/itssi_xai_2026.docx
+++ b/papers/itssi_xai_2026/itssi_xai_2026.docx
@@ -2972,7 +2972,7 @@
         <w:rPr>
           <w:lang w:val="uk-UA"/>
         </w:rPr>
-        <w:t xml:space="preserve">Помилкою вважають і віднесення зображення до хибного класу, і випадок, коли не активувався жоден концепт. Точність є часткою правильно розпізнаних зображень. Влучність, повноту й F1 обчислено для кожного класу та усереднено з вагами, пропорційними кількості зображень класу. Для точності та покласових влучності й повноти наведено 95 % довірчі інтервали (ДІ) Вільсона [41].</w:t>
+        <w:t xml:space="preserve">Помилкою вважають і віднесення зображення до хибного класу, і випадок, коли не активувався жоден концепт. Якщо конвеєр не побудував граф зображення, воно не потрапляє до класифікатора. Основну точність обчислено на класифікованих зображеннях, а точність, у якій такі збої зараховано до помилок, наведено окремо. Точність є часткою правильно розпізнаних зображень. Влучність, повноту й F1 обчислено для кожного класу та усереднено з вагами, пропорційними кількості зображень класу. Для точності та покласових влучності й повноти наведено 95 % довірчі інтервали (ДІ) Вільсона [41].</w:t>
       </w:r>
     </w:p>
     <w:p>
@@ -3793,7 +3793,7 @@
         <w:jc w:val="both"/>
       </w:pPr>
       <w:r>
-        <w:t>Із 10 000 тестових зображень MNIST [40] допущено 8 707, тобто 87,07 %; 1 293 (12,93 %) вилучено. Розпізнавання розірваних структур потребує окремого асоціативного механізму, якого система не має, тому метрики характеризують лише допущену підмножину.</w:t>
+        <w:t>Із 10 000 тестових зображень MNIST [40] допущено 8 707, тобто 87,07 %; 1 293 (12,93 %) вилучено. Розпізнавання розірваних структур потребує окремого асоціативного механізму, якого система не має, тому метрики характеризують лише допущену підмножину. Для 22 із 8 707 допущених зображень конвеєр не побудував граф, тому класифіковано 8 685 зображень. Точність на них становить 91,13 % (підрозділ 3.3). Якщо зарахувати ці 22 зображення до помилок, точність становить 90,90 % (7 915 з 8 707; 95 % ДІ 90,28–91,49 %).</w:t>
       </w:r>
     </w:p>
     <w:p>

</xml_diff>

<commit_message>
docs: name the 8,685 classified images next to 91.13 % in the abstracts and conclusion 4 of article 065
</commit_message>
<xml_diff>
--- a/papers/itssi_xai_2026/itssi_xai_2026.docx
+++ b/papers/itssi_xai_2026/itssi_xai_2026.docx
@@ -110,7 +110,7 @@
       </w:r>
       <w:r>
         <w:rPr/>
-        <w:t xml:space="preserve">Images were represented as graphs with two node types, points and vectors, and 13 features. In a single pass of structural reduction, thirteen concept attractors for 10 classes, with 3 to 12 nodes each, were formed from 76 manually selected sources expanded to 805 images. In classification on graph edit distance, narrow feature intervals weigh more. The contour-completeness filter admitted 8,707 of 10,000 images; the share of retained images per class ranges from 59.75 % to 99.47 %. Accuracy is 91.13 %</w:t>
+        <w:t xml:space="preserve">Images were represented as graphs with two node types, points and vectors, and 13 features. In a single pass of structural reduction, thirteen concept attractors for 10 classes, with 3 to 12 nodes each, were formed from 76 manually selected sources expanded to 805 images. In classification on graph edit distance, narrow feature intervals weigh more. The contour-completeness filter admitted 8,707 of 10,000 images; the share of retained images per class ranges from 59.75 % to 99.47 %. Accuracy on the 8,685 classified images is 91.13 %</w:t>
       </w:r>
       <w:r>
         <w:rPr/>
@@ -7594,7 +7594,7 @@
       </w:pPr>
       <w:r>
         <w:rPr/>
-        <w:t xml:space="preserve">4. Ручний фільтр допустив 8 707 із 10 000 зображень MNIST; частка збережених зображень класу коливається від 59,75 % до 99,47 %. Точність становить 91,13 %</w:t>
+        <w:t xml:space="preserve">4. Ручний фільтр допустив 8 707 із 10 000 зображень MNIST; частка збережених зображень класу коливається від 59,75 % до 99,47 %. Точність на 8 685 класифікованих зображеннях становить 91,13 %</w:t>
       </w:r>
       <w:r>
         <w:rPr/>
@@ -8873,7 +8873,7 @@
       </w:r>
       <w:r>
         <w:rPr/>
-        <w:t xml:space="preserve">Зображення подано графами з вузлами двох типів, точками й векторами, і 13 ознаками. Із 76 вручну відібраних оригіналів, розширених до 805 зразків, одним проходом структурної редукції сформовано 13 концептів-атракторів для 10 класів, по 3–12 вузлів кожний. У класифікації за відстанню редагування графів вузькі інтервали ознак важать більше. Фільтр повноти контуру допустив 8 707 із 10 000 зображень; частка збережених зображень класу коливається від 59,75 % до 99,47 %. Точність становить 91,13 %</w:t>
+        <w:t xml:space="preserve">Зображення подано графами з вузлами двох типів, точками й векторами, і 13 ознаками. Із 76 вручну відібраних оригіналів, розширених до 805 зразків, одним проходом структурної редукції сформовано 13 концептів-атракторів для 10 класів, по 3–12 вузлів кожний. У класифікації за відстанню редагування графів вузькі інтервали ознак важать більше. Фільтр повноти контуру допустив 8 707 із 10 000 зображень; частка збережених зображень класу коливається від 59,75 % до 99,47 %. Точність на 8 685 класифікованих зображеннях становить 91,13 %</w:t>
       </w:r>
       <w:r>
         <w:rPr/>

</xml_diff>